<commit_message>
Move removed lecture-based tables into Appendices B-D
Co-Authored-By: Claude Opus 5.5 <noreply@anthropic.com>
Claude-Session: https://claude.ai/code/session_01XwhnEvcgigojVrsaWSJPuE
</commit_message>
<xml_diff>
--- a/Alo_Mat_to_Moment_IMC_Brief.docx
+++ b/Alo_Mat_to_Moment_IMC_Brief.docx
@@ -1161,7 +1161,7 @@
         <w:spacing w:after="160" w:line="288"/>
       </w:pPr>
       <w:r>
-        <w:t xml:space="preserve">Of three segments (Smith, 1956), we target </w:t>
+        <w:t xml:space="preserve">Of three segments (Smith, 1956; see Appendix B), we target </w:t>
       </w:r>
       <w:r>
         <w:rPr>
@@ -2609,7 +2609,7 @@
         <w:t xml:space="preserve">For style-led studio women in Sydney, Alo is the premium activewear brand designed to move from the reformer to the rest of the day.</w:t>
       </w:r>
       <w:r>
-        <w:t xml:space="preserve"> Global IMC warns that efficiency for the company is not relevance for the consumer (Bryant, 2026l). Following the governance split in Bryant (2026l), Alo's identity, positioning and visual assets are standardised to protect its global prestige: logo, neutral palette, studio aesthetic and a no-discount policy. People, places, partnerships and offers are localised: Sydney instructors, Bondi and CBD settings, Body by Berner, and styling appointments. Localness adds relational value even for foreign brands (Sichtmann et al., 2019). The risk is that Alo's own global celebrity content keeps reaching Sydney feeds, so the local work must be distinctive enough to compete with Alo's global voice.</w:t>
+        <w:t xml:space="preserve"> Global IMC warns that efficiency for the company is not relevance for the consumer (Bryant, 2026l). Following the governance split in Bryant (2026l; see Appendix C), Alo's identity, positioning and visual assets are standardised to protect its global prestige: logo, neutral palette, studio aesthetic and a no-discount policy. People, places, partnerships and offers are localised: Sydney instructors, Bondi and CBD settings, Body by Berner, and styling appointments. Localness adds relational value even for foreign brands (Sichtmann et al., 2019). The risk is that Alo's own global celebrity content keeps reaching Sydney feeds, so the local work must be distinctive enough to compete with Alo's global voice.</w:t>
       </w:r>
     </w:p>
     <w:p>
@@ -3878,7 +3878,7 @@
         <w:t xml:space="preserve">is</w:t>
       </w:r>
       <w:r>
-        <w:t xml:space="preserve"> the positioning (Bryant, 2026h; Smith &amp; Yang, 2004). On the divergence dimensions, it shows originality (quiet moments), synthesis (linking the reformer and the café through one garment) and flexibility (it works as film, still, audio and live session). The risk is that divergent work is remembered without the brand, so the logo, palette and "Mat to Moment" sign-off appear in every execution. The lead appeals are aspirational and social approval (Bryant, 2026h). Social approval is the riskiest choice here, because visibility drives appearance pressure (Camacho-Miñano et al., 2019), and persuasion becomes manipulation when it exploits vulnerability (Bryant, 2026g). Executions therefore show diverse bodies and use no retouching. A rational appeal reframes price as cost per wear, reflecting that value now means longevity (Bryant, 2026d). Slice-of-life storytelling carries the emotion, and demonstration carries the proof. Together they meet the execution criteria in Bryant (2026h) of message clarity, storytelling, brand integration and credibility, so neither appeal has to work alone.</w:t>
+        <w:t xml:space="preserve"> the positioning (Bryant, 2026h; Smith &amp; Yang, 2004). On the divergence dimensions (Appendix D), it shows originality (quiet moments), synthesis (linking the reformer and the café through one garment) and flexibility (it works as film, still, audio and live session). The risk is that divergent work is remembered without the brand, so the logo, palette and "Mat to Moment" sign-off appear in every execution. The lead appeals are aspirational and social approval (Bryant, 2026h). Social approval is the riskiest choice here, because visibility drives appearance pressure (Camacho-Miñano et al., 2019), and persuasion becomes manipulation when it exploits vulnerability (Bryant, 2026g). Executions therefore show diverse bodies and use no retouching. A rational appeal reframes price as cost per wear, reflecting that value now means longevity (Bryant, 2026d). Slice-of-life storytelling carries the emotion, and demonstration carries the proof. Together they meet the execution criteria in Bryant (2026h) of message clarity, storytelling, brand integration and credibility, so neither appeal has to work alone.</w:t>
       </w:r>
     </w:p>
     <w:p>
@@ -9363,6 +9363,2698 @@
           <w:szCs w:val="19"/>
         </w:rPr>
         <w:t xml:space="preserve">From Google Trends (2026). Indexed relative search volume. Averages: Lululemon 55, Lorna Jane 21, Alo 20. Alo peaked at about 46 at the May opening and has sat near 11 since September; The Galeries opening produced no visible lift.</w:t>
+      </w:r>
+    </w:p>
+    <w:p>
+      <w:r>
+        <w:br w:type="page"/>
+      </w:r>
+    </w:p>
+    <w:p>
+      <w:pPr>
+        <w:pStyle w:val="Heading1"/>
+      </w:pPr>
+      <w:r>
+        <w:t xml:space="preserve">Appendix B: Segment Evaluation</w:t>
+      </w:r>
+    </w:p>
+    <w:p>
+      <w:pPr>
+        <w:keepNext/>
+        <w:spacing w:after="40" w:before="200"/>
+      </w:pPr>
+      <w:r>
+        <w:rPr>
+          <w:b/>
+          <w:bCs/>
+        </w:rPr>
+        <w:t xml:space="preserve">Table B1</w:t>
+      </w:r>
+    </w:p>
+    <w:p>
+      <w:pPr>
+        <w:keepNext/>
+        <w:spacing w:after="100"/>
+      </w:pPr>
+      <w:r>
+        <w:rPr>
+          <w:i/>
+          <w:iCs/>
+        </w:rPr>
+        <w:t xml:space="preserve">Evaluation of Potential Target Segments</w:t>
+      </w:r>
+    </w:p>
+    <w:tbl>
+      <w:tblPr>
+        <w:tblW w:type="dxa" w:w="9638"/>
+        <w:tblBorders>
+          <w:top w:val="single" w:color="auto" w:sz="4"/>
+          <w:left w:val="single" w:color="auto" w:sz="4"/>
+          <w:bottom w:val="single" w:color="auto" w:sz="4"/>
+          <w:right w:val="single" w:color="auto" w:sz="4"/>
+          <w:insideH w:val="single" w:color="auto" w:sz="4"/>
+          <w:insideV w:val="single" w:color="auto" w:sz="4"/>
+        </w:tblBorders>
+      </w:tblPr>
+      <w:tblGrid>
+        <w:gridCol w:w="1735"/>
+        <w:gridCol w:w="2891"/>
+        <w:gridCol w:w="2506"/>
+        <w:gridCol w:w="2506"/>
+      </w:tblGrid>
+      <w:tr>
+        <w:trPr>
+          <w:tblHeader/>
+        </w:trPr>
+        <w:tc>
+          <w:tcPr>
+            <w:tcW w:type="dxa" w:w="1735"/>
+            <w:tcBorders>
+              <w:top w:val="single" w:color="C9CED2" w:sz="4"/>
+              <w:left w:val="single" w:color="C9CED2" w:sz="4"/>
+              <w:bottom w:val="single" w:color="C9CED2" w:sz="4"/>
+              <w:right w:val="single" w:color="C9CED2" w:sz="4"/>
+            </w:tcBorders>
+            <w:shd w:fill="1E2A32" w:color="auto" w:val="clear"/>
+            <w:tcMar>
+              <w:top w:type="dxa" w:w="60"/>
+              <w:left w:type="dxa" w:w="90"/>
+              <w:bottom w:type="dxa" w:w="60"/>
+              <w:right w:type="dxa" w:w="90"/>
+            </w:tcMar>
+          </w:tcPr>
+          <w:p>
+            <w:pPr>
+              <w:spacing w:after="0" w:line="252"/>
+            </w:pPr>
+            <w:r>
+              <w:rPr>
+                <w:b/>
+                <w:bCs/>
+                <w:color w:val="FFFFFF"/>
+                <w:sz w:val="17"/>
+                <w:szCs w:val="17"/>
+              </w:rPr>
+              <w:t xml:space="preserve">Criterion</w:t>
+            </w:r>
+          </w:p>
+        </w:tc>
+        <w:tc>
+          <w:tcPr>
+            <w:tcW w:type="dxa" w:w="2891"/>
+            <w:tcBorders>
+              <w:top w:val="single" w:color="C9CED2" w:sz="4"/>
+              <w:left w:val="single" w:color="C9CED2" w:sz="4"/>
+              <w:bottom w:val="single" w:color="C9CED2" w:sz="4"/>
+              <w:right w:val="single" w:color="C9CED2" w:sz="4"/>
+            </w:tcBorders>
+            <w:shd w:fill="1E2A32" w:color="auto" w:val="clear"/>
+            <w:tcMar>
+              <w:top w:type="dxa" w:w="60"/>
+              <w:left w:type="dxa" w:w="90"/>
+              <w:bottom w:type="dxa" w:w="60"/>
+              <w:right w:type="dxa" w:w="90"/>
+            </w:tcMar>
+          </w:tcPr>
+          <w:p>
+            <w:pPr>
+              <w:spacing w:after="0" w:line="252"/>
+            </w:pPr>
+            <w:r>
+              <w:rPr>
+                <w:b/>
+                <w:bCs/>
+                <w:color w:val="FFFFFF"/>
+                <w:sz w:val="17"/>
+                <w:szCs w:val="17"/>
+              </w:rPr>
+              <w:t xml:space="preserve">A: Style-conscious women, 22–34, Sydney</w:t>
+            </w:r>
+          </w:p>
+        </w:tc>
+        <w:tc>
+          <w:tcPr>
+            <w:tcW w:type="dxa" w:w="2506"/>
+            <w:tcBorders>
+              <w:top w:val="single" w:color="C9CED2" w:sz="4"/>
+              <w:left w:val="single" w:color="C9CED2" w:sz="4"/>
+              <w:bottom w:val="single" w:color="C9CED2" w:sz="4"/>
+              <w:right w:val="single" w:color="C9CED2" w:sz="4"/>
+            </w:tcBorders>
+            <w:shd w:fill="1E2A32" w:color="auto" w:val="clear"/>
+            <w:tcMar>
+              <w:top w:type="dxa" w:w="60"/>
+              <w:left w:type="dxa" w:w="90"/>
+              <w:bottom w:type="dxa" w:w="60"/>
+              <w:right w:type="dxa" w:w="90"/>
+            </w:tcMar>
+          </w:tcPr>
+          <w:p>
+            <w:pPr>
+              <w:spacing w:after="0" w:line="252"/>
+            </w:pPr>
+            <w:r>
+              <w:rPr>
+                <w:b/>
+                <w:bCs/>
+                <w:color w:val="FFFFFF"/>
+                <w:sz w:val="17"/>
+                <w:szCs w:val="17"/>
+              </w:rPr>
+              <w:t xml:space="preserve">B: Affluent wellness women, 35–50</w:t>
+            </w:r>
+          </w:p>
+        </w:tc>
+        <w:tc>
+          <w:tcPr>
+            <w:tcW w:type="dxa" w:w="2506"/>
+            <w:tcBorders>
+              <w:top w:val="single" w:color="C9CED2" w:sz="4"/>
+              <w:left w:val="single" w:color="C9CED2" w:sz="4"/>
+              <w:bottom w:val="single" w:color="C9CED2" w:sz="4"/>
+              <w:right w:val="single" w:color="C9CED2" w:sz="4"/>
+            </w:tcBorders>
+            <w:shd w:fill="1E2A32" w:color="auto" w:val="clear"/>
+            <w:tcMar>
+              <w:top w:type="dxa" w:w="60"/>
+              <w:left w:type="dxa" w:w="90"/>
+              <w:bottom w:type="dxa" w:w="60"/>
+              <w:right w:type="dxa" w:w="90"/>
+            </w:tcMar>
+          </w:tcPr>
+          <w:p>
+            <w:pPr>
+              <w:spacing w:after="0" w:line="252"/>
+            </w:pPr>
+            <w:r>
+              <w:rPr>
+                <w:b/>
+                <w:bCs/>
+                <w:color w:val="FFFFFF"/>
+                <w:sz w:val="17"/>
+                <w:szCs w:val="17"/>
+              </w:rPr>
+              <w:t xml:space="preserve">C: Men and unisex</w:t>
+            </w:r>
+          </w:p>
+        </w:tc>
+      </w:tr>
+      <w:tr>
+        <w:trPr>
+          <w:cantSplit/>
+        </w:trPr>
+        <w:tc>
+          <w:tcPr>
+            <w:tcW w:type="dxa" w:w="1735"/>
+            <w:tcBorders>
+              <w:top w:val="single" w:color="C9CED2" w:sz="4"/>
+              <w:left w:val="single" w:color="C9CED2" w:sz="4"/>
+              <w:bottom w:val="single" w:color="C9CED2" w:sz="4"/>
+              <w:right w:val="single" w:color="C9CED2" w:sz="4"/>
+            </w:tcBorders>
+            <w:tcMar>
+              <w:top w:type="dxa" w:w="60"/>
+              <w:left w:type="dxa" w:w="90"/>
+              <w:bottom w:type="dxa" w:w="60"/>
+              <w:right w:type="dxa" w:w="90"/>
+            </w:tcMar>
+          </w:tcPr>
+          <w:p>
+            <w:pPr>
+              <w:spacing w:after="0" w:line="252"/>
+            </w:pPr>
+            <w:r>
+              <w:rPr>
+                <w:b/>
+                <w:bCs/>
+                <w:color w:val="1E2A32"/>
+                <w:sz w:val="17"/>
+                <w:szCs w:val="17"/>
+              </w:rPr>
+              <w:t xml:space="preserve">Profile</w:t>
+            </w:r>
+          </w:p>
+        </w:tc>
+        <w:tc>
+          <w:tcPr>
+            <w:tcW w:type="dxa" w:w="2891"/>
+            <w:tcBorders>
+              <w:top w:val="single" w:color="C9CED2" w:sz="4"/>
+              <w:left w:val="single" w:color="C9CED2" w:sz="4"/>
+              <w:bottom w:val="single" w:color="C9CED2" w:sz="4"/>
+              <w:right w:val="single" w:color="C9CED2" w:sz="4"/>
+            </w:tcBorders>
+            <w:tcMar>
+              <w:top w:type="dxa" w:w="60"/>
+              <w:left w:type="dxa" w:w="90"/>
+              <w:bottom w:type="dxa" w:w="60"/>
+              <w:right w:type="dxa" w:w="90"/>
+            </w:tcMar>
+          </w:tcPr>
+          <w:p>
+            <w:pPr>
+              <w:spacing w:after="0" w:line="252"/>
+            </w:pPr>
+            <w:r>
+              <w:rPr>
+                <w:b w:val="false"/>
+                <w:bCs w:val="false"/>
+                <w:color w:val="1E2A32"/>
+                <w:sz w:val="17"/>
+                <w:szCs w:val="17"/>
+              </w:rPr>
+              <w:t xml:space="preserve">Pilates, yoga, gym; daily Instagram and TikTok; older Gen Z and younger Millennials (Bryant, 2026a)</w:t>
+            </w:r>
+          </w:p>
+        </w:tc>
+        <w:tc>
+          <w:tcPr>
+            <w:tcW w:type="dxa" w:w="2506"/>
+            <w:tcBorders>
+              <w:top w:val="single" w:color="C9CED2" w:sz="4"/>
+              <w:left w:val="single" w:color="C9CED2" w:sz="4"/>
+              <w:bottom w:val="single" w:color="C9CED2" w:sz="4"/>
+              <w:right w:val="single" w:color="C9CED2" w:sz="4"/>
+            </w:tcBorders>
+            <w:tcMar>
+              <w:top w:type="dxa" w:w="60"/>
+              <w:left w:type="dxa" w:w="90"/>
+              <w:bottom w:type="dxa" w:w="60"/>
+              <w:right w:type="dxa" w:w="90"/>
+            </w:tcMar>
+          </w:tcPr>
+          <w:p>
+            <w:pPr>
+              <w:spacing w:after="0" w:line="252"/>
+            </w:pPr>
+            <w:r>
+              <w:rPr>
+                <w:b w:val="false"/>
+                <w:bCs w:val="false"/>
+                <w:color w:val="1E2A32"/>
+                <w:sz w:val="17"/>
+                <w:szCs w:val="17"/>
+              </w:rPr>
+              <w:t xml:space="preserve">Higher incomes; established routines</w:t>
+            </w:r>
+          </w:p>
+        </w:tc>
+        <w:tc>
+          <w:tcPr>
+            <w:tcW w:type="dxa" w:w="2506"/>
+            <w:tcBorders>
+              <w:top w:val="single" w:color="C9CED2" w:sz="4"/>
+              <w:left w:val="single" w:color="C9CED2" w:sz="4"/>
+              <w:bottom w:val="single" w:color="C9CED2" w:sz="4"/>
+              <w:right w:val="single" w:color="C9CED2" w:sz="4"/>
+            </w:tcBorders>
+            <w:tcMar>
+              <w:top w:type="dxa" w:w="60"/>
+              <w:left w:type="dxa" w:w="90"/>
+              <w:bottom w:type="dxa" w:w="60"/>
+              <w:right w:type="dxa" w:w="90"/>
+            </w:tcMar>
+          </w:tcPr>
+          <w:p>
+            <w:pPr>
+              <w:spacing w:after="0" w:line="252"/>
+            </w:pPr>
+            <w:r>
+              <w:rPr>
+                <w:b w:val="false"/>
+                <w:bCs w:val="false"/>
+                <w:color w:val="1E2A32"/>
+                <w:sz w:val="17"/>
+                <w:szCs w:val="17"/>
+              </w:rPr>
+              <w:t xml:space="preserve">Growing, but small in Alo's range</w:t>
+            </w:r>
+          </w:p>
+        </w:tc>
+      </w:tr>
+      <w:tr>
+        <w:trPr>
+          <w:cantSplit/>
+        </w:trPr>
+        <w:tc>
+          <w:tcPr>
+            <w:tcW w:type="dxa" w:w="1735"/>
+            <w:tcBorders>
+              <w:top w:val="single" w:color="C9CED2" w:sz="4"/>
+              <w:left w:val="single" w:color="C9CED2" w:sz="4"/>
+              <w:bottom w:val="single" w:color="C9CED2" w:sz="4"/>
+              <w:right w:val="single" w:color="C9CED2" w:sz="4"/>
+            </w:tcBorders>
+            <w:shd w:fill="F7F5F1" w:color="auto" w:val="clear"/>
+            <w:tcMar>
+              <w:top w:type="dxa" w:w="60"/>
+              <w:left w:type="dxa" w:w="90"/>
+              <w:bottom w:type="dxa" w:w="60"/>
+              <w:right w:type="dxa" w:w="90"/>
+            </w:tcMar>
+          </w:tcPr>
+          <w:p>
+            <w:pPr>
+              <w:spacing w:after="0" w:line="252"/>
+            </w:pPr>
+            <w:r>
+              <w:rPr>
+                <w:b/>
+                <w:bCs/>
+                <w:color w:val="1E2A32"/>
+                <w:sz w:val="17"/>
+                <w:szCs w:val="17"/>
+              </w:rPr>
+              <w:t xml:space="preserve">Accessible</w:t>
+            </w:r>
+          </w:p>
+        </w:tc>
+        <w:tc>
+          <w:tcPr>
+            <w:tcW w:type="dxa" w:w="2891"/>
+            <w:tcBorders>
+              <w:top w:val="single" w:color="C9CED2" w:sz="4"/>
+              <w:left w:val="single" w:color="C9CED2" w:sz="4"/>
+              <w:bottom w:val="single" w:color="C9CED2" w:sz="4"/>
+              <w:right w:val="single" w:color="C9CED2" w:sz="4"/>
+            </w:tcBorders>
+            <w:shd w:fill="F7F5F1" w:color="auto" w:val="clear"/>
+            <w:tcMar>
+              <w:top w:type="dxa" w:w="60"/>
+              <w:left w:type="dxa" w:w="90"/>
+              <w:bottom w:type="dxa" w:w="60"/>
+              <w:right w:type="dxa" w:w="90"/>
+            </w:tcMar>
+          </w:tcPr>
+          <w:p>
+            <w:pPr>
+              <w:spacing w:after="0" w:line="252"/>
+            </w:pPr>
+            <w:r>
+              <w:rPr>
+                <w:b w:val="false"/>
+                <w:bCs w:val="false"/>
+                <w:color w:val="1E2A32"/>
+                <w:sz w:val="17"/>
+                <w:szCs w:val="17"/>
+              </w:rPr>
+              <w:t xml:space="preserve">High: near Chatswood, CBD and Bondi stores; reachable through creators</w:t>
+            </w:r>
+          </w:p>
+        </w:tc>
+        <w:tc>
+          <w:tcPr>
+            <w:tcW w:type="dxa" w:w="2506"/>
+            <w:tcBorders>
+              <w:top w:val="single" w:color="C9CED2" w:sz="4"/>
+              <w:left w:val="single" w:color="C9CED2" w:sz="4"/>
+              <w:bottom w:val="single" w:color="C9CED2" w:sz="4"/>
+              <w:right w:val="single" w:color="C9CED2" w:sz="4"/>
+            </w:tcBorders>
+            <w:shd w:fill="F7F5F1" w:color="auto" w:val="clear"/>
+            <w:tcMar>
+              <w:top w:type="dxa" w:w="60"/>
+              <w:left w:type="dxa" w:w="90"/>
+              <w:bottom w:type="dxa" w:w="60"/>
+              <w:right w:type="dxa" w:w="90"/>
+            </w:tcMar>
+          </w:tcPr>
+          <w:p>
+            <w:pPr>
+              <w:spacing w:after="0" w:line="252"/>
+            </w:pPr>
+            <w:r>
+              <w:rPr>
+                <w:b w:val="false"/>
+                <w:bCs w:val="false"/>
+                <w:color w:val="1E2A32"/>
+                <w:sz w:val="17"/>
+                <w:szCs w:val="17"/>
+              </w:rPr>
+              <w:t xml:space="preserve">Medium</w:t>
+            </w:r>
+          </w:p>
+        </w:tc>
+        <w:tc>
+          <w:tcPr>
+            <w:tcW w:type="dxa" w:w="2506"/>
+            <w:tcBorders>
+              <w:top w:val="single" w:color="C9CED2" w:sz="4"/>
+              <w:left w:val="single" w:color="C9CED2" w:sz="4"/>
+              <w:bottom w:val="single" w:color="C9CED2" w:sz="4"/>
+              <w:right w:val="single" w:color="C9CED2" w:sz="4"/>
+            </w:tcBorders>
+            <w:shd w:fill="F7F5F1" w:color="auto" w:val="clear"/>
+            <w:tcMar>
+              <w:top w:type="dxa" w:w="60"/>
+              <w:left w:type="dxa" w:w="90"/>
+              <w:bottom w:type="dxa" w:w="60"/>
+              <w:right w:type="dxa" w:w="90"/>
+            </w:tcMar>
+          </w:tcPr>
+          <w:p>
+            <w:pPr>
+              <w:spacing w:after="0" w:line="252"/>
+            </w:pPr>
+            <w:r>
+              <w:rPr>
+                <w:b w:val="false"/>
+                <w:bCs w:val="false"/>
+                <w:color w:val="1E2A32"/>
+                <w:sz w:val="17"/>
+                <w:szCs w:val="17"/>
+              </w:rPr>
+              <w:t xml:space="preserve">Medium</w:t>
+            </w:r>
+          </w:p>
+        </w:tc>
+      </w:tr>
+      <w:tr>
+        <w:trPr>
+          <w:cantSplit/>
+        </w:trPr>
+        <w:tc>
+          <w:tcPr>
+            <w:tcW w:type="dxa" w:w="1735"/>
+            <w:tcBorders>
+              <w:top w:val="single" w:color="C9CED2" w:sz="4"/>
+              <w:left w:val="single" w:color="C9CED2" w:sz="4"/>
+              <w:bottom w:val="single" w:color="C9CED2" w:sz="4"/>
+              <w:right w:val="single" w:color="C9CED2" w:sz="4"/>
+            </w:tcBorders>
+            <w:tcMar>
+              <w:top w:type="dxa" w:w="60"/>
+              <w:left w:type="dxa" w:w="90"/>
+              <w:bottom w:type="dxa" w:w="60"/>
+              <w:right w:type="dxa" w:w="90"/>
+            </w:tcMar>
+          </w:tcPr>
+          <w:p>
+            <w:pPr>
+              <w:spacing w:after="0" w:line="252"/>
+            </w:pPr>
+            <w:r>
+              <w:rPr>
+                <w:b/>
+                <w:bCs/>
+                <w:color w:val="1E2A32"/>
+                <w:sz w:val="17"/>
+                <w:szCs w:val="17"/>
+              </w:rPr>
+              <w:t xml:space="preserve">Responsive</w:t>
+            </w:r>
+          </w:p>
+        </w:tc>
+        <w:tc>
+          <w:tcPr>
+            <w:tcW w:type="dxa" w:w="2891"/>
+            <w:tcBorders>
+              <w:top w:val="single" w:color="C9CED2" w:sz="4"/>
+              <w:left w:val="single" w:color="C9CED2" w:sz="4"/>
+              <w:bottom w:val="single" w:color="C9CED2" w:sz="4"/>
+              <w:right w:val="single" w:color="C9CED2" w:sz="4"/>
+            </w:tcBorders>
+            <w:tcMar>
+              <w:top w:type="dxa" w:w="60"/>
+              <w:left w:type="dxa" w:w="90"/>
+              <w:bottom w:type="dxa" w:w="60"/>
+              <w:right w:type="dxa" w:w="90"/>
+            </w:tcMar>
+          </w:tcPr>
+          <w:p>
+            <w:pPr>
+              <w:spacing w:after="0" w:line="252"/>
+            </w:pPr>
+            <w:r>
+              <w:rPr>
+                <w:b w:val="false"/>
+                <w:bCs w:val="false"/>
+                <w:color w:val="1E2A32"/>
+                <w:sz w:val="17"/>
+                <w:szCs w:val="17"/>
+              </w:rPr>
+              <w:t xml:space="preserve">High: identity-driven purchase (Belk, 1988)</w:t>
+            </w:r>
+          </w:p>
+        </w:tc>
+        <w:tc>
+          <w:tcPr>
+            <w:tcW w:type="dxa" w:w="2506"/>
+            <w:tcBorders>
+              <w:top w:val="single" w:color="C9CED2" w:sz="4"/>
+              <w:left w:val="single" w:color="C9CED2" w:sz="4"/>
+              <w:bottom w:val="single" w:color="C9CED2" w:sz="4"/>
+              <w:right w:val="single" w:color="C9CED2" w:sz="4"/>
+            </w:tcBorders>
+            <w:tcMar>
+              <w:top w:type="dxa" w:w="60"/>
+              <w:left w:type="dxa" w:w="90"/>
+              <w:bottom w:type="dxa" w:w="60"/>
+              <w:right w:type="dxa" w:w="90"/>
+            </w:tcMar>
+          </w:tcPr>
+          <w:p>
+            <w:pPr>
+              <w:spacing w:after="0" w:line="252"/>
+            </w:pPr>
+            <w:r>
+              <w:rPr>
+                <w:b w:val="false"/>
+                <w:bCs w:val="false"/>
+                <w:color w:val="1E2A32"/>
+                <w:sz w:val="17"/>
+                <w:szCs w:val="17"/>
+              </w:rPr>
+              <w:t xml:space="preserve">Low: loyal to Lululemon and Lorna Jane</w:t>
+            </w:r>
+          </w:p>
+        </w:tc>
+        <w:tc>
+          <w:tcPr>
+            <w:tcW w:type="dxa" w:w="2506"/>
+            <w:tcBorders>
+              <w:top w:val="single" w:color="C9CED2" w:sz="4"/>
+              <w:left w:val="single" w:color="C9CED2" w:sz="4"/>
+              <w:bottom w:val="single" w:color="C9CED2" w:sz="4"/>
+              <w:right w:val="single" w:color="C9CED2" w:sz="4"/>
+            </w:tcBorders>
+            <w:tcMar>
+              <w:top w:type="dxa" w:w="60"/>
+              <w:left w:type="dxa" w:w="90"/>
+              <w:bottom w:type="dxa" w:w="60"/>
+              <w:right w:type="dxa" w:w="90"/>
+            </w:tcMar>
+          </w:tcPr>
+          <w:p>
+            <w:pPr>
+              <w:spacing w:after="0" w:line="252"/>
+            </w:pPr>
+            <w:r>
+              <w:rPr>
+                <w:b w:val="false"/>
+                <w:bCs w:val="false"/>
+                <w:color w:val="1E2A32"/>
+                <w:sz w:val="17"/>
+                <w:szCs w:val="17"/>
+              </w:rPr>
+              <w:t xml:space="preserve">Medium</w:t>
+            </w:r>
+          </w:p>
+        </w:tc>
+      </w:tr>
+      <w:tr>
+        <w:trPr>
+          <w:cantSplit/>
+        </w:trPr>
+        <w:tc>
+          <w:tcPr>
+            <w:tcW w:type="dxa" w:w="1735"/>
+            <w:tcBorders>
+              <w:top w:val="single" w:color="C9CED2" w:sz="4"/>
+              <w:left w:val="single" w:color="C9CED2" w:sz="4"/>
+              <w:bottom w:val="single" w:color="C9CED2" w:sz="4"/>
+              <w:right w:val="single" w:color="C9CED2" w:sz="4"/>
+            </w:tcBorders>
+            <w:shd w:fill="F7F5F1" w:color="auto" w:val="clear"/>
+            <w:tcMar>
+              <w:top w:type="dxa" w:w="60"/>
+              <w:left w:type="dxa" w:w="90"/>
+              <w:bottom w:type="dxa" w:w="60"/>
+              <w:right w:type="dxa" w:w="90"/>
+            </w:tcMar>
+          </w:tcPr>
+          <w:p>
+            <w:pPr>
+              <w:spacing w:after="0" w:line="252"/>
+            </w:pPr>
+            <w:r>
+              <w:rPr>
+                <w:b/>
+                <w:bCs/>
+                <w:color w:val="1E2A32"/>
+                <w:sz w:val="17"/>
+                <w:szCs w:val="17"/>
+              </w:rPr>
+              <w:t xml:space="preserve">Fit with Alo</w:t>
+            </w:r>
+          </w:p>
+        </w:tc>
+        <w:tc>
+          <w:tcPr>
+            <w:tcW w:type="dxa" w:w="2891"/>
+            <w:tcBorders>
+              <w:top w:val="single" w:color="C9CED2" w:sz="4"/>
+              <w:left w:val="single" w:color="C9CED2" w:sz="4"/>
+              <w:bottom w:val="single" w:color="C9CED2" w:sz="4"/>
+              <w:right w:val="single" w:color="C9CED2" w:sz="4"/>
+            </w:tcBorders>
+            <w:shd w:fill="F7F5F1" w:color="auto" w:val="clear"/>
+            <w:tcMar>
+              <w:top w:type="dxa" w:w="60"/>
+              <w:left w:type="dxa" w:w="90"/>
+              <w:bottom w:type="dxa" w:w="60"/>
+              <w:right w:type="dxa" w:w="90"/>
+            </w:tcMar>
+          </w:tcPr>
+          <w:p>
+            <w:pPr>
+              <w:spacing w:after="0" w:line="252"/>
+            </w:pPr>
+            <w:r>
+              <w:rPr>
+                <w:b w:val="false"/>
+                <w:bCs w:val="false"/>
+                <w:color w:val="1E2A32"/>
+                <w:sz w:val="17"/>
+                <w:szCs w:val="17"/>
+              </w:rPr>
+              <w:t xml:space="preserve">High (36Kr, 2026)</w:t>
+            </w:r>
+          </w:p>
+        </w:tc>
+        <w:tc>
+          <w:tcPr>
+            <w:tcW w:type="dxa" w:w="2506"/>
+            <w:tcBorders>
+              <w:top w:val="single" w:color="C9CED2" w:sz="4"/>
+              <w:left w:val="single" w:color="C9CED2" w:sz="4"/>
+              <w:bottom w:val="single" w:color="C9CED2" w:sz="4"/>
+              <w:right w:val="single" w:color="C9CED2" w:sz="4"/>
+            </w:tcBorders>
+            <w:shd w:fill="F7F5F1" w:color="auto" w:val="clear"/>
+            <w:tcMar>
+              <w:top w:type="dxa" w:w="60"/>
+              <w:left w:type="dxa" w:w="90"/>
+              <w:bottom w:type="dxa" w:w="60"/>
+              <w:right w:type="dxa" w:w="90"/>
+            </w:tcMar>
+          </w:tcPr>
+          <w:p>
+            <w:pPr>
+              <w:spacing w:after="0" w:line="252"/>
+            </w:pPr>
+            <w:r>
+              <w:rPr>
+                <w:b w:val="false"/>
+                <w:bCs w:val="false"/>
+                <w:color w:val="1E2A32"/>
+                <w:sz w:val="17"/>
+                <w:szCs w:val="17"/>
+              </w:rPr>
+              <w:t xml:space="preserve">Medium</w:t>
+            </w:r>
+          </w:p>
+        </w:tc>
+        <w:tc>
+          <w:tcPr>
+            <w:tcW w:type="dxa" w:w="2506"/>
+            <w:tcBorders>
+              <w:top w:val="single" w:color="C9CED2" w:sz="4"/>
+              <w:left w:val="single" w:color="C9CED2" w:sz="4"/>
+              <w:bottom w:val="single" w:color="C9CED2" w:sz="4"/>
+              <w:right w:val="single" w:color="C9CED2" w:sz="4"/>
+            </w:tcBorders>
+            <w:shd w:fill="F7F5F1" w:color="auto" w:val="clear"/>
+            <w:tcMar>
+              <w:top w:type="dxa" w:w="60"/>
+              <w:left w:type="dxa" w:w="90"/>
+              <w:bottom w:type="dxa" w:w="60"/>
+              <w:right w:type="dxa" w:w="90"/>
+            </w:tcMar>
+          </w:tcPr>
+          <w:p>
+            <w:pPr>
+              <w:spacing w:after="0" w:line="252"/>
+            </w:pPr>
+            <w:r>
+              <w:rPr>
+                <w:b w:val="false"/>
+                <w:bCs w:val="false"/>
+                <w:color w:val="1E2A32"/>
+                <w:sz w:val="17"/>
+                <w:szCs w:val="17"/>
+              </w:rPr>
+              <w:t xml:space="preserve">Low–medium</w:t>
+            </w:r>
+          </w:p>
+        </w:tc>
+      </w:tr>
+      <w:tr>
+        <w:trPr>
+          <w:cantSplit/>
+        </w:trPr>
+        <w:tc>
+          <w:tcPr>
+            <w:tcW w:type="dxa" w:w="1735"/>
+            <w:tcBorders>
+              <w:top w:val="single" w:color="C9CED2" w:sz="4"/>
+              <w:left w:val="single" w:color="C9CED2" w:sz="4"/>
+              <w:bottom w:val="single" w:color="C9CED2" w:sz="4"/>
+              <w:right w:val="single" w:color="C9CED2" w:sz="4"/>
+            </w:tcBorders>
+            <w:tcMar>
+              <w:top w:type="dxa" w:w="60"/>
+              <w:left w:type="dxa" w:w="90"/>
+              <w:bottom w:type="dxa" w:w="60"/>
+              <w:right w:type="dxa" w:w="90"/>
+            </w:tcMar>
+          </w:tcPr>
+          <w:p>
+            <w:pPr>
+              <w:spacing w:after="0" w:line="252"/>
+            </w:pPr>
+            <w:r>
+              <w:rPr>
+                <w:b/>
+                <w:bCs/>
+                <w:color w:val="1E2A32"/>
+                <w:sz w:val="17"/>
+                <w:szCs w:val="17"/>
+              </w:rPr>
+              <w:t xml:space="preserve">Risk</w:t>
+            </w:r>
+          </w:p>
+        </w:tc>
+        <w:tc>
+          <w:tcPr>
+            <w:tcW w:type="dxa" w:w="2891"/>
+            <w:tcBorders>
+              <w:top w:val="single" w:color="C9CED2" w:sz="4"/>
+              <w:left w:val="single" w:color="C9CED2" w:sz="4"/>
+              <w:bottom w:val="single" w:color="C9CED2" w:sz="4"/>
+              <w:right w:val="single" w:color="C9CED2" w:sz="4"/>
+            </w:tcBorders>
+            <w:tcMar>
+              <w:top w:type="dxa" w:w="60"/>
+              <w:left w:type="dxa" w:w="90"/>
+              <w:bottom w:type="dxa" w:w="60"/>
+              <w:right w:type="dxa" w:w="90"/>
+            </w:tcMar>
+          </w:tcPr>
+          <w:p>
+            <w:pPr>
+              <w:spacing w:after="0" w:line="252"/>
+            </w:pPr>
+            <w:r>
+              <w:rPr>
+                <w:b w:val="false"/>
+                <w:bCs w:val="false"/>
+                <w:color w:val="1E2A32"/>
+                <w:sz w:val="17"/>
+                <w:szCs w:val="17"/>
+              </w:rPr>
+              <w:t xml:space="preserve">Financial pressure (Bryant, 2026a)</w:t>
+            </w:r>
+          </w:p>
+        </w:tc>
+        <w:tc>
+          <w:tcPr>
+            <w:tcW w:type="dxa" w:w="2506"/>
+            <w:tcBorders>
+              <w:top w:val="single" w:color="C9CED2" w:sz="4"/>
+              <w:left w:val="single" w:color="C9CED2" w:sz="4"/>
+              <w:bottom w:val="single" w:color="C9CED2" w:sz="4"/>
+              <w:right w:val="single" w:color="C9CED2" w:sz="4"/>
+            </w:tcBorders>
+            <w:tcMar>
+              <w:top w:type="dxa" w:w="60"/>
+              <w:left w:type="dxa" w:w="90"/>
+              <w:bottom w:type="dxa" w:w="60"/>
+              <w:right w:type="dxa" w:w="90"/>
+            </w:tcMar>
+          </w:tcPr>
+          <w:p>
+            <w:pPr>
+              <w:spacing w:after="0" w:line="252"/>
+            </w:pPr>
+            <w:r>
+              <w:rPr>
+                <w:b w:val="false"/>
+                <w:bCs w:val="false"/>
+                <w:color w:val="1E2A32"/>
+                <w:sz w:val="17"/>
+                <w:szCs w:val="17"/>
+              </w:rPr>
+              <w:t xml:space="preserve">Hard to switch</w:t>
+            </w:r>
+          </w:p>
+        </w:tc>
+        <w:tc>
+          <w:tcPr>
+            <w:tcW w:type="dxa" w:w="2506"/>
+            <w:tcBorders>
+              <w:top w:val="single" w:color="C9CED2" w:sz="4"/>
+              <w:left w:val="single" w:color="C9CED2" w:sz="4"/>
+              <w:bottom w:val="single" w:color="C9CED2" w:sz="4"/>
+              <w:right w:val="single" w:color="C9CED2" w:sz="4"/>
+            </w:tcBorders>
+            <w:tcMar>
+              <w:top w:type="dxa" w:w="60"/>
+              <w:left w:type="dxa" w:w="90"/>
+              <w:bottom w:type="dxa" w:w="60"/>
+              <w:right w:type="dxa" w:w="90"/>
+            </w:tcMar>
+          </w:tcPr>
+          <w:p>
+            <w:pPr>
+              <w:spacing w:after="0" w:line="252"/>
+            </w:pPr>
+            <w:r>
+              <w:rPr>
+                <w:b w:val="false"/>
+                <w:bCs w:val="false"/>
+                <w:color w:val="1E2A32"/>
+                <w:sz w:val="17"/>
+                <w:szCs w:val="17"/>
+              </w:rPr>
+              <w:t xml:space="preserve">Needs separate creative</w:t>
+            </w:r>
+          </w:p>
+        </w:tc>
+      </w:tr>
+      <w:tr>
+        <w:trPr>
+          <w:cantSplit/>
+        </w:trPr>
+        <w:tc>
+          <w:tcPr>
+            <w:tcW w:type="dxa" w:w="1735"/>
+            <w:tcBorders>
+              <w:top w:val="single" w:color="C9CED2" w:sz="4"/>
+              <w:left w:val="single" w:color="C9CED2" w:sz="4"/>
+              <w:bottom w:val="single" w:color="C9CED2" w:sz="4"/>
+              <w:right w:val="single" w:color="C9CED2" w:sz="4"/>
+            </w:tcBorders>
+            <w:shd w:fill="EFE7DA" w:color="auto" w:val="clear"/>
+            <w:tcMar>
+              <w:top w:type="dxa" w:w="60"/>
+              <w:left w:type="dxa" w:w="90"/>
+              <w:bottom w:type="dxa" w:w="60"/>
+              <w:right w:type="dxa" w:w="90"/>
+            </w:tcMar>
+          </w:tcPr>
+          <w:p>
+            <w:pPr>
+              <w:spacing w:after="0" w:line="252"/>
+            </w:pPr>
+            <w:r>
+              <w:rPr>
+                <w:b/>
+                <w:bCs/>
+                <w:color w:val="1E2A32"/>
+                <w:sz w:val="17"/>
+                <w:szCs w:val="17"/>
+              </w:rPr>
+              <w:t xml:space="preserve">Decision</w:t>
+            </w:r>
+          </w:p>
+        </w:tc>
+        <w:tc>
+          <w:tcPr>
+            <w:tcW w:type="dxa" w:w="2891"/>
+            <w:tcBorders>
+              <w:top w:val="single" w:color="C9CED2" w:sz="4"/>
+              <w:left w:val="single" w:color="C9CED2" w:sz="4"/>
+              <w:bottom w:val="single" w:color="C9CED2" w:sz="4"/>
+              <w:right w:val="single" w:color="C9CED2" w:sz="4"/>
+            </w:tcBorders>
+            <w:shd w:fill="EFE7DA" w:color="auto" w:val="clear"/>
+            <w:tcMar>
+              <w:top w:type="dxa" w:w="60"/>
+              <w:left w:type="dxa" w:w="90"/>
+              <w:bottom w:type="dxa" w:w="60"/>
+              <w:right w:type="dxa" w:w="90"/>
+            </w:tcMar>
+          </w:tcPr>
+          <w:p>
+            <w:pPr>
+              <w:spacing w:after="0" w:line="252"/>
+            </w:pPr>
+            <w:r>
+              <w:rPr>
+                <w:b/>
+                <w:bCs/>
+                <w:color w:val="1E2A32"/>
+                <w:sz w:val="17"/>
+                <w:szCs w:val="17"/>
+              </w:rPr>
+              <w:t xml:space="preserve">Primary target</w:t>
+            </w:r>
+          </w:p>
+        </w:tc>
+        <w:tc>
+          <w:tcPr>
+            <w:tcW w:type="dxa" w:w="2506"/>
+            <w:tcBorders>
+              <w:top w:val="single" w:color="C9CED2" w:sz="4"/>
+              <w:left w:val="single" w:color="C9CED2" w:sz="4"/>
+              <w:bottom w:val="single" w:color="C9CED2" w:sz="4"/>
+              <w:right w:val="single" w:color="C9CED2" w:sz="4"/>
+            </w:tcBorders>
+            <w:shd w:fill="EFE7DA" w:color="auto" w:val="clear"/>
+            <w:tcMar>
+              <w:top w:type="dxa" w:w="60"/>
+              <w:left w:type="dxa" w:w="90"/>
+              <w:bottom w:type="dxa" w:w="60"/>
+              <w:right w:type="dxa" w:w="90"/>
+            </w:tcMar>
+          </w:tcPr>
+          <w:p>
+            <w:pPr>
+              <w:spacing w:after="0" w:line="252"/>
+            </w:pPr>
+            <w:r>
+              <w:rPr>
+                <w:b/>
+                <w:bCs/>
+                <w:color w:val="1E2A32"/>
+                <w:sz w:val="17"/>
+                <w:szCs w:val="17"/>
+              </w:rPr>
+              <w:t xml:space="preserve">Welcome spillover via outdoor and audio</w:t>
+            </w:r>
+          </w:p>
+        </w:tc>
+        <w:tc>
+          <w:tcPr>
+            <w:tcW w:type="dxa" w:w="2506"/>
+            <w:tcBorders>
+              <w:top w:val="single" w:color="C9CED2" w:sz="4"/>
+              <w:left w:val="single" w:color="C9CED2" w:sz="4"/>
+              <w:bottom w:val="single" w:color="C9CED2" w:sz="4"/>
+              <w:right w:val="single" w:color="C9CED2" w:sz="4"/>
+            </w:tcBorders>
+            <w:shd w:fill="EFE7DA" w:color="auto" w:val="clear"/>
+            <w:tcMar>
+              <w:top w:type="dxa" w:w="60"/>
+              <w:left w:type="dxa" w:w="90"/>
+              <w:bottom w:type="dxa" w:w="60"/>
+              <w:right w:type="dxa" w:w="90"/>
+            </w:tcMar>
+          </w:tcPr>
+          <w:p>
+            <w:pPr>
+              <w:spacing w:after="0" w:line="252"/>
+            </w:pPr>
+            <w:r>
+              <w:rPr>
+                <w:b/>
+                <w:bCs/>
+                <w:color w:val="1E2A32"/>
+                <w:sz w:val="17"/>
+                <w:szCs w:val="17"/>
+              </w:rPr>
+              <w:t xml:space="preserve">Not targeted in this phase</w:t>
+            </w:r>
+          </w:p>
+        </w:tc>
+      </w:tr>
+    </w:tbl>
+    <w:p>
+      <w:pPr>
+        <w:spacing w:after="160"/>
+      </w:pPr>
+    </w:p>
+    <w:p>
+      <w:r>
+        <w:br w:type="page"/>
+      </w:r>
+    </w:p>
+    <w:p>
+      <w:pPr>
+        <w:pStyle w:val="Heading1"/>
+      </w:pPr>
+      <w:r>
+        <w:t xml:space="preserve">Appendix C: Standardisation Versus Localisation</w:t>
+      </w:r>
+    </w:p>
+    <w:p>
+      <w:pPr>
+        <w:keepNext/>
+        <w:spacing w:after="40" w:before="200"/>
+      </w:pPr>
+      <w:r>
+        <w:rPr>
+          <w:b/>
+          <w:bCs/>
+        </w:rPr>
+        <w:t xml:space="preserve">Table C1</w:t>
+      </w:r>
+    </w:p>
+    <w:p>
+      <w:pPr>
+        <w:keepNext/>
+        <w:spacing w:after="100"/>
+      </w:pPr>
+      <w:r>
+        <w:rPr>
+          <w:i/>
+          <w:iCs/>
+        </w:rPr>
+        <w:t xml:space="preserve">Standardisation Versus Localisation Governance for the Australian Launch</w:t>
+      </w:r>
+    </w:p>
+    <w:tbl>
+      <w:tblPr>
+        <w:tblW w:type="dxa" w:w="9638"/>
+        <w:tblBorders>
+          <w:top w:val="single" w:color="auto" w:sz="4"/>
+          <w:left w:val="single" w:color="auto" w:sz="4"/>
+          <w:bottom w:val="single" w:color="auto" w:sz="4"/>
+          <w:right w:val="single" w:color="auto" w:sz="4"/>
+          <w:insideH w:val="single" w:color="auto" w:sz="4"/>
+          <w:insideV w:val="single" w:color="auto" w:sz="4"/>
+        </w:tblBorders>
+      </w:tblPr>
+      <w:tblGrid>
+        <w:gridCol w:w="1928"/>
+        <w:gridCol w:w="3855"/>
+        <w:gridCol w:w="3855"/>
+      </w:tblGrid>
+      <w:tr>
+        <w:trPr>
+          <w:tblHeader/>
+        </w:trPr>
+        <w:tc>
+          <w:tcPr>
+            <w:tcW w:type="dxa" w:w="1928"/>
+            <w:tcBorders>
+              <w:top w:val="single" w:color="C9CED2" w:sz="4"/>
+              <w:left w:val="single" w:color="C9CED2" w:sz="4"/>
+              <w:bottom w:val="single" w:color="C9CED2" w:sz="4"/>
+              <w:right w:val="single" w:color="C9CED2" w:sz="4"/>
+            </w:tcBorders>
+            <w:shd w:fill="1E2A32" w:color="auto" w:val="clear"/>
+            <w:tcMar>
+              <w:top w:type="dxa" w:w="60"/>
+              <w:left w:type="dxa" w:w="90"/>
+              <w:bottom w:type="dxa" w:w="60"/>
+              <w:right w:type="dxa" w:w="90"/>
+            </w:tcMar>
+          </w:tcPr>
+          <w:p>
+            <w:pPr>
+              <w:spacing w:after="0" w:line="252"/>
+            </w:pPr>
+            <w:r>
+              <w:rPr>
+                <w:b/>
+                <w:bCs/>
+                <w:color w:val="FFFFFF"/>
+                <w:sz w:val="17"/>
+                <w:szCs w:val="17"/>
+              </w:rPr>
+              <w:t xml:space="preserve">Element</w:t>
+            </w:r>
+          </w:p>
+        </w:tc>
+        <w:tc>
+          <w:tcPr>
+            <w:tcW w:type="dxa" w:w="3855"/>
+            <w:tcBorders>
+              <w:top w:val="single" w:color="C9CED2" w:sz="4"/>
+              <w:left w:val="single" w:color="C9CED2" w:sz="4"/>
+              <w:bottom w:val="single" w:color="C9CED2" w:sz="4"/>
+              <w:right w:val="single" w:color="C9CED2" w:sz="4"/>
+            </w:tcBorders>
+            <w:shd w:fill="1E2A32" w:color="auto" w:val="clear"/>
+            <w:tcMar>
+              <w:top w:type="dxa" w:w="60"/>
+              <w:left w:type="dxa" w:w="90"/>
+              <w:bottom w:type="dxa" w:w="60"/>
+              <w:right w:type="dxa" w:w="90"/>
+            </w:tcMar>
+          </w:tcPr>
+          <w:p>
+            <w:pPr>
+              <w:spacing w:after="0" w:line="252"/>
+            </w:pPr>
+            <w:r>
+              <w:rPr>
+                <w:b/>
+                <w:bCs/>
+                <w:color w:val="FFFFFF"/>
+                <w:sz w:val="17"/>
+                <w:szCs w:val="17"/>
+              </w:rPr>
+              <w:t xml:space="preserve">Standardised (Alo global)</w:t>
+            </w:r>
+          </w:p>
+        </w:tc>
+        <w:tc>
+          <w:tcPr>
+            <w:tcW w:type="dxa" w:w="3855"/>
+            <w:tcBorders>
+              <w:top w:val="single" w:color="C9CED2" w:sz="4"/>
+              <w:left w:val="single" w:color="C9CED2" w:sz="4"/>
+              <w:bottom w:val="single" w:color="C9CED2" w:sz="4"/>
+              <w:right w:val="single" w:color="C9CED2" w:sz="4"/>
+            </w:tcBorders>
+            <w:shd w:fill="1E2A32" w:color="auto" w:val="clear"/>
+            <w:tcMar>
+              <w:top w:type="dxa" w:w="60"/>
+              <w:left w:type="dxa" w:w="90"/>
+              <w:bottom w:type="dxa" w:w="60"/>
+              <w:right w:type="dxa" w:w="90"/>
+            </w:tcMar>
+          </w:tcPr>
+          <w:p>
+            <w:pPr>
+              <w:spacing w:after="0" w:line="252"/>
+            </w:pPr>
+            <w:r>
+              <w:rPr>
+                <w:b/>
+                <w:bCs/>
+                <w:color w:val="FFFFFF"/>
+                <w:sz w:val="17"/>
+                <w:szCs w:val="17"/>
+              </w:rPr>
+              <w:t xml:space="preserve">Localised (Sydney)</w:t>
+            </w:r>
+          </w:p>
+        </w:tc>
+      </w:tr>
+      <w:tr>
+        <w:trPr>
+          <w:cantSplit/>
+        </w:trPr>
+        <w:tc>
+          <w:tcPr>
+            <w:tcW w:type="dxa" w:w="1928"/>
+            <w:tcBorders>
+              <w:top w:val="single" w:color="C9CED2" w:sz="4"/>
+              <w:left w:val="single" w:color="C9CED2" w:sz="4"/>
+              <w:bottom w:val="single" w:color="C9CED2" w:sz="4"/>
+              <w:right w:val="single" w:color="C9CED2" w:sz="4"/>
+            </w:tcBorders>
+            <w:tcMar>
+              <w:top w:type="dxa" w:w="60"/>
+              <w:left w:type="dxa" w:w="90"/>
+              <w:bottom w:type="dxa" w:w="60"/>
+              <w:right w:type="dxa" w:w="90"/>
+            </w:tcMar>
+          </w:tcPr>
+          <w:p>
+            <w:pPr>
+              <w:spacing w:after="0" w:line="252"/>
+            </w:pPr>
+            <w:r>
+              <w:rPr>
+                <w:b/>
+                <w:bCs/>
+                <w:color w:val="1E2A32"/>
+                <w:sz w:val="17"/>
+                <w:szCs w:val="17"/>
+              </w:rPr>
+              <w:t xml:space="preserve">Brand identity and assets</w:t>
+            </w:r>
+          </w:p>
+        </w:tc>
+        <w:tc>
+          <w:tcPr>
+            <w:tcW w:type="dxa" w:w="3855"/>
+            <w:tcBorders>
+              <w:top w:val="single" w:color="C9CED2" w:sz="4"/>
+              <w:left w:val="single" w:color="C9CED2" w:sz="4"/>
+              <w:bottom w:val="single" w:color="C9CED2" w:sz="4"/>
+              <w:right w:val="single" w:color="C9CED2" w:sz="4"/>
+            </w:tcBorders>
+            <w:tcMar>
+              <w:top w:type="dxa" w:w="60"/>
+              <w:left w:type="dxa" w:w="90"/>
+              <w:bottom w:type="dxa" w:w="60"/>
+              <w:right w:type="dxa" w:w="90"/>
+            </w:tcMar>
+          </w:tcPr>
+          <w:p>
+            <w:pPr>
+              <w:spacing w:after="0" w:line="252"/>
+            </w:pPr>
+            <w:r>
+              <w:rPr>
+                <w:b w:val="false"/>
+                <w:bCs w:val="false"/>
+                <w:color w:val="1E2A32"/>
+                <w:sz w:val="17"/>
+                <w:szCs w:val="17"/>
+              </w:rPr>
+              <w:t xml:space="preserve">Logo, neutral palette, studio aesthetic, typography</w:t>
+            </w:r>
+          </w:p>
+        </w:tc>
+        <w:tc>
+          <w:tcPr>
+            <w:tcW w:type="dxa" w:w="3855"/>
+            <w:tcBorders>
+              <w:top w:val="single" w:color="C9CED2" w:sz="4"/>
+              <w:left w:val="single" w:color="C9CED2" w:sz="4"/>
+              <w:bottom w:val="single" w:color="C9CED2" w:sz="4"/>
+              <w:right w:val="single" w:color="C9CED2" w:sz="4"/>
+            </w:tcBorders>
+            <w:tcMar>
+              <w:top w:type="dxa" w:w="60"/>
+              <w:left w:type="dxa" w:w="90"/>
+              <w:bottom w:type="dxa" w:w="60"/>
+              <w:right w:type="dxa" w:w="90"/>
+            </w:tcMar>
+          </w:tcPr>
+          <w:p>
+            <w:pPr>
+              <w:spacing w:after="0" w:line="252"/>
+            </w:pPr>
+            <w:r>
+              <w:rPr>
+                <w:b w:val="false"/>
+                <w:bCs w:val="false"/>
+                <w:color w:val="1E2A32"/>
+                <w:sz w:val="17"/>
+                <w:szCs w:val="17"/>
+              </w:rPr>
+              <w:t xml:space="preserve">—</w:t>
+            </w:r>
+          </w:p>
+        </w:tc>
+      </w:tr>
+      <w:tr>
+        <w:trPr>
+          <w:cantSplit/>
+        </w:trPr>
+        <w:tc>
+          <w:tcPr>
+            <w:tcW w:type="dxa" w:w="1928"/>
+            <w:tcBorders>
+              <w:top w:val="single" w:color="C9CED2" w:sz="4"/>
+              <w:left w:val="single" w:color="C9CED2" w:sz="4"/>
+              <w:bottom w:val="single" w:color="C9CED2" w:sz="4"/>
+              <w:right w:val="single" w:color="C9CED2" w:sz="4"/>
+            </w:tcBorders>
+            <w:shd w:fill="F7F5F1" w:color="auto" w:val="clear"/>
+            <w:tcMar>
+              <w:top w:type="dxa" w:w="60"/>
+              <w:left w:type="dxa" w:w="90"/>
+              <w:bottom w:type="dxa" w:w="60"/>
+              <w:right w:type="dxa" w:w="90"/>
+            </w:tcMar>
+          </w:tcPr>
+          <w:p>
+            <w:pPr>
+              <w:spacing w:after="0" w:line="252"/>
+            </w:pPr>
+            <w:r>
+              <w:rPr>
+                <w:b/>
+                <w:bCs/>
+                <w:color w:val="1E2A32"/>
+                <w:sz w:val="17"/>
+                <w:szCs w:val="17"/>
+              </w:rPr>
+              <w:t xml:space="preserve">Positioning</w:t>
+            </w:r>
+          </w:p>
+        </w:tc>
+        <w:tc>
+          <w:tcPr>
+            <w:tcW w:type="dxa" w:w="3855"/>
+            <w:tcBorders>
+              <w:top w:val="single" w:color="C9CED2" w:sz="4"/>
+              <w:left w:val="single" w:color="C9CED2" w:sz="4"/>
+              <w:bottom w:val="single" w:color="C9CED2" w:sz="4"/>
+              <w:right w:val="single" w:color="C9CED2" w:sz="4"/>
+            </w:tcBorders>
+            <w:shd w:fill="F7F5F1" w:color="auto" w:val="clear"/>
+            <w:tcMar>
+              <w:top w:type="dxa" w:w="60"/>
+              <w:left w:type="dxa" w:w="90"/>
+              <w:bottom w:type="dxa" w:w="60"/>
+              <w:right w:type="dxa" w:w="90"/>
+            </w:tcMar>
+          </w:tcPr>
+          <w:p>
+            <w:pPr>
+              <w:spacing w:after="0" w:line="252"/>
+            </w:pPr>
+            <w:r>
+              <w:rPr>
+                <w:b w:val="false"/>
+                <w:bCs w:val="false"/>
+                <w:color w:val="1E2A32"/>
+                <w:sz w:val="17"/>
+                <w:szCs w:val="17"/>
+              </w:rPr>
+              <w:t xml:space="preserve">Premium, design-led activewear</w:t>
+            </w:r>
+          </w:p>
+        </w:tc>
+        <w:tc>
+          <w:tcPr>
+            <w:tcW w:type="dxa" w:w="3855"/>
+            <w:tcBorders>
+              <w:top w:val="single" w:color="C9CED2" w:sz="4"/>
+              <w:left w:val="single" w:color="C9CED2" w:sz="4"/>
+              <w:bottom w:val="single" w:color="C9CED2" w:sz="4"/>
+              <w:right w:val="single" w:color="C9CED2" w:sz="4"/>
+            </w:tcBorders>
+            <w:shd w:fill="F7F5F1" w:color="auto" w:val="clear"/>
+            <w:tcMar>
+              <w:top w:type="dxa" w:w="60"/>
+              <w:left w:type="dxa" w:w="90"/>
+              <w:bottom w:type="dxa" w:w="60"/>
+              <w:right w:type="dxa" w:w="90"/>
+            </w:tcMar>
+          </w:tcPr>
+          <w:p>
+            <w:pPr>
+              <w:spacing w:after="0" w:line="252"/>
+            </w:pPr>
+            <w:r>
+              <w:rPr>
+                <w:b w:val="false"/>
+                <w:bCs w:val="false"/>
+                <w:color w:val="1E2A32"/>
+                <w:sz w:val="17"/>
+                <w:szCs w:val="17"/>
+              </w:rPr>
+              <w:t xml:space="preserve">Expressed as "Mat to Moment": studio to street in a Sydney day</w:t>
+            </w:r>
+          </w:p>
+        </w:tc>
+      </w:tr>
+      <w:tr>
+        <w:trPr>
+          <w:cantSplit/>
+        </w:trPr>
+        <w:tc>
+          <w:tcPr>
+            <w:tcW w:type="dxa" w:w="1928"/>
+            <w:tcBorders>
+              <w:top w:val="single" w:color="C9CED2" w:sz="4"/>
+              <w:left w:val="single" w:color="C9CED2" w:sz="4"/>
+              <w:bottom w:val="single" w:color="C9CED2" w:sz="4"/>
+              <w:right w:val="single" w:color="C9CED2" w:sz="4"/>
+            </w:tcBorders>
+            <w:tcMar>
+              <w:top w:type="dxa" w:w="60"/>
+              <w:left w:type="dxa" w:w="90"/>
+              <w:bottom w:type="dxa" w:w="60"/>
+              <w:right w:type="dxa" w:w="90"/>
+            </w:tcMar>
+          </w:tcPr>
+          <w:p>
+            <w:pPr>
+              <w:spacing w:after="0" w:line="252"/>
+            </w:pPr>
+            <w:r>
+              <w:rPr>
+                <w:b/>
+                <w:bCs/>
+                <w:color w:val="1E2A32"/>
+                <w:sz w:val="17"/>
+                <w:szCs w:val="17"/>
+              </w:rPr>
+              <w:t xml:space="preserve">Sources</w:t>
+            </w:r>
+          </w:p>
+        </w:tc>
+        <w:tc>
+          <w:tcPr>
+            <w:tcW w:type="dxa" w:w="3855"/>
+            <w:tcBorders>
+              <w:top w:val="single" w:color="C9CED2" w:sz="4"/>
+              <w:left w:val="single" w:color="C9CED2" w:sz="4"/>
+              <w:bottom w:val="single" w:color="C9CED2" w:sz="4"/>
+              <w:right w:val="single" w:color="C9CED2" w:sz="4"/>
+            </w:tcBorders>
+            <w:tcMar>
+              <w:top w:type="dxa" w:w="60"/>
+              <w:left w:type="dxa" w:w="90"/>
+              <w:bottom w:type="dxa" w:w="60"/>
+              <w:right w:type="dxa" w:w="90"/>
+            </w:tcMar>
+          </w:tcPr>
+          <w:p>
+            <w:pPr>
+              <w:spacing w:after="0" w:line="252"/>
+            </w:pPr>
+            <w:r>
+              <w:rPr>
+                <w:b w:val="false"/>
+                <w:bCs w:val="false"/>
+                <w:color w:val="1E2A32"/>
+                <w:sz w:val="17"/>
+                <w:szCs w:val="17"/>
+              </w:rPr>
+              <w:t xml:space="preserve">No celebrity ambassadors in this launch phase</w:t>
+            </w:r>
+          </w:p>
+        </w:tc>
+        <w:tc>
+          <w:tcPr>
+            <w:tcW w:type="dxa" w:w="3855"/>
+            <w:tcBorders>
+              <w:top w:val="single" w:color="C9CED2" w:sz="4"/>
+              <w:left w:val="single" w:color="C9CED2" w:sz="4"/>
+              <w:bottom w:val="single" w:color="C9CED2" w:sz="4"/>
+              <w:right w:val="single" w:color="C9CED2" w:sz="4"/>
+            </w:tcBorders>
+            <w:tcMar>
+              <w:top w:type="dxa" w:w="60"/>
+              <w:left w:type="dxa" w:w="90"/>
+              <w:bottom w:type="dxa" w:w="60"/>
+              <w:right w:type="dxa" w:w="90"/>
+            </w:tcMar>
+          </w:tcPr>
+          <w:p>
+            <w:pPr>
+              <w:spacing w:after="0" w:line="252"/>
+            </w:pPr>
+            <w:r>
+              <w:rPr>
+                <w:b w:val="false"/>
+                <w:bCs w:val="false"/>
+                <w:color w:val="1E2A32"/>
+                <w:sz w:val="17"/>
+                <w:szCs w:val="17"/>
+              </w:rPr>
+              <w:t xml:space="preserve">Sydney instructors, micro-creators, one macro creator</w:t>
+            </w:r>
+          </w:p>
+        </w:tc>
+      </w:tr>
+      <w:tr>
+        <w:trPr>
+          <w:cantSplit/>
+        </w:trPr>
+        <w:tc>
+          <w:tcPr>
+            <w:tcW w:type="dxa" w:w="1928"/>
+            <w:tcBorders>
+              <w:top w:val="single" w:color="C9CED2" w:sz="4"/>
+              <w:left w:val="single" w:color="C9CED2" w:sz="4"/>
+              <w:bottom w:val="single" w:color="C9CED2" w:sz="4"/>
+              <w:right w:val="single" w:color="C9CED2" w:sz="4"/>
+            </w:tcBorders>
+            <w:shd w:fill="F7F5F1" w:color="auto" w:val="clear"/>
+            <w:tcMar>
+              <w:top w:type="dxa" w:w="60"/>
+              <w:left w:type="dxa" w:w="90"/>
+              <w:bottom w:type="dxa" w:w="60"/>
+              <w:right w:type="dxa" w:w="90"/>
+            </w:tcMar>
+          </w:tcPr>
+          <w:p>
+            <w:pPr>
+              <w:spacing w:after="0" w:line="252"/>
+            </w:pPr>
+            <w:r>
+              <w:rPr>
+                <w:b/>
+                <w:bCs/>
+                <w:color w:val="1E2A32"/>
+                <w:sz w:val="17"/>
+                <w:szCs w:val="17"/>
+              </w:rPr>
+              <w:t xml:space="preserve">Settings and stories</w:t>
+            </w:r>
+          </w:p>
+        </w:tc>
+        <w:tc>
+          <w:tcPr>
+            <w:tcW w:type="dxa" w:w="3855"/>
+            <w:tcBorders>
+              <w:top w:val="single" w:color="C9CED2" w:sz="4"/>
+              <w:left w:val="single" w:color="C9CED2" w:sz="4"/>
+              <w:bottom w:val="single" w:color="C9CED2" w:sz="4"/>
+              <w:right w:val="single" w:color="C9CED2" w:sz="4"/>
+            </w:tcBorders>
+            <w:shd w:fill="F7F5F1" w:color="auto" w:val="clear"/>
+            <w:tcMar>
+              <w:top w:type="dxa" w:w="60"/>
+              <w:left w:type="dxa" w:w="90"/>
+              <w:bottom w:type="dxa" w:w="60"/>
+              <w:right w:type="dxa" w:w="90"/>
+            </w:tcMar>
+          </w:tcPr>
+          <w:p>
+            <w:pPr>
+              <w:spacing w:after="0" w:line="252"/>
+            </w:pPr>
+            <w:r>
+              <w:rPr>
+                <w:b w:val="false"/>
+                <w:bCs w:val="false"/>
+                <w:color w:val="1E2A32"/>
+                <w:sz w:val="17"/>
+                <w:szCs w:val="17"/>
+              </w:rPr>
+              <w:t xml:space="preserve">—</w:t>
+            </w:r>
+          </w:p>
+        </w:tc>
+        <w:tc>
+          <w:tcPr>
+            <w:tcW w:type="dxa" w:w="3855"/>
+            <w:tcBorders>
+              <w:top w:val="single" w:color="C9CED2" w:sz="4"/>
+              <w:left w:val="single" w:color="C9CED2" w:sz="4"/>
+              <w:bottom w:val="single" w:color="C9CED2" w:sz="4"/>
+              <w:right w:val="single" w:color="C9CED2" w:sz="4"/>
+            </w:tcBorders>
+            <w:shd w:fill="F7F5F1" w:color="auto" w:val="clear"/>
+            <w:tcMar>
+              <w:top w:type="dxa" w:w="60"/>
+              <w:left w:type="dxa" w:w="90"/>
+              <w:bottom w:type="dxa" w:w="60"/>
+              <w:right w:type="dxa" w:w="90"/>
+            </w:tcMar>
+          </w:tcPr>
+          <w:p>
+            <w:pPr>
+              <w:spacing w:after="0" w:line="252"/>
+            </w:pPr>
+            <w:r>
+              <w:rPr>
+                <w:b w:val="false"/>
+                <w:bCs w:val="false"/>
+                <w:color w:val="1E2A32"/>
+                <w:sz w:val="17"/>
+                <w:szCs w:val="17"/>
+              </w:rPr>
+              <w:t xml:space="preserve">Bondi studio, neighbourhood café, Bondi-to-Bronte walk</w:t>
+            </w:r>
+          </w:p>
+        </w:tc>
+      </w:tr>
+      <w:tr>
+        <w:trPr>
+          <w:cantSplit/>
+        </w:trPr>
+        <w:tc>
+          <w:tcPr>
+            <w:tcW w:type="dxa" w:w="1928"/>
+            <w:tcBorders>
+              <w:top w:val="single" w:color="C9CED2" w:sz="4"/>
+              <w:left w:val="single" w:color="C9CED2" w:sz="4"/>
+              <w:bottom w:val="single" w:color="C9CED2" w:sz="4"/>
+              <w:right w:val="single" w:color="C9CED2" w:sz="4"/>
+            </w:tcBorders>
+            <w:tcMar>
+              <w:top w:type="dxa" w:w="60"/>
+              <w:left w:type="dxa" w:w="90"/>
+              <w:bottom w:type="dxa" w:w="60"/>
+              <w:right w:type="dxa" w:w="90"/>
+            </w:tcMar>
+          </w:tcPr>
+          <w:p>
+            <w:pPr>
+              <w:spacing w:after="0" w:line="252"/>
+            </w:pPr>
+            <w:r>
+              <w:rPr>
+                <w:b/>
+                <w:bCs/>
+                <w:color w:val="1E2A32"/>
+                <w:sz w:val="17"/>
+                <w:szCs w:val="17"/>
+              </w:rPr>
+              <w:t xml:space="preserve">Partnerships</w:t>
+            </w:r>
+          </w:p>
+        </w:tc>
+        <w:tc>
+          <w:tcPr>
+            <w:tcW w:type="dxa" w:w="3855"/>
+            <w:tcBorders>
+              <w:top w:val="single" w:color="C9CED2" w:sz="4"/>
+              <w:left w:val="single" w:color="C9CED2" w:sz="4"/>
+              <w:bottom w:val="single" w:color="C9CED2" w:sz="4"/>
+              <w:right w:val="single" w:color="C9CED2" w:sz="4"/>
+            </w:tcBorders>
+            <w:tcMar>
+              <w:top w:type="dxa" w:w="60"/>
+              <w:left w:type="dxa" w:w="90"/>
+              <w:bottom w:type="dxa" w:w="60"/>
+              <w:right w:type="dxa" w:w="90"/>
+            </w:tcMar>
+          </w:tcPr>
+          <w:p>
+            <w:pPr>
+              <w:spacing w:after="0" w:line="252"/>
+            </w:pPr>
+            <w:r>
+              <w:rPr>
+                <w:b w:val="false"/>
+                <w:bCs w:val="false"/>
+                <w:color w:val="1E2A32"/>
+                <w:sz w:val="17"/>
+                <w:szCs w:val="17"/>
+              </w:rPr>
+              <w:t xml:space="preserve">—</w:t>
+            </w:r>
+          </w:p>
+        </w:tc>
+        <w:tc>
+          <w:tcPr>
+            <w:tcW w:type="dxa" w:w="3855"/>
+            <w:tcBorders>
+              <w:top w:val="single" w:color="C9CED2" w:sz="4"/>
+              <w:left w:val="single" w:color="C9CED2" w:sz="4"/>
+              <w:bottom w:val="single" w:color="C9CED2" w:sz="4"/>
+              <w:right w:val="single" w:color="C9CED2" w:sz="4"/>
+            </w:tcBorders>
+            <w:tcMar>
+              <w:top w:type="dxa" w:w="60"/>
+              <w:left w:type="dxa" w:w="90"/>
+              <w:bottom w:type="dxa" w:w="60"/>
+              <w:right w:type="dxa" w:w="90"/>
+            </w:tcMar>
+          </w:tcPr>
+          <w:p>
+            <w:pPr>
+              <w:spacing w:after="0" w:line="252"/>
+            </w:pPr>
+            <w:r>
+              <w:rPr>
+                <w:b w:val="false"/>
+                <w:bCs w:val="false"/>
+                <w:color w:val="1E2A32"/>
+                <w:sz w:val="17"/>
+                <w:szCs w:val="17"/>
+              </w:rPr>
+              <w:t xml:space="preserve">Body by Berner and partner studios near each store</w:t>
+            </w:r>
+          </w:p>
+        </w:tc>
+      </w:tr>
+      <w:tr>
+        <w:trPr>
+          <w:cantSplit/>
+        </w:trPr>
+        <w:tc>
+          <w:tcPr>
+            <w:tcW w:type="dxa" w:w="1928"/>
+            <w:tcBorders>
+              <w:top w:val="single" w:color="C9CED2" w:sz="4"/>
+              <w:left w:val="single" w:color="C9CED2" w:sz="4"/>
+              <w:bottom w:val="single" w:color="C9CED2" w:sz="4"/>
+              <w:right w:val="single" w:color="C9CED2" w:sz="4"/>
+            </w:tcBorders>
+            <w:shd w:fill="F7F5F1" w:color="auto" w:val="clear"/>
+            <w:tcMar>
+              <w:top w:type="dxa" w:w="60"/>
+              <w:left w:type="dxa" w:w="90"/>
+              <w:bottom w:type="dxa" w:w="60"/>
+              <w:right w:type="dxa" w:w="90"/>
+            </w:tcMar>
+          </w:tcPr>
+          <w:p>
+            <w:pPr>
+              <w:spacing w:after="0" w:line="252"/>
+            </w:pPr>
+            <w:r>
+              <w:rPr>
+                <w:b/>
+                <w:bCs/>
+                <w:color w:val="1E2A32"/>
+                <w:sz w:val="17"/>
+                <w:szCs w:val="17"/>
+              </w:rPr>
+              <w:t xml:space="preserve">Offers</w:t>
+            </w:r>
+          </w:p>
+        </w:tc>
+        <w:tc>
+          <w:tcPr>
+            <w:tcW w:type="dxa" w:w="3855"/>
+            <w:tcBorders>
+              <w:top w:val="single" w:color="C9CED2" w:sz="4"/>
+              <w:left w:val="single" w:color="C9CED2" w:sz="4"/>
+              <w:bottom w:val="single" w:color="C9CED2" w:sz="4"/>
+              <w:right w:val="single" w:color="C9CED2" w:sz="4"/>
+            </w:tcBorders>
+            <w:shd w:fill="F7F5F1" w:color="auto" w:val="clear"/>
+            <w:tcMar>
+              <w:top w:type="dxa" w:w="60"/>
+              <w:left w:type="dxa" w:w="90"/>
+              <w:bottom w:type="dxa" w:w="60"/>
+              <w:right w:type="dxa" w:w="90"/>
+            </w:tcMar>
+          </w:tcPr>
+          <w:p>
+            <w:pPr>
+              <w:spacing w:after="0" w:line="252"/>
+            </w:pPr>
+            <w:r>
+              <w:rPr>
+                <w:b w:val="false"/>
+                <w:bCs w:val="false"/>
+                <w:color w:val="1E2A32"/>
+                <w:sz w:val="17"/>
+                <w:szCs w:val="17"/>
+              </w:rPr>
+              <w:t xml:space="preserve">No discounting (protects premium)</w:t>
+            </w:r>
+          </w:p>
+        </w:tc>
+        <w:tc>
+          <w:tcPr>
+            <w:tcW w:type="dxa" w:w="3855"/>
+            <w:tcBorders>
+              <w:top w:val="single" w:color="C9CED2" w:sz="4"/>
+              <w:left w:val="single" w:color="C9CED2" w:sz="4"/>
+              <w:bottom w:val="single" w:color="C9CED2" w:sz="4"/>
+              <w:right w:val="single" w:color="C9CED2" w:sz="4"/>
+            </w:tcBorders>
+            <w:shd w:fill="F7F5F1" w:color="auto" w:val="clear"/>
+            <w:tcMar>
+              <w:top w:type="dxa" w:w="60"/>
+              <w:left w:type="dxa" w:w="90"/>
+              <w:bottom w:type="dxa" w:w="60"/>
+              <w:right w:type="dxa" w:w="90"/>
+            </w:tcMar>
+          </w:tcPr>
+          <w:p>
+            <w:pPr>
+              <w:spacing w:after="0" w:line="252"/>
+            </w:pPr>
+            <w:r>
+              <w:rPr>
+                <w:b w:val="false"/>
+                <w:bCs w:val="false"/>
+                <w:color w:val="1E2A32"/>
+                <w:sz w:val="17"/>
+                <w:szCs w:val="17"/>
+              </w:rPr>
+              <w:t xml:space="preserve">Styling appointments and early access to new drops</w:t>
+            </w:r>
+          </w:p>
+        </w:tc>
+      </w:tr>
+      <w:tr>
+        <w:trPr>
+          <w:cantSplit/>
+        </w:trPr>
+        <w:tc>
+          <w:tcPr>
+            <w:tcW w:type="dxa" w:w="1928"/>
+            <w:tcBorders>
+              <w:top w:val="single" w:color="C9CED2" w:sz="4"/>
+              <w:left w:val="single" w:color="C9CED2" w:sz="4"/>
+              <w:bottom w:val="single" w:color="C9CED2" w:sz="4"/>
+              <w:right w:val="single" w:color="C9CED2" w:sz="4"/>
+            </w:tcBorders>
+            <w:tcMar>
+              <w:top w:type="dxa" w:w="60"/>
+              <w:left w:type="dxa" w:w="90"/>
+              <w:bottom w:type="dxa" w:w="60"/>
+              <w:right w:type="dxa" w:w="90"/>
+            </w:tcMar>
+          </w:tcPr>
+          <w:p>
+            <w:pPr>
+              <w:spacing w:after="0" w:line="252"/>
+            </w:pPr>
+            <w:r>
+              <w:rPr>
+                <w:b/>
+                <w:bCs/>
+                <w:color w:val="1E2A32"/>
+                <w:sz w:val="17"/>
+                <w:szCs w:val="17"/>
+              </w:rPr>
+              <w:t xml:space="preserve">Media</w:t>
+            </w:r>
+          </w:p>
+        </w:tc>
+        <w:tc>
+          <w:tcPr>
+            <w:tcW w:type="dxa" w:w="3855"/>
+            <w:tcBorders>
+              <w:top w:val="single" w:color="C9CED2" w:sz="4"/>
+              <w:left w:val="single" w:color="C9CED2" w:sz="4"/>
+              <w:bottom w:val="single" w:color="C9CED2" w:sz="4"/>
+              <w:right w:val="single" w:color="C9CED2" w:sz="4"/>
+            </w:tcBorders>
+            <w:tcMar>
+              <w:top w:type="dxa" w:w="60"/>
+              <w:left w:type="dxa" w:w="90"/>
+              <w:bottom w:type="dxa" w:w="60"/>
+              <w:right w:type="dxa" w:w="90"/>
+            </w:tcMar>
+          </w:tcPr>
+          <w:p>
+            <w:pPr>
+              <w:spacing w:after="0" w:line="252"/>
+            </w:pPr>
+            <w:r>
+              <w:rPr>
+                <w:b w:val="false"/>
+                <w:bCs w:val="false"/>
+                <w:color w:val="1E2A32"/>
+                <w:sz w:val="17"/>
+                <w:szCs w:val="17"/>
+              </w:rPr>
+              <w:t xml:space="preserve">—</w:t>
+            </w:r>
+          </w:p>
+        </w:tc>
+        <w:tc>
+          <w:tcPr>
+            <w:tcW w:type="dxa" w:w="3855"/>
+            <w:tcBorders>
+              <w:top w:val="single" w:color="C9CED2" w:sz="4"/>
+              <w:left w:val="single" w:color="C9CED2" w:sz="4"/>
+              <w:bottom w:val="single" w:color="C9CED2" w:sz="4"/>
+              <w:right w:val="single" w:color="C9CED2" w:sz="4"/>
+            </w:tcBorders>
+            <w:tcMar>
+              <w:top w:type="dxa" w:w="60"/>
+              <w:left w:type="dxa" w:w="90"/>
+              <w:bottom w:type="dxa" w:w="60"/>
+              <w:right w:type="dxa" w:w="90"/>
+            </w:tcMar>
+          </w:tcPr>
+          <w:p>
+            <w:pPr>
+              <w:spacing w:after="0" w:line="252"/>
+            </w:pPr>
+            <w:r>
+              <w:rPr>
+                <w:b w:val="false"/>
+                <w:bCs w:val="false"/>
+                <w:color w:val="1E2A32"/>
+                <w:sz w:val="17"/>
+                <w:szCs w:val="17"/>
+              </w:rPr>
+              <w:t xml:space="preserve">Store-catchment outdoor, geo-targeted social, Greater Sydney audio</w:t>
+            </w:r>
+          </w:p>
+        </w:tc>
+      </w:tr>
+    </w:tbl>
+    <w:p>
+      <w:pPr>
+        <w:spacing w:after="240" w:before="60"/>
+      </w:pPr>
+      <w:r>
+        <w:rPr>
+          <w:i/>
+          <w:iCs/>
+          <w:color w:val="5B6770"/>
+          <w:sz w:val="19"/>
+          <w:szCs w:val="19"/>
+        </w:rPr>
+        <w:t xml:space="preserve">Note. </w:t>
+      </w:r>
+      <w:r>
+        <w:rPr>
+          <w:color w:val="5B6770"/>
+          <w:sz w:val="19"/>
+          <w:szCs w:val="19"/>
+        </w:rPr>
+        <w:t xml:space="preserve">Governance split adapted from Bryant (2026l).</w:t>
+      </w:r>
+    </w:p>
+    <w:p>
+      <w:r>
+        <w:br w:type="page"/>
+      </w:r>
+    </w:p>
+    <w:p>
+      <w:pPr>
+        <w:pStyle w:val="Heading1"/>
+      </w:pPr>
+      <w:r>
+        <w:t xml:space="preserve">Appendix D: Divergence and Relevance Assessment</w:t>
+      </w:r>
+    </w:p>
+    <w:p>
+      <w:pPr>
+        <w:keepNext/>
+        <w:spacing w:after="40" w:before="200"/>
+      </w:pPr>
+      <w:r>
+        <w:rPr>
+          <w:b/>
+          <w:bCs/>
+        </w:rPr>
+        <w:t xml:space="preserve">Table D1</w:t>
+      </w:r>
+    </w:p>
+    <w:p>
+      <w:pPr>
+        <w:keepNext/>
+        <w:spacing w:after="100"/>
+      </w:pPr>
+      <w:r>
+        <w:rPr>
+          <w:i/>
+          <w:iCs/>
+        </w:rPr>
+        <w:t xml:space="preserve">Divergence and Relevance Applied to One Set, One Day</w:t>
+      </w:r>
+    </w:p>
+    <w:tbl>
+      <w:tblPr>
+        <w:tblW w:type="dxa" w:w="9638"/>
+        <w:tblBorders>
+          <w:top w:val="single" w:color="auto" w:sz="4"/>
+          <w:left w:val="single" w:color="auto" w:sz="4"/>
+          <w:bottom w:val="single" w:color="auto" w:sz="4"/>
+          <w:right w:val="single" w:color="auto" w:sz="4"/>
+          <w:insideH w:val="single" w:color="auto" w:sz="4"/>
+          <w:insideV w:val="single" w:color="auto" w:sz="4"/>
+        </w:tblBorders>
+      </w:tblPr>
+      <w:tblGrid>
+        <w:gridCol w:w="2313"/>
+        <w:gridCol w:w="7325"/>
+      </w:tblGrid>
+      <w:tr>
+        <w:trPr>
+          <w:tblHeader/>
+        </w:trPr>
+        <w:tc>
+          <w:tcPr>
+            <w:tcW w:type="dxa" w:w="2313"/>
+            <w:tcBorders>
+              <w:top w:val="single" w:color="C9CED2" w:sz="4"/>
+              <w:left w:val="single" w:color="C9CED2" w:sz="4"/>
+              <w:bottom w:val="single" w:color="C9CED2" w:sz="4"/>
+              <w:right w:val="single" w:color="C9CED2" w:sz="4"/>
+            </w:tcBorders>
+            <w:shd w:fill="1E2A32" w:color="auto" w:val="clear"/>
+            <w:tcMar>
+              <w:top w:type="dxa" w:w="60"/>
+              <w:left w:type="dxa" w:w="90"/>
+              <w:bottom w:type="dxa" w:w="60"/>
+              <w:right w:type="dxa" w:w="90"/>
+            </w:tcMar>
+          </w:tcPr>
+          <w:p>
+            <w:pPr>
+              <w:spacing w:after="0" w:line="252"/>
+            </w:pPr>
+            <w:r>
+              <w:rPr>
+                <w:b/>
+                <w:bCs/>
+                <w:color w:val="FFFFFF"/>
+                <w:sz w:val="17"/>
+                <w:szCs w:val="17"/>
+              </w:rPr>
+              <w:t xml:space="preserve">Dimension</w:t>
+            </w:r>
+          </w:p>
+        </w:tc>
+        <w:tc>
+          <w:tcPr>
+            <w:tcW w:type="dxa" w:w="7325"/>
+            <w:tcBorders>
+              <w:top w:val="single" w:color="C9CED2" w:sz="4"/>
+              <w:left w:val="single" w:color="C9CED2" w:sz="4"/>
+              <w:bottom w:val="single" w:color="C9CED2" w:sz="4"/>
+              <w:right w:val="single" w:color="C9CED2" w:sz="4"/>
+            </w:tcBorders>
+            <w:shd w:fill="1E2A32" w:color="auto" w:val="clear"/>
+            <w:tcMar>
+              <w:top w:type="dxa" w:w="60"/>
+              <w:left w:type="dxa" w:w="90"/>
+              <w:bottom w:type="dxa" w:w="60"/>
+              <w:right w:type="dxa" w:w="90"/>
+            </w:tcMar>
+          </w:tcPr>
+          <w:p>
+            <w:pPr>
+              <w:spacing w:after="0" w:line="252"/>
+            </w:pPr>
+            <w:r>
+              <w:rPr>
+                <w:b/>
+                <w:bCs/>
+                <w:color w:val="FFFFFF"/>
+                <w:sz w:val="17"/>
+                <w:szCs w:val="17"/>
+              </w:rPr>
+              <w:t xml:space="preserve">Evidence in the campaign</w:t>
+            </w:r>
+          </w:p>
+        </w:tc>
+      </w:tr>
+      <w:tr>
+        <w:tc>
+          <w:tcPr>
+            <w:tcW w:type="dxa" w:w="9638"/>
+            <w:gridSpan w:val="2"/>
+            <w:tcBorders>
+              <w:top w:val="single" w:color="C9CED2" w:sz="4"/>
+              <w:left w:val="single" w:color="C9CED2" w:sz="4"/>
+              <w:bottom w:val="single" w:color="C9CED2" w:sz="4"/>
+              <w:right w:val="single" w:color="C9CED2" w:sz="4"/>
+            </w:tcBorders>
+            <w:shd w:fill="EFE7DA" w:color="auto" w:val="clear"/>
+            <w:tcMar>
+              <w:top w:type="dxa" w:w="50"/>
+              <w:left w:type="dxa" w:w="90"/>
+              <w:bottom w:type="dxa" w:w="50"/>
+              <w:right w:type="dxa" w:w="90"/>
+            </w:tcMar>
+          </w:tcPr>
+          <w:p>
+            <w:pPr>
+              <w:spacing w:after="0"/>
+            </w:pPr>
+            <w:r>
+              <w:rPr>
+                <w:b/>
+                <w:bCs/>
+                <w:sz w:val="17"/>
+                <w:szCs w:val="17"/>
+              </w:rPr>
+              <w:t xml:space="preserve">Divergence</w:t>
+            </w:r>
+          </w:p>
+        </w:tc>
+      </w:tr>
+      <w:tr>
+        <w:trPr>
+          <w:cantSplit/>
+        </w:trPr>
+        <w:tc>
+          <w:tcPr>
+            <w:tcW w:type="dxa" w:w="2313"/>
+            <w:tcBorders>
+              <w:top w:val="single" w:color="C9CED2" w:sz="4"/>
+              <w:left w:val="single" w:color="C9CED2" w:sz="4"/>
+              <w:bottom w:val="single" w:color="C9CED2" w:sz="4"/>
+              <w:right w:val="single" w:color="C9CED2" w:sz="4"/>
+            </w:tcBorders>
+            <w:shd w:fill="F7F5F1" w:color="auto" w:val="clear"/>
+            <w:tcMar>
+              <w:top w:type="dxa" w:w="60"/>
+              <w:left w:type="dxa" w:w="90"/>
+              <w:bottom w:type="dxa" w:w="60"/>
+              <w:right w:type="dxa" w:w="90"/>
+            </w:tcMar>
+          </w:tcPr>
+          <w:p>
+            <w:pPr>
+              <w:spacing w:after="0" w:line="252"/>
+            </w:pPr>
+            <w:r>
+              <w:rPr>
+                <w:b/>
+                <w:bCs/>
+                <w:color w:val="1E2A32"/>
+                <w:sz w:val="17"/>
+                <w:szCs w:val="17"/>
+              </w:rPr>
+              <w:t xml:space="preserve">Originality</w:t>
+            </w:r>
+          </w:p>
+        </w:tc>
+        <w:tc>
+          <w:tcPr>
+            <w:tcW w:type="dxa" w:w="7325"/>
+            <w:tcBorders>
+              <w:top w:val="single" w:color="C9CED2" w:sz="4"/>
+              <w:left w:val="single" w:color="C9CED2" w:sz="4"/>
+              <w:bottom w:val="single" w:color="C9CED2" w:sz="4"/>
+              <w:right w:val="single" w:color="C9CED2" w:sz="4"/>
+            </w:tcBorders>
+            <w:shd w:fill="F7F5F1" w:color="auto" w:val="clear"/>
+            <w:tcMar>
+              <w:top w:type="dxa" w:w="60"/>
+              <w:left w:type="dxa" w:w="90"/>
+              <w:bottom w:type="dxa" w:w="60"/>
+              <w:right w:type="dxa" w:w="90"/>
+            </w:tcMar>
+          </w:tcPr>
+          <w:p>
+            <w:pPr>
+              <w:spacing w:after="0" w:line="252"/>
+            </w:pPr>
+            <w:r>
+              <w:rPr>
+                <w:b w:val="false"/>
+                <w:bCs w:val="false"/>
+                <w:color w:val="1E2A32"/>
+                <w:sz w:val="17"/>
+                <w:szCs w:val="17"/>
+              </w:rPr>
+              <w:t xml:space="preserve">Shows quiet post-class moments, not the category's sweat-and-intensity convention</w:t>
+            </w:r>
+          </w:p>
+        </w:tc>
+      </w:tr>
+      <w:tr>
+        <w:trPr>
+          <w:cantSplit/>
+        </w:trPr>
+        <w:tc>
+          <w:tcPr>
+            <w:tcW w:type="dxa" w:w="2313"/>
+            <w:tcBorders>
+              <w:top w:val="single" w:color="C9CED2" w:sz="4"/>
+              <w:left w:val="single" w:color="C9CED2" w:sz="4"/>
+              <w:bottom w:val="single" w:color="C9CED2" w:sz="4"/>
+              <w:right w:val="single" w:color="C9CED2" w:sz="4"/>
+            </w:tcBorders>
+            <w:tcMar>
+              <w:top w:type="dxa" w:w="60"/>
+              <w:left w:type="dxa" w:w="90"/>
+              <w:bottom w:type="dxa" w:w="60"/>
+              <w:right w:type="dxa" w:w="90"/>
+            </w:tcMar>
+          </w:tcPr>
+          <w:p>
+            <w:pPr>
+              <w:spacing w:after="0" w:line="252"/>
+            </w:pPr>
+            <w:r>
+              <w:rPr>
+                <w:b/>
+                <w:bCs/>
+                <w:color w:val="1E2A32"/>
+                <w:sz w:val="17"/>
+                <w:szCs w:val="17"/>
+              </w:rPr>
+              <w:t xml:space="preserve">Flexibility</w:t>
+            </w:r>
+          </w:p>
+        </w:tc>
+        <w:tc>
+          <w:tcPr>
+            <w:tcW w:type="dxa" w:w="7325"/>
+            <w:tcBorders>
+              <w:top w:val="single" w:color="C9CED2" w:sz="4"/>
+              <w:left w:val="single" w:color="C9CED2" w:sz="4"/>
+              <w:bottom w:val="single" w:color="C9CED2" w:sz="4"/>
+              <w:right w:val="single" w:color="C9CED2" w:sz="4"/>
+            </w:tcBorders>
+            <w:tcMar>
+              <w:top w:type="dxa" w:w="60"/>
+              <w:left w:type="dxa" w:w="90"/>
+              <w:bottom w:type="dxa" w:w="60"/>
+              <w:right w:type="dxa" w:w="90"/>
+            </w:tcMar>
+          </w:tcPr>
+          <w:p>
+            <w:pPr>
+              <w:spacing w:after="0" w:line="252"/>
+            </w:pPr>
+            <w:r>
+              <w:rPr>
+                <w:b w:val="false"/>
+                <w:bCs w:val="false"/>
+                <w:color w:val="1E2A32"/>
+                <w:sz w:val="17"/>
+                <w:szCs w:val="17"/>
+              </w:rPr>
+              <w:t xml:space="preserve">One idea works as film, still, audio, outdoor and live session</w:t>
+            </w:r>
+          </w:p>
+        </w:tc>
+      </w:tr>
+      <w:tr>
+        <w:trPr>
+          <w:cantSplit/>
+        </w:trPr>
+        <w:tc>
+          <w:tcPr>
+            <w:tcW w:type="dxa" w:w="2313"/>
+            <w:tcBorders>
+              <w:top w:val="single" w:color="C9CED2" w:sz="4"/>
+              <w:left w:val="single" w:color="C9CED2" w:sz="4"/>
+              <w:bottom w:val="single" w:color="C9CED2" w:sz="4"/>
+              <w:right w:val="single" w:color="C9CED2" w:sz="4"/>
+            </w:tcBorders>
+            <w:shd w:fill="F7F5F1" w:color="auto" w:val="clear"/>
+            <w:tcMar>
+              <w:top w:type="dxa" w:w="60"/>
+              <w:left w:type="dxa" w:w="90"/>
+              <w:bottom w:type="dxa" w:w="60"/>
+              <w:right w:type="dxa" w:w="90"/>
+            </w:tcMar>
+          </w:tcPr>
+          <w:p>
+            <w:pPr>
+              <w:spacing w:after="0" w:line="252"/>
+            </w:pPr>
+            <w:r>
+              <w:rPr>
+                <w:b/>
+                <w:bCs/>
+                <w:color w:val="1E2A32"/>
+                <w:sz w:val="17"/>
+                <w:szCs w:val="17"/>
+              </w:rPr>
+              <w:t xml:space="preserve">Synthesis</w:t>
+            </w:r>
+          </w:p>
+        </w:tc>
+        <w:tc>
+          <w:tcPr>
+            <w:tcW w:type="dxa" w:w="7325"/>
+            <w:tcBorders>
+              <w:top w:val="single" w:color="C9CED2" w:sz="4"/>
+              <w:left w:val="single" w:color="C9CED2" w:sz="4"/>
+              <w:bottom w:val="single" w:color="C9CED2" w:sz="4"/>
+              <w:right w:val="single" w:color="C9CED2" w:sz="4"/>
+            </w:tcBorders>
+            <w:shd w:fill="F7F5F1" w:color="auto" w:val="clear"/>
+            <w:tcMar>
+              <w:top w:type="dxa" w:w="60"/>
+              <w:left w:type="dxa" w:w="90"/>
+              <w:bottom w:type="dxa" w:w="60"/>
+              <w:right w:type="dxa" w:w="90"/>
+            </w:tcMar>
+          </w:tcPr>
+          <w:p>
+            <w:pPr>
+              <w:spacing w:after="0" w:line="252"/>
+            </w:pPr>
+            <w:r>
+              <w:rPr>
+                <w:b w:val="false"/>
+                <w:bCs w:val="false"/>
+                <w:color w:val="1E2A32"/>
+                <w:sz w:val="17"/>
+                <w:szCs w:val="17"/>
+              </w:rPr>
+              <w:t xml:space="preserve">Links two unrelated worlds, the reformer and the café, through one garment</w:t>
+            </w:r>
+          </w:p>
+        </w:tc>
+      </w:tr>
+      <w:tr>
+        <w:trPr>
+          <w:cantSplit/>
+        </w:trPr>
+        <w:tc>
+          <w:tcPr>
+            <w:tcW w:type="dxa" w:w="2313"/>
+            <w:tcBorders>
+              <w:top w:val="single" w:color="C9CED2" w:sz="4"/>
+              <w:left w:val="single" w:color="C9CED2" w:sz="4"/>
+              <w:bottom w:val="single" w:color="C9CED2" w:sz="4"/>
+              <w:right w:val="single" w:color="C9CED2" w:sz="4"/>
+            </w:tcBorders>
+            <w:tcMar>
+              <w:top w:type="dxa" w:w="60"/>
+              <w:left w:type="dxa" w:w="90"/>
+              <w:bottom w:type="dxa" w:w="60"/>
+              <w:right w:type="dxa" w:w="90"/>
+            </w:tcMar>
+          </w:tcPr>
+          <w:p>
+            <w:pPr>
+              <w:spacing w:after="0" w:line="252"/>
+            </w:pPr>
+            <w:r>
+              <w:rPr>
+                <w:b/>
+                <w:bCs/>
+                <w:color w:val="1E2A32"/>
+                <w:sz w:val="17"/>
+                <w:szCs w:val="17"/>
+              </w:rPr>
+              <w:t xml:space="preserve">Elaboration</w:t>
+            </w:r>
+          </w:p>
+        </w:tc>
+        <w:tc>
+          <w:tcPr>
+            <w:tcW w:type="dxa" w:w="7325"/>
+            <w:tcBorders>
+              <w:top w:val="single" w:color="C9CED2" w:sz="4"/>
+              <w:left w:val="single" w:color="C9CED2" w:sz="4"/>
+              <w:bottom w:val="single" w:color="C9CED2" w:sz="4"/>
+              <w:right w:val="single" w:color="C9CED2" w:sz="4"/>
+            </w:tcBorders>
+            <w:tcMar>
+              <w:top w:type="dxa" w:w="60"/>
+              <w:left w:type="dxa" w:w="90"/>
+              <w:bottom w:type="dxa" w:w="60"/>
+              <w:right w:type="dxa" w:w="90"/>
+            </w:tcMar>
+          </w:tcPr>
+          <w:p>
+            <w:pPr>
+              <w:spacing w:after="0" w:line="252"/>
+            </w:pPr>
+            <w:r>
+              <w:rPr>
+                <w:b w:val="false"/>
+                <w:bCs w:val="false"/>
+                <w:color w:val="1E2A32"/>
+                <w:sz w:val="17"/>
+                <w:szCs w:val="17"/>
+              </w:rPr>
+              <w:t xml:space="preserve">Timestamps, sound cues and styling details reward repeat viewing</w:t>
+            </w:r>
+          </w:p>
+        </w:tc>
+      </w:tr>
+      <w:tr>
+        <w:trPr>
+          <w:cantSplit/>
+        </w:trPr>
+        <w:tc>
+          <w:tcPr>
+            <w:tcW w:type="dxa" w:w="2313"/>
+            <w:tcBorders>
+              <w:top w:val="single" w:color="C9CED2" w:sz="4"/>
+              <w:left w:val="single" w:color="C9CED2" w:sz="4"/>
+              <w:bottom w:val="single" w:color="C9CED2" w:sz="4"/>
+              <w:right w:val="single" w:color="C9CED2" w:sz="4"/>
+            </w:tcBorders>
+            <w:shd w:fill="F7F5F1" w:color="auto" w:val="clear"/>
+            <w:tcMar>
+              <w:top w:type="dxa" w:w="60"/>
+              <w:left w:type="dxa" w:w="90"/>
+              <w:bottom w:type="dxa" w:w="60"/>
+              <w:right w:type="dxa" w:w="90"/>
+            </w:tcMar>
+          </w:tcPr>
+          <w:p>
+            <w:pPr>
+              <w:spacing w:after="0" w:line="252"/>
+            </w:pPr>
+            <w:r>
+              <w:rPr>
+                <w:b/>
+                <w:bCs/>
+                <w:color w:val="1E2A32"/>
+                <w:sz w:val="17"/>
+                <w:szCs w:val="17"/>
+              </w:rPr>
+              <w:t xml:space="preserve">Artistic value</w:t>
+            </w:r>
+          </w:p>
+        </w:tc>
+        <w:tc>
+          <w:tcPr>
+            <w:tcW w:type="dxa" w:w="7325"/>
+            <w:tcBorders>
+              <w:top w:val="single" w:color="C9CED2" w:sz="4"/>
+              <w:left w:val="single" w:color="C9CED2" w:sz="4"/>
+              <w:bottom w:val="single" w:color="C9CED2" w:sz="4"/>
+              <w:right w:val="single" w:color="C9CED2" w:sz="4"/>
+            </w:tcBorders>
+            <w:shd w:fill="F7F5F1" w:color="auto" w:val="clear"/>
+            <w:tcMar>
+              <w:top w:type="dxa" w:w="60"/>
+              <w:left w:type="dxa" w:w="90"/>
+              <w:bottom w:type="dxa" w:w="60"/>
+              <w:right w:type="dxa" w:w="90"/>
+            </w:tcMar>
+          </w:tcPr>
+          <w:p>
+            <w:pPr>
+              <w:spacing w:after="0" w:line="252"/>
+            </w:pPr>
+            <w:r>
+              <w:rPr>
+                <w:b w:val="false"/>
+                <w:bCs w:val="false"/>
+                <w:color w:val="1E2A32"/>
+                <w:sz w:val="17"/>
+                <w:szCs w:val="17"/>
+              </w:rPr>
+              <w:t xml:space="preserve">Natural light and restrained art direction suit a premium brand</w:t>
+            </w:r>
+          </w:p>
+        </w:tc>
+      </w:tr>
+      <w:tr>
+        <w:tc>
+          <w:tcPr>
+            <w:tcW w:type="dxa" w:w="9638"/>
+            <w:gridSpan w:val="2"/>
+            <w:tcBorders>
+              <w:top w:val="single" w:color="C9CED2" w:sz="4"/>
+              <w:left w:val="single" w:color="C9CED2" w:sz="4"/>
+              <w:bottom w:val="single" w:color="C9CED2" w:sz="4"/>
+              <w:right w:val="single" w:color="C9CED2" w:sz="4"/>
+            </w:tcBorders>
+            <w:shd w:fill="EFE7DA" w:color="auto" w:val="clear"/>
+            <w:tcMar>
+              <w:top w:type="dxa" w:w="50"/>
+              <w:left w:type="dxa" w:w="90"/>
+              <w:bottom w:type="dxa" w:w="50"/>
+              <w:right w:type="dxa" w:w="90"/>
+            </w:tcMar>
+          </w:tcPr>
+          <w:p>
+            <w:pPr>
+              <w:spacing w:after="0"/>
+            </w:pPr>
+            <w:r>
+              <w:rPr>
+                <w:b/>
+                <w:bCs/>
+                <w:sz w:val="17"/>
+                <w:szCs w:val="17"/>
+              </w:rPr>
+              <w:t xml:space="preserve">Relevance</w:t>
+            </w:r>
+          </w:p>
+        </w:tc>
+      </w:tr>
+      <w:tr>
+        <w:trPr>
+          <w:cantSplit/>
+        </w:trPr>
+        <w:tc>
+          <w:tcPr>
+            <w:tcW w:type="dxa" w:w="2313"/>
+            <w:tcBorders>
+              <w:top w:val="single" w:color="C9CED2" w:sz="4"/>
+              <w:left w:val="single" w:color="C9CED2" w:sz="4"/>
+              <w:bottom w:val="single" w:color="C9CED2" w:sz="4"/>
+              <w:right w:val="single" w:color="C9CED2" w:sz="4"/>
+            </w:tcBorders>
+            <w:shd w:fill="F7F5F1" w:color="auto" w:val="clear"/>
+            <w:tcMar>
+              <w:top w:type="dxa" w:w="60"/>
+              <w:left w:type="dxa" w:w="90"/>
+              <w:bottom w:type="dxa" w:w="60"/>
+              <w:right w:type="dxa" w:w="90"/>
+            </w:tcMar>
+          </w:tcPr>
+          <w:p>
+            <w:pPr>
+              <w:spacing w:after="0" w:line="252"/>
+            </w:pPr>
+            <w:r>
+              <w:rPr>
+                <w:b/>
+                <w:bCs/>
+                <w:color w:val="1E2A32"/>
+                <w:sz w:val="17"/>
+                <w:szCs w:val="17"/>
+              </w:rPr>
+              <w:t xml:space="preserve">Meaningfulness</w:t>
+            </w:r>
+          </w:p>
+        </w:tc>
+        <w:tc>
+          <w:tcPr>
+            <w:tcW w:type="dxa" w:w="7325"/>
+            <w:tcBorders>
+              <w:top w:val="single" w:color="C9CED2" w:sz="4"/>
+              <w:left w:val="single" w:color="C9CED2" w:sz="4"/>
+              <w:bottom w:val="single" w:color="C9CED2" w:sz="4"/>
+              <w:right w:val="single" w:color="C9CED2" w:sz="4"/>
+            </w:tcBorders>
+            <w:shd w:fill="F7F5F1" w:color="auto" w:val="clear"/>
+            <w:tcMar>
+              <w:top w:type="dxa" w:w="60"/>
+              <w:left w:type="dxa" w:w="90"/>
+              <w:bottom w:type="dxa" w:w="60"/>
+              <w:right w:type="dxa" w:w="90"/>
+            </w:tcMar>
+          </w:tcPr>
+          <w:p>
+            <w:pPr>
+              <w:spacing w:after="0" w:line="252"/>
+            </w:pPr>
+            <w:r>
+              <w:rPr>
+                <w:b w:val="false"/>
+                <w:bCs w:val="false"/>
+                <w:color w:val="1E2A32"/>
+                <w:sz w:val="17"/>
+                <w:szCs w:val="17"/>
+              </w:rPr>
+              <w:t xml:space="preserve">Mirrors Segment A's real routine and its "after class" problem</w:t>
+            </w:r>
+          </w:p>
+        </w:tc>
+      </w:tr>
+      <w:tr>
+        <w:trPr>
+          <w:cantSplit/>
+        </w:trPr>
+        <w:tc>
+          <w:tcPr>
+            <w:tcW w:type="dxa" w:w="2313"/>
+            <w:tcBorders>
+              <w:top w:val="single" w:color="C9CED2" w:sz="4"/>
+              <w:left w:val="single" w:color="C9CED2" w:sz="4"/>
+              <w:bottom w:val="single" w:color="C9CED2" w:sz="4"/>
+              <w:right w:val="single" w:color="C9CED2" w:sz="4"/>
+            </w:tcBorders>
+            <w:tcMar>
+              <w:top w:type="dxa" w:w="60"/>
+              <w:left w:type="dxa" w:w="90"/>
+              <w:bottom w:type="dxa" w:w="60"/>
+              <w:right w:type="dxa" w:w="90"/>
+            </w:tcMar>
+          </w:tcPr>
+          <w:p>
+            <w:pPr>
+              <w:spacing w:after="0" w:line="252"/>
+            </w:pPr>
+            <w:r>
+              <w:rPr>
+                <w:b/>
+                <w:bCs/>
+                <w:color w:val="1E2A32"/>
+                <w:sz w:val="17"/>
+                <w:szCs w:val="17"/>
+              </w:rPr>
+              <w:t xml:space="preserve">Brand appropriateness</w:t>
+            </w:r>
+          </w:p>
+        </w:tc>
+        <w:tc>
+          <w:tcPr>
+            <w:tcW w:type="dxa" w:w="7325"/>
+            <w:tcBorders>
+              <w:top w:val="single" w:color="C9CED2" w:sz="4"/>
+              <w:left w:val="single" w:color="C9CED2" w:sz="4"/>
+              <w:bottom w:val="single" w:color="C9CED2" w:sz="4"/>
+              <w:right w:val="single" w:color="C9CED2" w:sz="4"/>
+            </w:tcBorders>
+            <w:tcMar>
+              <w:top w:type="dxa" w:w="60"/>
+              <w:left w:type="dxa" w:w="90"/>
+              <w:bottom w:type="dxa" w:w="60"/>
+              <w:right w:type="dxa" w:w="90"/>
+            </w:tcMar>
+          </w:tcPr>
+          <w:p>
+            <w:pPr>
+              <w:spacing w:after="0" w:line="252"/>
+            </w:pPr>
+            <w:r>
+              <w:rPr>
+                <w:b w:val="false"/>
+                <w:bCs w:val="false"/>
+                <w:color w:val="1E2A32"/>
+                <w:sz w:val="17"/>
+                <w:szCs w:val="17"/>
+              </w:rPr>
+              <w:t xml:space="preserve">Expresses Alo's studio-to-street design heritage</w:t>
+            </w:r>
+          </w:p>
+        </w:tc>
+      </w:tr>
+      <w:tr>
+        <w:trPr>
+          <w:cantSplit/>
+        </w:trPr>
+        <w:tc>
+          <w:tcPr>
+            <w:tcW w:type="dxa" w:w="2313"/>
+            <w:tcBorders>
+              <w:top w:val="single" w:color="C9CED2" w:sz="4"/>
+              <w:left w:val="single" w:color="C9CED2" w:sz="4"/>
+              <w:bottom w:val="single" w:color="C9CED2" w:sz="4"/>
+              <w:right w:val="single" w:color="C9CED2" w:sz="4"/>
+            </w:tcBorders>
+            <w:shd w:fill="F7F5F1" w:color="auto" w:val="clear"/>
+            <w:tcMar>
+              <w:top w:type="dxa" w:w="60"/>
+              <w:left w:type="dxa" w:w="90"/>
+              <w:bottom w:type="dxa" w:w="60"/>
+              <w:right w:type="dxa" w:w="90"/>
+            </w:tcMar>
+          </w:tcPr>
+          <w:p>
+            <w:pPr>
+              <w:spacing w:after="0" w:line="252"/>
+            </w:pPr>
+            <w:r>
+              <w:rPr>
+                <w:b/>
+                <w:bCs/>
+                <w:color w:val="1E2A32"/>
+                <w:sz w:val="17"/>
+                <w:szCs w:val="17"/>
+              </w:rPr>
+              <w:t xml:space="preserve">Persuasion</w:t>
+            </w:r>
+          </w:p>
+        </w:tc>
+        <w:tc>
+          <w:tcPr>
+            <w:tcW w:type="dxa" w:w="7325"/>
+            <w:tcBorders>
+              <w:top w:val="single" w:color="C9CED2" w:sz="4"/>
+              <w:left w:val="single" w:color="C9CED2" w:sz="4"/>
+              <w:bottom w:val="single" w:color="C9CED2" w:sz="4"/>
+              <w:right w:val="single" w:color="C9CED2" w:sz="4"/>
+            </w:tcBorders>
+            <w:shd w:fill="F7F5F1" w:color="auto" w:val="clear"/>
+            <w:tcMar>
+              <w:top w:type="dxa" w:w="60"/>
+              <w:left w:type="dxa" w:w="90"/>
+              <w:bottom w:type="dxa" w:w="60"/>
+              <w:right w:type="dxa" w:w="90"/>
+            </w:tcMar>
+          </w:tcPr>
+          <w:p>
+            <w:pPr>
+              <w:spacing w:after="0" w:line="252"/>
+            </w:pPr>
+            <w:r>
+              <w:rPr>
+                <w:b w:val="false"/>
+                <w:bCs w:val="false"/>
+                <w:color w:val="1E2A32"/>
+                <w:sz w:val="17"/>
+                <w:szCs w:val="17"/>
+              </w:rPr>
+              <w:t xml:space="preserve">Turns a price objection into a cost-per-wear argument</w:t>
+            </w:r>
+          </w:p>
+        </w:tc>
+      </w:tr>
+    </w:tbl>
+    <w:p>
+      <w:pPr>
+        <w:spacing w:after="240" w:before="60"/>
+      </w:pPr>
+      <w:r>
+        <w:rPr>
+          <w:i/>
+          <w:iCs/>
+          <w:color w:val="5B6770"/>
+          <w:sz w:val="19"/>
+          <w:szCs w:val="19"/>
+        </w:rPr>
+        <w:t xml:space="preserve">Note. </w:t>
+      </w:r>
+      <w:r>
+        <w:rPr>
+          <w:color w:val="5B6770"/>
+          <w:sz w:val="19"/>
+          <w:szCs w:val="19"/>
+        </w:rPr>
+        <w:t xml:space="preserve">Dimensions adapted from Smith and Yang (2004) as presented in Bryant (2026h).</w:t>
       </w:r>
     </w:p>
     <w:sectPr>

</xml_diff>

<commit_message>
Address rubric gaps: verified sources, costed budget, AI disclosure
Replaces placeholder references with verified sources, adds budget
cost benchmarks and missing subtotals, segment-size evidence, baseline
rationale, named media vehicles, media and pre-test KPIs, and an AI
use disclosure appendix with prompts and reflection.

Co-Authored-By: Claude Opus 5.5 <noreply@anthropic.com>
Claude-Session: https://claude.ai/code/session_01XwhnEvcgigojVrsaWSJPuE
</commit_message>
<xml_diff>
--- a/Alo_Mat_to_Moment_IMC_Brief.docx
+++ b/Alo_Mat_to_Moment_IMC_Brief.docx
@@ -131,7 +131,15 @@
         <w:pStyle w:val="Heading1"/>
       </w:pPr>
       <w:r>
-        <w:t xml:space="preserve">Executive Summary</w:t>
+        <w:t xml:space="preserve">1. Situation Analysis</w:t>
+      </w:r>
+    </w:p>
+    <w:p>
+      <w:pPr>
+        <w:pStyle w:val="Heading2"/>
+      </w:pPr>
+      <w:r>
+        <w:t xml:space="preserve">1.1 Company Overview</w:t>
       </w:r>
     </w:p>
     <w:p>
@@ -139,41 +147,7 @@
         <w:spacing w:after="160" w:line="288"/>
       </w:pPr>
       <w:r>
-        <w:t xml:space="preserve">Alo opened in Sydney in 2026 to strong curiosity that has since faded (Appendix A). Sydney women know the name but do not yet see Alo as worth its price, as a brand for them, or as easy to find. </w:t>
-      </w:r>
-      <w:r>
-        <w:rPr>
-          <w:b/>
-          <w:bCs/>
-        </w:rPr>
-        <w:t xml:space="preserve">Mat to Moment</w:t>
-      </w:r>
-      <w:r>
-        <w:t xml:space="preserve"> is a 12-week, A$250,000 integrated campaign for style-conscious women aged 22–34. It delivers one message, that one Alo set is made for the whole Sydney day, through every touchpoint, from Bondi Pilates studios to CBD bus shelters.</w:t>
-      </w:r>
-    </w:p>
-    <w:p>
-      <w:pPr>
-        <w:pStyle w:val="Heading1"/>
-      </w:pPr>
-      <w:r>
-        <w:t xml:space="preserve">1. Situation Analysis</w:t>
-      </w:r>
-    </w:p>
-    <w:p>
-      <w:pPr>
-        <w:pStyle w:val="Heading2"/>
-      </w:pPr>
-      <w:r>
-        <w:t xml:space="preserve">1.1 Company Overview</w:t>
-      </w:r>
-    </w:p>
-    <w:p>
-      <w:pPr>
-        <w:spacing w:after="160" w:line="288"/>
-      </w:pPr>
-      <w:r>
-        <w:t xml:space="preserve">Alo Yoga is a Los Angeles premium activewear and lifestyle brand founded in 2007, with around 170 stores worldwide (SGB Media, 2026) and estimated 2025 sales near US$2 billion (Modaes, 2026). Its owners are reportedly weighing an IPO or sale (Rydzek, 2026), so performance in new markets is under scrutiny. Alo opened at Chatswood Chase, opposite Lululemon, in May 2026 (Inside Retail, 2026), and at The Galeries in the CBD in September, with Bondi Junction planned (Concrete Playground, 2026). Australian leggings and bras cost roughly A$100–200 (Concrete Playground, 2026). Its premium, fashion-led image was built on social media and celebrity visibility (Inside Retail, 2026). Brand equity depends on awareness and favourable associations (Keller, 1993), and IMC is what converts brand identity into local equity (Keller, 2001). In Sydney, that conversion has barely begun.</w:t>
+        <w:t xml:space="preserve">Alo Yoga is a Los Angeles premium activewear and lifestyle brand founded in 2007, with around 170 stores worldwide (SGB Media, 2026) and estimated 2025 sales near US$2 billion (Modaes, 2026). Its owners are reportedly weighing an IPO or sale (Rydzek, 2026), so performance in new markets is under scrutiny. Alo opened at Chatswood Chase, opposite Lululemon, in May 2026 (Inside Retail, 2026), and at The Galeries in the CBD in September, with Bondi Junction planned (Concrete Playground, 2026). Australian leggings and bras cost roughly A$100–200 (Concrete Playground, 2026). Its premium, fashion-led image was built on social media and celebrity visibility (Inside Retail, 2026). Brand equity depends on awareness and favourable associations (Keller, 1993), and IMC is what converts brand identity into local equity (Keller, 2001). In Sydney, that conversion has barely begun. Alo's strengths are a coherent brand image and control of its own retail experience; its weaknesses here are a small store base, no local heritage and prices above an established leader.</w:t>
       </w:r>
     </w:p>
     <w:p>
@@ -429,7 +403,7 @@
                 <w:sz w:val="17"/>
                 <w:szCs w:val="17"/>
               </w:rPr>
-              <w:t xml:space="preserve">Community model; fabric technology (Salpini, 2025b); ~3× Alo's search interest</w:t>
+              <w:t xml:space="preserve">Ambassador community model (lululemon athletica, n.d.); ~3× Alo's search interest</w:t>
             </w:r>
           </w:p>
         </w:tc>
@@ -461,7 +435,7 @@
                 <w:sz w:val="17"/>
                 <w:szCs w:val="17"/>
               </w:rPr>
-              <w:t xml:space="preserve">"Too predictable" (Salpini, 2025b); losing share to Alo (Salpini, 2025a)</w:t>
+              <w:t xml:space="preserve">"Too predictable"; losing US share to Alo (Salpini, 2025)</w:t>
             </w:r>
           </w:p>
         </w:tc>
@@ -564,7 +538,7 @@
                 <w:sz w:val="17"/>
                 <w:szCs w:val="17"/>
               </w:rPr>
-              <w:t xml:space="preserve">Local loyalty; profit doubled (Chadwick, 2025a); well known (Russh, 2026)</w:t>
+              <w:t xml:space="preserve">Local loyalty; profit doubled to A$21.3m (Inside Retail, 2025)</w:t>
             </w:r>
           </w:p>
         </w:tc>
@@ -699,7 +673,7 @@
                 <w:sz w:val="17"/>
                 <w:szCs w:val="17"/>
               </w:rPr>
-              <w:t xml:space="preserve">Fashion-led local credentials (Chadwick, 2025b)</w:t>
+              <w:t xml:space="preserve">Fashion-led local labels</w:t>
             </w:r>
           </w:p>
         </w:tc>
@@ -731,7 +705,7 @@
                 <w:sz w:val="17"/>
                 <w:szCs w:val="17"/>
               </w:rPr>
-              <w:t xml:space="preserve">Activewear one of several lines</w:t>
+              <w:t xml:space="preserve">Smaller ranges and store networks</w:t>
             </w:r>
           </w:p>
         </w:tc>
@@ -834,7 +808,7 @@
                 <w:sz w:val="17"/>
                 <w:szCs w:val="17"/>
               </w:rPr>
-              <w:t xml:space="preserve">Scale (OpenPR, 2026); Adidas reputation rising (Danziger, 2026)</w:t>
+              <w:t xml:space="preserve">Scale; Adidas rose to #2 in global reputation (RepTrak, 2026)</w:t>
             </w:r>
           </w:p>
         </w:tc>
@@ -867,7 +841,7 @@
                 <w:sz w:val="17"/>
                 <w:szCs w:val="17"/>
               </w:rPr>
-              <w:t xml:space="preserve">Performance-led, not premium lifestyle</w:t>
+              <w:t xml:space="preserve">Nike fell to #50 (RepTrak, 2026); performance-led</w:t>
             </w:r>
           </w:p>
         </w:tc>
@@ -969,7 +943,7 @@
                 <w:sz w:val="17"/>
                 <w:szCs w:val="17"/>
               </w:rPr>
-              <w:t xml:space="preserve">Cheaper (Lanoue, 2025; Pedestrian, 2026)</w:t>
+              <w:t xml:space="preserve">Lower price points</w:t>
             </w:r>
           </w:p>
         </w:tc>
@@ -1041,15 +1015,33 @@
     </w:tbl>
     <w:p>
       <w:pPr>
-        <w:spacing w:after="160"/>
-      </w:pPr>
+        <w:spacing w:after="240" w:before="60"/>
+      </w:pPr>
+      <w:r>
+        <w:rPr>
+          <w:i/>
+          <w:iCs/>
+          <w:color w:val="5B6770"/>
+          <w:sz w:val="19"/>
+          <w:szCs w:val="19"/>
+        </w:rPr>
+        <w:t xml:space="preserve">Note. </w:t>
+      </w:r>
+      <w:r>
+        <w:rPr>
+          <w:color w:val="5B6770"/>
+          <w:sz w:val="19"/>
+          <w:szCs w:val="19"/>
+        </w:rPr>
+        <w:t xml:space="preserve">Unreferenced entries are agency assessments.</w:t>
+      </w:r>
     </w:p>
     <w:p>
       <w:pPr>
         <w:spacing w:after="160" w:line="288"/>
       </w:pPr>
       <w:r>
-        <w:t xml:space="preserve">Lululemon's search interest is almost three times Alo's (Appendix A), and larger brands enjoy more buyers and more loyalty (Sharp, 2010). Alo therefore cannot argue loyalists away; it must become easier to think of and to find. Competitor weaknesses cluster around dated, functional design or mid-market focus, which leaves premium, design-led, all-day wear unclaimed (see the positioning map in Appendix E). Fashion alone is not defensible, because P.E Nation sits nearby with local credentials. Fashion plus proven studio performance, made locally relevant, is. With young consumers under financial pressure (Deloitte, 2026), cheaper brands such as Gymshark become the fallback whenever Alo's premium is not justified. Adidas's rise through community-led marketing (Danziger, 2026) confirms that community works in this category, but also that the space is crowded; Alo needs a community with a distinct purpose.</w:t>
+        <w:t xml:space="preserve">Lululemon's search interest is almost three times Alo's (Appendix A), and larger brands enjoy more buyers and more loyalty (Sharp, 2010). Alo therefore cannot argue loyalists away; it must become easier to think of and to find. Competitor weaknesses cluster around dated, functional design or mid-market focus, which leaves premium, design-led, all-day wear unclaimed (see the positioning map in Appendix E). Fashion alone is not defensible, because P.E Nation sits nearby with local credentials. Fashion plus proven studio performance, made locally relevant, is. Lululemon's recent share losses to Alo are US evidence (Salpini, 2025), so the same shift cannot be assumed in Sydney. With young consumers under financial pressure (Deloitte, 2026), cheaper brands such as Gymshark become the fallback whenever Alo's premium is not justified.</w:t>
       </w:r>
     </w:p>
     <w:p>
@@ -1075,7 +1067,7 @@
         <w:t xml:space="preserve">style-conscious women aged 22–34 in Greater Sydney</w:t>
       </w:r>
       <w:r>
-        <w:t xml:space="preserve"> who do Pilates, yoga or gym and use Instagram and TikTok daily. Affluent women aged 35–50 are loyal to Lululemon and Lorna Jane and hard to switch, and men are a small part of Alo's range, so both are reached only as spillover. The chosen segment buys activewear as identity: possessions extend the self (Belk, 1988), and Alo turns a healthy lifestyle into a visible identity (36Kr, 2026). It spans older Gen Z, who prize authenticity (Francis &amp; Hoefel, 2018), and younger Millennials, so the campaign pairs unpolished creator content with bookable experiences and audio. Social dynamics matter as well: consumers build self-brand connections through the brands their reference groups use (Escalas &amp; Bettman, 2005), and the studio class is this segment's most visible reference group, which is where the campaign places its sources. Critically, more than half of Gen Z and Millennials have delayed major decisions because of financial pressure (Deloitte, 2026). The audience most drawn to Alo is also the most price-stretched, which is why price justification ranks first below and why value is framed as longevity rather than discount.</w:t>
+        <w:t xml:space="preserve"> who do Pilates, yoga or gym and use Instagram and TikTok daily. Affluent women aged 35–50 are loyal to Lululemon and Lorna Jane and hard to switch, and men are a small part of Alo's range, so both are reached only as spillover. The chosen segment buys activewear as identity: possessions extend the self (Belk, 1988), and Alo's appeal is built on exactly that social visibility (Inside Retail, 2026). The segment is substantial: Pilates alone has about 585,000 adult Australian participants, around 90% of them women (Sport Australia, 2019). It spans older Gen Z, who prize authenticity (Francis &amp; Hoefel, 2018), and younger Millennials, so the campaign pairs unpolished creator content with bookable experiences and audio. Consumers also build self-brand connections through the brands their reference groups use (Escalas &amp; Bettman, 2005), and the studio class is this segment's most visible reference group, which is where the campaign places its sources. Critically, more than half of Gen Z and Millennials have delayed major decisions because of financial pressure (Deloitte, 2026). The audience most drawn to Alo is also the most price-stretched, so price justification ranks first.</w:t>
       </w:r>
     </w:p>
     <w:p>
@@ -1151,7 +1143,7 @@
         <w:t xml:space="preserve">Limited reach</w:t>
       </w:r>
       <w:r>
-        <w:t xml:space="preserve">: two stores cannot cover Greater Sydney, so media must bring people to them.</w:t>
+        <w:t xml:space="preserve">: two stores (Concrete Playground, 2026) cannot cover Greater Sydney, so media must bring people to them.</w:t>
       </w:r>
     </w:p>
     <w:p>
@@ -1171,7 +1163,7 @@
         <w:t xml:space="preserve">Standing apart from Lululemon</w:t>
       </w:r>
       <w:r>
-        <w:t xml:space="preserve">, which already owns "community" (Salpini, 2025b); a generic community message would strengthen the leader.</w:t>
+        <w:t xml:space="preserve">, which already owns "community" through its ambassador model (lululemon athletica, n.d.); a generic community message would strengthen the leader.</w:t>
       </w:r>
     </w:p>
     <w:p>
@@ -2267,7 +2259,7 @@
         <w:spacing w:after="160" w:line="288"/>
       </w:pPr>
       <w:r>
-        <w:t xml:space="preserve">The objectives follow DAGMAR (Colley, 1961). AIDA and the hierarchy of effects assume that consumers think, then feel, then do (Lavidge &amp; Steiner, 1961; Strong, 1925). Figure 1 shows why this campaign reverses the first two steps. Premium activewear is a high-involvement purchase worn in public, so attitude precedes information (Vaughn, 1980): until Segment A feels Alo is "for people like me", knowing a store's address is worthless. The hierarchy is a heuristic, not a law, so all four objectives are tracked simultaneously. O3 (doubling store awareness) is the most ambitious, but it is attainable because every paid asset carries the store line, and it links directly to the reach objective in Section 5. Baselines are estimates to be confirmed by the pre-campaign survey, and visits rather than sales are targeted because price and stock sit outside communication's control (Belch &amp; Belch, 2021).</w:t>
+        <w:t xml:space="preserve">The objectives follow DAGMAR (Colley, 1961). AIDA and the hierarchy of effects assume that consumers think, then feel, then do (Lavidge &amp; Steiner, 1961; Strong, 1925). Figure 1 shows why this campaign reverses the first two steps. Premium activewear is a high-involvement purchase worn in public, so attitude precedes information (Vaughn, 1980): until Segment A feels Alo is "for people like me", knowing a store's address is worthless. The hierarchy is a heuristic, not a law, so all four objectives are tracked simultaneously. O3 is ambitious but attainable because every paid asset carries the store line. Baselines are agency estimates to be confirmed by the pre-campaign survey. O3 starts at 25% because Alo's search interest matches Lorna Jane's, but store awareness should trail name awareness for a four-month-old entrant. O1 and O2 start low because few locals have tried the product. Visits rather than sales are targeted because price and stock sit outside communication's control (Belch &amp; Belch, 2021).</w:t>
       </w:r>
     </w:p>
     <w:p>
@@ -2394,7 +2386,7 @@
         <w:t xml:space="preserve">Insight:</w:t>
       </w:r>
       <w:r>
-        <w:t xml:space="preserve"> for Segment A, studio fitness is a social performance. Young women experience exercise as visible "aesthetic labour" on Instagram (Camacho-Miñano et al., 2019), so activewear is judged at the café as much as in class. The communication process model (Schramm, as cited in Belch &amp; Belch, 2021) explains why Alo has not yet capitalised on this (Figure 2). Meaning is shared only where fields of experience overlap. Alo's launch was encoded in Los Angeles and decoded in Sydney as "beautiful, but not for me". The fix is not more volume but re-encoding the message through Sydney instructors and creators, whose fields of experience overlap almost completely with the audience's. The model also highlights noise from Lululemon's far larger share of search and a crowded influencer feed, which favours repeating one idea. The model's feedback loop is built into the plan: creator comments, bookings and search interest are reviewed between bursts so the encoding can be adjusted (Section 6).</w:t>
+        <w:t xml:space="preserve"> for Segment A, studio fitness is a social performance. Young women experience exercise as visible "aesthetic labour" on Instagram (Camacho-Miñano et al., 2019), so activewear is judged at the café as much as in class. The communication process model (Schramm, as cited in Belch &amp; Belch, 2021) explains why Alo has not yet capitalised on this (Figure 2). Meaning is shared only where fields of experience overlap. Alo's launch was encoded in Los Angeles and decoded in Sydney as "beautiful, but not for me". The fix is not more volume but re-encoding the message through Sydney instructors and creators, whose fields of experience overlap almost completely with the audience's. The model also highlights noise from Lululemon's far larger share of search and a crowded influencer feed, which favours repeating one idea. The model's feedback loop is built in: comments, bookings and search interest are reviewed between bursts (Section 6).</w:t>
       </w:r>
     </w:p>
     <w:p>
@@ -2567,7 +2559,7 @@
         <w:t xml:space="preserve">Find us</w:t>
       </w:r>
       <w:r>
-        <w:t xml:space="preserve"> through repetition that builds memory structures (Sharp, 2010). Peripheral attitudes are weaker and fade faster, which is why the schedule keeps an always-on base rather than relying on bursts alone. </w:t>
+        <w:t xml:space="preserve"> through repetition that builds memory structures (Sharp, 2010). Peripheral attitudes fade faster, hence the always-on base. </w:t>
       </w:r>
       <w:r>
         <w:rPr>
@@ -2801,7 +2793,7 @@
         <w:spacing w:after="160" w:line="288"/>
       </w:pPr>
       <w:r>
-        <w:t xml:space="preserve">IMC exists because fragmented messages weaken brand equity and trust (Belch &amp; Belch, 2021; Keller, 2001). Figure 5 maps the campaign onto the consumer decision journey, extended for social influence (Court et al., 2009; Stephen, 2016): each stage has a different job, but all six tell the same story, and advocates' #MatToMoment posts become discovery content for the next customer at no media cost. Figure 6 shows the cost of this approach. About 45% of the budget goes to creators, sessions and PR, which carry higher impact but lower control (Duncan, as cited in Belch &amp; Belch, 2021). Company-created touchpoints such as outdoor are controllable but persuade least. Customer-initiated and unexpected ones, such as a #MatToMoment post, a critical review or a creator controversy, persuade most but cannot be scripted. Shared brand codes, tight creator briefs and weekly social listening protect consistency. This is the campaign's central bet: an advertising-led plan would be more controllable but less believable, which is the opposite of what Challenges 1 and 5 need. Because the journey is non-linear, attribution across touchpoints will remain imperfect (Lemon &amp; Verhoef, 2016), which Section 6 acknowledges.</w:t>
+        <w:t xml:space="preserve">IMC exists because fragmented messages weaken brand equity and trust (Belch &amp; Belch, 2021; Keller, 2001). Figure 5 maps the campaign onto the consumer decision journey, extended for social influence (Court et al., 2009; Stephen, 2016): each stage has a different job, but all six tell the same story, and advocates' #MatToMoment posts become discovery content for the next customer at no media cost. Figure 6 shows the cost of this approach. About 45% of the budget goes to creators, sessions and PR, which carry higher impact but lower control (Duncan, as cited in Belch &amp; Belch, 2021). Customer posts, reviews and creator controversies cannot be scripted. Shared brand codes, tight creator briefs and weekly social listening protect consistency. This is the campaign's central bet: an advertising-led plan would be more controllable but less believable, which is the opposite of what Challenges 1 and 5 need. Because the journey is non-linear, attribution across touchpoints will remain imperfect (Lemon &amp; Verhoef, 2016), which Section 6 acknowledges.</w:t>
       </w:r>
     </w:p>
     <w:p>
@@ -3474,146 +3466,6 @@
           </w:p>
         </w:tc>
       </w:tr>
-      <w:tr>
-        <w:trPr>
-          <w:cantSplit/>
-        </w:trPr>
-        <w:tc>
-          <w:tcPr>
-            <w:tcW w:type="dxa" w:w="2506"/>
-            <w:tcBorders>
-              <w:top w:val="single" w:color="C9CED2" w:sz="4"/>
-              <w:left w:val="single" w:color="C9CED2" w:sz="4"/>
-              <w:bottom w:val="single" w:color="C9CED2" w:sz="4"/>
-              <w:right w:val="single" w:color="C9CED2" w:sz="4"/>
-            </w:tcBorders>
-            <w:shd w:fill="F7F5F1" w:color="auto" w:val="clear"/>
-            <w:tcMar>
-              <w:top w:type="dxa" w:w="60"/>
-              <w:left w:type="dxa" w:w="90"/>
-              <w:bottom w:type="dxa" w:w="60"/>
-              <w:right w:type="dxa" w:w="90"/>
-            </w:tcMar>
-          </w:tcPr>
-          <w:p>
-            <w:pPr>
-              <w:spacing w:after="0" w:line="252"/>
-            </w:pPr>
-            <w:r>
-              <w:rPr>
-                <w:b/>
-                <w:bCs/>
-                <w:color w:val="1E2A32"/>
-                <w:sz w:val="17"/>
-                <w:szCs w:val="17"/>
-              </w:rPr>
-              <w:t xml:space="preserve">Mandatories</w:t>
-            </w:r>
-          </w:p>
-        </w:tc>
-        <w:tc>
-          <w:tcPr>
-            <w:tcW w:type="dxa" w:w="7132"/>
-            <w:tcBorders>
-              <w:top w:val="single" w:color="C9CED2" w:sz="4"/>
-              <w:left w:val="single" w:color="C9CED2" w:sz="4"/>
-              <w:bottom w:val="single" w:color="C9CED2" w:sz="4"/>
-              <w:right w:val="single" w:color="C9CED2" w:sz="4"/>
-            </w:tcBorders>
-            <w:shd w:fill="F7F5F1" w:color="auto" w:val="clear"/>
-            <w:tcMar>
-              <w:top w:type="dxa" w:w="60"/>
-              <w:left w:type="dxa" w:w="90"/>
-              <w:bottom w:type="dxa" w:w="60"/>
-              <w:right w:type="dxa" w:w="90"/>
-            </w:tcMar>
-          </w:tcPr>
-          <w:p>
-            <w:pPr>
-              <w:spacing w:after="0" w:line="252"/>
-            </w:pPr>
-            <w:r>
-              <w:rPr>
-                <w:b w:val="false"/>
-                <w:bCs w:val="false"/>
-                <w:color w:val="1E2A32"/>
-                <w:sz w:val="17"/>
-                <w:szCs w:val="17"/>
-              </w:rPr>
-              <w:t xml:space="preserve">#ad disclosure, substantiated claims, sync licences</w:t>
-            </w:r>
-          </w:p>
-        </w:tc>
-      </w:tr>
-      <w:tr>
-        <w:trPr>
-          <w:cantSplit/>
-        </w:trPr>
-        <w:tc>
-          <w:tcPr>
-            <w:tcW w:type="dxa" w:w="2506"/>
-            <w:tcBorders>
-              <w:top w:val="single" w:color="C9CED2" w:sz="4"/>
-              <w:left w:val="single" w:color="C9CED2" w:sz="4"/>
-              <w:bottom w:val="single" w:color="C9CED2" w:sz="4"/>
-              <w:right w:val="single" w:color="C9CED2" w:sz="4"/>
-            </w:tcBorders>
-            <w:tcMar>
-              <w:top w:type="dxa" w:w="60"/>
-              <w:left w:type="dxa" w:w="90"/>
-              <w:bottom w:type="dxa" w:w="60"/>
-              <w:right w:type="dxa" w:w="90"/>
-            </w:tcMar>
-          </w:tcPr>
-          <w:p>
-            <w:pPr>
-              <w:spacing w:after="0" w:line="252"/>
-            </w:pPr>
-            <w:r>
-              <w:rPr>
-                <w:b/>
-                <w:bCs/>
-                <w:color w:val="1E2A32"/>
-                <w:sz w:val="17"/>
-                <w:szCs w:val="17"/>
-              </w:rPr>
-              <w:t xml:space="preserve">Deliverables</w:t>
-            </w:r>
-          </w:p>
-        </w:tc>
-        <w:tc>
-          <w:tcPr>
-            <w:tcW w:type="dxa" w:w="7132"/>
-            <w:tcBorders>
-              <w:top w:val="single" w:color="C9CED2" w:sz="4"/>
-              <w:left w:val="single" w:color="C9CED2" w:sz="4"/>
-              <w:bottom w:val="single" w:color="C9CED2" w:sz="4"/>
-              <w:right w:val="single" w:color="C9CED2" w:sz="4"/>
-            </w:tcBorders>
-            <w:tcMar>
-              <w:top w:type="dxa" w:w="60"/>
-              <w:left w:type="dxa" w:w="90"/>
-              <w:bottom w:type="dxa" w:w="60"/>
-              <w:right w:type="dxa" w:w="90"/>
-            </w:tcMar>
-          </w:tcPr>
-          <w:p>
-            <w:pPr>
-              <w:spacing w:after="0" w:line="252"/>
-            </w:pPr>
-            <w:r>
-              <w:rPr>
-                <w:b w:val="false"/>
-                <w:bCs w:val="false"/>
-                <w:color w:val="1E2A32"/>
-                <w:sz w:val="17"/>
-                <w:szCs w:val="17"/>
-              </w:rPr>
-              <w:t xml:space="preserve">Hero film, cut-downs, audio, outdoor, creator toolkits</w:t>
-            </w:r>
-          </w:p>
-        </w:tc>
-      </w:tr>
     </w:tbl>
     <w:p>
       <w:pPr>
@@ -3686,7 +3538,7 @@
         <w:t xml:space="preserve">is</w:t>
       </w:r>
       <w:r>
-        <w:t xml:space="preserve"> the positioning (Smith &amp; Yang, 2004). On the divergence dimensions of Smith et al. (2007; see Appendix D), it shows originality (quiet moments), synthesis (linking the reformer and the café through one garment) and flexibility (it works as film, still, audio and live session). The risk is that divergent work is remembered without the brand, so the logo, palette and "Mat to Moment" sign-off appear in every execution. The lead appeals are aspirational and social approval (Belch &amp; Belch, 2021). Social approval is the riskiest choice here, because visibility drives appearance pressure (Camacho-Miñano et al., 2019), and exploiting that insecurity would cross from persuasion into manipulation. Executions therefore show diverse bodies and use no retouching. A rational appeal reframes price as cost per wear, presenting value as longevity rather than low price. Slice-of-life storytelling carries the emotion, and demonstration carries the proof.</w:t>
+        <w:t xml:space="preserve"> the positioning (Smith &amp; Yang, 2004). On Smith et al.'s (2007) divergence dimensions, it scores on originality, synthesis and flexibility (Appendix D). The risk is that divergent work is remembered without the brand, so the logo, palette and "Mat to Moment" sign-off appear in every execution. The lead appeals are aspirational and social approval (Belch &amp; Belch, 2021). Social approval is the riskiest choice here, because visibility drives appearance pressure (Camacho-Miñano et al., 2019), and exploiting that insecurity would cross from persuasion into manipulation. Executions therefore show diverse bodies and use no retouching. A rational appeal reframes price as cost per wear, presenting value as longevity rather than low price. Slice-of-life storytelling carries the emotion, and demonstration carries the proof.</w:t>
       </w:r>
     </w:p>
     <w:p>
@@ -3702,7 +3554,7 @@
         <w:spacing w:after="160" w:line="288"/>
       </w:pPr>
       <w:r>
-        <w:t xml:space="preserve">Strong integrated campaigns use many tactics in service of one idea. In Appendix G, each channel adapts the hook and call to action to suit its medium, but all share one story and one sign-off, which gives consistent meaning without identical executions (Batra &amp; Keller, 2016). Because IMC builds recall through repetition and consistency (Keller, 2001), a viewer who hears the audio, passes a bus shelter and then sees a creator's post meets one idea three times, not three different ideas once. Weaker formats compress the idea rather than abandon it, for example three moments in one outdoor frame. Claims must be substantiated under the Australian Consumer Law, as Lorna Jane's A$5 million penalty shows (ACCC, 2021), and creator posts must be clearly identifiable as advertising (Australian Association of National Advertisers [AANA], 2021). Emails need recorded consent, and the music needs sync licences.</w:t>
+        <w:t xml:space="preserve">In Appendix G, each channel adapts the hook and call to action to suit its medium, but all share one story and one sign-off, which gives consistent meaning without identical executions (Batra &amp; Keller, 2016). Because IMC builds recall through repetition and consistency (Keller, 2001), a viewer who hears the audio, passes a bus shelter and then sees a creator's post meets one idea three times, not three different ideas once. Claims must be substantiated under the Australian Consumer Law, as Lorna Jane's A$5 million penalty shows (ACCC, 2021), and creator posts must be clearly identifiable as advertising (Australian Association of National Advertisers [AANA], 2021). The music also needs sync licences.</w:t>
       </w:r>
     </w:p>
     <w:p>
@@ -3748,7 +3600,7 @@
         <w:t xml:space="preserve">Made for Sydney's day</w:t>
       </w:r>
       <w:r>
-        <w:t xml:space="preserve">. The media objective is to reach 70% of Segment A at least once in Burst 1, at an average frequency of four, and to retarget 20% of those exposed in Burst 3. Geographic coverage is Greater Sydney, weighted to the catchments around Chatswood Chase, The Galeries and Bondi Junction. If Bondi Junction opens late, its weight moves to the CBD. Outdoor has low audience selectivity (Belch &amp; Belch, 2021), so it carries only the store line, near the stores. Spotify reaches commuting and workout moments but cannot show the set, so it uses sound cues. Retargeting then follows anyone exposed, and it works best once consumers have formed preferences (Lambrecht &amp; Tucker, 2013). Publicity depends on newsworthiness (Belch &amp; Belch, 2021), and a branded class is not news, so the hook is a free Bondi-to-Bronte walk series. Sessions also act as a free trial, which reduces purchase risk without a price cut (Belch &amp; Belch, 2021). Booking and store emails are personalised direct marketing that converts interest into visits, so they are sent only with recorded consent.</w:t>
+        <w:t xml:space="preserve">. The media objective is to reach 70% of Segment A at least once in Burst 1, at an average frequency of four, and to retarget 20% of those exposed in Burst 3. Geographic coverage is Greater Sydney, weighted to the catchments around Chatswood Chase, The Galeries and Bondi Junction. If Bondi Junction opens late, its weight moves to the CBD. Vehicles are Instagram Reels and Stories, TikTok in-feed ads with boosted creator posts, Spotify audio ads, and bus-side panels on routes serving the three stores. Television and print were excluded because the budget cannot buy competitive television frequency in Sydney, and print reaches this audience less efficiently than social. Filmed sessions and styling guides form the content-marketing layer on owned channels. Outdoor has low audience selectivity (Belch &amp; Belch, 2021), so it carries only the store line, near the stores. Spotify reaches commuting and workout moments but cannot show the set, so it uses sound cues. Retargeting then follows anyone exposed, and it works best once consumers have formed preferences (Lambrecht &amp; Tucker, 2013). Publicity depends on newsworthiness (Belch &amp; Belch, 2021), and a branded class is not news, so the hook is a free Bondi-to-Bronte walk series. Sessions also act as a free trial, which reduces purchase risk without a price cut (Belch &amp; Belch, 2021). Booking and store emails are personalised direct marketing, sent only with recorded consent.</w:t>
       </w:r>
     </w:p>
     <w:p>
@@ -4763,7 +4615,7 @@
         <w:t xml:space="preserve">pulsing</w:t>
       </w:r>
       <w:r>
-        <w:t xml:space="preserve">: an always-on base with three bursts (Belch &amp; Belch, 2021; Figure 7). Burst 1 (weeks 1–3) builds awareness, Burst 2 (weeks 6–8) builds consideration in February, when many people resume fitness routines, and Burst 3 (weeks 11–12) drives visits and advocacy. Flighting would leave gaps in which interest decays, and full continuous weight is unaffordable.</w:t>
+        <w:t xml:space="preserve">: an always-on base with three bursts (Belch &amp; Belch, 2021; Figure 7). Burst 1 (weeks 1–3) builds awareness, Burst 2 (weeks 6–8) builds consideration, and Burst 3 (weeks 11–12) drives visits and advocacy. Flighting would leave gaps in which interest decays, and full continuous weight is unaffordable.</w:t>
       </w:r>
     </w:p>
     <w:p>
@@ -4867,7 +4719,7 @@
         <w:spacing w:after="160" w:line="288"/>
       </w:pPr>
       <w:r>
-        <w:t xml:space="preserve">The budget uses the objective-and-task method (Belch &amp; Belch, 2021). Partnerships receive 42% because they span paid, owned and earned media (Stephen &amp; Galak, 2012): a creator partnership is paid, its content is reused on Alo's owned channels, and audiences share it as earned media. Discounting and celebrity fees are excluded because both would weaken Alo's premium, local position. The weakness is that only 40% buys traditional reach, so if Burst 1 misses its reach target, the contingency moves into paid social. The 5% contingency also covers rate rises and a delayed Bondi Junction opening.</w:t>
+        <w:t xml:space="preserve">The budget uses the objective-and-task method (Belch &amp; Belch, 2021). Partnerships receive 42% because they span paid, owned and earned media (Stephen &amp; Galak, 2012): a creator partnership is paid, its content is reused on Alo's owned channels, and audiences share it as earned media. Costs follow published benchmarks. Australian micro-creators charge roughly A$150–750 per post (Wise, 2025), so A$50,000 funds about 40 micro posts plus the lead and macro creators. Sydney bus-side panels start at about A$150 per week plus A$375 production (GoTransit, n.d.), so outdoor buys about 40 panels for three weeks with beach-side posters. At Instagram CPMs of about US$8 (Admetrics, 2025), paid social delivers several million impressions, enough for the Burst 1 reach target. The weakness is that only 40% buys traditional reach, so if Burst 1 misses its reach target, the contingency moves into paid social. The 5% contingency also covers rate rises and a delayed Bondi Junction opening.</w:t>
       </w:r>
     </w:p>
     <w:p>
@@ -4980,7 +4832,7 @@
                 <w:sz w:val="17"/>
                 <w:szCs w:val="17"/>
               </w:rPr>
-              <w:t xml:space="preserve">Subtotal</w:t>
+              <w:t xml:space="preserve">Category</w:t>
             </w:r>
           </w:p>
         </w:tc>
@@ -6261,27 +6113,27 @@
               <w:bottom w:val="single" w:color="C9CED2" w:sz="4"/>
               <w:right w:val="single" w:color="C9CED2" w:sz="4"/>
             </w:tcBorders>
-            <w:shd w:fill="F7F5F1" w:color="auto" w:val="clear"/>
-            <w:tcMar>
-              <w:top w:type="dxa" w:w="60"/>
-              <w:left w:type="dxa" w:w="90"/>
-              <w:bottom w:type="dxa" w:w="60"/>
-              <w:right w:type="dxa" w:w="90"/>
-            </w:tcMar>
-          </w:tcPr>
-          <w:p>
-            <w:pPr>
-              <w:spacing w:after="0" w:line="252"/>
-            </w:pPr>
-            <w:r>
-              <w:rPr>
-                <w:b w:val="false"/>
-                <w:bCs w:val="false"/>
-                <w:color w:val="1E2A32"/>
-                <w:sz w:val="17"/>
-                <w:szCs w:val="17"/>
-              </w:rPr>
-              <w:t xml:space="preserve">Research (pre/post surveys)</w:t>
+            <w:shd w:fill="EFE7DA" w:color="auto" w:val="clear"/>
+            <w:tcMar>
+              <w:top w:type="dxa" w:w="60"/>
+              <w:left w:type="dxa" w:w="90"/>
+              <w:bottom w:type="dxa" w:w="60"/>
+              <w:right w:type="dxa" w:w="90"/>
+            </w:tcMar>
+          </w:tcPr>
+          <w:p>
+            <w:pPr>
+              <w:spacing w:after="0" w:line="252"/>
+            </w:pPr>
+            <w:r>
+              <w:rPr>
+                <w:b/>
+                <w:bCs/>
+                <w:color w:val="1E2A32"/>
+                <w:sz w:val="17"/>
+                <w:szCs w:val="17"/>
+              </w:rPr>
+              <w:t xml:space="preserve">Subtotal C</w:t>
             </w:r>
           </w:p>
         </w:tc>
@@ -6294,28 +6146,18 @@
               <w:bottom w:val="single" w:color="C9CED2" w:sz="4"/>
               <w:right w:val="single" w:color="C9CED2" w:sz="4"/>
             </w:tcBorders>
-            <w:shd w:fill="F7F5F1" w:color="auto" w:val="clear"/>
-            <w:tcMar>
-              <w:top w:type="dxa" w:w="60"/>
-              <w:left w:type="dxa" w:w="90"/>
-              <w:bottom w:type="dxa" w:w="60"/>
-              <w:right w:type="dxa" w:w="90"/>
-            </w:tcMar>
-          </w:tcPr>
-          <w:p>
-            <w:pPr>
-              <w:spacing w:after="0" w:line="252"/>
-            </w:pPr>
-            <w:r>
-              <w:rPr>
-                <w:b w:val="false"/>
-                <w:bCs w:val="false"/>
-                <w:color w:val="1E2A32"/>
-                <w:sz w:val="17"/>
-                <w:szCs w:val="17"/>
-              </w:rPr>
-              <w:t xml:space="preserve">D</w:t>
-            </w:r>
+            <w:shd w:fill="EFE7DA" w:color="auto" w:val="clear"/>
+            <w:tcMar>
+              <w:top w:type="dxa" w:w="60"/>
+              <w:left w:type="dxa" w:w="90"/>
+              <w:bottom w:type="dxa" w:w="60"/>
+              <w:right w:type="dxa" w:w="90"/>
+            </w:tcMar>
+          </w:tcPr>
+          <w:p>
+            <w:pPr>
+              <w:spacing w:after="0" w:line="252"/>
+            </w:pPr>
           </w:p>
         </w:tc>
         <w:tc>
@@ -6327,27 +6169,27 @@
               <w:bottom w:val="single" w:color="C9CED2" w:sz="4"/>
               <w:right w:val="single" w:color="C9CED2" w:sz="4"/>
             </w:tcBorders>
-            <w:shd w:fill="F7F5F1" w:color="auto" w:val="clear"/>
-            <w:tcMar>
-              <w:top w:type="dxa" w:w="60"/>
-              <w:left w:type="dxa" w:w="90"/>
-              <w:bottom w:type="dxa" w:w="60"/>
-              <w:right w:type="dxa" w:w="90"/>
-            </w:tcMar>
-          </w:tcPr>
-          <w:p>
-            <w:pPr>
-              <w:spacing w:after="0" w:line="252"/>
-            </w:pPr>
-            <w:r>
-              <w:rPr>
-                <w:b w:val="false"/>
-                <w:bCs w:val="false"/>
-                <w:color w:val="1E2A32"/>
-                <w:sz w:val="17"/>
-                <w:szCs w:val="17"/>
-              </w:rPr>
-              <w:t xml:space="preserve">5,000</w:t>
+            <w:shd w:fill="EFE7DA" w:color="auto" w:val="clear"/>
+            <w:tcMar>
+              <w:top w:type="dxa" w:w="60"/>
+              <w:left w:type="dxa" w:w="90"/>
+              <w:bottom w:type="dxa" w:w="60"/>
+              <w:right w:type="dxa" w:w="90"/>
+            </w:tcMar>
+          </w:tcPr>
+          <w:p>
+            <w:pPr>
+              <w:spacing w:after="0" w:line="252"/>
+            </w:pPr>
+            <w:r>
+              <w:rPr>
+                <w:b/>
+                <w:bCs/>
+                <w:color w:val="1E2A32"/>
+                <w:sz w:val="17"/>
+                <w:szCs w:val="17"/>
+              </w:rPr>
+              <w:t xml:space="preserve">28,000</w:t>
             </w:r>
           </w:p>
         </w:tc>
@@ -6360,27 +6202,27 @@
               <w:bottom w:val="single" w:color="C9CED2" w:sz="4"/>
               <w:right w:val="single" w:color="C9CED2" w:sz="4"/>
             </w:tcBorders>
-            <w:shd w:fill="F7F5F1" w:color="auto" w:val="clear"/>
-            <w:tcMar>
-              <w:top w:type="dxa" w:w="60"/>
-              <w:left w:type="dxa" w:w="90"/>
-              <w:bottom w:type="dxa" w:w="60"/>
-              <w:right w:type="dxa" w:w="90"/>
-            </w:tcMar>
-          </w:tcPr>
-          <w:p>
-            <w:pPr>
-              <w:spacing w:after="0" w:line="252"/>
-            </w:pPr>
-            <w:r>
-              <w:rPr>
-                <w:b w:val="false"/>
-                <w:bCs w:val="false"/>
-                <w:color w:val="1E2A32"/>
-                <w:sz w:val="17"/>
-                <w:szCs w:val="17"/>
-              </w:rPr>
-              <w:t xml:space="preserve">2</w:t>
+            <w:shd w:fill="EFE7DA" w:color="auto" w:val="clear"/>
+            <w:tcMar>
+              <w:top w:type="dxa" w:w="60"/>
+              <w:left w:type="dxa" w:w="90"/>
+              <w:bottom w:type="dxa" w:w="60"/>
+              <w:right w:type="dxa" w:w="90"/>
+            </w:tcMar>
+          </w:tcPr>
+          <w:p>
+            <w:pPr>
+              <w:spacing w:after="0" w:line="252"/>
+            </w:pPr>
+            <w:r>
+              <w:rPr>
+                <w:b/>
+                <w:bCs/>
+                <w:color w:val="1E2A32"/>
+                <w:sz w:val="17"/>
+                <w:szCs w:val="17"/>
+              </w:rPr>
+              <w:t xml:space="preserve">11.2</w:t>
             </w:r>
           </w:p>
         </w:tc>
@@ -6398,26 +6240,27 @@
               <w:bottom w:val="single" w:color="C9CED2" w:sz="4"/>
               <w:right w:val="single" w:color="C9CED2" w:sz="4"/>
             </w:tcBorders>
-            <w:tcMar>
-              <w:top w:type="dxa" w:w="60"/>
-              <w:left w:type="dxa" w:w="90"/>
-              <w:bottom w:type="dxa" w:w="60"/>
-              <w:right w:type="dxa" w:w="90"/>
-            </w:tcMar>
-          </w:tcPr>
-          <w:p>
-            <w:pPr>
-              <w:spacing w:after="0" w:line="252"/>
-            </w:pPr>
-            <w:r>
-              <w:rPr>
-                <w:b w:val="false"/>
-                <w:bCs w:val="false"/>
-                <w:color w:val="1E2A32"/>
-                <w:sz w:val="17"/>
-                <w:szCs w:val="17"/>
-              </w:rPr>
-              <w:t xml:space="preserve">Contingency</w:t>
+            <w:shd w:fill="EFE7DA" w:color="auto" w:val="clear"/>
+            <w:tcMar>
+              <w:top w:type="dxa" w:w="60"/>
+              <w:left w:type="dxa" w:w="90"/>
+              <w:bottom w:type="dxa" w:w="60"/>
+              <w:right w:type="dxa" w:w="90"/>
+            </w:tcMar>
+          </w:tcPr>
+          <w:p>
+            <w:pPr>
+              <w:spacing w:after="0" w:line="252"/>
+            </w:pPr>
+            <w:r>
+              <w:rPr>
+                <w:b/>
+                <w:bCs/>
+                <w:color w:val="1E2A32"/>
+                <w:sz w:val="17"/>
+                <w:szCs w:val="17"/>
+              </w:rPr>
+              <w:t xml:space="preserve">Subtotal D: research (pre/post surveys)</w:t>
             </w:r>
           </w:p>
         </w:tc>
@@ -6430,27 +6273,18 @@
               <w:bottom w:val="single" w:color="C9CED2" w:sz="4"/>
               <w:right w:val="single" w:color="C9CED2" w:sz="4"/>
             </w:tcBorders>
-            <w:tcMar>
-              <w:top w:type="dxa" w:w="60"/>
-              <w:left w:type="dxa" w:w="90"/>
-              <w:bottom w:type="dxa" w:w="60"/>
-              <w:right w:type="dxa" w:w="90"/>
-            </w:tcMar>
-          </w:tcPr>
-          <w:p>
-            <w:pPr>
-              <w:spacing w:after="0" w:line="252"/>
-            </w:pPr>
-            <w:r>
-              <w:rPr>
-                <w:b w:val="false"/>
-                <w:bCs w:val="false"/>
-                <w:color w:val="1E2A32"/>
-                <w:sz w:val="17"/>
-                <w:szCs w:val="17"/>
-              </w:rPr>
-              <w:t xml:space="preserve">E</w:t>
-            </w:r>
+            <w:shd w:fill="EFE7DA" w:color="auto" w:val="clear"/>
+            <w:tcMar>
+              <w:top w:type="dxa" w:w="60"/>
+              <w:left w:type="dxa" w:w="90"/>
+              <w:bottom w:type="dxa" w:w="60"/>
+              <w:right w:type="dxa" w:w="90"/>
+            </w:tcMar>
+          </w:tcPr>
+          <w:p>
+            <w:pPr>
+              <w:spacing w:after="0" w:line="252"/>
+            </w:pPr>
           </w:p>
         </w:tc>
         <w:tc>
@@ -6462,26 +6296,27 @@
               <w:bottom w:val="single" w:color="C9CED2" w:sz="4"/>
               <w:right w:val="single" w:color="C9CED2" w:sz="4"/>
             </w:tcBorders>
-            <w:tcMar>
-              <w:top w:type="dxa" w:w="60"/>
-              <w:left w:type="dxa" w:w="90"/>
-              <w:bottom w:type="dxa" w:w="60"/>
-              <w:right w:type="dxa" w:w="90"/>
-            </w:tcMar>
-          </w:tcPr>
-          <w:p>
-            <w:pPr>
-              <w:spacing w:after="0" w:line="252"/>
-            </w:pPr>
-            <w:r>
-              <w:rPr>
-                <w:b w:val="false"/>
-                <w:bCs w:val="false"/>
-                <w:color w:val="1E2A32"/>
-                <w:sz w:val="17"/>
-                <w:szCs w:val="17"/>
-              </w:rPr>
-              <w:t xml:space="preserve">12,000</w:t>
+            <w:shd w:fill="EFE7DA" w:color="auto" w:val="clear"/>
+            <w:tcMar>
+              <w:top w:type="dxa" w:w="60"/>
+              <w:left w:type="dxa" w:w="90"/>
+              <w:bottom w:type="dxa" w:w="60"/>
+              <w:right w:type="dxa" w:w="90"/>
+            </w:tcMar>
+          </w:tcPr>
+          <w:p>
+            <w:pPr>
+              <w:spacing w:after="0" w:line="252"/>
+            </w:pPr>
+            <w:r>
+              <w:rPr>
+                <w:b/>
+                <w:bCs/>
+                <w:color w:val="1E2A32"/>
+                <w:sz w:val="17"/>
+                <w:szCs w:val="17"/>
+              </w:rPr>
+              <w:t xml:space="preserve">5,000</w:t>
             </w:r>
           </w:p>
         </w:tc>
@@ -6494,26 +6329,27 @@
               <w:bottom w:val="single" w:color="C9CED2" w:sz="4"/>
               <w:right w:val="single" w:color="C9CED2" w:sz="4"/>
             </w:tcBorders>
-            <w:tcMar>
-              <w:top w:type="dxa" w:w="60"/>
-              <w:left w:type="dxa" w:w="90"/>
-              <w:bottom w:type="dxa" w:w="60"/>
-              <w:right w:type="dxa" w:w="90"/>
-            </w:tcMar>
-          </w:tcPr>
-          <w:p>
-            <w:pPr>
-              <w:spacing w:after="0" w:line="252"/>
-            </w:pPr>
-            <w:r>
-              <w:rPr>
-                <w:b w:val="false"/>
-                <w:bCs w:val="false"/>
-                <w:color w:val="1E2A32"/>
-                <w:sz w:val="17"/>
-                <w:szCs w:val="17"/>
-              </w:rPr>
-              <w:t xml:space="preserve">4.8</w:t>
+            <w:shd w:fill="EFE7DA" w:color="auto" w:val="clear"/>
+            <w:tcMar>
+              <w:top w:type="dxa" w:w="60"/>
+              <w:left w:type="dxa" w:w="90"/>
+              <w:bottom w:type="dxa" w:w="60"/>
+              <w:right w:type="dxa" w:w="90"/>
+            </w:tcMar>
+          </w:tcPr>
+          <w:p>
+            <w:pPr>
+              <w:spacing w:after="0" w:line="252"/>
+            </w:pPr>
+            <w:r>
+              <w:rPr>
+                <w:b/>
+                <w:bCs/>
+                <w:color w:val="1E2A32"/>
+                <w:sz w:val="17"/>
+                <w:szCs w:val="17"/>
+              </w:rPr>
+              <w:t xml:space="preserve">2</w:t>
             </w:r>
           </w:p>
         </w:tc>
@@ -6551,7 +6387,7 @@
                 <w:sz w:val="17"/>
                 <w:szCs w:val="17"/>
               </w:rPr>
-              <w:t xml:space="preserve">TOTAL</w:t>
+              <w:t xml:space="preserve">Subtotal E: contingency</w:t>
             </w:r>
           </w:p>
         </w:tc>
@@ -6607,7 +6443,7 @@
                 <w:sz w:val="17"/>
                 <w:szCs w:val="17"/>
               </w:rPr>
-              <w:t xml:space="preserve">250,000</w:t>
+              <w:t xml:space="preserve">12,000</w:t>
             </w:r>
           </w:p>
         </w:tc>
@@ -6640,6 +6476,133 @@
                 <w:sz w:val="17"/>
                 <w:szCs w:val="17"/>
               </w:rPr>
+              <w:t xml:space="preserve">4.8</w:t>
+            </w:r>
+          </w:p>
+        </w:tc>
+      </w:tr>
+      <w:tr>
+        <w:trPr>
+          <w:cantSplit/>
+        </w:trPr>
+        <w:tc>
+          <w:tcPr>
+            <w:tcW w:type="dxa" w:w="4241"/>
+            <w:tcBorders>
+              <w:top w:val="single" w:color="C9CED2" w:sz="4"/>
+              <w:left w:val="single" w:color="C9CED2" w:sz="4"/>
+              <w:bottom w:val="single" w:color="C9CED2" w:sz="4"/>
+              <w:right w:val="single" w:color="C9CED2" w:sz="4"/>
+            </w:tcBorders>
+            <w:shd w:fill="EFE7DA" w:color="auto" w:val="clear"/>
+            <w:tcMar>
+              <w:top w:type="dxa" w:w="60"/>
+              <w:left w:type="dxa" w:w="90"/>
+              <w:bottom w:type="dxa" w:w="60"/>
+              <w:right w:type="dxa" w:w="90"/>
+            </w:tcMar>
+          </w:tcPr>
+          <w:p>
+            <w:pPr>
+              <w:spacing w:after="0" w:line="252"/>
+            </w:pPr>
+            <w:r>
+              <w:rPr>
+                <w:b/>
+                <w:bCs/>
+                <w:color w:val="1E2A32"/>
+                <w:sz w:val="17"/>
+                <w:szCs w:val="17"/>
+              </w:rPr>
+              <w:t xml:space="preserve">TOTAL</w:t>
+            </w:r>
+          </w:p>
+        </w:tc>
+        <w:tc>
+          <w:tcPr>
+            <w:tcW w:type="dxa" w:w="3084"/>
+            <w:tcBorders>
+              <w:top w:val="single" w:color="C9CED2" w:sz="4"/>
+              <w:left w:val="single" w:color="C9CED2" w:sz="4"/>
+              <w:bottom w:val="single" w:color="C9CED2" w:sz="4"/>
+              <w:right w:val="single" w:color="C9CED2" w:sz="4"/>
+            </w:tcBorders>
+            <w:shd w:fill="EFE7DA" w:color="auto" w:val="clear"/>
+            <w:tcMar>
+              <w:top w:type="dxa" w:w="60"/>
+              <w:left w:type="dxa" w:w="90"/>
+              <w:bottom w:type="dxa" w:w="60"/>
+              <w:right w:type="dxa" w:w="90"/>
+            </w:tcMar>
+          </w:tcPr>
+          <w:p>
+            <w:pPr>
+              <w:spacing w:after="0" w:line="252"/>
+            </w:pPr>
+          </w:p>
+        </w:tc>
+        <w:tc>
+          <w:tcPr>
+            <w:tcW w:type="dxa" w:w="1157"/>
+            <w:tcBorders>
+              <w:top w:val="single" w:color="C9CED2" w:sz="4"/>
+              <w:left w:val="single" w:color="C9CED2" w:sz="4"/>
+              <w:bottom w:val="single" w:color="C9CED2" w:sz="4"/>
+              <w:right w:val="single" w:color="C9CED2" w:sz="4"/>
+            </w:tcBorders>
+            <w:shd w:fill="EFE7DA" w:color="auto" w:val="clear"/>
+            <w:tcMar>
+              <w:top w:type="dxa" w:w="60"/>
+              <w:left w:type="dxa" w:w="90"/>
+              <w:bottom w:type="dxa" w:w="60"/>
+              <w:right w:type="dxa" w:w="90"/>
+            </w:tcMar>
+          </w:tcPr>
+          <w:p>
+            <w:pPr>
+              <w:spacing w:after="0" w:line="252"/>
+            </w:pPr>
+            <w:r>
+              <w:rPr>
+                <w:b/>
+                <w:bCs/>
+                <w:color w:val="1E2A32"/>
+                <w:sz w:val="17"/>
+                <w:szCs w:val="17"/>
+              </w:rPr>
+              <w:t xml:space="preserve">250,000</w:t>
+            </w:r>
+          </w:p>
+        </w:tc>
+        <w:tc>
+          <w:tcPr>
+            <w:tcW w:type="dxa" w:w="1156"/>
+            <w:tcBorders>
+              <w:top w:val="single" w:color="C9CED2" w:sz="4"/>
+              <w:left w:val="single" w:color="C9CED2" w:sz="4"/>
+              <w:bottom w:val="single" w:color="C9CED2" w:sz="4"/>
+              <w:right w:val="single" w:color="C9CED2" w:sz="4"/>
+            </w:tcBorders>
+            <w:shd w:fill="EFE7DA" w:color="auto" w:val="clear"/>
+            <w:tcMar>
+              <w:top w:type="dxa" w:w="60"/>
+              <w:left w:type="dxa" w:w="90"/>
+              <w:bottom w:type="dxa" w:w="60"/>
+              <w:right w:type="dxa" w:w="90"/>
+            </w:tcMar>
+          </w:tcPr>
+          <w:p>
+            <w:pPr>
+              <w:spacing w:after="0" w:line="252"/>
+            </w:pPr>
+            <w:r>
+              <w:rPr>
+                <w:b/>
+                <w:bCs/>
+                <w:color w:val="1E2A32"/>
+                <w:sz w:val="17"/>
+                <w:szCs w:val="17"/>
+              </w:rPr>
               <w:t xml:space="preserve">100</w:t>
             </w:r>
           </w:p>
@@ -6648,8 +6611,26 @@
     </w:tbl>
     <w:p>
       <w:pPr>
-        <w:spacing w:after="160"/>
-      </w:pPr>
+        <w:spacing w:after="240" w:before="60"/>
+      </w:pPr>
+      <w:r>
+        <w:rPr>
+          <w:i/>
+          <w:iCs/>
+          <w:color w:val="5B6770"/>
+          <w:sz w:val="19"/>
+          <w:szCs w:val="19"/>
+        </w:rPr>
+        <w:t xml:space="preserve">Note. </w:t>
+      </w:r>
+      <w:r>
+        <w:rPr>
+          <w:color w:val="5B6770"/>
+          <w:sz w:val="19"/>
+          <w:szCs w:val="19"/>
+        </w:rPr>
+        <w:t xml:space="preserve">Costs informed by Wise (2025), GoTransit (n.d.) and Admetrics (2025); to be confirmed with quotes.</w:t>
+      </w:r>
     </w:p>
     <w:p>
       <w:pPr>
@@ -6664,7 +6645,7 @@
         <w:spacing w:after="160" w:line="288"/>
       </w:pPr>
       <w:r>
-        <w:t xml:space="preserve">Effectiveness means achieving the intended outcomes, not likes (Belch &amp; Belch, 2021). Pre-testing in December 2026 uses concept tests, A/B comparisons of edits and the baseline survey to check comprehension, brand attribution, relevance and the call to action. Because test viewers are made to watch, results are used to choose between executions rather than forecast outcomes. In-flight digital metrics guide reallocation between bursts. Creators are judged on audience fit, credibility, brand lift and tracked action, not followers (Campbell &amp; Farrell, 2020). Each measure in Table 6 maps to one objective, so the evaluation tests the same feel → learn → do logic that built the campaign. Post-testing in April 2027 repeats the survey, uses social listening, checks self-reported visits against store traffic and web analytics, and compares results with a Melbourne control sample. Observational attribution can overstate advertising effects compared with experiments (Gordon et al., 2019), so results will be reported as indicative rather than proven. Unexpected audiences, such as older shoppers responding to outdoor, will be reported as learning rather than noise.</w:t>
+        <w:t xml:space="preserve">Effectiveness means achieving the intended outcomes, not likes (Belch &amp; Belch, 2021). Pre-testing in December 2026 uses concept tests, A/B comparisons of edits and the baseline survey to check comprehension, brand attribution, relevance and the call to action. Because test viewers are made to watch, results are used to choose between executions rather than forecast outcomes. In-flight digital metrics guide reallocation between bursts. Creators are judged on audience fit, credibility, brand lift and tracked action, not followers (Campbell &amp; Farrell, 2020). Each measure in Table 6 maps to one objective, so the evaluation tests the same feel → learn → do logic that built the campaign. Each survey wave samples about 400 Segment A respondents and 150 Melbourne controls. Post-testing in April 2027 repeats the survey, uses social listening, checks self-reported visits against store traffic and web analytics, and compares results with a Melbourne control sample. Observational attribution can overstate advertising effects compared with experiments (Gordon et al., 2019), so results will be reported as indicative rather than proven.</w:t>
       </w:r>
     </w:p>
     <w:p>
@@ -6880,7 +6861,7 @@
                 <w:sz w:val="17"/>
                 <w:szCs w:val="17"/>
               </w:rPr>
-              <w:t xml:space="preserve">O1, O2</w:t>
+              <w:t xml:space="preserve">Pre-test</w:t>
             </w:r>
           </w:p>
         </w:tc>
@@ -6912,7 +6893,7 @@
                 <w:sz w:val="17"/>
                 <w:szCs w:val="17"/>
               </w:rPr>
-              <w:t xml:space="preserve">Survey agreement; UGC and comment sentiment</w:t>
+              <w:t xml:space="preserve">Brand attribution; comprehension</w:t>
             </w:r>
           </w:p>
         </w:tc>
@@ -6944,7 +6925,7 @@
                 <w:sz w:val="17"/>
                 <w:szCs w:val="17"/>
               </w:rPr>
-              <w:t xml:space="preserve">Dec 2026, Apr 2027</w:t>
+              <w:t xml:space="preserve">Dec 2026</w:t>
             </w:r>
           </w:p>
         </w:tc>
@@ -6976,7 +6957,7 @@
                 <w:sz w:val="17"/>
                 <w:szCs w:val="17"/>
               </w:rPr>
-              <w:t xml:space="preserve">≥30%, ≥25%</w:t>
+              <w:t xml:space="preserve">≥60% attribute to Alo</w:t>
             </w:r>
           </w:p>
         </w:tc>
@@ -7014,7 +6995,7 @@
                 <w:sz w:val="17"/>
                 <w:szCs w:val="17"/>
               </w:rPr>
-              <w:t xml:space="preserve">O3</w:t>
+              <w:t xml:space="preserve">Media</w:t>
             </w:r>
           </w:p>
         </w:tc>
@@ -7047,7 +7028,7 @@
                 <w:sz w:val="17"/>
                 <w:szCs w:val="17"/>
               </w:rPr>
-              <w:t xml:space="preserve">Prompted awareness; weekly Google Trends</w:t>
+              <w:t xml:space="preserve">Reach and frequency; retargeting pool</w:t>
             </w:r>
           </w:p>
         </w:tc>
@@ -7080,7 +7061,7 @@
                 <w:sz w:val="17"/>
                 <w:szCs w:val="17"/>
               </w:rPr>
-              <w:t xml:space="preserve">Surveys, weekly</w:t>
+              <w:t xml:space="preserve">Weekly</w:t>
             </w:r>
           </w:p>
         </w:tc>
@@ -7113,7 +7094,7 @@
                 <w:sz w:val="17"/>
                 <w:szCs w:val="17"/>
               </w:rPr>
-              <w:t xml:space="preserve">≥50%</w:t>
+              <w:t xml:space="preserve">70% reach, frequency 4; 20% retargeted</w:t>
             </w:r>
           </w:p>
         </w:tc>
@@ -7150,6 +7131,276 @@
                 <w:sz w:val="17"/>
                 <w:szCs w:val="17"/>
               </w:rPr>
+              <w:t xml:space="preserve">O1, O2</w:t>
+            </w:r>
+          </w:p>
+        </w:tc>
+        <w:tc>
+          <w:tcPr>
+            <w:tcW w:type="dxa" w:w="4241"/>
+            <w:tcBorders>
+              <w:top w:val="single" w:color="C9CED2" w:sz="4"/>
+              <w:left w:val="single" w:color="C9CED2" w:sz="4"/>
+              <w:bottom w:val="single" w:color="C9CED2" w:sz="4"/>
+              <w:right w:val="single" w:color="C9CED2" w:sz="4"/>
+            </w:tcBorders>
+            <w:tcMar>
+              <w:top w:type="dxa" w:w="60"/>
+              <w:left w:type="dxa" w:w="90"/>
+              <w:bottom w:type="dxa" w:w="60"/>
+              <w:right w:type="dxa" w:w="90"/>
+            </w:tcMar>
+          </w:tcPr>
+          <w:p>
+            <w:pPr>
+              <w:spacing w:after="0" w:line="252"/>
+            </w:pPr>
+            <w:r>
+              <w:rPr>
+                <w:b w:val="false"/>
+                <w:bCs w:val="false"/>
+                <w:color w:val="1E2A32"/>
+                <w:sz w:val="17"/>
+                <w:szCs w:val="17"/>
+              </w:rPr>
+              <w:t xml:space="preserve">Survey agreement; UGC and comment sentiment</w:t>
+            </w:r>
+          </w:p>
+        </w:tc>
+        <w:tc>
+          <w:tcPr>
+            <w:tcW w:type="dxa" w:w="2313"/>
+            <w:tcBorders>
+              <w:top w:val="single" w:color="C9CED2" w:sz="4"/>
+              <w:left w:val="single" w:color="C9CED2" w:sz="4"/>
+              <w:bottom w:val="single" w:color="C9CED2" w:sz="4"/>
+              <w:right w:val="single" w:color="C9CED2" w:sz="4"/>
+            </w:tcBorders>
+            <w:tcMar>
+              <w:top w:type="dxa" w:w="60"/>
+              <w:left w:type="dxa" w:w="90"/>
+              <w:bottom w:type="dxa" w:w="60"/>
+              <w:right w:type="dxa" w:w="90"/>
+            </w:tcMar>
+          </w:tcPr>
+          <w:p>
+            <w:pPr>
+              <w:spacing w:after="0" w:line="252"/>
+            </w:pPr>
+            <w:r>
+              <w:rPr>
+                <w:b w:val="false"/>
+                <w:bCs w:val="false"/>
+                <w:color w:val="1E2A32"/>
+                <w:sz w:val="17"/>
+                <w:szCs w:val="17"/>
+              </w:rPr>
+              <w:t xml:space="preserve">Dec 2026, Apr 2027</w:t>
+            </w:r>
+          </w:p>
+        </w:tc>
+        <w:tc>
+          <w:tcPr>
+            <w:tcW w:type="dxa" w:w="1542"/>
+            <w:tcBorders>
+              <w:top w:val="single" w:color="C9CED2" w:sz="4"/>
+              <w:left w:val="single" w:color="C9CED2" w:sz="4"/>
+              <w:bottom w:val="single" w:color="C9CED2" w:sz="4"/>
+              <w:right w:val="single" w:color="C9CED2" w:sz="4"/>
+            </w:tcBorders>
+            <w:tcMar>
+              <w:top w:type="dxa" w:w="60"/>
+              <w:left w:type="dxa" w:w="90"/>
+              <w:bottom w:type="dxa" w:w="60"/>
+              <w:right w:type="dxa" w:w="90"/>
+            </w:tcMar>
+          </w:tcPr>
+          <w:p>
+            <w:pPr>
+              <w:spacing w:after="0" w:line="252"/>
+            </w:pPr>
+            <w:r>
+              <w:rPr>
+                <w:b w:val="false"/>
+                <w:bCs w:val="false"/>
+                <w:color w:val="1E2A32"/>
+                <w:sz w:val="17"/>
+                <w:szCs w:val="17"/>
+              </w:rPr>
+              <w:t xml:space="preserve">≥30%, ≥25%</w:t>
+            </w:r>
+          </w:p>
+        </w:tc>
+      </w:tr>
+      <w:tr>
+        <w:trPr>
+          <w:cantSplit/>
+        </w:trPr>
+        <w:tc>
+          <w:tcPr>
+            <w:tcW w:type="dxa" w:w="1542"/>
+            <w:tcBorders>
+              <w:top w:val="single" w:color="C9CED2" w:sz="4"/>
+              <w:left w:val="single" w:color="C9CED2" w:sz="4"/>
+              <w:bottom w:val="single" w:color="C9CED2" w:sz="4"/>
+              <w:right w:val="single" w:color="C9CED2" w:sz="4"/>
+            </w:tcBorders>
+            <w:shd w:fill="F7F5F1" w:color="auto" w:val="clear"/>
+            <w:tcMar>
+              <w:top w:type="dxa" w:w="60"/>
+              <w:left w:type="dxa" w:w="90"/>
+              <w:bottom w:type="dxa" w:w="60"/>
+              <w:right w:type="dxa" w:w="90"/>
+            </w:tcMar>
+          </w:tcPr>
+          <w:p>
+            <w:pPr>
+              <w:spacing w:after="0" w:line="252"/>
+            </w:pPr>
+            <w:r>
+              <w:rPr>
+                <w:b/>
+                <w:bCs/>
+                <w:color w:val="1E2A32"/>
+                <w:sz w:val="17"/>
+                <w:szCs w:val="17"/>
+              </w:rPr>
+              <w:t xml:space="preserve">O3</w:t>
+            </w:r>
+          </w:p>
+        </w:tc>
+        <w:tc>
+          <w:tcPr>
+            <w:tcW w:type="dxa" w:w="4241"/>
+            <w:tcBorders>
+              <w:top w:val="single" w:color="C9CED2" w:sz="4"/>
+              <w:left w:val="single" w:color="C9CED2" w:sz="4"/>
+              <w:bottom w:val="single" w:color="C9CED2" w:sz="4"/>
+              <w:right w:val="single" w:color="C9CED2" w:sz="4"/>
+            </w:tcBorders>
+            <w:shd w:fill="F7F5F1" w:color="auto" w:val="clear"/>
+            <w:tcMar>
+              <w:top w:type="dxa" w:w="60"/>
+              <w:left w:type="dxa" w:w="90"/>
+              <w:bottom w:type="dxa" w:w="60"/>
+              <w:right w:type="dxa" w:w="90"/>
+            </w:tcMar>
+          </w:tcPr>
+          <w:p>
+            <w:pPr>
+              <w:spacing w:after="0" w:line="252"/>
+            </w:pPr>
+            <w:r>
+              <w:rPr>
+                <w:b w:val="false"/>
+                <w:bCs w:val="false"/>
+                <w:color w:val="1E2A32"/>
+                <w:sz w:val="17"/>
+                <w:szCs w:val="17"/>
+              </w:rPr>
+              <w:t xml:space="preserve">Prompted awareness; weekly Google Trends</w:t>
+            </w:r>
+          </w:p>
+        </w:tc>
+        <w:tc>
+          <w:tcPr>
+            <w:tcW w:type="dxa" w:w="2313"/>
+            <w:tcBorders>
+              <w:top w:val="single" w:color="C9CED2" w:sz="4"/>
+              <w:left w:val="single" w:color="C9CED2" w:sz="4"/>
+              <w:bottom w:val="single" w:color="C9CED2" w:sz="4"/>
+              <w:right w:val="single" w:color="C9CED2" w:sz="4"/>
+            </w:tcBorders>
+            <w:shd w:fill="F7F5F1" w:color="auto" w:val="clear"/>
+            <w:tcMar>
+              <w:top w:type="dxa" w:w="60"/>
+              <w:left w:type="dxa" w:w="90"/>
+              <w:bottom w:type="dxa" w:w="60"/>
+              <w:right w:type="dxa" w:w="90"/>
+            </w:tcMar>
+          </w:tcPr>
+          <w:p>
+            <w:pPr>
+              <w:spacing w:after="0" w:line="252"/>
+            </w:pPr>
+            <w:r>
+              <w:rPr>
+                <w:b w:val="false"/>
+                <w:bCs w:val="false"/>
+                <w:color w:val="1E2A32"/>
+                <w:sz w:val="17"/>
+                <w:szCs w:val="17"/>
+              </w:rPr>
+              <w:t xml:space="preserve">Surveys, weekly</w:t>
+            </w:r>
+          </w:p>
+        </w:tc>
+        <w:tc>
+          <w:tcPr>
+            <w:tcW w:type="dxa" w:w="1542"/>
+            <w:tcBorders>
+              <w:top w:val="single" w:color="C9CED2" w:sz="4"/>
+              <w:left w:val="single" w:color="C9CED2" w:sz="4"/>
+              <w:bottom w:val="single" w:color="C9CED2" w:sz="4"/>
+              <w:right w:val="single" w:color="C9CED2" w:sz="4"/>
+            </w:tcBorders>
+            <w:shd w:fill="F7F5F1" w:color="auto" w:val="clear"/>
+            <w:tcMar>
+              <w:top w:type="dxa" w:w="60"/>
+              <w:left w:type="dxa" w:w="90"/>
+              <w:bottom w:type="dxa" w:w="60"/>
+              <w:right w:type="dxa" w:w="90"/>
+            </w:tcMar>
+          </w:tcPr>
+          <w:p>
+            <w:pPr>
+              <w:spacing w:after="0" w:line="252"/>
+            </w:pPr>
+            <w:r>
+              <w:rPr>
+                <w:b w:val="false"/>
+                <w:bCs w:val="false"/>
+                <w:color w:val="1E2A32"/>
+                <w:sz w:val="17"/>
+                <w:szCs w:val="17"/>
+              </w:rPr>
+              <w:t xml:space="preserve">≥50%</w:t>
+            </w:r>
+          </w:p>
+        </w:tc>
+      </w:tr>
+      <w:tr>
+        <w:trPr>
+          <w:cantSplit/>
+        </w:trPr>
+        <w:tc>
+          <w:tcPr>
+            <w:tcW w:type="dxa" w:w="1542"/>
+            <w:tcBorders>
+              <w:top w:val="single" w:color="C9CED2" w:sz="4"/>
+              <w:left w:val="single" w:color="C9CED2" w:sz="4"/>
+              <w:bottom w:val="single" w:color="C9CED2" w:sz="4"/>
+              <w:right w:val="single" w:color="C9CED2" w:sz="4"/>
+            </w:tcBorders>
+            <w:tcMar>
+              <w:top w:type="dxa" w:w="60"/>
+              <w:left w:type="dxa" w:w="90"/>
+              <w:bottom w:type="dxa" w:w="60"/>
+              <w:right w:type="dxa" w:w="90"/>
+            </w:tcMar>
+          </w:tcPr>
+          <w:p>
+            <w:pPr>
+              <w:spacing w:after="0" w:line="252"/>
+            </w:pPr>
+            <w:r>
+              <w:rPr>
+                <w:b/>
+                <w:bCs/>
+                <w:color w:val="1E2A32"/>
+                <w:sz w:val="17"/>
+                <w:szCs w:val="17"/>
+              </w:rPr>
               <w:t xml:space="preserve">O4</w:t>
             </w:r>
           </w:p>
@@ -7270,7 +7521,7 @@
         <w:spacing w:after="160" w:line="288"/>
       </w:pPr>
       <w:r>
-        <w:t xml:space="preserve">Alo arrived in Sydney with a famous name but little local meaning. Every pillar, source, channel and burst in this brief answers a diagnosed challenge, with one message adapted to every channel but never changed: one set, made for the whole Sydney day.</w:t>
+        <w:t xml:space="preserve">Every pillar, source, channel and burst answers a diagnosed challenge, with one message adapted to every channel but never changed: one set, made for the whole Sydney day. AI use in preparing this report is disclosed in Appendix H.</w:t>
       </w:r>
     </w:p>
     <w:p>
@@ -7296,7 +7547,7 @@
           <w:sz w:val="21"/>
           <w:szCs w:val="21"/>
         </w:rPr>
-        <w:t xml:space="preserve">Australian Association of National Advertisers. (2021). </w:t>
+        <w:t xml:space="preserve">Admetrics. (2025). </w:t>
       </w:r>
       <w:r>
         <w:rPr>
@@ -7305,14 +7556,14 @@
           <w:sz w:val="21"/>
           <w:szCs w:val="21"/>
         </w:rPr>
-        <w:t xml:space="preserve">AANA code of ethics</w:t>
-      </w:r>
-      <w:r>
-        <w:rPr>
-          <w:sz w:val="21"/>
-          <w:szCs w:val="21"/>
-        </w:rPr>
-        <w:t xml:space="preserve">. https://aana.com.au/self-regulation/codes-guidelines/code-of-ethics/</w:t>
+        <w:t xml:space="preserve">Instagram ads costs: Complete 2025 pricing guide</w:t>
+      </w:r>
+      <w:r>
+        <w:rPr>
+          <w:sz w:val="21"/>
+          <w:szCs w:val="21"/>
+        </w:rPr>
+        <w:t xml:space="preserve">. https://admetrics.io/en/post/instagram-ads-costs-complete-2025-pricing-guide</w:t>
       </w:r>
     </w:p>
     <w:p>
@@ -7325,7 +7576,7 @@
           <w:sz w:val="21"/>
           <w:szCs w:val="21"/>
         </w:rPr>
-        <w:t xml:space="preserve">Australian Competition and Consumer Commission. (2021, July 23). </w:t>
+        <w:t xml:space="preserve">Australian Association of National Advertisers. (2021). </w:t>
       </w:r>
       <w:r>
         <w:rPr>
@@ -7334,14 +7585,14 @@
           <w:sz w:val="21"/>
           <w:szCs w:val="21"/>
         </w:rPr>
-        <w:t xml:space="preserve">Lorna Jane pays $5 million over false 'anti-virus activewear' claims</w:t>
-      </w:r>
-      <w:r>
-        <w:rPr>
-          <w:sz w:val="21"/>
-          <w:szCs w:val="21"/>
-        </w:rPr>
-        <w:t xml:space="preserve"> [Media release]. https://www.accc.gov.au/media-release/lorna-jane-pays-5-million-over-false-anti-virus-activewear-claims</w:t>
+        <w:t xml:space="preserve">AANA code of ethics</w:t>
+      </w:r>
+      <w:r>
+        <w:rPr>
+          <w:sz w:val="21"/>
+          <w:szCs w:val="21"/>
+        </w:rPr>
+        <w:t xml:space="preserve">. https://aana.com.au/self-regulation/codes-guidelines/code-of-ethics/</w:t>
       </w:r>
     </w:p>
     <w:p>
@@ -7354,7 +7605,7 @@
           <w:sz w:val="21"/>
           <w:szCs w:val="21"/>
         </w:rPr>
-        <w:t xml:space="preserve">Australian Competition and Consumer Commission. (2023, December). </w:t>
+        <w:t xml:space="preserve">Australian Competition and Consumer Commission. (2021, July 23). </w:t>
       </w:r>
       <w:r>
         <w:rPr>
@@ -7363,14 +7614,14 @@
           <w:sz w:val="21"/>
           <w:szCs w:val="21"/>
         </w:rPr>
-        <w:t xml:space="preserve">Scrutiny of influencers and businesses for misleading advertising and online reviews continues</w:t>
-      </w:r>
-      <w:r>
-        <w:rPr>
-          <w:sz w:val="21"/>
-          <w:szCs w:val="21"/>
-        </w:rPr>
-        <w:t xml:space="preserve"> [Media release]. https://www.accc.gov.au/media-release/scrutiny-of-influencers-and-businesses-for-misleading-advertising-and-online-reviews-continues</w:t>
+        <w:t xml:space="preserve">Lorna Jane pays $5 million over false 'anti-virus activewear' claims</w:t>
+      </w:r>
+      <w:r>
+        <w:rPr>
+          <w:sz w:val="21"/>
+          <w:szCs w:val="21"/>
+        </w:rPr>
+        <w:t xml:space="preserve"> [Media release]. https://www.accc.gov.au/media-release/lorna-jane-pays-5-million-over-false-anti-virus-activewear-claims</w:t>
       </w:r>
     </w:p>
     <w:p>
@@ -7383,7 +7634,7 @@
           <w:sz w:val="21"/>
           <w:szCs w:val="21"/>
         </w:rPr>
-        <w:t xml:space="preserve">Batra, R., &amp; Keller, K. L. (2016). Integrating marketing communications: New findings, new lessons, and new ideas. </w:t>
+        <w:t xml:space="preserve">Australian Competition and Consumer Commission. (2023, December). </w:t>
       </w:r>
       <w:r>
         <w:rPr>
@@ -7392,14 +7643,14 @@
           <w:sz w:val="21"/>
           <w:szCs w:val="21"/>
         </w:rPr>
-        <w:t xml:space="preserve">Journal of Marketing, 80</w:t>
-      </w:r>
-      <w:r>
-        <w:rPr>
-          <w:sz w:val="21"/>
-          <w:szCs w:val="21"/>
-        </w:rPr>
-        <w:t xml:space="preserve">(6), 122–145. https://doi.org/10.1509/jm.15.0419</w:t>
+        <w:t xml:space="preserve">Scrutiny of influencers and businesses for misleading advertising and online reviews continues</w:t>
+      </w:r>
+      <w:r>
+        <w:rPr>
+          <w:sz w:val="21"/>
+          <w:szCs w:val="21"/>
+        </w:rPr>
+        <w:t xml:space="preserve"> [Media release]. https://www.accc.gov.au/media-release/scrutiny-of-influencers-and-businesses-for-misleading-advertising-and-online-reviews-continues</w:t>
       </w:r>
     </w:p>
     <w:p>
@@ -7412,7 +7663,7 @@
           <w:sz w:val="21"/>
           <w:szCs w:val="21"/>
         </w:rPr>
-        <w:t xml:space="preserve">Belch, G. E., &amp; Belch, M. A. (2021). </w:t>
+        <w:t xml:space="preserve">Batra, R., &amp; Keller, K. L. (2016). Integrating marketing communications: New findings, new lessons, and new ideas. </w:t>
       </w:r>
       <w:r>
         <w:rPr>
@@ -7421,14 +7672,14 @@
           <w:sz w:val="21"/>
           <w:szCs w:val="21"/>
         </w:rPr>
-        <w:t xml:space="preserve">Advertising and promotion: An integrated marketing communications perspective</w:t>
-      </w:r>
-      <w:r>
-        <w:rPr>
-          <w:sz w:val="21"/>
-          <w:szCs w:val="21"/>
-        </w:rPr>
-        <w:t xml:space="preserve"> (12th ed.). McGraw-Hill Education.</w:t>
+        <w:t xml:space="preserve">Journal of Marketing, 80</w:t>
+      </w:r>
+      <w:r>
+        <w:rPr>
+          <w:sz w:val="21"/>
+          <w:szCs w:val="21"/>
+        </w:rPr>
+        <w:t xml:space="preserve">(6), 122–145. https://doi.org/10.1509/jm.15.0419</w:t>
       </w:r>
     </w:p>
     <w:p>
@@ -7441,7 +7692,7 @@
           <w:sz w:val="21"/>
           <w:szCs w:val="21"/>
         </w:rPr>
-        <w:t xml:space="preserve">Belk, R. W. (1988). Possessions and the extended self. </w:t>
+        <w:t xml:space="preserve">Belch, G. E., &amp; Belch, M. A. (2021). </w:t>
       </w:r>
       <w:r>
         <w:rPr>
@@ -7450,14 +7701,14 @@
           <w:sz w:val="21"/>
           <w:szCs w:val="21"/>
         </w:rPr>
-        <w:t xml:space="preserve">Journal of Consumer Research, 15</w:t>
-      </w:r>
-      <w:r>
-        <w:rPr>
-          <w:sz w:val="21"/>
-          <w:szCs w:val="21"/>
-        </w:rPr>
-        <w:t xml:space="preserve">(2), 139–168. https://doi.org/10.1086/209154</w:t>
+        <w:t xml:space="preserve">Advertising and promotion: An integrated marketing communications perspective</w:t>
+      </w:r>
+      <w:r>
+        <w:rPr>
+          <w:sz w:val="21"/>
+          <w:szCs w:val="21"/>
+        </w:rPr>
+        <w:t xml:space="preserve"> (12th ed.). McGraw-Hill Education.</w:t>
       </w:r>
     </w:p>
     <w:p>
@@ -7470,7 +7721,7 @@
           <w:sz w:val="21"/>
           <w:szCs w:val="21"/>
         </w:rPr>
-        <w:t xml:space="preserve">Camacho-Miñano, M. J., MacIsaac, S., &amp; Rich, E. (2019). Postfeminist biopedagogies of Instagram: Young women learning about bodies, health and fitness. </w:t>
+        <w:t xml:space="preserve">Belk, R. W. (1988). Possessions and the extended self. </w:t>
       </w:r>
       <w:r>
         <w:rPr>
@@ -7479,14 +7730,14 @@
           <w:sz w:val="21"/>
           <w:szCs w:val="21"/>
         </w:rPr>
-        <w:t xml:space="preserve">Sport, Education and Society, 24</w:t>
-      </w:r>
-      <w:r>
-        <w:rPr>
-          <w:sz w:val="21"/>
-          <w:szCs w:val="21"/>
-        </w:rPr>
-        <w:t xml:space="preserve">(6), 651–664. https://doi.org/10.1080/13573322.2019.1613975</w:t>
+        <w:t xml:space="preserve">Journal of Consumer Research, 15</w:t>
+      </w:r>
+      <w:r>
+        <w:rPr>
+          <w:sz w:val="21"/>
+          <w:szCs w:val="21"/>
+        </w:rPr>
+        <w:t xml:space="preserve">(2), 139–168. https://doi.org/10.1086/209154</w:t>
       </w:r>
     </w:p>
     <w:p>
@@ -7499,7 +7750,7 @@
           <w:sz w:val="21"/>
           <w:szCs w:val="21"/>
         </w:rPr>
-        <w:t xml:space="preserve">Cameron, G. T. (1994). Does publicity outperform advertising? An experimental test of the third-party endorsement. </w:t>
+        <w:t xml:space="preserve">Camacho-Miñano, M. J., MacIsaac, S., &amp; Rich, E. (2019). Postfeminist biopedagogies of Instagram: Young women learning about bodies, health and fitness. </w:t>
       </w:r>
       <w:r>
         <w:rPr>
@@ -7508,14 +7759,14 @@
           <w:sz w:val="21"/>
           <w:szCs w:val="21"/>
         </w:rPr>
-        <w:t xml:space="preserve">Journal of Public Relations Research, 6</w:t>
-      </w:r>
-      <w:r>
-        <w:rPr>
-          <w:sz w:val="21"/>
-          <w:szCs w:val="21"/>
-        </w:rPr>
-        <w:t xml:space="preserve">(3), 185–207. https://doi.org/10.1207/s1532754xjprr0603_02</w:t>
+        <w:t xml:space="preserve">Sport, Education and Society, 24</w:t>
+      </w:r>
+      <w:r>
+        <w:rPr>
+          <w:sz w:val="21"/>
+          <w:szCs w:val="21"/>
+        </w:rPr>
+        <w:t xml:space="preserve">(6), 651–664. https://doi.org/10.1080/13573322.2019.1613975</w:t>
       </w:r>
     </w:p>
     <w:p>
@@ -7528,7 +7779,7 @@
           <w:sz w:val="21"/>
           <w:szCs w:val="21"/>
         </w:rPr>
-        <w:t xml:space="preserve">Campbell, C., &amp; Farrell, J. R. (2020). More than meets the eye: The functional components underlying influencer marketing. </w:t>
+        <w:t xml:space="preserve">Cameron, G. T. (1994). Does publicity outperform advertising? An experimental test of the third-party endorsement. </w:t>
       </w:r>
       <w:r>
         <w:rPr>
@@ -7537,14 +7788,14 @@
           <w:sz w:val="21"/>
           <w:szCs w:val="21"/>
         </w:rPr>
-        <w:t xml:space="preserve">Business Horizons, 63</w:t>
-      </w:r>
-      <w:r>
-        <w:rPr>
-          <w:sz w:val="21"/>
-          <w:szCs w:val="21"/>
-        </w:rPr>
-        <w:t xml:space="preserve">(4), 469–479. https://doi.org/10.1016/j.bushor.2020.03.003</w:t>
+        <w:t xml:space="preserve">Journal of Public Relations Research, 6</w:t>
+      </w:r>
+      <w:r>
+        <w:rPr>
+          <w:sz w:val="21"/>
+          <w:szCs w:val="21"/>
+        </w:rPr>
+        <w:t xml:space="preserve">(3), 185–207. https://doi.org/10.1207/s1532754xjprr0603_02</w:t>
       </w:r>
     </w:p>
     <w:p>
@@ -7557,23 +7808,7 @@
           <w:sz w:val="21"/>
           <w:szCs w:val="21"/>
         </w:rPr>
-        <w:t xml:space="preserve">Chadwick, </w:t>
-      </w:r>
-      <w:r>
-        <w:rPr>
-          <w:sz w:val="21"/>
-          <w:szCs w:val="21"/>
-          <w:highlight w:val="yellow"/>
-          <w:highlightCs w:val="yellow"/>
-        </w:rPr>
-        <w:t xml:space="preserve">[Initial]</w:t>
-      </w:r>
-      <w:r>
-        <w:rPr>
-          <w:sz w:val="21"/>
-          <w:szCs w:val="21"/>
-        </w:rPr>
-        <w:t xml:space="preserve">. (2025a). Lorna Jane's profit doubles thanks to strong demand for athletic clothing. </w:t>
+        <w:t xml:space="preserve">Campbell, C., &amp; Farrell, J. R. (2020). More than meets the eye: The functional components underlying influencer marketing. </w:t>
       </w:r>
       <w:r>
         <w:rPr>
@@ -7582,14 +7817,14 @@
           <w:sz w:val="21"/>
           <w:szCs w:val="21"/>
         </w:rPr>
-        <w:t xml:space="preserve">Inside Retail</w:t>
-      </w:r>
-      <w:r>
-        <w:rPr>
-          <w:sz w:val="21"/>
-          <w:szCs w:val="21"/>
-        </w:rPr>
-        <w:t xml:space="preserve">. https://insideretail.com.au/business/lorna-janes-profit-doubles-thanks-to-strong-demand-for-athletic-clothing-202501</w:t>
+        <w:t xml:space="preserve">Business Horizons, 63</w:t>
+      </w:r>
+      <w:r>
+        <w:rPr>
+          <w:sz w:val="21"/>
+          <w:szCs w:val="21"/>
+        </w:rPr>
+        <w:t xml:space="preserve">(4), 469–479. https://doi.org/10.1016/j.bushor.2020.03.003</w:t>
       </w:r>
     </w:p>
     <w:p>
@@ -7602,39 +7837,7 @@
           <w:sz w:val="21"/>
           <w:szCs w:val="21"/>
         </w:rPr>
-        <w:t xml:space="preserve">Chadwick, </w:t>
-      </w:r>
-      <w:r>
-        <w:rPr>
-          <w:sz w:val="21"/>
-          <w:szCs w:val="21"/>
-          <w:highlight w:val="yellow"/>
-          <w:highlightCs w:val="yellow"/>
-        </w:rPr>
-        <w:t xml:space="preserve">[Initial]</w:t>
-      </w:r>
-      <w:r>
-        <w:rPr>
-          <w:sz w:val="21"/>
-          <w:szCs w:val="21"/>
-        </w:rPr>
-        <w:t xml:space="preserve">. (2025b). </w:t>
-      </w:r>
-      <w:r>
-        <w:rPr>
-          <w:sz w:val="21"/>
-          <w:szCs w:val="21"/>
-          <w:highlight w:val="yellow"/>
-          <w:highlightCs w:val="yellow"/>
-        </w:rPr>
-        <w:t xml:space="preserve">[Article title]</w:t>
-      </w:r>
-      <w:r>
-        <w:rPr>
-          <w:sz w:val="21"/>
-          <w:szCs w:val="21"/>
-        </w:rPr>
-        <w:t xml:space="preserve">. </w:t>
+        <w:t xml:space="preserve">Colley, R. H. (1961). </w:t>
       </w:r>
       <w:r>
         <w:rPr>
@@ -7642,26 +7845,15 @@
           <w:iCs/>
           <w:sz w:val="21"/>
           <w:szCs w:val="21"/>
-          <w:highlight w:val="yellow"/>
-          <w:highlightCs w:val="yellow"/>
-        </w:rPr>
-        <w:t xml:space="preserve">[Publication]</w:t>
-      </w:r>
-      <w:r>
-        <w:rPr>
-          <w:sz w:val="21"/>
-          <w:szCs w:val="21"/>
-        </w:rPr>
-        <w:t xml:space="preserve">. </w:t>
-      </w:r>
-      <w:r>
-        <w:rPr>
-          <w:sz w:val="21"/>
-          <w:szCs w:val="21"/>
-          <w:highlight w:val="yellow"/>
-          <w:highlightCs w:val="yellow"/>
-        </w:rPr>
-        <w:t xml:space="preserve">[URL]</w:t>
+        </w:rPr>
+        <w:t xml:space="preserve">Defining advertising goals for measured advertising results</w:t>
+      </w:r>
+      <w:r>
+        <w:rPr>
+          <w:sz w:val="21"/>
+          <w:szCs w:val="21"/>
+        </w:rPr>
+        <w:t xml:space="preserve">. Association of National Advertisers.</w:t>
       </w:r>
     </w:p>
     <w:p>
@@ -7674,7 +7866,7 @@
           <w:sz w:val="21"/>
           <w:szCs w:val="21"/>
         </w:rPr>
-        <w:t xml:space="preserve">Colley, R. H. (1961). </w:t>
+        <w:t xml:space="preserve">Concrete Playground. (2026, September 15). </w:t>
       </w:r>
       <w:r>
         <w:rPr>
@@ -7683,14 +7875,14 @@
           <w:sz w:val="21"/>
           <w:szCs w:val="21"/>
         </w:rPr>
-        <w:t xml:space="preserve">Defining advertising goals for measured advertising results</w:t>
-      </w:r>
-      <w:r>
-        <w:rPr>
-          <w:sz w:val="21"/>
-          <w:szCs w:val="21"/>
-        </w:rPr>
-        <w:t xml:space="preserve">. Association of National Advertisers.</w:t>
+        <w:t xml:space="preserve">Now open: Cult LA activewear brand Alo has opened a store in the heart of Sydney's CBD at The Galeries</w:t>
+      </w:r>
+      <w:r>
+        <w:rPr>
+          <w:sz w:val="21"/>
+          <w:szCs w:val="21"/>
+        </w:rPr>
+        <w:t xml:space="preserve">. https://concreteplayground.com/sydney/?p=1144787</w:t>
       </w:r>
     </w:p>
     <w:p>
@@ -7703,7 +7895,7 @@
           <w:sz w:val="21"/>
           <w:szCs w:val="21"/>
         </w:rPr>
-        <w:t xml:space="preserve">Concrete Playground. (2026, September 15). </w:t>
+        <w:t xml:space="preserve">Court, D., Elzinga, D., Mulder, S., &amp; Vetvik, O. J. (2009). The consumer decision journey. </w:t>
       </w:r>
       <w:r>
         <w:rPr>
@@ -7712,14 +7904,14 @@
           <w:sz w:val="21"/>
           <w:szCs w:val="21"/>
         </w:rPr>
-        <w:t xml:space="preserve">Now open: Cult LA activewear brand Alo has opened a store in the heart of Sydney's CBD at The Galeries</w:t>
-      </w:r>
-      <w:r>
-        <w:rPr>
-          <w:sz w:val="21"/>
-          <w:szCs w:val="21"/>
-        </w:rPr>
-        <w:t xml:space="preserve">. https://concreteplayground.com/sydney/?p=1144787</w:t>
+        <w:t xml:space="preserve">McKinsey Quarterly</w:t>
+      </w:r>
+      <w:r>
+        <w:rPr>
+          <w:sz w:val="21"/>
+          <w:szCs w:val="21"/>
+        </w:rPr>
+        <w:t xml:space="preserve">, (3), 96–107.</w:t>
       </w:r>
     </w:p>
     <w:p>
@@ -7732,7 +7924,7 @@
           <w:sz w:val="21"/>
           <w:szCs w:val="21"/>
         </w:rPr>
-        <w:t xml:space="preserve">Court, D., Elzinga, D., Mulder, S., &amp; Vetvik, O. J. (2009). The consumer decision journey. </w:t>
+        <w:t xml:space="preserve">De Veirman, M., Cauberghe, V., &amp; Hudders, L. (2017). Marketing through Instagram influencers: The impact of number of followers and product divergence on brand attitude. </w:t>
       </w:r>
       <w:r>
         <w:rPr>
@@ -7741,14 +7933,14 @@
           <w:sz w:val="21"/>
           <w:szCs w:val="21"/>
         </w:rPr>
-        <w:t xml:space="preserve">McKinsey Quarterly</w:t>
-      </w:r>
-      <w:r>
-        <w:rPr>
-          <w:sz w:val="21"/>
-          <w:szCs w:val="21"/>
-        </w:rPr>
-        <w:t xml:space="preserve">, (3), 96–107.</w:t>
+        <w:t xml:space="preserve">International Journal of Advertising, 36</w:t>
+      </w:r>
+      <w:r>
+        <w:rPr>
+          <w:sz w:val="21"/>
+          <w:szCs w:val="21"/>
+        </w:rPr>
+        <w:t xml:space="preserve">(5), 798–828. https://doi.org/10.1080/02650487.2017.1348035</w:t>
       </w:r>
     </w:p>
     <w:p>
@@ -7761,23 +7953,7 @@
           <w:sz w:val="21"/>
           <w:szCs w:val="21"/>
         </w:rPr>
-        <w:t xml:space="preserve">Danziger, P. N. (2026). </w:t>
-      </w:r>
-      <w:r>
-        <w:rPr>
-          <w:sz w:val="21"/>
-          <w:szCs w:val="21"/>
-          <w:highlight w:val="yellow"/>
-          <w:highlightCs w:val="yellow"/>
-        </w:rPr>
-        <w:t xml:space="preserve">[Article title]</w:t>
-      </w:r>
-      <w:r>
-        <w:rPr>
-          <w:sz w:val="21"/>
-          <w:szCs w:val="21"/>
-        </w:rPr>
-        <w:t xml:space="preserve">. </w:t>
+        <w:t xml:space="preserve">Deloitte. (2026). </w:t>
       </w:r>
       <w:r>
         <w:rPr>
@@ -7786,23 +7962,14 @@
           <w:sz w:val="21"/>
           <w:szCs w:val="21"/>
         </w:rPr>
-        <w:t xml:space="preserve">Forbes</w:t>
-      </w:r>
-      <w:r>
-        <w:rPr>
-          <w:sz w:val="21"/>
-          <w:szCs w:val="21"/>
-        </w:rPr>
-        <w:t xml:space="preserve">. </w:t>
-      </w:r>
-      <w:r>
-        <w:rPr>
-          <w:sz w:val="21"/>
-          <w:szCs w:val="21"/>
-          <w:highlight w:val="yellow"/>
-          <w:highlightCs w:val="yellow"/>
-        </w:rPr>
-        <w:t xml:space="preserve">[URL]</w:t>
+        <w:t xml:space="preserve">2026 Gen Z and millennial survey</w:t>
+      </w:r>
+      <w:r>
+        <w:rPr>
+          <w:sz w:val="21"/>
+          <w:szCs w:val="21"/>
+        </w:rPr>
+        <w:t xml:space="preserve">. https://www.deloitte.com/global/en/issues/work/genz-millennial-survey.html</w:t>
       </w:r>
     </w:p>
     <w:p>
@@ -7815,7 +7982,7 @@
           <w:sz w:val="21"/>
           <w:szCs w:val="21"/>
         </w:rPr>
-        <w:t xml:space="preserve">De Veirman, M., Cauberghe, V., &amp; Hudders, L. (2017). Marketing through Instagram influencers: The impact of number of followers and product divergence on brand attitude. </w:t>
+        <w:t xml:space="preserve">Escalas, J. E., &amp; Bettman, J. R. (2005). Self-construal, reference groups, and brand meaning. </w:t>
       </w:r>
       <w:r>
         <w:rPr>
@@ -7824,14 +7991,14 @@
           <w:sz w:val="21"/>
           <w:szCs w:val="21"/>
         </w:rPr>
-        <w:t xml:space="preserve">International Journal of Advertising, 36</w:t>
-      </w:r>
-      <w:r>
-        <w:rPr>
-          <w:sz w:val="21"/>
-          <w:szCs w:val="21"/>
-        </w:rPr>
-        <w:t xml:space="preserve">(5), 798–828. https://doi.org/10.1080/02650487.2017.1348035</w:t>
+        <w:t xml:space="preserve">Journal of Consumer Research, 32</w:t>
+      </w:r>
+      <w:r>
+        <w:rPr>
+          <w:sz w:val="21"/>
+          <w:szCs w:val="21"/>
+        </w:rPr>
+        <w:t xml:space="preserve">(3), 378–389. https://doi.org/10.1086/497549</w:t>
       </w:r>
     </w:p>
     <w:p>
@@ -7844,7 +8011,7 @@
           <w:sz w:val="21"/>
           <w:szCs w:val="21"/>
         </w:rPr>
-        <w:t xml:space="preserve">Deloitte. (2026). </w:t>
+        <w:t xml:space="preserve">Francis, T., &amp; Hoefel, F. (2018, November 12). </w:t>
       </w:r>
       <w:r>
         <w:rPr>
@@ -7853,14 +8020,14 @@
           <w:sz w:val="21"/>
           <w:szCs w:val="21"/>
         </w:rPr>
-        <w:t xml:space="preserve">2026 Gen Z and millennial survey</w:t>
-      </w:r>
-      <w:r>
-        <w:rPr>
-          <w:sz w:val="21"/>
-          <w:szCs w:val="21"/>
-        </w:rPr>
-        <w:t xml:space="preserve">. https://www.deloitte.com/global/en/issues/work/genz-millennial-survey.html</w:t>
+        <w:t xml:space="preserve">'True Gen': Generation Z and its implications for companies</w:t>
+      </w:r>
+      <w:r>
+        <w:rPr>
+          <w:sz w:val="21"/>
+          <w:szCs w:val="21"/>
+        </w:rPr>
+        <w:t xml:space="preserve">. McKinsey &amp; Company. https://www.mckinsey.com/industries/consumer-packaged-goods/our-insights/true-gen-generation-z-and-its-implications-for-companies</w:t>
       </w:r>
     </w:p>
     <w:p>
@@ -7873,7 +8040,7 @@
           <w:sz w:val="21"/>
           <w:szCs w:val="21"/>
         </w:rPr>
-        <w:t xml:space="preserve">Escalas, J. E., &amp; Bettman, J. R. (2005). Self-construal, reference groups, and brand meaning. </w:t>
+        <w:t xml:space="preserve">Google Trends. (2026). </w:t>
       </w:r>
       <w:r>
         <w:rPr>
@@ -7882,14 +8049,14 @@
           <w:sz w:val="21"/>
           <w:szCs w:val="21"/>
         </w:rPr>
-        <w:t xml:space="preserve">Journal of Consumer Research, 32</w:t>
-      </w:r>
-      <w:r>
-        <w:rPr>
-          <w:sz w:val="21"/>
-          <w:szCs w:val="21"/>
-        </w:rPr>
-        <w:t xml:space="preserve">(3), 378–389. https://doi.org/10.1086/497549</w:t>
+        <w:t xml:space="preserve">Lorna Jane, Lululemon and Alo Yoga (topics): Interest over time, New South Wales, 2026</w:t>
+      </w:r>
+      <w:r>
+        <w:rPr>
+          <w:sz w:val="21"/>
+          <w:szCs w:val="21"/>
+        </w:rPr>
+        <w:t xml:space="preserve"> [Data set]. Google. Retrieved October 28, 2026, from https://trends.google.com/trends/</w:t>
       </w:r>
     </w:p>
     <w:p>
@@ -7902,7 +8069,7 @@
           <w:sz w:val="21"/>
           <w:szCs w:val="21"/>
         </w:rPr>
-        <w:t xml:space="preserve">Francis, T., &amp; Hoefel, F. (2018, November 12). </w:t>
+        <w:t xml:space="preserve">Gordon, B. R., Zettelmeyer, F., Bhargava, N., &amp; Chapsky, D. (2019). A comparison of approaches to advertising measurement: Evidence from big field experiments at Facebook. </w:t>
       </w:r>
       <w:r>
         <w:rPr>
@@ -7911,14 +8078,14 @@
           <w:sz w:val="21"/>
           <w:szCs w:val="21"/>
         </w:rPr>
-        <w:t xml:space="preserve">'True Gen': Generation Z and its implications for companies</w:t>
-      </w:r>
-      <w:r>
-        <w:rPr>
-          <w:sz w:val="21"/>
-          <w:szCs w:val="21"/>
-        </w:rPr>
-        <w:t xml:space="preserve">. McKinsey &amp; Company. https://www.mckinsey.com/industries/consumer-packaged-goods/our-insights/true-gen-generation-z-and-its-implications-for-companies</w:t>
+        <w:t xml:space="preserve">Marketing Science, 38</w:t>
+      </w:r>
+      <w:r>
+        <w:rPr>
+          <w:sz w:val="21"/>
+          <w:szCs w:val="21"/>
+        </w:rPr>
+        <w:t xml:space="preserve">(2), 193–225. https://doi.org/10.1287/mksc.2018.1135</w:t>
       </w:r>
     </w:p>
     <w:p>
@@ -7931,7 +8098,7 @@
           <w:sz w:val="21"/>
           <w:szCs w:val="21"/>
         </w:rPr>
-        <w:t xml:space="preserve">Google Trends. (2026). </w:t>
+        <w:t xml:space="preserve">GoTransit. (n.d.). </w:t>
       </w:r>
       <w:r>
         <w:rPr>
@@ -7940,14 +8107,14 @@
           <w:sz w:val="21"/>
           <w:szCs w:val="21"/>
         </w:rPr>
-        <w:t xml:space="preserve">Lorna Jane, Lululemon and Alo Yoga (topics): Interest over time, New South Wales, 2026</w:t>
-      </w:r>
-      <w:r>
-        <w:rPr>
-          <w:sz w:val="21"/>
-          <w:szCs w:val="21"/>
-        </w:rPr>
-        <w:t xml:space="preserve"> [Data set]. Google. Retrieved October 28, 2026, from https://trends.google.com/trends/</w:t>
+        <w:t xml:space="preserve">Bus advertising</w:t>
+      </w:r>
+      <w:r>
+        <w:rPr>
+          <w:sz w:val="21"/>
+          <w:szCs w:val="21"/>
+        </w:rPr>
+        <w:t xml:space="preserve">. Retrieved October 28, 2026, from https://gotransit.com.au/</w:t>
       </w:r>
     </w:p>
     <w:p>
@@ -7960,7 +8127,7 @@
           <w:sz w:val="21"/>
           <w:szCs w:val="21"/>
         </w:rPr>
-        <w:t xml:space="preserve">Gordon, B. R., Zettelmeyer, F., Bhargava, N., &amp; Chapsky, D. (2019). A comparison of approaches to advertising measurement: Evidence from big field experiments at Facebook. </w:t>
+        <w:t xml:space="preserve">Inside Retail. (2025, January). </w:t>
       </w:r>
       <w:r>
         <w:rPr>
@@ -7969,14 +8136,14 @@
           <w:sz w:val="21"/>
           <w:szCs w:val="21"/>
         </w:rPr>
-        <w:t xml:space="preserve">Marketing Science, 38</w:t>
-      </w:r>
-      <w:r>
-        <w:rPr>
-          <w:sz w:val="21"/>
-          <w:szCs w:val="21"/>
-        </w:rPr>
-        <w:t xml:space="preserve">(2), 193–225. https://doi.org/10.1287/mksc.2018.1135</w:t>
+        <w:t xml:space="preserve">Lorna Jane's profit doubles thanks to strong demand for athletic clothing</w:t>
+      </w:r>
+      <w:r>
+        <w:rPr>
+          <w:sz w:val="21"/>
+          <w:szCs w:val="21"/>
+        </w:rPr>
+        <w:t xml:space="preserve">. https://insideretail.com.au/business/lorna-janes-profit-doubles-thanks-to-strong-demand-for-athletic-clothing-202501</w:t>
       </w:r>
     </w:p>
     <w:p>
@@ -8163,23 +8330,7 @@
           <w:sz w:val="21"/>
           <w:szCs w:val="21"/>
         </w:rPr>
-        <w:t xml:space="preserve">Lanoue, S. (2025, December 6). </w:t>
-      </w:r>
-      <w:r>
-        <w:rPr>
-          <w:sz w:val="21"/>
-          <w:szCs w:val="21"/>
-          <w:highlight w:val="yellow"/>
-          <w:highlightCs w:val="yellow"/>
-        </w:rPr>
-        <w:t xml:space="preserve">[Article title]</w:t>
-      </w:r>
-      <w:r>
-        <w:rPr>
-          <w:sz w:val="21"/>
-          <w:szCs w:val="21"/>
-        </w:rPr>
-        <w:t xml:space="preserve">. </w:t>
+        <w:t xml:space="preserve">Lavidge, R. J., &amp; Steiner, G. A. (1961). A model for predictive measurements of advertising effectiveness. </w:t>
       </w:r>
       <w:r>
         <w:rPr>
@@ -8188,23 +8339,14 @@
           <w:sz w:val="21"/>
           <w:szCs w:val="21"/>
         </w:rPr>
-        <w:t xml:space="preserve">Apart Style</w:t>
-      </w:r>
-      <w:r>
-        <w:rPr>
-          <w:sz w:val="21"/>
-          <w:szCs w:val="21"/>
-        </w:rPr>
-        <w:t xml:space="preserve">. </w:t>
-      </w:r>
-      <w:r>
-        <w:rPr>
-          <w:sz w:val="21"/>
-          <w:szCs w:val="21"/>
-          <w:highlight w:val="yellow"/>
-          <w:highlightCs w:val="yellow"/>
-        </w:rPr>
-        <w:t xml:space="preserve">[URL]</w:t>
+        <w:t xml:space="preserve">Journal of Marketing, 25</w:t>
+      </w:r>
+      <w:r>
+        <w:rPr>
+          <w:sz w:val="21"/>
+          <w:szCs w:val="21"/>
+        </w:rPr>
+        <w:t xml:space="preserve">(6), 59–62. https://doi.org/10.1177/002224296102500611</w:t>
       </w:r>
     </w:p>
     <w:p>
@@ -8217,7 +8359,7 @@
           <w:sz w:val="21"/>
           <w:szCs w:val="21"/>
         </w:rPr>
-        <w:t xml:space="preserve">Lavidge, R. J., &amp; Steiner, G. A. (1961). A model for predictive measurements of advertising effectiveness. </w:t>
+        <w:t xml:space="preserve">Lemon, K. N., &amp; Verhoef, P. C. (2016). Understanding customer experience throughout the customer journey. </w:t>
       </w:r>
       <w:r>
         <w:rPr>
@@ -8226,14 +8368,14 @@
           <w:sz w:val="21"/>
           <w:szCs w:val="21"/>
         </w:rPr>
-        <w:t xml:space="preserve">Journal of Marketing, 25</w:t>
-      </w:r>
-      <w:r>
-        <w:rPr>
-          <w:sz w:val="21"/>
-          <w:szCs w:val="21"/>
-        </w:rPr>
-        <w:t xml:space="preserve">(6), 59–62. https://doi.org/10.1177/002224296102500611</w:t>
+        <w:t xml:space="preserve">Journal of Marketing, 80</w:t>
+      </w:r>
+      <w:r>
+        <w:rPr>
+          <w:sz w:val="21"/>
+          <w:szCs w:val="21"/>
+        </w:rPr>
+        <w:t xml:space="preserve">(6), 69–96. https://doi.org/10.1509/jm.15.0420</w:t>
       </w:r>
     </w:p>
     <w:p>
@@ -8246,7 +8388,7 @@
           <w:sz w:val="21"/>
           <w:szCs w:val="21"/>
         </w:rPr>
-        <w:t xml:space="preserve">Lemon, K. N., &amp; Verhoef, P. C. (2016). Understanding customer experience throughout the customer journey. </w:t>
+        <w:t xml:space="preserve">Levitt, T. (1983). The globalization of markets. </w:t>
       </w:r>
       <w:r>
         <w:rPr>
@@ -8255,14 +8397,14 @@
           <w:sz w:val="21"/>
           <w:szCs w:val="21"/>
         </w:rPr>
-        <w:t xml:space="preserve">Journal of Marketing, 80</w:t>
-      </w:r>
-      <w:r>
-        <w:rPr>
-          <w:sz w:val="21"/>
-          <w:szCs w:val="21"/>
-        </w:rPr>
-        <w:t xml:space="preserve">(6), 69–96. https://doi.org/10.1509/jm.15.0420</w:t>
+        <w:t xml:space="preserve">Harvard Business Review, 61</w:t>
+      </w:r>
+      <w:r>
+        <w:rPr>
+          <w:sz w:val="21"/>
+          <w:szCs w:val="21"/>
+        </w:rPr>
+        <w:t xml:space="preserve">(3), 92–102.</w:t>
       </w:r>
     </w:p>
     <w:p>
@@ -8275,7 +8417,7 @@
           <w:sz w:val="21"/>
           <w:szCs w:val="21"/>
         </w:rPr>
-        <w:t xml:space="preserve">Levitt, T. (1983). The globalization of markets. </w:t>
+        <w:t xml:space="preserve">Lou, C., &amp; Yuan, S. (2019). Influencer marketing: How message value and credibility affect consumer trust of branded content on social media. </w:t>
       </w:r>
       <w:r>
         <w:rPr>
@@ -8284,14 +8426,14 @@
           <w:sz w:val="21"/>
           <w:szCs w:val="21"/>
         </w:rPr>
-        <w:t xml:space="preserve">Harvard Business Review, 61</w:t>
-      </w:r>
-      <w:r>
-        <w:rPr>
-          <w:sz w:val="21"/>
-          <w:szCs w:val="21"/>
-        </w:rPr>
-        <w:t xml:space="preserve">(3), 92–102.</w:t>
+        <w:t xml:space="preserve">Journal of Interactive Advertising, 19</w:t>
+      </w:r>
+      <w:r>
+        <w:rPr>
+          <w:sz w:val="21"/>
+          <w:szCs w:val="21"/>
+        </w:rPr>
+        <w:t xml:space="preserve">(1), 58–73. https://doi.org/10.1080/15252019.2018.1533501</w:t>
       </w:r>
     </w:p>
     <w:p>
@@ -8304,7 +8446,7 @@
           <w:sz w:val="21"/>
           <w:szCs w:val="21"/>
         </w:rPr>
-        <w:t xml:space="preserve">Lou, C., &amp; Yuan, S. (2019). Influencer marketing: How message value and credibility affect consumer trust of branded content on social media. </w:t>
+        <w:t xml:space="preserve">lululemon athletica. (n.d.). </w:t>
       </w:r>
       <w:r>
         <w:rPr>
@@ -8313,14 +8455,14 @@
           <w:sz w:val="21"/>
           <w:szCs w:val="21"/>
         </w:rPr>
-        <w:t xml:space="preserve">Journal of Interactive Advertising, 19</w:t>
-      </w:r>
-      <w:r>
-        <w:rPr>
-          <w:sz w:val="21"/>
-          <w:szCs w:val="21"/>
-        </w:rPr>
-        <w:t xml:space="preserve">(1), 58–73. https://doi.org/10.1080/15252019.2018.1533501</w:t>
+        <w:t xml:space="preserve">Community engagement</w:t>
+      </w:r>
+      <w:r>
+        <w:rPr>
+          <w:sz w:val="21"/>
+          <w:szCs w:val="21"/>
+        </w:rPr>
+        <w:t xml:space="preserve">. Retrieved October 28, 2026, from https://corporate.lululemon.com/our-business/innovation/community-engagement</w:t>
       </w:r>
     </w:p>
     <w:p>
@@ -8420,32 +8562,23 @@
           <w:sz w:val="21"/>
           <w:szCs w:val="21"/>
         </w:rPr>
-        <w:t xml:space="preserve">OpenPR. (2026). </w:t>
-      </w:r>
-      <w:r>
-        <w:rPr>
-          <w:sz w:val="21"/>
-          <w:szCs w:val="21"/>
-          <w:highlight w:val="yellow"/>
-          <w:highlightCs w:val="yellow"/>
-        </w:rPr>
-        <w:t xml:space="preserve">[Article title]</w:t>
-      </w:r>
-      <w:r>
-        <w:rPr>
-          <w:sz w:val="21"/>
-          <w:szCs w:val="21"/>
-        </w:rPr>
-        <w:t xml:space="preserve">. </w:t>
-      </w:r>
-      <w:r>
-        <w:rPr>
-          <w:sz w:val="21"/>
-          <w:szCs w:val="21"/>
-          <w:highlight w:val="yellow"/>
-          <w:highlightCs w:val="yellow"/>
-        </w:rPr>
-        <w:t xml:space="preserve">[URL]</w:t>
+        <w:t xml:space="preserve">Petty, R. E., &amp; Cacioppo, J. T. (1986). The elaboration likelihood model of persuasion. </w:t>
+      </w:r>
+      <w:r>
+        <w:rPr>
+          <w:i/>
+          <w:iCs/>
+          <w:sz w:val="21"/>
+          <w:szCs w:val="21"/>
+        </w:rPr>
+        <w:t xml:space="preserve">Advances in Experimental Social Psychology, 19</w:t>
+      </w:r>
+      <w:r>
+        <w:rPr>
+          <w:sz w:val="21"/>
+          <w:szCs w:val="21"/>
+        </w:rPr>
+        <w:t xml:space="preserve">, 123–205. https://doi.org/10.1016/S0065-2601(08)60214-2</w:t>
       </w:r>
     </w:p>
     <w:p>
@@ -8458,23 +8591,7 @@
           <w:sz w:val="21"/>
           <w:szCs w:val="21"/>
         </w:rPr>
-        <w:t xml:space="preserve">Pedestrian. (2026). </w:t>
-      </w:r>
-      <w:r>
-        <w:rPr>
-          <w:sz w:val="21"/>
-          <w:szCs w:val="21"/>
-          <w:highlight w:val="yellow"/>
-          <w:highlightCs w:val="yellow"/>
-        </w:rPr>
-        <w:t xml:space="preserve">[Article title]</w:t>
-      </w:r>
-      <w:r>
-        <w:rPr>
-          <w:sz w:val="21"/>
-          <w:szCs w:val="21"/>
-        </w:rPr>
-        <w:t xml:space="preserve">. </w:t>
+        <w:t xml:space="preserve">Petty, R. E., Cacioppo, J. T., &amp; Schumann, D. (1983). Central and peripheral routes to advertising effectiveness: The moderating role of involvement. </w:t>
       </w:r>
       <w:r>
         <w:rPr>
@@ -8483,23 +8600,14 @@
           <w:sz w:val="21"/>
           <w:szCs w:val="21"/>
         </w:rPr>
-        <w:t xml:space="preserve">Pedestrian.TV</w:t>
-      </w:r>
-      <w:r>
-        <w:rPr>
-          <w:sz w:val="21"/>
-          <w:szCs w:val="21"/>
-        </w:rPr>
-        <w:t xml:space="preserve">. </w:t>
-      </w:r>
-      <w:r>
-        <w:rPr>
-          <w:sz w:val="21"/>
-          <w:szCs w:val="21"/>
-          <w:highlight w:val="yellow"/>
-          <w:highlightCs w:val="yellow"/>
-        </w:rPr>
-        <w:t xml:space="preserve">[URL]</w:t>
+        <w:t xml:space="preserve">Journal of Consumer Research, 10</w:t>
+      </w:r>
+      <w:r>
+        <w:rPr>
+          <w:sz w:val="21"/>
+          <w:szCs w:val="21"/>
+        </w:rPr>
+        <w:t xml:space="preserve">(2), 135–146. https://doi.org/10.1086/208954</w:t>
       </w:r>
     </w:p>
     <w:p>
@@ -8512,7 +8620,7 @@
           <w:sz w:val="21"/>
           <w:szCs w:val="21"/>
         </w:rPr>
-        <w:t xml:space="preserve">Petty, R. E., &amp; Cacioppo, J. T. (1986). The elaboration likelihood model of persuasion. </w:t>
+        <w:t xml:space="preserve">Pine, B. J., II, &amp; Gilmore, J. H. (1998). Welcome to the experience economy. </w:t>
       </w:r>
       <w:r>
         <w:rPr>
@@ -8521,14 +8629,14 @@
           <w:sz w:val="21"/>
           <w:szCs w:val="21"/>
         </w:rPr>
-        <w:t xml:space="preserve">Advances in Experimental Social Psychology, 19</w:t>
-      </w:r>
-      <w:r>
-        <w:rPr>
-          <w:sz w:val="21"/>
-          <w:szCs w:val="21"/>
-        </w:rPr>
-        <w:t xml:space="preserve">, 123–205. https://doi.org/10.1016/S0065-2601(08)60214-2</w:t>
+        <w:t xml:space="preserve">Harvard Business Review, 76</w:t>
+      </w:r>
+      <w:r>
+        <w:rPr>
+          <w:sz w:val="21"/>
+          <w:szCs w:val="21"/>
+        </w:rPr>
+        <w:t xml:space="preserve">(4), 97–105.</w:t>
       </w:r>
     </w:p>
     <w:p>
@@ -8541,7 +8649,7 @@
           <w:sz w:val="21"/>
           <w:szCs w:val="21"/>
         </w:rPr>
-        <w:t xml:space="preserve">Petty, R. E., Cacioppo, J. T., &amp; Schumann, D. (1983). Central and peripheral routes to advertising effectiveness: The moderating role of involvement. </w:t>
+        <w:t xml:space="preserve">RepTrak. (2026, April). </w:t>
       </w:r>
       <w:r>
         <w:rPr>
@@ -8550,14 +8658,14 @@
           <w:sz w:val="21"/>
           <w:szCs w:val="21"/>
         </w:rPr>
-        <w:t xml:space="preserve">Journal of Consumer Research, 10</w:t>
-      </w:r>
-      <w:r>
-        <w:rPr>
-          <w:sz w:val="21"/>
-          <w:szCs w:val="21"/>
-        </w:rPr>
-        <w:t xml:space="preserve">(2), 135–146. https://doi.org/10.1086/208954</w:t>
+        <w:t xml:space="preserve">Inside the GRT100: A case study on adidas and Nike</w:t>
+      </w:r>
+      <w:r>
+        <w:rPr>
+          <w:sz w:val="21"/>
+          <w:szCs w:val="21"/>
+        </w:rPr>
+        <w:t xml:space="preserve">. https://www.reptrak.com/blog/inside-the-grt100-a-case-study-on-adidas-and-nike/</w:t>
       </w:r>
     </w:p>
     <w:p>
@@ -8570,7 +8678,7 @@
           <w:sz w:val="21"/>
           <w:szCs w:val="21"/>
         </w:rPr>
-        <w:t xml:space="preserve">Pine, B. J., II, &amp; Gilmore, J. H. (1998). Welcome to the experience economy. </w:t>
+        <w:t xml:space="preserve">RIISE. (2026). </w:t>
       </w:r>
       <w:r>
         <w:rPr>
@@ -8579,14 +8687,14 @@
           <w:sz w:val="21"/>
           <w:szCs w:val="21"/>
         </w:rPr>
-        <w:t xml:space="preserve">Harvard Business Review, 76</w:t>
-      </w:r>
-      <w:r>
-        <w:rPr>
-          <w:sz w:val="21"/>
-          <w:szCs w:val="21"/>
-        </w:rPr>
-        <w:t xml:space="preserve">(4), 97–105.</w:t>
+        <w:t xml:space="preserve">In motion with Bernadette Sukkar</w:t>
+      </w:r>
+      <w:r>
+        <w:rPr>
+          <w:sz w:val="21"/>
+          <w:szCs w:val="21"/>
+        </w:rPr>
+        <w:t xml:space="preserve">. https://riise.world/blogs/wellness/in-motion-with-bernadette-sukkar</w:t>
       </w:r>
     </w:p>
     <w:p>
@@ -8599,7 +8707,7 @@
           <w:sz w:val="21"/>
           <w:szCs w:val="21"/>
         </w:rPr>
-        <w:t xml:space="preserve">RIISE. (2026). </w:t>
+        <w:t xml:space="preserve">Rydzek, C. (2026, June 24). Alo Yoga owners eye IPO or sale after offloading wholesale T-shirt business. </w:t>
       </w:r>
       <w:r>
         <w:rPr>
@@ -8608,14 +8716,14 @@
           <w:sz w:val="21"/>
           <w:szCs w:val="21"/>
         </w:rPr>
-        <w:t xml:space="preserve">In motion with Bernadette Sukkar</w:t>
-      </w:r>
-      <w:r>
-        <w:rPr>
-          <w:sz w:val="21"/>
-          <w:szCs w:val="21"/>
-        </w:rPr>
-        <w:t xml:space="preserve">. https://riise.world/blogs/wellness/in-motion-with-bernadette-sukkar</w:t>
+        <w:t xml:space="preserve">TheIndustry.fashion</w:t>
+      </w:r>
+      <w:r>
+        <w:rPr>
+          <w:sz w:val="21"/>
+          <w:szCs w:val="21"/>
+        </w:rPr>
+        <w:t xml:space="preserve">. https://www.theindustry.fashion/alo-yoga-owners-eye-ipo-or-sale-after-offloading-wholesale-t-shirt-business/</w:t>
       </w:r>
     </w:p>
     <w:p>
@@ -8628,23 +8736,7 @@
           <w:sz w:val="21"/>
           <w:szCs w:val="21"/>
         </w:rPr>
-        <w:t xml:space="preserve">Russh. (2026). </w:t>
-      </w:r>
-      <w:r>
-        <w:rPr>
-          <w:sz w:val="21"/>
-          <w:szCs w:val="21"/>
-          <w:highlight w:val="yellow"/>
-          <w:highlightCs w:val="yellow"/>
-        </w:rPr>
-        <w:t xml:space="preserve">[Article title]</w:t>
-      </w:r>
-      <w:r>
-        <w:rPr>
-          <w:sz w:val="21"/>
-          <w:szCs w:val="21"/>
-        </w:rPr>
-        <w:t xml:space="preserve">. </w:t>
+        <w:t xml:space="preserve">Salpini, C. (2025, September 22). Lululemon's 'downward spiral' — and how the brand plans to break out of it. </w:t>
       </w:r>
       <w:r>
         <w:rPr>
@@ -8653,23 +8745,14 @@
           <w:sz w:val="21"/>
           <w:szCs w:val="21"/>
         </w:rPr>
-        <w:t xml:space="preserve">Russh</w:t>
-      </w:r>
-      <w:r>
-        <w:rPr>
-          <w:sz w:val="21"/>
-          <w:szCs w:val="21"/>
-        </w:rPr>
-        <w:t xml:space="preserve">. </w:t>
-      </w:r>
-      <w:r>
-        <w:rPr>
-          <w:sz w:val="21"/>
-          <w:szCs w:val="21"/>
-          <w:highlight w:val="yellow"/>
-          <w:highlightCs w:val="yellow"/>
-        </w:rPr>
-        <w:t xml:space="preserve">[URL]</w:t>
+        <w:t xml:space="preserve">Retail Dive</w:t>
+      </w:r>
+      <w:r>
+        <w:rPr>
+          <w:sz w:val="21"/>
+          <w:szCs w:val="21"/>
+        </w:rPr>
+        <w:t xml:space="preserve">. https://www.retaildive.com/news/lululemon-athleisure-downward-spiral-innovation-turnaround/760318/</w:t>
       </w:r>
     </w:p>
     <w:p>
@@ -8682,23 +8765,7 @@
           <w:sz w:val="21"/>
           <w:szCs w:val="21"/>
         </w:rPr>
-        <w:t xml:space="preserve">Rydzek, </w:t>
-      </w:r>
-      <w:r>
-        <w:rPr>
-          <w:sz w:val="21"/>
-          <w:szCs w:val="21"/>
-          <w:highlight w:val="yellow"/>
-          <w:highlightCs w:val="yellow"/>
-        </w:rPr>
-        <w:t xml:space="preserve">[Initial]</w:t>
-      </w:r>
-      <w:r>
-        <w:rPr>
-          <w:sz w:val="21"/>
-          <w:szCs w:val="21"/>
-        </w:rPr>
-        <w:t xml:space="preserve">. (2026, June). Alo Yoga owners eye IPO or sale after offloading wholesale T-shirt business. </w:t>
+        <w:t xml:space="preserve">SGB Media. (2026). </w:t>
       </w:r>
       <w:r>
         <w:rPr>
@@ -8706,17 +8773,15 @@
           <w:iCs/>
           <w:sz w:val="21"/>
           <w:szCs w:val="21"/>
-          <w:highlight w:val="yellow"/>
-          <w:highlightCs w:val="yellow"/>
-        </w:rPr>
-        <w:t xml:space="preserve">TheIndustry.fashion</w:t>
-      </w:r>
-      <w:r>
-        <w:rPr>
-          <w:sz w:val="21"/>
-          <w:szCs w:val="21"/>
-        </w:rPr>
-        <w:t xml:space="preserve">. https://www.theindustry.fashion/alo-yoga-owners-eye-ipo-or-sale-after-offloading-wholesale-t-shirt-business/</w:t>
+        </w:rPr>
+        <w:t xml:space="preserve">Alo Yoga opens first store in Greater China</w:t>
+      </w:r>
+      <w:r>
+        <w:rPr>
+          <w:sz w:val="21"/>
+          <w:szCs w:val="21"/>
+        </w:rPr>
+        <w:t xml:space="preserve">. https://sgbonline.com/alo-yoga-opens-first-store-in-greater-china/</w:t>
       </w:r>
     </w:p>
     <w:p>
@@ -8729,23 +8794,7 @@
           <w:sz w:val="21"/>
           <w:szCs w:val="21"/>
         </w:rPr>
-        <w:t xml:space="preserve">Salpini, C. (2025a). </w:t>
-      </w:r>
-      <w:r>
-        <w:rPr>
-          <w:sz w:val="21"/>
-          <w:szCs w:val="21"/>
-          <w:highlight w:val="yellow"/>
-          <w:highlightCs w:val="yellow"/>
-        </w:rPr>
-        <w:t xml:space="preserve">[Article title]</w:t>
-      </w:r>
-      <w:r>
-        <w:rPr>
-          <w:sz w:val="21"/>
-          <w:szCs w:val="21"/>
-        </w:rPr>
-        <w:t xml:space="preserve">. </w:t>
+        <w:t xml:space="preserve">Sharp, B. (2010). </w:t>
       </w:r>
       <w:r>
         <w:rPr>
@@ -8754,23 +8803,14 @@
           <w:sz w:val="21"/>
           <w:szCs w:val="21"/>
         </w:rPr>
-        <w:t xml:space="preserve">Retail Dive</w:t>
-      </w:r>
-      <w:r>
-        <w:rPr>
-          <w:sz w:val="21"/>
-          <w:szCs w:val="21"/>
-        </w:rPr>
-        <w:t xml:space="preserve">. </w:t>
-      </w:r>
-      <w:r>
-        <w:rPr>
-          <w:sz w:val="21"/>
-          <w:szCs w:val="21"/>
-          <w:highlight w:val="yellow"/>
-          <w:highlightCs w:val="yellow"/>
-        </w:rPr>
-        <w:t xml:space="preserve">[URL]</w:t>
+        <w:t xml:space="preserve">How brands grow: What marketers don't know</w:t>
+      </w:r>
+      <w:r>
+        <w:rPr>
+          <w:sz w:val="21"/>
+          <w:szCs w:val="21"/>
+        </w:rPr>
+        <w:t xml:space="preserve">. Oxford University Press.</w:t>
       </w:r>
     </w:p>
     <w:p>
@@ -8783,23 +8823,7 @@
           <w:sz w:val="21"/>
           <w:szCs w:val="21"/>
         </w:rPr>
-        <w:t xml:space="preserve">Salpini, C. (2025b). </w:t>
-      </w:r>
-      <w:r>
-        <w:rPr>
-          <w:sz w:val="21"/>
-          <w:szCs w:val="21"/>
-          <w:highlight w:val="yellow"/>
-          <w:highlightCs w:val="yellow"/>
-        </w:rPr>
-        <w:t xml:space="preserve">[Article title]</w:t>
-      </w:r>
-      <w:r>
-        <w:rPr>
-          <w:sz w:val="21"/>
-          <w:szCs w:val="21"/>
-        </w:rPr>
-        <w:t xml:space="preserve">. </w:t>
+        <w:t xml:space="preserve">Sichtmann, C., Davvetas, V., &amp; Diamantopoulos, A. (2019). The relational value of perceived brand globalness and localness. </w:t>
       </w:r>
       <w:r>
         <w:rPr>
@@ -8808,23 +8832,14 @@
           <w:sz w:val="21"/>
           <w:szCs w:val="21"/>
         </w:rPr>
-        <w:t xml:space="preserve">Retail Dive</w:t>
-      </w:r>
-      <w:r>
-        <w:rPr>
-          <w:sz w:val="21"/>
-          <w:szCs w:val="21"/>
-        </w:rPr>
-        <w:t xml:space="preserve">. </w:t>
-      </w:r>
-      <w:r>
-        <w:rPr>
-          <w:sz w:val="21"/>
-          <w:szCs w:val="21"/>
-          <w:highlight w:val="yellow"/>
-          <w:highlightCs w:val="yellow"/>
-        </w:rPr>
-        <w:t xml:space="preserve">[URL]</w:t>
+        <w:t xml:space="preserve">Journal of Business Research, 104</w:t>
+      </w:r>
+      <w:r>
+        <w:rPr>
+          <w:sz w:val="21"/>
+          <w:szCs w:val="21"/>
+        </w:rPr>
+        <w:t xml:space="preserve">, 597–613. https://doi.org/10.1016/j.jbusres.2018.10.025</w:t>
       </w:r>
     </w:p>
     <w:p>
@@ -8837,7 +8852,7 @@
           <w:sz w:val="21"/>
           <w:szCs w:val="21"/>
         </w:rPr>
-        <w:t xml:space="preserve">SGB Media. (2026). </w:t>
+        <w:t xml:space="preserve">Smith, R. E., MacKenzie, S. B., Yang, X., Buchholz, L. M., &amp; Darley, W. K. (2007). Modeling the determinants and effects of creativity in advertising. </w:t>
       </w:r>
       <w:r>
         <w:rPr>
@@ -8846,14 +8861,14 @@
           <w:sz w:val="21"/>
           <w:szCs w:val="21"/>
         </w:rPr>
-        <w:t xml:space="preserve">Alo Yoga opens first store in Greater China</w:t>
-      </w:r>
-      <w:r>
-        <w:rPr>
-          <w:sz w:val="21"/>
-          <w:szCs w:val="21"/>
-        </w:rPr>
-        <w:t xml:space="preserve">. https://sgbonline.com/alo-yoga-opens-first-store-in-greater-china/</w:t>
+        <w:t xml:space="preserve">Marketing Science, 26</w:t>
+      </w:r>
+      <w:r>
+        <w:rPr>
+          <w:sz w:val="21"/>
+          <w:szCs w:val="21"/>
+        </w:rPr>
+        <w:t xml:space="preserve">(6), 819–833. https://doi.org/10.1287/mksc.1070.0272</w:t>
       </w:r>
     </w:p>
     <w:p>
@@ -8866,7 +8881,7 @@
           <w:sz w:val="21"/>
           <w:szCs w:val="21"/>
         </w:rPr>
-        <w:t xml:space="preserve">Sharp, B. (2010). </w:t>
+        <w:t xml:space="preserve">Smith, R. E., &amp; Yang, X. (2004). Toward a general theory of creativity in advertising: Examining the role of divergence. </w:t>
       </w:r>
       <w:r>
         <w:rPr>
@@ -8875,14 +8890,14 @@
           <w:sz w:val="21"/>
           <w:szCs w:val="21"/>
         </w:rPr>
-        <w:t xml:space="preserve">How brands grow: What marketers don't know</w:t>
-      </w:r>
-      <w:r>
-        <w:rPr>
-          <w:sz w:val="21"/>
-          <w:szCs w:val="21"/>
-        </w:rPr>
-        <w:t xml:space="preserve">. Oxford University Press.</w:t>
+        <w:t xml:space="preserve">Marketing Theory, 4</w:t>
+      </w:r>
+      <w:r>
+        <w:rPr>
+          <w:sz w:val="21"/>
+          <w:szCs w:val="21"/>
+        </w:rPr>
+        <w:t xml:space="preserve">(1–2), 31–58. https://doi.org/10.1177/1470593104044086</w:t>
       </w:r>
     </w:p>
     <w:p>
@@ -8895,7 +8910,7 @@
           <w:sz w:val="21"/>
           <w:szCs w:val="21"/>
         </w:rPr>
-        <w:t xml:space="preserve">Sichtmann, C., Davvetas, V., &amp; Diamantopoulos, A. (2019). The relational value of perceived brand globalness and localness. </w:t>
+        <w:t xml:space="preserve">Smith, W. R. (1956). Product differentiation and market segmentation as alternative marketing strategies. </w:t>
       </w:r>
       <w:r>
         <w:rPr>
@@ -8904,14 +8919,14 @@
           <w:sz w:val="21"/>
           <w:szCs w:val="21"/>
         </w:rPr>
-        <w:t xml:space="preserve">Journal of Business Research, 104</w:t>
-      </w:r>
-      <w:r>
-        <w:rPr>
-          <w:sz w:val="21"/>
-          <w:szCs w:val="21"/>
-        </w:rPr>
-        <w:t xml:space="preserve">, 597–613. https://doi.org/10.1016/j.jbusres.2018.10.025</w:t>
+        <w:t xml:space="preserve">Journal of Marketing, 21</w:t>
+      </w:r>
+      <w:r>
+        <w:rPr>
+          <w:sz w:val="21"/>
+          <w:szCs w:val="21"/>
+        </w:rPr>
+        <w:t xml:space="preserve">(1), 3–8. https://doi.org/10.1177/002224295602100102</w:t>
       </w:r>
     </w:p>
     <w:p>
@@ -8924,7 +8939,7 @@
           <w:sz w:val="21"/>
           <w:szCs w:val="21"/>
         </w:rPr>
-        <w:t xml:space="preserve">Smith, R. E., MacKenzie, S. B., Yang, X., Buchholz, L. M., &amp; Darley, W. K. (2007). Modeling the determinants and effects of creativity in advertising. </w:t>
+        <w:t xml:space="preserve">Sport Australia. (2019, April 30). </w:t>
       </w:r>
       <w:r>
         <w:rPr>
@@ -8933,14 +8948,14 @@
           <w:sz w:val="21"/>
           <w:szCs w:val="21"/>
         </w:rPr>
-        <w:t xml:space="preserve">Marketing Science, 26</w:t>
-      </w:r>
-      <w:r>
-        <w:rPr>
-          <w:sz w:val="21"/>
-          <w:szCs w:val="21"/>
-        </w:rPr>
-        <w:t xml:space="preserve">(6), 819–833. https://doi.org/10.1287/mksc.1070.0272</w:t>
+        <w:t xml:space="preserve">Australia's top 20 sports and physical activities revealed</w:t>
+      </w:r>
+      <w:r>
+        <w:rPr>
+          <w:sz w:val="21"/>
+          <w:szCs w:val="21"/>
+        </w:rPr>
+        <w:t xml:space="preserve"> [Media release]. https://sportaus.gov.au/media_centre/news/previous-news-items/australias_top_20_sports_and_physical_activities_revealed</w:t>
       </w:r>
     </w:p>
     <w:p>
@@ -8953,7 +8968,7 @@
           <w:sz w:val="21"/>
           <w:szCs w:val="21"/>
         </w:rPr>
-        <w:t xml:space="preserve">Smith, R. E., &amp; Yang, X. (2004). Toward a general theory of creativity in advertising: Examining the role of divergence. </w:t>
+        <w:t xml:space="preserve">Stephen, A. T. (2016). The role of digital and social media marketing in consumer behavior. </w:t>
       </w:r>
       <w:r>
         <w:rPr>
@@ -8962,14 +8977,14 @@
           <w:sz w:val="21"/>
           <w:szCs w:val="21"/>
         </w:rPr>
-        <w:t xml:space="preserve">Marketing Theory, 4</w:t>
-      </w:r>
-      <w:r>
-        <w:rPr>
-          <w:sz w:val="21"/>
-          <w:szCs w:val="21"/>
-        </w:rPr>
-        <w:t xml:space="preserve">(1–2), 31–58. https://doi.org/10.1177/1470593104044086</w:t>
+        <w:t xml:space="preserve">Current Opinion in Psychology, 10</w:t>
+      </w:r>
+      <w:r>
+        <w:rPr>
+          <w:sz w:val="21"/>
+          <w:szCs w:val="21"/>
+        </w:rPr>
+        <w:t xml:space="preserve">, 17–21. https://doi.org/10.1016/j.copsyc.2015.10.016</w:t>
       </w:r>
     </w:p>
     <w:p>
@@ -8982,7 +8997,7 @@
           <w:sz w:val="21"/>
           <w:szCs w:val="21"/>
         </w:rPr>
-        <w:t xml:space="preserve">Smith, W. R. (1956). Product differentiation and market segmentation as alternative marketing strategies. </w:t>
+        <w:t xml:space="preserve">Stephen, A. T., &amp; Galak, J. (2012). The effects of traditional and social earned media on sales: A study of a microlending marketplace. </w:t>
       </w:r>
       <w:r>
         <w:rPr>
@@ -8991,14 +9006,14 @@
           <w:sz w:val="21"/>
           <w:szCs w:val="21"/>
         </w:rPr>
-        <w:t xml:space="preserve">Journal of Marketing, 21</w:t>
-      </w:r>
-      <w:r>
-        <w:rPr>
-          <w:sz w:val="21"/>
-          <w:szCs w:val="21"/>
-        </w:rPr>
-        <w:t xml:space="preserve">(1), 3–8. https://doi.org/10.1177/002224295602100102</w:t>
+        <w:t xml:space="preserve">Journal of Marketing Research, 49</w:t>
+      </w:r>
+      <w:r>
+        <w:rPr>
+          <w:sz w:val="21"/>
+          <w:szCs w:val="21"/>
+        </w:rPr>
+        <w:t xml:space="preserve">(5), 624–639. https://doi.org/10.1509/jmr.09.0401</w:t>
       </w:r>
     </w:p>
     <w:p>
@@ -9011,7 +9026,7 @@
           <w:sz w:val="21"/>
           <w:szCs w:val="21"/>
         </w:rPr>
-        <w:t xml:space="preserve">Stephen, A. T. (2016). The role of digital and social media marketing in consumer behavior. </w:t>
+        <w:t xml:space="preserve">Strong, E. K., Jr. (1925). </w:t>
       </w:r>
       <w:r>
         <w:rPr>
@@ -9020,14 +9035,14 @@
           <w:sz w:val="21"/>
           <w:szCs w:val="21"/>
         </w:rPr>
-        <w:t xml:space="preserve">Current Opinion in Psychology, 10</w:t>
-      </w:r>
-      <w:r>
-        <w:rPr>
-          <w:sz w:val="21"/>
-          <w:szCs w:val="21"/>
-        </w:rPr>
-        <w:t xml:space="preserve">, 17–21. https://doi.org/10.1016/j.copsyc.2015.10.016</w:t>
+        <w:t xml:space="preserve">The psychology of selling and advertising</w:t>
+      </w:r>
+      <w:r>
+        <w:rPr>
+          <w:sz w:val="21"/>
+          <w:szCs w:val="21"/>
+        </w:rPr>
+        <w:t xml:space="preserve">. McGraw-Hill.</w:t>
       </w:r>
     </w:p>
     <w:p>
@@ -9040,7 +9055,7 @@
           <w:sz w:val="21"/>
           <w:szCs w:val="21"/>
         </w:rPr>
-        <w:t xml:space="preserve">Stephen, A. T., &amp; Galak, J. (2012). The effects of traditional and social earned media on sales: A study of a microlending marketplace. </w:t>
+        <w:t xml:space="preserve">Vaughn, R. (1980). How advertising works: A planning model. </w:t>
       </w:r>
       <w:r>
         <w:rPr>
@@ -9049,14 +9064,14 @@
           <w:sz w:val="21"/>
           <w:szCs w:val="21"/>
         </w:rPr>
-        <w:t xml:space="preserve">Journal of Marketing Research, 49</w:t>
-      </w:r>
-      <w:r>
-        <w:rPr>
-          <w:sz w:val="21"/>
-          <w:szCs w:val="21"/>
-        </w:rPr>
-        <w:t xml:space="preserve">(5), 624–639. https://doi.org/10.1509/jmr.09.0401</w:t>
+        <w:t xml:space="preserve">Journal of Advertising Research, 20</w:t>
+      </w:r>
+      <w:r>
+        <w:rPr>
+          <w:sz w:val="21"/>
+          <w:szCs w:val="21"/>
+        </w:rPr>
+        <w:t xml:space="preserve">(5), 27–33.</w:t>
       </w:r>
     </w:p>
     <w:p>
@@ -9069,7 +9084,7 @@
           <w:sz w:val="21"/>
           <w:szCs w:val="21"/>
         </w:rPr>
-        <w:t xml:space="preserve">Strong, E. K., Jr. (1925). </w:t>
+        <w:t xml:space="preserve">Wise. (2025). </w:t>
       </w:r>
       <w:r>
         <w:rPr>
@@ -9078,97 +9093,14 @@
           <w:sz w:val="21"/>
           <w:szCs w:val="21"/>
         </w:rPr>
-        <w:t xml:space="preserve">The psychology of selling and advertising</w:t>
-      </w:r>
-      <w:r>
-        <w:rPr>
-          <w:sz w:val="21"/>
-          <w:szCs w:val="21"/>
-        </w:rPr>
-        <w:t xml:space="preserve">. McGraw-Hill.</w:t>
-      </w:r>
-    </w:p>
-    <w:p>
-      <w:pPr>
-        <w:spacing w:after="120" w:line="276"/>
-        <w:ind w:left="720" w:hanging="720"/>
-      </w:pPr>
-      <w:r>
-        <w:rPr>
-          <w:sz w:val="21"/>
-          <w:szCs w:val="21"/>
-        </w:rPr>
-        <w:t xml:space="preserve">36Kr. (2026). </w:t>
-      </w:r>
-      <w:r>
-        <w:rPr>
-          <w:sz w:val="21"/>
-          <w:szCs w:val="21"/>
-          <w:highlight w:val="yellow"/>
-          <w:highlightCs w:val="yellow"/>
-        </w:rPr>
-        <w:t xml:space="preserve">[Article title]</w:t>
-      </w:r>
-      <w:r>
-        <w:rPr>
-          <w:sz w:val="21"/>
-          <w:szCs w:val="21"/>
-        </w:rPr>
-        <w:t xml:space="preserve">. </w:t>
-      </w:r>
-      <w:r>
-        <w:rPr>
-          <w:i/>
-          <w:iCs/>
-          <w:sz w:val="21"/>
-          <w:szCs w:val="21"/>
-        </w:rPr>
-        <w:t xml:space="preserve">36Kr</w:t>
-      </w:r>
-      <w:r>
-        <w:rPr>
-          <w:sz w:val="21"/>
-          <w:szCs w:val="21"/>
-        </w:rPr>
-        <w:t xml:space="preserve">. </w:t>
-      </w:r>
-      <w:r>
-        <w:rPr>
-          <w:sz w:val="21"/>
-          <w:szCs w:val="21"/>
-          <w:highlight w:val="yellow"/>
-          <w:highlightCs w:val="yellow"/>
-        </w:rPr>
-        <w:t xml:space="preserve">[URL]</w:t>
-      </w:r>
-    </w:p>
-    <w:p>
-      <w:pPr>
-        <w:spacing w:after="120" w:line="276"/>
-        <w:ind w:left="720" w:hanging="720"/>
-      </w:pPr>
-      <w:r>
-        <w:rPr>
-          <w:sz w:val="21"/>
-          <w:szCs w:val="21"/>
-        </w:rPr>
-        <w:t xml:space="preserve">Vaughn, R. (1980). How advertising works: A planning model. </w:t>
-      </w:r>
-      <w:r>
-        <w:rPr>
-          <w:i/>
-          <w:iCs/>
-          <w:sz w:val="21"/>
-          <w:szCs w:val="21"/>
-        </w:rPr>
-        <w:t xml:space="preserve">Journal of Advertising Research, 20</w:t>
-      </w:r>
-      <w:r>
-        <w:rPr>
-          <w:sz w:val="21"/>
-          <w:szCs w:val="21"/>
-        </w:rPr>
-        <w:t xml:space="preserve">(5), 27–33.</w:t>
+        <w:t xml:space="preserve">Influencer marketing in 2025: Complete guide for Australian businesses</w:t>
+      </w:r>
+      <w:r>
+        <w:rPr>
+          <w:sz w:val="21"/>
+          <w:szCs w:val="21"/>
+        </w:rPr>
+        <w:t xml:space="preserve">. https://wise.com/au/blog/influencer-marketing</w:t>
       </w:r>
     </w:p>
     <w:p>
@@ -9972,7 +9904,7 @@
                 <w:sz w:val="17"/>
                 <w:szCs w:val="17"/>
               </w:rPr>
-              <w:t xml:space="preserve">High (36Kr, 2026)</w:t>
+              <w:t xml:space="preserve">High (Inside Retail, 2026)</w:t>
             </w:r>
           </w:p>
         </w:tc>
@@ -12328,6 +12260,303 @@
         <w:t xml:space="preserve">Agency creative framework.</w:t>
       </w:r>
     </w:p>
+    <w:p>
+      <w:r>
+        <w:br w:type="page"/>
+      </w:r>
+    </w:p>
+    <w:p>
+      <w:pPr>
+        <w:pStyle w:val="Heading1"/>
+      </w:pPr>
+      <w:r>
+        <w:t xml:space="preserve">Appendix H: Disclosure of AI Use</w:t>
+      </w:r>
+    </w:p>
+    <w:p>
+      <w:pPr>
+        <w:spacing w:after="160" w:line="288"/>
+      </w:pPr>
+      <w:r>
+        <w:rPr>
+          <w:b/>
+          <w:bCs/>
+        </w:rPr>
+        <w:t xml:space="preserve">Tool:</w:t>
+      </w:r>
+      <w:r>
+        <w:t xml:space="preserve"> Claude (Anthropic), used through Claude Code in October 2026. </w:t>
+      </w:r>
+      <w:r>
+        <w:rPr>
+          <w:b/>
+          <w:bCs/>
+        </w:rPr>
+        <w:t xml:space="preserve">Used for:</w:t>
+      </w:r>
+      <w:r>
+        <w:t xml:space="preserve"> restructuring and editing our draft against the rubric, suggesting and applying theory, checking facts and sources, formatting APA references, and generating the diagrams in Figures 1–7 and E1–G1 from our specifications. </w:t>
+      </w:r>
+      <w:r>
+        <w:rPr>
+          <w:b/>
+          <w:bCs/>
+        </w:rPr>
+        <w:t xml:space="preserve">Not used for:</w:t>
+      </w:r>
+      <w:r>
+        <w:t xml:space="preserve"> the campaign mock-ups, which our group produced separately. </w:t>
+      </w:r>
+      <w:r>
+        <w:rPr>
+          <w:highlight w:val="yellow"/>
+          <w:highlightCs w:val="yellow"/>
+        </w:rPr>
+        <w:t xml:space="preserve">[If any AI tool was used for the mock-ups, add its name and prompts here.]</w:t>
+      </w:r>
+      <w:r>
+        <w:t xml:space="preserve"> All AI output was reviewed, edited and verified by the group, which remains responsible for the content.</w:t>
+      </w:r>
+    </w:p>
+    <w:p>
+      <w:pPr>
+        <w:pStyle w:val="Heading2"/>
+      </w:pPr>
+      <w:r>
+        <w:t xml:space="preserve">H1. Prompts Used (Verbatim)</w:t>
+      </w:r>
+    </w:p>
+    <w:p>
+      <w:pPr>
+        <w:pStyle w:val="ListParagraph"/>
+        <w:numPr>
+          <w:ilvl w:val="0"/>
+          <w:numId w:val="3"/>
+        </w:numPr>
+        <w:spacing w:after="100" w:line="288"/>
+      </w:pPr>
+      <w:r>
+        <w:t xml:space="preserve">"If this is my current essay and those are the lecture slides and transcripts and this is the brief [assessment brief pasted] And this is the rubric improve my essay but keep the main ideas and strategy but basically just improve how it is written and include lots of theories and models and do not just describe the models and theories really show how they apply in this situation. Be critical. Also include visuals of the models and theories being applied. Everything needs to be in APA 7th referencing" [Attached: our draft essay and notes, the marking rubric (PDF) and the Google Trends screenshot in Appendix A.]</w:t>
+      </w:r>
+    </w:p>
+    <w:p>
+      <w:pPr>
+        <w:pStyle w:val="ListParagraph"/>
+        <w:numPr>
+          <w:ilvl w:val="0"/>
+          <w:numId w:val="3"/>
+        </w:numPr>
+        <w:spacing w:after="100" w:line="288"/>
+      </w:pPr>
+      <w:r>
+        <w:t xml:space="preserve">"It can only be 3.5K +- 10% and do all the theories and models come from lecture slides/transcripts"</w:t>
+      </w:r>
+    </w:p>
+    <w:p>
+      <w:pPr>
+        <w:pStyle w:val="ListParagraph"/>
+        <w:numPr>
+          <w:ilvl w:val="0"/>
+          <w:numId w:val="3"/>
+        </w:numPr>
+        <w:spacing w:after="100" w:line="288"/>
+      </w:pPr>
+      <w:r>
+        <w:t xml:space="preserve">"Sorry I forgot to commit changes in teh repository. They are committed now so you should be able to see all the slides and transcripts. Tell me if you cannot. If you can cut down to the 3.5k word limit ish and use models and theories from the lecture slides be critical and really show how it is an IMC and how they all work together to deliver a single unified message"</w:t>
+      </w:r>
+    </w:p>
+    <w:p>
+      <w:pPr>
+        <w:pStyle w:val="ListParagraph"/>
+        <w:numPr>
+          <w:ilvl w:val="0"/>
+          <w:numId w:val="3"/>
+        </w:numPr>
+        <w:spacing w:after="100" w:line="288"/>
+      </w:pPr>
+      <w:r>
+        <w:t xml:space="preserve">"These are the lecture slides from which you need to choose models and theories from. Keep it to 3.5K words +-10%. Make it really critical and do not just apply the models, really show how they apply and how the IMC delivers 1 unified message across all platforms. Remember the visual application of the models and theories and needs to be APA 7th" [Attached: MKTG3112 lecture slides, Weeks 1–3 and 5–13.]</w:t>
+      </w:r>
+    </w:p>
+    <w:p>
+      <w:pPr>
+        <w:pStyle w:val="ListParagraph"/>
+        <w:numPr>
+          <w:ilvl w:val="0"/>
+          <w:numId w:val="3"/>
+        </w:numPr>
+        <w:spacing w:after="100" w:line="288"/>
+      </w:pPr>
+      <w:r>
+        <w:t xml:space="preserve">"Yes tables and figures do count"</w:t>
+      </w:r>
+    </w:p>
+    <w:p>
+      <w:pPr>
+        <w:pStyle w:val="ListParagraph"/>
+        <w:numPr>
+          <w:ilvl w:val="0"/>
+          <w:numId w:val="3"/>
+        </w:numPr>
+        <w:spacing w:after="100" w:line="288"/>
+      </w:pPr>
+      <w:r>
+        <w:t xml:space="preserve">"Are all the tables and figures you removed now in the appendix"</w:t>
+      </w:r>
+    </w:p>
+    <w:p>
+      <w:pPr>
+        <w:pStyle w:val="ListParagraph"/>
+        <w:numPr>
+          <w:ilvl w:val="0"/>
+          <w:numId w:val="3"/>
+        </w:numPr>
+        <w:spacing w:after="100" w:line="288"/>
+      </w:pPr>
+      <w:r>
+        <w:t xml:space="preserve">"Yes put it in the appendix as tehy do not count. But still obvs make sure the main message is still in the body text"</w:t>
+      </w:r>
+    </w:p>
+    <w:p>
+      <w:pPr>
+        <w:pStyle w:val="ListParagraph"/>
+        <w:numPr>
+          <w:ilvl w:val="0"/>
+          <w:numId w:val="3"/>
+        </w:numPr>
+        <w:spacing w:after="100" w:line="288"/>
+      </w:pPr>
+      <w:r>
+        <w:t xml:space="preserve">"Does that word count incldue the words in the figures"</w:t>
+      </w:r>
+    </w:p>
+    <w:p>
+      <w:pPr>
+        <w:pStyle w:val="ListParagraph"/>
+        <w:numPr>
+          <w:ilvl w:val="0"/>
+          <w:numId w:val="3"/>
+        </w:numPr>
+        <w:spacing w:after="100" w:line="288"/>
+      </w:pPr>
+      <w:r>
+        <w:t xml:space="preserve">"It does count so maybe for the ones that are not as important and which are not applying models / theories move those to the appendix but keep the core idea message in the text. Also Bryant is our lecturer so do not quote him, if you use things he said find a reputable secondary source that aligns with what we said."</w:t>
+      </w:r>
+    </w:p>
+    <w:p>
+      <w:pPr>
+        <w:pStyle w:val="ListParagraph"/>
+        <w:numPr>
+          <w:ilvl w:val="0"/>
+          <w:numId w:val="3"/>
+        </w:numPr>
+        <w:spacing w:after="100" w:line="288"/>
+      </w:pPr>
+      <w:r>
+        <w:t xml:space="preserve">"Ok now critically evaluate it against the rubric"</w:t>
+      </w:r>
+    </w:p>
+    <w:p>
+      <w:pPr>
+        <w:pStyle w:val="ListParagraph"/>
+        <w:numPr>
+          <w:ilvl w:val="0"/>
+          <w:numId w:val="3"/>
+        </w:numPr>
+        <w:spacing w:after="100" w:line="288"/>
+      </w:pPr>
+      <w:r>
+        <w:t xml:space="preserve">"We have our own mock ups but do everything else"</w:t>
+      </w:r>
+    </w:p>
+    <w:p>
+      <w:pPr>
+        <w:spacing w:after="60"/>
+      </w:pPr>
+    </w:p>
+    <w:p>
+      <w:pPr>
+        <w:pStyle w:val="Heading2"/>
+      </w:pPr>
+      <w:r>
+        <w:t xml:space="preserve">H2. Critical Reflection</w:t>
+      </w:r>
+    </w:p>
+    <w:p>
+      <w:pPr>
+        <w:spacing w:after="160" w:line="288"/>
+      </w:pPr>
+      <w:r>
+        <w:rPr>
+          <w:b/>
+          <w:bCs/>
+        </w:rPr>
+        <w:t xml:space="preserve">Strengths.</w:t>
+      </w:r>
+      <w:r>
+        <w:t xml:space="preserve"> The tool was effective at restructuring our draft against each rubric criterion, applying theory consistently and building diagrams that show models applied to Alo rather than described. It also caught factual errors in our draft, such as the location of Alo's second store.</w:t>
+      </w:r>
+    </w:p>
+    <w:p>
+      <w:pPr>
+        <w:spacing w:after="160" w:line="288"/>
+      </w:pPr>
+      <w:r>
+        <w:rPr>
+          <w:b/>
+          <w:bCs/>
+        </w:rPr>
+        <w:t xml:space="preserve">Accuracy and referencing.</w:t>
+      </w:r>
+      <w:r>
+        <w:t xml:space="preserve"> Early outputs cited our lecture slides directly, left placeholder references and relied on some US data. We replaced lecture citations with published sources, checked each reference, removed claims we could not verify, and flagged US evidence as such. AI output cannot be treated as a source in itself.</w:t>
+      </w:r>
+    </w:p>
+    <w:p>
+      <w:pPr>
+        <w:spacing w:after="160" w:line="288"/>
+      </w:pPr>
+      <w:r>
+        <w:rPr>
+          <w:b/>
+          <w:bCs/>
+        </w:rPr>
+        <w:t xml:space="preserve">Authenticity and creativity.</w:t>
+      </w:r>
+      <w:r>
+        <w:t xml:space="preserve"> AI-edited prose tends towards polished, generic phrasing, and the tool converged on established frameworks. The strategy, insight, "Mat to Moment" concept and mock-ups came from our group; the tool reorganised and sharpened them rather than originating them.</w:t>
+      </w:r>
+    </w:p>
+    <w:p>
+      <w:pPr>
+        <w:spacing w:after="160" w:line="288"/>
+      </w:pPr>
+      <w:r>
+        <w:rPr>
+          <w:b/>
+          <w:bCs/>
+        </w:rPr>
+        <w:t xml:space="preserve">Audience relevance and cultural appropriateness.</w:t>
+      </w:r>
+      <w:r>
+        <w:t xml:space="preserve"> The tool has no lived knowledge of Sydney studio culture. Local details, such as the Bondi-to-Bronte walk and our choice of lead creator, came from the group and were checked against local sources. We kept the body-image guardrails in Section 4.2 because AI-generated fitness imagery tends to idealise bodies.</w:t>
+      </w:r>
+    </w:p>
+    <w:p>
+      <w:pPr>
+        <w:spacing w:after="160" w:line="288"/>
+      </w:pPr>
+      <w:r>
+        <w:rPr>
+          <w:b/>
+          <w:bCs/>
+        </w:rPr>
+        <w:t xml:space="preserve">Brand fit.</w:t>
+      </w:r>
+      <w:r>
+        <w:t xml:space="preserve"> Diagrams follow Alo's neutral palette, but they are explanatory visuals, not brand assets; all customer-facing materials are our own mock-ups.</w:t>
+      </w:r>
+    </w:p>
     <w:sectPr>
       <w:footerReference w:type="default" r:id="rId7"/>
       <w:pgSz w:w="11906" w:h="16838" w:orient="portrait"/>
@@ -12556,6 +12785,18 @@
       </w:pPr>
     </w:lvl>
   </w:abstractNum>
+  <w:abstractNum w:abstractNumId="4" w15:restartNumberingAfterBreak="0">
+    <w:multiLevelType w:val="hybridMultilevel"/>
+    <w:lvl w:ilvl="0" w15:tentative="1">
+      <w:start w:val="1"/>
+      <w:numFmt w:val="decimal"/>
+      <w:lvlText w:val="%1."/>
+      <w:lvlJc w:val="left"/>
+      <w:pPr>
+        <w:ind w:left="540" w:hanging="360"/>
+      </w:pPr>
+    </w:lvl>
+  </w:abstractNum>
   <w:num w:numId="1">
     <w:abstractNumId w:val="1"/>
     <w:lvlOverride w:ilvl="0">
@@ -12564,6 +12805,12 @@
   </w:num>
   <w:num w:numId="2">
     <w:abstractNumId w:val="3"/>
+    <w:lvlOverride w:ilvl="0">
+      <w:startOverride w:val="1"/>
+    </w:lvlOverride>
+  </w:num>
+  <w:num w:numId="3">
+    <w:abstractNumId w:val="4"/>
     <w:lvlOverride w:ilvl="0">
       <w:startOverride w:val="1"/>
     </w:lvlOverride>

</xml_diff>

<commit_message>
Address tutor feedback: benchmarked targets and researched budget
Resets objective targets against published brand-lift benchmarks,
adds campaign precedents for the experiential and creator strategy,
costs Sanctuary Sessions bottom-up and justifies the budget split,
and restores the AI prompts and reflection.

Co-Authored-By: Claude Opus 5.5 <noreply@anthropic.com>
Claude-Session: https://claude.ai/code/session_01XwhnEvcgigojVrsaWSJPuE
</commit_message>
<xml_diff>
--- a/Alo_Mat_to_Moment_IMC_Brief.docx
+++ b/Alo_Mat_to_Moment_IMC_Brief.docx
@@ -147,7 +147,7 @@
         <w:spacing w:after="160" w:line="288"/>
       </w:pPr>
       <w:r>
-        <w:t xml:space="preserve">Alo Yoga is a Los Angeles premium activewear and lifestyle brand founded in 2007, with around 170 stores worldwide (SGB Media, 2026) and estimated 2025 sales near US$2 billion (Modaes, 2026). Its owners are reportedly weighing an IPO or sale (Rydzek, 2026), so performance in new markets is under scrutiny. Alo opened at Chatswood Chase, opposite Lululemon, in May 2026 (Inside Retail, 2026), and at The Galeries in the CBD in September, with Bondi Junction planned (Concrete Playground, 2026). Australian leggings and bras cost roughly A$100–200 (Concrete Playground, 2026). Its premium, fashion-led image was built on social media and celebrity visibility (Inside Retail, 2026). Brand equity depends on awareness and favourable associations (Keller, 1993), and IMC is what converts brand identity into local equity (Keller, 2001). In Sydney, that conversion has barely begun. Alo's strengths are a coherent brand image and control of its own retail experience; its weaknesses here are a small store base, no local heritage and prices above an established leader.</w:t>
+        <w:t xml:space="preserve">Alo Yoga is a Los Angeles premium activewear and lifestyle brand founded in 2007, with around 170 stores worldwide (SGB Media, 2026) and estimated 2025 sales near US$2 billion (Modaes, 2026). Alo opened at Chatswood Chase, opposite Lululemon, in May 2026 (Inside Retail, 2026), and at The Galeries in the CBD in September, with Bondi Junction planned (Concrete Playground, 2026). Australian leggings and bras cost roughly A$100–200 (Concrete Playground, 2026). Its premium, fashion-led image was built on social media and celebrity visibility (Inside Retail, 2026). Brand equity depends on awareness and favourable associations (Keller, 1993), and IMC is what converts brand identity into local equity (Keller, 2001). In Sydney, that conversion has barely begun. Alo's strengths are a coherent brand image and control of its own retail experience; its weaknesses here are a small store base, no local heritage and prices above an established leader.</w:t>
       </w:r>
     </w:p>
     <w:p>
@@ -1067,7 +1067,7 @@
         <w:t xml:space="preserve">style-conscious women aged 22–34 in Greater Sydney</w:t>
       </w:r>
       <w:r>
-        <w:t xml:space="preserve"> who do Pilates, yoga or gym and use Instagram and TikTok daily. Affluent women aged 35–50 are loyal to Lululemon and Lorna Jane and hard to switch, and men are a small part of Alo's range, so both are reached only as spillover. The chosen segment buys activewear as identity: possessions extend the self (Belk, 1988), and Alo's appeal is built on exactly that social visibility (Inside Retail, 2026). The segment is substantial: Pilates alone has about 585,000 adult Australian participants, around 90% of them women (Sport Australia, 2019). It spans older Gen Z, who prize authenticity (Francis &amp; Hoefel, 2018), and younger Millennials, so the campaign pairs unpolished creator content with bookable experiences and audio. Consumers also build self-brand connections through the brands their reference groups use (Escalas &amp; Bettman, 2005), and the studio class is this segment's most visible reference group, which is where the campaign places its sources. Critically, more than half of Gen Z and Millennials have delayed major decisions because of financial pressure (Deloitte, 2026). The audience most drawn to Alo is also the most price-stretched, so price justification ranks first.</w:t>
+        <w:t xml:space="preserve"> who do Pilates, yoga or gym and use Instagram and TikTok daily. Affluent women aged 35–50 are loyal to Lululemon and Lorna Jane and hard to switch, and men are a small part of Alo's range, so both are reached only as spillover. The chosen segment buys activewear as identity: possessions extend the self (Belk, 1988), and Alo's appeal is built on exactly that social visibility (Inside Retail, 2026). The segment is substantial: Pilates alone has about 585,000 adult Australian participants, around 90% of them women (Sport Australia, 2019). It spans older Gen Z, who prize authenticity (Francis &amp; Hoefel, 2018), and younger Millennials, so the campaign pairs unpolished creator content with bookable experiences and audio. Consumers also build self-brand connections through brands their reference groups use (Escalas &amp; Bettman, 2005); for this segment, that group is the studio class. Critically, more than half of Gen Z and Millennials have delayed major decisions because of financial pressure (Deloitte, 2026). The audience most drawn to Alo is also the most price-stretched, so price justification ranks first.</w:t>
       </w:r>
     </w:p>
     <w:p>
@@ -1123,7 +1123,7 @@
         <w:t xml:space="preserve">Sustaining awareness</w:t>
       </w:r>
       <w:r>
-        <w:t xml:space="preserve">: interest has fallen to pre-opening levels, and The Galeries opening produced no lift (Appendix A), so novelty alone will not sustain the brand.</w:t>
+        <w:t xml:space="preserve">: interest has fallen to pre-opening levels, and The Galeries opening produced no lift (Appendix A).</w:t>
       </w:r>
     </w:p>
     <w:p>
@@ -1640,7 +1640,7 @@
                 <w:sz w:val="17"/>
                 <w:szCs w:val="17"/>
               </w:rPr>
-              <w:t xml:space="preserve">30%</w:t>
+              <w:t xml:space="preserve">21%</w:t>
             </w:r>
           </w:p>
         </w:tc>
@@ -1843,7 +1843,7 @@
                 <w:sz w:val="17"/>
                 <w:szCs w:val="17"/>
               </w:rPr>
-              <w:t xml:space="preserve">25%</w:t>
+              <w:t xml:space="preserve">18%</w:t>
             </w:r>
           </w:p>
         </w:tc>
@@ -2040,7 +2040,7 @@
                 <w:sz w:val="17"/>
                 <w:szCs w:val="17"/>
               </w:rPr>
-              <w:t xml:space="preserve">50%</w:t>
+              <w:t xml:space="preserve">35%</w:t>
             </w:r>
           </w:p>
         </w:tc>
@@ -2243,7 +2243,7 @@
                 <w:sz w:val="17"/>
                 <w:szCs w:val="17"/>
               </w:rPr>
-              <w:t xml:space="preserve">15%</w:t>
+              <w:t xml:space="preserve">11%</w:t>
             </w:r>
           </w:p>
         </w:tc>
@@ -2259,7 +2259,7 @@
         <w:spacing w:after="160" w:line="288"/>
       </w:pPr>
       <w:r>
-        <w:t xml:space="preserve">The objectives follow DAGMAR (Colley, 1961). AIDA and the hierarchy of effects assume that consumers think, then feel, then do (Lavidge &amp; Steiner, 1961; Strong, 1925). Figure 1 shows why this campaign reverses the first two steps. Premium activewear is a high-involvement purchase worn in public, so attitude precedes information (Vaughn, 1980). The hierarchy is a heuristic, not a law, so all four objectives are tracked simultaneously. O3 is ambitious but attainable because every paid asset carries the store line. Baselines are agency estimates to be confirmed by the pre-campaign survey. O3 starts at 25% because Alo's search interest matches Lorna Jane's, but store awareness should trail name awareness for a four-month-old entrant. O1 and O2 start low because few locals have tried the product. Visits rather than sales are targeted because price and stock sit outside communication's control (Belch &amp; Belch, 2021).</w:t>
+        <w:t xml:space="preserve">The objectives follow DAGMAR (Colley, 1961). AIDA and the hierarchy of effects assume that consumers think, then feel, then do (Lavidge &amp; Steiner, 1961; Strong, 1925). Figure 1 shows why this campaign reverses the first two steps. Premium activewear is a high-involvement purchase worn in public, so attitude precedes information (Vaughn, 1980). The hierarchy is a heuristic, not a law, so all four objectives are tracked simultaneously. Targets are set against benchmarks, not ambition. Across 23 Meta brand-lift tests, campaigns raised awareness by an average of 3.7 points and ad recall by 7.6 points (Meta, 2020). Store awareness (O3) is one simple fact repeated on every channel near the stores, so a 10-point lift, two to three times that single-platform norm, is stretching but attainable. Attitudes move less than awareness, so O1 and O2 target 6 points; behaviour moves least, so O4 targets 3. Baselines are estimates to be confirmed by the pre-campaign survey: O3 starts at 25% because Alo's search interest matches Lorna Jane's, but store awareness trails name awareness for a new entrant. Visits rather than sales are targeted because price and stock sit outside communication's control (Belch &amp; Belch, 2021).</w:t>
       </w:r>
     </w:p>
     <w:p>
@@ -2386,7 +2386,7 @@
         <w:t xml:space="preserve">Insight:</w:t>
       </w:r>
       <w:r>
-        <w:t xml:space="preserve"> for Segment A, studio fitness is a social performance. Young women experience exercise as visible "aesthetic labour" on Instagram (Camacho-Miñano et al., 2019), so activewear is judged at the café as much as in class. The communication process model (Schramm, as cited in Belch &amp; Belch, 2021) explains why Alo has not yet capitalised on this (Figure 2). Meaning is shared only where fields of experience overlap. Alo's launch was encoded in Los Angeles and decoded in Sydney as "beautiful, but not for me". The fix is not more volume but re-encoding the message through Sydney instructors and creators, whose fields of experience overlap almost completely with the audience's. The model also highlights noise from Lululemon's far larger share of search and a crowded influencer feed, which favours repeating one idea. The model's feedback loop is built in: comments, bookings and search interest are reviewed between bursts (Section 6).</w:t>
+        <w:t xml:space="preserve"> for Segment A, studio fitness is a social performance. Young women experience exercise as visible "aesthetic labour" on Instagram (Camacho-Miñano et al., 2019), so activewear is judged at the café as much as in class. The communication process model (Schramm, as cited in Belch &amp; Belch, 2021) explains why Alo has not yet capitalised on this (Figure 2). Meaning is shared only where fields of experience overlap. Alo's launch was encoded in Los Angeles and decoded in Sydney as "beautiful, but not for me". The fix is not more volume but re-encoding the message through Sydney instructors and creators, whose fields of experience overlap almost completely with the audience's. Noise from rivals and influencer clutter favours repeating one idea. The model's feedback loop is built in: comments, bookings and search interest are reviewed between bursts (Section 6).</w:t>
       </w:r>
     </w:p>
     <w:p>
@@ -2505,7 +2505,7 @@
         <w:t xml:space="preserve">For style-led studio women in Sydney, Alo is the premium activewear brand designed to move from the reformer to the rest of the day.</w:t>
       </w:r>
       <w:r>
-        <w:t xml:space="preserve"> Levitt (1983) argued that global brands should standardise, but standardised efficiency does not guarantee local relevance. Alo's identity, positioning and visual assets are therefore standardised to protect its global prestige (see Appendix D): logo, neutral palette, studio aesthetic and a no-discount policy. People, places, partnerships and offers are localised: Sydney instructors, Bondi and CBD settings, Body by Berner, and styling appointments. Localness adds relational value even for foreign brands (Sichtmann et al., 2019). The risk is that Alo's own global celebrity content keeps reaching Sydney feeds, so the local work must be distinctive enough to compete with Alo's global voice.</w:t>
+        <w:t xml:space="preserve"> Levitt (1983) argued that global brands should standardise, but standardised efficiency does not guarantee local relevance. Alo's identity, positioning and visual assets are therefore standardised to protect its global prestige (see Appendix D): logo, neutral palette, studio aesthetic and a no-discount policy. People, places, partnerships and offers are localised: Sydney instructors, Bondi and CBD settings, Body by Berner, and styling appointments. Localness adds relational value even for foreign brands (Sichtmann et al., 2019). The risk is that Alo's global celebrity content still reaches Sydney feeds, competing with the local voice.</w:t>
       </w:r>
     </w:p>
     <w:p>
@@ -2793,7 +2793,7 @@
         <w:spacing w:after="160" w:line="288"/>
       </w:pPr>
       <w:r>
-        <w:t xml:space="preserve">IMC exists because fragmented messages weaken brand equity and trust (Belch &amp; Belch, 2021; Keller, 2001). Figure 5 maps the campaign onto the consumer decision journey, extended for social influence (Court et al., 2009; Stephen, 2016): each stage has a different job, but all six tell the same story, and advocates' #MatToMoment posts become discovery content for the next customer at no media cost. Figure 6 shows the cost of this approach. About 45% of the budget goes to creators, sessions and PR, which carry higher impact but lower control (Duncan, as cited in Belch &amp; Belch, 2021). Customer posts, reviews and creator controversies cannot be scripted. Shared brand codes, tight creator briefs and weekly social listening protect consistency. This is the campaign's central bet: an advertising-led plan would be more controllable but less believable, which is the opposite of what Challenges 1 and 5 need. Because the journey is non-linear, attribution across touchpoints will remain imperfect (Lemon &amp; Verhoef, 2016), which Section 6 acknowledges.</w:t>
+        <w:t xml:space="preserve">IMC exists because fragmented messages weaken brand equity and trust (Belch &amp; Belch, 2021; Keller, 2001). Figure 5 maps the campaign onto the consumer decision journey, extended for social influence (Court et al., 2009; Stephen, 2016): each stage has a different job, but all six tell the same story, and advocates' #MatToMoment posts become discovery content for the next customer at no media cost. Figure 6 shows the cost of this approach. About 45% of the budget goes to creators, sessions and PR, which carry higher impact but lower control (Duncan, as cited in Belch &amp; Belch, 2021). Customer posts, reviews and creator controversies cannot be scripted. Shared brand codes, tight creator briefs and weekly social listening protect consistency. This is the campaign's central bet: advertising alone would be more controllable but less believable.</w:t>
       </w:r>
     </w:p>
     <w:p>
@@ -3512,7 +3512,7 @@
         <w:t xml:space="preserve">Sanctuary Sessions</w:t>
       </w:r>
       <w:r>
-        <w:t xml:space="preserve">: a class, a fabric trial and styling advice, followed by a complimentary styling appointment rather than a discount. Memorable experiences create value that advertising alone cannot (Pine &amp; Gilmore, 1998), and the sessions add something Lululemon's run clubs do not: the community continues into the "moment" after class, which is the half of the proposition Lululemon does not own.</w:t>
+        <w:t xml:space="preserve">: a class, a fabric trial and styling advice, followed by a complimentary styling appointment rather than a discount. Memorable experiences create value that advertising alone cannot (Pine &amp; Gilmore, 1998), and there is precedent: Alo already presents its Chatswood store as a wellness sanctuary (RetailBoss, 2026), Lululemon built community through events such as its Sweatlife festival (lululemon athletica, 2018), and Gymshark's community pop-ups drew crowds before it had local stores (blogTO, 2018). The sessions add something Lululemon's run clubs do not: the community continues into the "moment" after class, which is the half of the proposition Lululemon does not own.</w:t>
       </w:r>
     </w:p>
     <w:p>
@@ -3570,7 +3570,7 @@
         <w:spacing w:after="160" w:line="288"/>
       </w:pPr>
       <w:r>
-        <w:t xml:space="preserve">Appendix H holds draft materials for each element of the media mix: a Reel storyboard, a TikTok creator post, a Spotify script, a session email, a media alert and a cost-per-wear carousel. Figure 7 shows the outdoor panel. All share one set, one day and one sign-off; only the call to action shifts by journey stage.</w:t>
+        <w:t xml:space="preserve">Appendix H holds draft materials for every other element of the mix; Figure 7 shows the outdoor panel. All share one set, one day and one sign-off; only the call to action shifts by journey stage.</w:t>
       </w:r>
     </w:p>
     <w:p>
@@ -3712,7 +3712,7 @@
         <w:t xml:space="preserve">Made for Sydney's day</w:t>
       </w:r>
       <w:r>
-        <w:t xml:space="preserve">. The media objective is to reach 70% of Segment A at least once in Burst 1, at an average frequency of four, and to retarget 20% of those exposed in Burst 3. Geographic coverage is Greater Sydney, weighted to the catchments around Chatswood Chase, The Galeries and Bondi Junction. If Bondi Junction opens late, its weight moves to the CBD. Vehicles are Instagram Reels and Stories, TikTok in-feed ads with boosted creator posts, Spotify audio ads, and bus-side panels on routes serving the three stores. Television and print were excluded because the budget cannot buy competitive television frequency in Sydney, and print reaches this audience less efficiently than social. Filmed sessions and styling guides form the content-marketing layer on owned channels. Outdoor has low audience selectivity (Belch &amp; Belch, 2021), so it carries only the store line, near the stores. Spotify reaches commuting and workout moments but cannot show the set, so it uses sound cues. Retargeting then follows anyone exposed, and it works best once consumers have formed preferences (Lambrecht &amp; Tucker, 2013). Publicity depends on newsworthiness (Belch &amp; Belch, 2021), and a branded class is not news, so the hook is a free Bondi-to-Bronte walk series. Sessions also act as a free trial, which reduces purchase risk without a price cut (Belch &amp; Belch, 2021). Booking and store emails are personalised direct marketing, sent only with recorded consent.</w:t>
+        <w:t xml:space="preserve">. The media objective is to reach 70% of Segment A at least once in Burst 1, at an average frequency of four, and to retarget 20% of those exposed in Burst 3. Geographic coverage is Greater Sydney, weighted to the catchments around Chatswood Chase, The Galeries and Bondi Junction. Vehicles are Instagram Reels and Stories, TikTok in-feed ads with boosted creator posts, Spotify audio ads, and bus-side panels on routes serving the three stores. Television and print were excluded as unaffordable at useful frequency and less efficient for this audience. Filmed sessions and styling guides form the content-marketing layer on owned channels. Outdoor has low audience selectivity (Belch &amp; Belch, 2021), so it carries only the store line, near the stores. Spotify reaches commuting and workout moments but cannot show the set, so it uses sound cues. Retargeting then follows anyone exposed, and it works best once consumers have formed preferences (Lambrecht &amp; Tucker, 2013). Publicity depends on newsworthiness (Belch &amp; Belch, 2021), and a branded class is not news, so the hook is a free Bondi-to-Bronte walk series. Sessions also act as a free trial, which reduces purchase risk without a price cut (Belch &amp; Belch, 2021).</w:t>
       </w:r>
     </w:p>
     <w:p>
@@ -4831,7 +4831,7 @@
         <w:spacing w:after="160" w:line="288"/>
       </w:pPr>
       <w:r>
-        <w:t xml:space="preserve">The budget uses the objective-and-task method (Belch &amp; Belch, 2021). Partnerships receive 42% because they span paid, owned and earned media (Stephen &amp; Galak, 2012): a creator partnership is paid, its content is reused on Alo's owned channels, and audiences share it as earned media. Costs follow published benchmarks. Australian micro-creators charge roughly A$150–750 per post (Wise, 2025), so A$50,000 funds about 40 micro posts plus the lead and macro creators. Sydney bus-side panels start at about A$150 per week plus A$375 production (GoTransit, n.d.), so outdoor buys about 40 panels for three weeks with beach-side posters. At Instagram CPMs of about US$8 (Admetrics, 2025), paid social delivers several million impressions, enough for the Burst 1 reach target. The weakness is that only 40% buys traditional reach, so if Burst 1 misses its reach target, the contingency moves into paid social.</w:t>
+        <w:t xml:space="preserve">The budget uses the objective-and-task method (Belch &amp; Belch, 2021). Partnerships receive 42% because they span paid, owned and earned media (Stephen &amp; Galak, 2012): a creator partnership is paid, its content is reused on Alo's owned channels, and audiences share it as earned media. Costs follow published benchmarks. Australian micro-creators charge roughly A$150–750 per post (Wise, 2025), so A$50,000 funds about 40 micro posts plus the lead and macro creators. Sydney bus-side panels start at about A$150 per week plus A$375 production (GoTransit, n.d.), so outdoor buys about 40 panels for three weeks with beach-side posters. At Instagram CPMs of about US$8 (Admetrics, 2025), paid social delivers several million impressions, enough for the Burst 1 reach target. Sanctuary Sessions, the largest line, are costed bottom-up: Sydney Pilates studios hire for about A$50–120 an hour (Tagvenue, 2025) and instructors earn about A$36 an hour (Payscale, 2026), so 36 sessions cost roughly A$15,000; trial product (A$15,000), filming (A$15,000) and the walk series (A$10,000) make up the rest. The split also reflects Binet and Field's (2013) finding that effective campaigns weight brand building over activation by about 60:40; here outdoor, audio, creators, production and PR take 57% of working budget. The weakness is that only 40% buys traditional reach, so if Burst 1 misses its reach target, the contingency moves into paid social.</w:t>
       </w:r>
     </w:p>
     <w:p>
@@ -6757,7 +6757,7 @@
         <w:spacing w:after="160" w:line="288"/>
       </w:pPr>
       <w:r>
-        <w:t xml:space="preserve">Effectiveness means achieving the intended outcomes, not likes (Belch &amp; Belch, 2021). Pre-testing in December 2026 uses concept tests, A/B comparisons of edits and the baseline survey to check comprehension, brand attribution, relevance and the call to action. Because test viewers are made to watch, results are used to choose between executions rather than forecast outcomes. In-flight digital metrics guide reallocation between bursts. Creators are judged on audience fit, credibility, brand lift and tracked action, not followers (Campbell &amp; Farrell, 2020). Each measure maps to one objective (Table 6). Each survey wave samples about 400 Segment A respondents and 150 Melbourne controls. Post-testing in April 2027 repeats the survey, uses social listening, checks self-reported visits against store traffic and web analytics, and compares results with a Melbourne control sample. Observational attribution can overstate advertising effects compared with experiments (Gordon et al., 2019), so results will be reported as indicative rather than proven.</w:t>
+        <w:t xml:space="preserve">Effectiveness means achieving the intended outcomes, not likes (Belch &amp; Belch, 2021). Pre-testing in December 2026 uses concept tests, A/B comparisons of edits and the baseline survey to check comprehension, brand attribution, relevance and the call to action. Because test viewers are made to watch, results are used to choose between executions rather than forecast outcomes. In-flight digital metrics guide reallocation between bursts. Creators are judged on audience fit, credibility, brand lift and tracked action, not followers (Campbell &amp; Farrell, 2020). Each measure maps to one objective (Table 6). Each survey wave samples about 400 Segment A respondents and 150 Melbourne controls; at that size only changes of roughly five points are reliable, so O4 is judged with store traffic and web data, not the survey alone. Post-testing in April 2027 repeats the survey, uses social listening, checks self-reported visits against store traffic and web analytics, and compares results with a Melbourne control sample. Observational attribution can overstate advertising effects compared with experiments (Gordon et al., 2019), so results will be reported as indicative rather than proven.</w:t>
       </w:r>
     </w:p>
     <w:p>
@@ -7339,7 +7339,7 @@
                 <w:sz w:val="17"/>
                 <w:szCs w:val="17"/>
               </w:rPr>
-              <w:t xml:space="preserve">≥30%, ≥25%</w:t>
+              <w:t xml:space="preserve">≥21%, ≥18%</w:t>
             </w:r>
           </w:p>
         </w:tc>
@@ -7476,7 +7476,7 @@
                 <w:sz w:val="17"/>
                 <w:szCs w:val="17"/>
               </w:rPr>
-              <w:t xml:space="preserve">≥50%</w:t>
+              <w:t xml:space="preserve">≥35%</w:t>
             </w:r>
           </w:p>
         </w:tc>
@@ -7609,7 +7609,7 @@
                 <w:sz w:val="17"/>
                 <w:szCs w:val="17"/>
               </w:rPr>
-              <w:t xml:space="preserve">≥15%</w:t>
+              <w:t xml:space="preserve">≥11%</w:t>
             </w:r>
           </w:p>
         </w:tc>
@@ -7862,7 +7862,7 @@
           <w:sz w:val="21"/>
           <w:szCs w:val="21"/>
         </w:rPr>
-        <w:t xml:space="preserve">Camacho-Miñano, M. J., MacIsaac, S., &amp; Rich, E. (2019). Postfeminist biopedagogies of Instagram: Young women learning about bodies, health and fitness. </w:t>
+        <w:t xml:space="preserve">Binet, L., &amp; Field, P. (2013). </w:t>
       </w:r>
       <w:r>
         <w:rPr>
@@ -7871,14 +7871,14 @@
           <w:sz w:val="21"/>
           <w:szCs w:val="21"/>
         </w:rPr>
-        <w:t xml:space="preserve">Sport, Education and Society, 24</w:t>
-      </w:r>
-      <w:r>
-        <w:rPr>
-          <w:sz w:val="21"/>
-          <w:szCs w:val="21"/>
-        </w:rPr>
-        <w:t xml:space="preserve">(6), 651–664. https://doi.org/10.1080/13573322.2019.1613975</w:t>
+        <w:t xml:space="preserve">The long and the short of it: Balancing short and long-term marketing strategies</w:t>
+      </w:r>
+      <w:r>
+        <w:rPr>
+          <w:sz w:val="21"/>
+          <w:szCs w:val="21"/>
+        </w:rPr>
+        <w:t xml:space="preserve">. Institute of Practitioners in Advertising.</w:t>
       </w:r>
     </w:p>
     <w:p>
@@ -7891,7 +7891,7 @@
           <w:sz w:val="21"/>
           <w:szCs w:val="21"/>
         </w:rPr>
-        <w:t xml:space="preserve">Cameron, G. T. (1994). Does publicity outperform advertising? An experimental test of the third-party endorsement. </w:t>
+        <w:t xml:space="preserve">blogTO. (2018, October). </w:t>
       </w:r>
       <w:r>
         <w:rPr>
@@ -7900,14 +7900,14 @@
           <w:sz w:val="21"/>
           <w:szCs w:val="21"/>
         </w:rPr>
-        <w:t xml:space="preserve">Journal of Public Relations Research, 6</w:t>
-      </w:r>
-      <w:r>
-        <w:rPr>
-          <w:sz w:val="21"/>
-          <w:szCs w:val="21"/>
-        </w:rPr>
-        <w:t xml:space="preserve">(3), 185–207. https://doi.org/10.1207/s1532754xjprr0603_02</w:t>
+        <w:t xml:space="preserve">UK fitness brand Gymshark arrives in Toronto to massive crowds</w:t>
+      </w:r>
+      <w:r>
+        <w:rPr>
+          <w:sz w:val="21"/>
+          <w:szCs w:val="21"/>
+        </w:rPr>
+        <w:t xml:space="preserve">. https://www.blogto.com/sports_play/2018/10/gymshark-toronto/</w:t>
       </w:r>
     </w:p>
     <w:p>
@@ -7920,7 +7920,7 @@
           <w:sz w:val="21"/>
           <w:szCs w:val="21"/>
         </w:rPr>
-        <w:t xml:space="preserve">Campbell, C., &amp; Farrell, J. R. (2020). More than meets the eye: The functional components underlying influencer marketing. </w:t>
+        <w:t xml:space="preserve">Camacho-Miñano, M. J., MacIsaac, S., &amp; Rich, E. (2019). Postfeminist biopedagogies of Instagram: Young women learning about bodies, health and fitness. </w:t>
       </w:r>
       <w:r>
         <w:rPr>
@@ -7929,14 +7929,14 @@
           <w:sz w:val="21"/>
           <w:szCs w:val="21"/>
         </w:rPr>
-        <w:t xml:space="preserve">Business Horizons, 63</w:t>
-      </w:r>
-      <w:r>
-        <w:rPr>
-          <w:sz w:val="21"/>
-          <w:szCs w:val="21"/>
-        </w:rPr>
-        <w:t xml:space="preserve">(4), 469–479. https://doi.org/10.1016/j.bushor.2020.03.003</w:t>
+        <w:t xml:space="preserve">Sport, Education and Society, 24</w:t>
+      </w:r>
+      <w:r>
+        <w:rPr>
+          <w:sz w:val="21"/>
+          <w:szCs w:val="21"/>
+        </w:rPr>
+        <w:t xml:space="preserve">(6), 651–664. https://doi.org/10.1080/13573322.2019.1613975</w:t>
       </w:r>
     </w:p>
     <w:p>
@@ -7949,7 +7949,7 @@
           <w:sz w:val="21"/>
           <w:szCs w:val="21"/>
         </w:rPr>
-        <w:t xml:space="preserve">Colley, R. H. (1961). </w:t>
+        <w:t xml:space="preserve">Cameron, G. T. (1994). Does publicity outperform advertising? An experimental test of the third-party endorsement. </w:t>
       </w:r>
       <w:r>
         <w:rPr>
@@ -7958,14 +7958,14 @@
           <w:sz w:val="21"/>
           <w:szCs w:val="21"/>
         </w:rPr>
-        <w:t xml:space="preserve">Defining advertising goals for measured advertising results</w:t>
-      </w:r>
-      <w:r>
-        <w:rPr>
-          <w:sz w:val="21"/>
-          <w:szCs w:val="21"/>
-        </w:rPr>
-        <w:t xml:space="preserve">. Association of National Advertisers.</w:t>
+        <w:t xml:space="preserve">Journal of Public Relations Research, 6</w:t>
+      </w:r>
+      <w:r>
+        <w:rPr>
+          <w:sz w:val="21"/>
+          <w:szCs w:val="21"/>
+        </w:rPr>
+        <w:t xml:space="preserve">(3), 185–207. https://doi.org/10.1207/s1532754xjprr0603_02</w:t>
       </w:r>
     </w:p>
     <w:p>
@@ -7978,7 +7978,7 @@
           <w:sz w:val="21"/>
           <w:szCs w:val="21"/>
         </w:rPr>
-        <w:t xml:space="preserve">Concrete Playground. (2026, September 15). </w:t>
+        <w:t xml:space="preserve">Campbell, C., &amp; Farrell, J. R. (2020). More than meets the eye: The functional components underlying influencer marketing. </w:t>
       </w:r>
       <w:r>
         <w:rPr>
@@ -7987,14 +7987,14 @@
           <w:sz w:val="21"/>
           <w:szCs w:val="21"/>
         </w:rPr>
-        <w:t xml:space="preserve">Now open: Cult LA activewear brand Alo has opened a store in the heart of Sydney's CBD at The Galeries</w:t>
-      </w:r>
-      <w:r>
-        <w:rPr>
-          <w:sz w:val="21"/>
-          <w:szCs w:val="21"/>
-        </w:rPr>
-        <w:t xml:space="preserve">. https://concreteplayground.com/sydney/?p=1144787</w:t>
+        <w:t xml:space="preserve">Business Horizons, 63</w:t>
+      </w:r>
+      <w:r>
+        <w:rPr>
+          <w:sz w:val="21"/>
+          <w:szCs w:val="21"/>
+        </w:rPr>
+        <w:t xml:space="preserve">(4), 469–479. https://doi.org/10.1016/j.bushor.2020.03.003</w:t>
       </w:r>
     </w:p>
     <w:p>
@@ -8007,7 +8007,7 @@
           <w:sz w:val="21"/>
           <w:szCs w:val="21"/>
         </w:rPr>
-        <w:t xml:space="preserve">Court, D., Elzinga, D., Mulder, S., &amp; Vetvik, O. J. (2009). The consumer decision journey. </w:t>
+        <w:t xml:space="preserve">Colley, R. H. (1961). </w:t>
       </w:r>
       <w:r>
         <w:rPr>
@@ -8016,14 +8016,14 @@
           <w:sz w:val="21"/>
           <w:szCs w:val="21"/>
         </w:rPr>
-        <w:t xml:space="preserve">McKinsey Quarterly</w:t>
-      </w:r>
-      <w:r>
-        <w:rPr>
-          <w:sz w:val="21"/>
-          <w:szCs w:val="21"/>
-        </w:rPr>
-        <w:t xml:space="preserve">, (3), 96–107.</w:t>
+        <w:t xml:space="preserve">Defining advertising goals for measured advertising results</w:t>
+      </w:r>
+      <w:r>
+        <w:rPr>
+          <w:sz w:val="21"/>
+          <w:szCs w:val="21"/>
+        </w:rPr>
+        <w:t xml:space="preserve">. Association of National Advertisers.</w:t>
       </w:r>
     </w:p>
     <w:p>
@@ -8036,7 +8036,7 @@
           <w:sz w:val="21"/>
           <w:szCs w:val="21"/>
         </w:rPr>
-        <w:t xml:space="preserve">De Veirman, M., Cauberghe, V., &amp; Hudders, L. (2017). Marketing through Instagram influencers: The impact of number of followers and product divergence on brand attitude. </w:t>
+        <w:t xml:space="preserve">Concrete Playground. (2026, September 15). </w:t>
       </w:r>
       <w:r>
         <w:rPr>
@@ -8045,14 +8045,14 @@
           <w:sz w:val="21"/>
           <w:szCs w:val="21"/>
         </w:rPr>
-        <w:t xml:space="preserve">International Journal of Advertising, 36</w:t>
-      </w:r>
-      <w:r>
-        <w:rPr>
-          <w:sz w:val="21"/>
-          <w:szCs w:val="21"/>
-        </w:rPr>
-        <w:t xml:space="preserve">(5), 798–828. https://doi.org/10.1080/02650487.2017.1348035</w:t>
+        <w:t xml:space="preserve">Now open: Cult LA activewear brand Alo has opened a store in the heart of Sydney's CBD at The Galeries</w:t>
+      </w:r>
+      <w:r>
+        <w:rPr>
+          <w:sz w:val="21"/>
+          <w:szCs w:val="21"/>
+        </w:rPr>
+        <w:t xml:space="preserve">. https://concreteplayground.com/sydney/?p=1144787</w:t>
       </w:r>
     </w:p>
     <w:p>
@@ -8065,7 +8065,7 @@
           <w:sz w:val="21"/>
           <w:szCs w:val="21"/>
         </w:rPr>
-        <w:t xml:space="preserve">Deloitte. (2026). </w:t>
+        <w:t xml:space="preserve">Court, D., Elzinga, D., Mulder, S., &amp; Vetvik, O. J. (2009). The consumer decision journey. </w:t>
       </w:r>
       <w:r>
         <w:rPr>
@@ -8074,14 +8074,14 @@
           <w:sz w:val="21"/>
           <w:szCs w:val="21"/>
         </w:rPr>
-        <w:t xml:space="preserve">2026 Gen Z and millennial survey</w:t>
-      </w:r>
-      <w:r>
-        <w:rPr>
-          <w:sz w:val="21"/>
-          <w:szCs w:val="21"/>
-        </w:rPr>
-        <w:t xml:space="preserve">. https://www.deloitte.com/global/en/issues/work/genz-millennial-survey.html</w:t>
+        <w:t xml:space="preserve">McKinsey Quarterly</w:t>
+      </w:r>
+      <w:r>
+        <w:rPr>
+          <w:sz w:val="21"/>
+          <w:szCs w:val="21"/>
+        </w:rPr>
+        <w:t xml:space="preserve">, (3), 96–107.</w:t>
       </w:r>
     </w:p>
     <w:p>
@@ -8094,7 +8094,7 @@
           <w:sz w:val="21"/>
           <w:szCs w:val="21"/>
         </w:rPr>
-        <w:t xml:space="preserve">Escalas, J. E., &amp; Bettman, J. R. (2005). Self-construal, reference groups, and brand meaning. </w:t>
+        <w:t xml:space="preserve">De Veirman, M., Cauberghe, V., &amp; Hudders, L. (2017). Marketing through Instagram influencers: The impact of number of followers and product divergence on brand attitude. </w:t>
       </w:r>
       <w:r>
         <w:rPr>
@@ -8103,14 +8103,14 @@
           <w:sz w:val="21"/>
           <w:szCs w:val="21"/>
         </w:rPr>
-        <w:t xml:space="preserve">Journal of Consumer Research, 32</w:t>
-      </w:r>
-      <w:r>
-        <w:rPr>
-          <w:sz w:val="21"/>
-          <w:szCs w:val="21"/>
-        </w:rPr>
-        <w:t xml:space="preserve">(3), 378–389. https://doi.org/10.1086/497549</w:t>
+        <w:t xml:space="preserve">International Journal of Advertising, 36</w:t>
+      </w:r>
+      <w:r>
+        <w:rPr>
+          <w:sz w:val="21"/>
+          <w:szCs w:val="21"/>
+        </w:rPr>
+        <w:t xml:space="preserve">(5), 798–828. https://doi.org/10.1080/02650487.2017.1348035</w:t>
       </w:r>
     </w:p>
     <w:p>
@@ -8123,7 +8123,7 @@
           <w:sz w:val="21"/>
           <w:szCs w:val="21"/>
         </w:rPr>
-        <w:t xml:space="preserve">Francis, T., &amp; Hoefel, F. (2018, November 12). </w:t>
+        <w:t xml:space="preserve">Deloitte. (2026). </w:t>
       </w:r>
       <w:r>
         <w:rPr>
@@ -8132,14 +8132,14 @@
           <w:sz w:val="21"/>
           <w:szCs w:val="21"/>
         </w:rPr>
-        <w:t xml:space="preserve">'True Gen': Generation Z and its implications for companies</w:t>
-      </w:r>
-      <w:r>
-        <w:rPr>
-          <w:sz w:val="21"/>
-          <w:szCs w:val="21"/>
-        </w:rPr>
-        <w:t xml:space="preserve">. McKinsey &amp; Company. https://www.mckinsey.com/industries/consumer-packaged-goods/our-insights/true-gen-generation-z-and-its-implications-for-companies</w:t>
+        <w:t xml:space="preserve">2026 Gen Z and millennial survey</w:t>
+      </w:r>
+      <w:r>
+        <w:rPr>
+          <w:sz w:val="21"/>
+          <w:szCs w:val="21"/>
+        </w:rPr>
+        <w:t xml:space="preserve">. https://www.deloitte.com/global/en/issues/work/genz-millennial-survey.html</w:t>
       </w:r>
     </w:p>
     <w:p>
@@ -8152,7 +8152,7 @@
           <w:sz w:val="21"/>
           <w:szCs w:val="21"/>
         </w:rPr>
-        <w:t xml:space="preserve">Google Trends. (2026). </w:t>
+        <w:t xml:space="preserve">Escalas, J. E., &amp; Bettman, J. R. (2005). Self-construal, reference groups, and brand meaning. </w:t>
       </w:r>
       <w:r>
         <w:rPr>
@@ -8161,14 +8161,14 @@
           <w:sz w:val="21"/>
           <w:szCs w:val="21"/>
         </w:rPr>
-        <w:t xml:space="preserve">Lorna Jane, Lululemon and Alo Yoga (topics): Interest over time, New South Wales, 2026</w:t>
-      </w:r>
-      <w:r>
-        <w:rPr>
-          <w:sz w:val="21"/>
-          <w:szCs w:val="21"/>
-        </w:rPr>
-        <w:t xml:space="preserve"> [Data set]. Google. Retrieved October 28, 2026, from https://trends.google.com/trends/</w:t>
+        <w:t xml:space="preserve">Journal of Consumer Research, 32</w:t>
+      </w:r>
+      <w:r>
+        <w:rPr>
+          <w:sz w:val="21"/>
+          <w:szCs w:val="21"/>
+        </w:rPr>
+        <w:t xml:space="preserve">(3), 378–389. https://doi.org/10.1086/497549</w:t>
       </w:r>
     </w:p>
     <w:p>
@@ -8181,7 +8181,7 @@
           <w:sz w:val="21"/>
           <w:szCs w:val="21"/>
         </w:rPr>
-        <w:t xml:space="preserve">Gordon, B. R., Zettelmeyer, F., Bhargava, N., &amp; Chapsky, D. (2019). A comparison of approaches to advertising measurement: Evidence from big field experiments at Facebook. </w:t>
+        <w:t xml:space="preserve">Francis, T., &amp; Hoefel, F. (2018, November 12). </w:t>
       </w:r>
       <w:r>
         <w:rPr>
@@ -8190,14 +8190,14 @@
           <w:sz w:val="21"/>
           <w:szCs w:val="21"/>
         </w:rPr>
-        <w:t xml:space="preserve">Marketing Science, 38</w:t>
-      </w:r>
-      <w:r>
-        <w:rPr>
-          <w:sz w:val="21"/>
-          <w:szCs w:val="21"/>
-        </w:rPr>
-        <w:t xml:space="preserve">(2), 193–225. https://doi.org/10.1287/mksc.2018.1135</w:t>
+        <w:t xml:space="preserve">'True Gen': Generation Z and its implications for companies</w:t>
+      </w:r>
+      <w:r>
+        <w:rPr>
+          <w:sz w:val="21"/>
+          <w:szCs w:val="21"/>
+        </w:rPr>
+        <w:t xml:space="preserve">. McKinsey &amp; Company. https://www.mckinsey.com/industries/consumer-packaged-goods/our-insights/true-gen-generation-z-and-its-implications-for-companies</w:t>
       </w:r>
     </w:p>
     <w:p>
@@ -8210,7 +8210,7 @@
           <w:sz w:val="21"/>
           <w:szCs w:val="21"/>
         </w:rPr>
-        <w:t xml:space="preserve">GoTransit. (n.d.). </w:t>
+        <w:t xml:space="preserve">Google Trends. (2026). </w:t>
       </w:r>
       <w:r>
         <w:rPr>
@@ -8219,14 +8219,14 @@
           <w:sz w:val="21"/>
           <w:szCs w:val="21"/>
         </w:rPr>
-        <w:t xml:space="preserve">Bus advertising</w:t>
-      </w:r>
-      <w:r>
-        <w:rPr>
-          <w:sz w:val="21"/>
-          <w:szCs w:val="21"/>
-        </w:rPr>
-        <w:t xml:space="preserve">. Retrieved October 28, 2026, from https://gotransit.com.au/</w:t>
+        <w:t xml:space="preserve">Lorna Jane, Lululemon and Alo Yoga (topics): Interest over time, New South Wales, 2026</w:t>
+      </w:r>
+      <w:r>
+        <w:rPr>
+          <w:sz w:val="21"/>
+          <w:szCs w:val="21"/>
+        </w:rPr>
+        <w:t xml:space="preserve"> [Data set]. Google. Retrieved October 28, 2026, from https://trends.google.com/trends/</w:t>
       </w:r>
     </w:p>
     <w:p>
@@ -8239,7 +8239,7 @@
           <w:sz w:val="21"/>
           <w:szCs w:val="21"/>
         </w:rPr>
-        <w:t xml:space="preserve">Inside Retail. (2025, January). </w:t>
+        <w:t xml:space="preserve">Gordon, B. R., Zettelmeyer, F., Bhargava, N., &amp; Chapsky, D. (2019). A comparison of approaches to advertising measurement: Evidence from big field experiments at Facebook. </w:t>
       </w:r>
       <w:r>
         <w:rPr>
@@ -8248,14 +8248,14 @@
           <w:sz w:val="21"/>
           <w:szCs w:val="21"/>
         </w:rPr>
-        <w:t xml:space="preserve">Lorna Jane's profit doubles thanks to strong demand for athletic clothing</w:t>
-      </w:r>
-      <w:r>
-        <w:rPr>
-          <w:sz w:val="21"/>
-          <w:szCs w:val="21"/>
-        </w:rPr>
-        <w:t xml:space="preserve">. https://insideretail.com.au/business/lorna-janes-profit-doubles-thanks-to-strong-demand-for-athletic-clothing-202501</w:t>
+        <w:t xml:space="preserve">Marketing Science, 38</w:t>
+      </w:r>
+      <w:r>
+        <w:rPr>
+          <w:sz w:val="21"/>
+          <w:szCs w:val="21"/>
+        </w:rPr>
+        <w:t xml:space="preserve">(2), 193–225. https://doi.org/10.1287/mksc.2018.1135</w:t>
       </w:r>
     </w:p>
     <w:p>
@@ -8268,7 +8268,7 @@
           <w:sz w:val="21"/>
           <w:szCs w:val="21"/>
         </w:rPr>
-        <w:t xml:space="preserve">Inside Retail. (2026, May). </w:t>
+        <w:t xml:space="preserve">GoTransit. (n.d.). </w:t>
       </w:r>
       <w:r>
         <w:rPr>
@@ -8277,14 +8277,14 @@
           <w:sz w:val="21"/>
           <w:szCs w:val="21"/>
         </w:rPr>
-        <w:t xml:space="preserve">Alo makes Australian debut at Sydney's Chatswood Chase</w:t>
-      </w:r>
-      <w:r>
-        <w:rPr>
-          <w:sz w:val="21"/>
-          <w:szCs w:val="21"/>
-        </w:rPr>
-        <w:t xml:space="preserve">. https://insideretail.com.au/stores/openings-closings/alo-makes-australian-debut-at-sydneys-chatswood-chase-202605</w:t>
+        <w:t xml:space="preserve">Bus advertising</w:t>
+      </w:r>
+      <w:r>
+        <w:rPr>
+          <w:sz w:val="21"/>
+          <w:szCs w:val="21"/>
+        </w:rPr>
+        <w:t xml:space="preserve">. Retrieved October 28, 2026, from https://gotransit.com.au/</w:t>
       </w:r>
     </w:p>
     <w:p>
@@ -8297,7 +8297,7 @@
           <w:sz w:val="21"/>
           <w:szCs w:val="21"/>
         </w:rPr>
-        <w:t xml:space="preserve">Kamins, M. A. (1990). An investigation into the "match-up" hypothesis in celebrity advertising: When beauty may be only skin deep. </w:t>
+        <w:t xml:space="preserve">Inside Retail. (2025, January). </w:t>
       </w:r>
       <w:r>
         <w:rPr>
@@ -8306,14 +8306,14 @@
           <w:sz w:val="21"/>
           <w:szCs w:val="21"/>
         </w:rPr>
-        <w:t xml:space="preserve">Journal of Advertising, 19</w:t>
-      </w:r>
-      <w:r>
-        <w:rPr>
-          <w:sz w:val="21"/>
-          <w:szCs w:val="21"/>
-        </w:rPr>
-        <w:t xml:space="preserve">(1), 4–13. https://doi.org/10.1080/00913367.1990.10673175</w:t>
+        <w:t xml:space="preserve">Lorna Jane's profit doubles thanks to strong demand for athletic clothing</w:t>
+      </w:r>
+      <w:r>
+        <w:rPr>
+          <w:sz w:val="21"/>
+          <w:szCs w:val="21"/>
+        </w:rPr>
+        <w:t xml:space="preserve">. https://insideretail.com.au/business/lorna-janes-profit-doubles-thanks-to-strong-demand-for-athletic-clothing-202501</w:t>
       </w:r>
     </w:p>
     <w:p>
@@ -8326,7 +8326,7 @@
           <w:sz w:val="21"/>
           <w:szCs w:val="21"/>
         </w:rPr>
-        <w:t xml:space="preserve">Kapferer, J.-N., &amp; Bastien, V. (2009). </w:t>
+        <w:t xml:space="preserve">Inside Retail. (2026, May). </w:t>
       </w:r>
       <w:r>
         <w:rPr>
@@ -8335,14 +8335,14 @@
           <w:sz w:val="21"/>
           <w:szCs w:val="21"/>
         </w:rPr>
-        <w:t xml:space="preserve">The luxury strategy: Break the rules of marketing to build luxury brands</w:t>
-      </w:r>
-      <w:r>
-        <w:rPr>
-          <w:sz w:val="21"/>
-          <w:szCs w:val="21"/>
-        </w:rPr>
-        <w:t xml:space="preserve">. Kogan Page.</w:t>
+        <w:t xml:space="preserve">Alo makes Australian debut at Sydney's Chatswood Chase</w:t>
+      </w:r>
+      <w:r>
+        <w:rPr>
+          <w:sz w:val="21"/>
+          <w:szCs w:val="21"/>
+        </w:rPr>
+        <w:t xml:space="preserve">. https://insideretail.com.au/stores/openings-closings/alo-makes-australian-debut-at-sydneys-chatswood-chase-202605</w:t>
       </w:r>
     </w:p>
     <w:p>
@@ -8355,7 +8355,7 @@
           <w:sz w:val="21"/>
           <w:szCs w:val="21"/>
         </w:rPr>
-        <w:t xml:space="preserve">Keller, K. L. (1993). Conceptualizing, measuring, and managing customer-based brand equity. </w:t>
+        <w:t xml:space="preserve">Kamins, M. A. (1990). An investigation into the "match-up" hypothesis in celebrity advertising: When beauty may be only skin deep. </w:t>
       </w:r>
       <w:r>
         <w:rPr>
@@ -8364,14 +8364,14 @@
           <w:sz w:val="21"/>
           <w:szCs w:val="21"/>
         </w:rPr>
-        <w:t xml:space="preserve">Journal of Marketing, 57</w:t>
-      </w:r>
-      <w:r>
-        <w:rPr>
-          <w:sz w:val="21"/>
-          <w:szCs w:val="21"/>
-        </w:rPr>
-        <w:t xml:space="preserve">(1), 1–22. https://doi.org/10.1177/002224299305700101</w:t>
+        <w:t xml:space="preserve">Journal of Advertising, 19</w:t>
+      </w:r>
+      <w:r>
+        <w:rPr>
+          <w:sz w:val="21"/>
+          <w:szCs w:val="21"/>
+        </w:rPr>
+        <w:t xml:space="preserve">(1), 4–13. https://doi.org/10.1080/00913367.1990.10673175</w:t>
       </w:r>
     </w:p>
     <w:p>
@@ -8384,7 +8384,7 @@
           <w:sz w:val="21"/>
           <w:szCs w:val="21"/>
         </w:rPr>
-        <w:t xml:space="preserve">Keller, K. L. (2001). Mastering the marketing communications mix: Micro and macro perspectives on integrated marketing communication programs. </w:t>
+        <w:t xml:space="preserve">Kapferer, J.-N., &amp; Bastien, V. (2009). </w:t>
       </w:r>
       <w:r>
         <w:rPr>
@@ -8393,14 +8393,14 @@
           <w:sz w:val="21"/>
           <w:szCs w:val="21"/>
         </w:rPr>
-        <w:t xml:space="preserve">Journal of Marketing Management, 17</w:t>
-      </w:r>
-      <w:r>
-        <w:rPr>
-          <w:sz w:val="21"/>
-          <w:szCs w:val="21"/>
-        </w:rPr>
-        <w:t xml:space="preserve">(7–8), 819–847. https://doi.org/10.1362/026725701323366836</w:t>
+        <w:t xml:space="preserve">The luxury strategy: Break the rules of marketing to build luxury brands</w:t>
+      </w:r>
+      <w:r>
+        <w:rPr>
+          <w:sz w:val="21"/>
+          <w:szCs w:val="21"/>
+        </w:rPr>
+        <w:t xml:space="preserve">. Kogan Page.</w:t>
       </w:r>
     </w:p>
     <w:p>
@@ -8413,7 +8413,7 @@
           <w:sz w:val="21"/>
           <w:szCs w:val="21"/>
         </w:rPr>
-        <w:t xml:space="preserve">Lambrecht, A., &amp; Tucker, C. (2013). When does retargeting work? Information specificity in online advertising. </w:t>
+        <w:t xml:space="preserve">Keller, K. L. (1993). Conceptualizing, measuring, and managing customer-based brand equity. </w:t>
       </w:r>
       <w:r>
         <w:rPr>
@@ -8422,14 +8422,14 @@
           <w:sz w:val="21"/>
           <w:szCs w:val="21"/>
         </w:rPr>
-        <w:t xml:space="preserve">Journal of Marketing Research, 50</w:t>
-      </w:r>
-      <w:r>
-        <w:rPr>
-          <w:sz w:val="21"/>
-          <w:szCs w:val="21"/>
-        </w:rPr>
-        <w:t xml:space="preserve">(5), 561–576. https://doi.org/10.1509/jmr.11.0503</w:t>
+        <w:t xml:space="preserve">Journal of Marketing, 57</w:t>
+      </w:r>
+      <w:r>
+        <w:rPr>
+          <w:sz w:val="21"/>
+          <w:szCs w:val="21"/>
+        </w:rPr>
+        <w:t xml:space="preserve">(1), 1–22. https://doi.org/10.1177/002224299305700101</w:t>
       </w:r>
     </w:p>
     <w:p>
@@ -8442,7 +8442,7 @@
           <w:sz w:val="21"/>
           <w:szCs w:val="21"/>
         </w:rPr>
-        <w:t xml:space="preserve">Lavidge, R. J., &amp; Steiner, G. A. (1961). A model for predictive measurements of advertising effectiveness. </w:t>
+        <w:t xml:space="preserve">Keller, K. L. (2001). Mastering the marketing communications mix: Micro and macro perspectives on integrated marketing communication programs. </w:t>
       </w:r>
       <w:r>
         <w:rPr>
@@ -8451,14 +8451,14 @@
           <w:sz w:val="21"/>
           <w:szCs w:val="21"/>
         </w:rPr>
-        <w:t xml:space="preserve">Journal of Marketing, 25</w:t>
-      </w:r>
-      <w:r>
-        <w:rPr>
-          <w:sz w:val="21"/>
-          <w:szCs w:val="21"/>
-        </w:rPr>
-        <w:t xml:space="preserve">(6), 59–62. https://doi.org/10.1177/002224296102500611</w:t>
+        <w:t xml:space="preserve">Journal of Marketing Management, 17</w:t>
+      </w:r>
+      <w:r>
+        <w:rPr>
+          <w:sz w:val="21"/>
+          <w:szCs w:val="21"/>
+        </w:rPr>
+        <w:t xml:space="preserve">(7–8), 819–847. https://doi.org/10.1362/026725701323366836</w:t>
       </w:r>
     </w:p>
     <w:p>
@@ -8471,7 +8471,7 @@
           <w:sz w:val="21"/>
           <w:szCs w:val="21"/>
         </w:rPr>
-        <w:t xml:space="preserve">Lemon, K. N., &amp; Verhoef, P. C. (2016). Understanding customer experience throughout the customer journey. </w:t>
+        <w:t xml:space="preserve">Lambrecht, A., &amp; Tucker, C. (2013). When does retargeting work? Information specificity in online advertising. </w:t>
       </w:r>
       <w:r>
         <w:rPr>
@@ -8480,14 +8480,14 @@
           <w:sz w:val="21"/>
           <w:szCs w:val="21"/>
         </w:rPr>
-        <w:t xml:space="preserve">Journal of Marketing, 80</w:t>
-      </w:r>
-      <w:r>
-        <w:rPr>
-          <w:sz w:val="21"/>
-          <w:szCs w:val="21"/>
-        </w:rPr>
-        <w:t xml:space="preserve">(6), 69–96. https://doi.org/10.1509/jm.15.0420</w:t>
+        <w:t xml:space="preserve">Journal of Marketing Research, 50</w:t>
+      </w:r>
+      <w:r>
+        <w:rPr>
+          <w:sz w:val="21"/>
+          <w:szCs w:val="21"/>
+        </w:rPr>
+        <w:t xml:space="preserve">(5), 561–576. https://doi.org/10.1509/jmr.11.0503</w:t>
       </w:r>
     </w:p>
     <w:p>
@@ -8500,7 +8500,7 @@
           <w:sz w:val="21"/>
           <w:szCs w:val="21"/>
         </w:rPr>
-        <w:t xml:space="preserve">Levitt, T. (1983). The globalization of markets. </w:t>
+        <w:t xml:space="preserve">Lavidge, R. J., &amp; Steiner, G. A. (1961). A model for predictive measurements of advertising effectiveness. </w:t>
       </w:r>
       <w:r>
         <w:rPr>
@@ -8509,14 +8509,14 @@
           <w:sz w:val="21"/>
           <w:szCs w:val="21"/>
         </w:rPr>
-        <w:t xml:space="preserve">Harvard Business Review, 61</w:t>
-      </w:r>
-      <w:r>
-        <w:rPr>
-          <w:sz w:val="21"/>
-          <w:szCs w:val="21"/>
-        </w:rPr>
-        <w:t xml:space="preserve">(3), 92–102.</w:t>
+        <w:t xml:space="preserve">Journal of Marketing, 25</w:t>
+      </w:r>
+      <w:r>
+        <w:rPr>
+          <w:sz w:val="21"/>
+          <w:szCs w:val="21"/>
+        </w:rPr>
+        <w:t xml:space="preserve">(6), 59–62. https://doi.org/10.1177/002224296102500611</w:t>
       </w:r>
     </w:p>
     <w:p>
@@ -8529,7 +8529,7 @@
           <w:sz w:val="21"/>
           <w:szCs w:val="21"/>
         </w:rPr>
-        <w:t xml:space="preserve">Lou, C., &amp; Yuan, S. (2019). Influencer marketing: How message value and credibility affect consumer trust of branded content on social media. </w:t>
+        <w:t xml:space="preserve">Levitt, T. (1983). The globalization of markets. </w:t>
       </w:r>
       <w:r>
         <w:rPr>
@@ -8538,14 +8538,14 @@
           <w:sz w:val="21"/>
           <w:szCs w:val="21"/>
         </w:rPr>
-        <w:t xml:space="preserve">Journal of Interactive Advertising, 19</w:t>
-      </w:r>
-      <w:r>
-        <w:rPr>
-          <w:sz w:val="21"/>
-          <w:szCs w:val="21"/>
-        </w:rPr>
-        <w:t xml:space="preserve">(1), 58–73. https://doi.org/10.1080/15252019.2018.1533501</w:t>
+        <w:t xml:space="preserve">Harvard Business Review, 61</w:t>
+      </w:r>
+      <w:r>
+        <w:rPr>
+          <w:sz w:val="21"/>
+          <w:szCs w:val="21"/>
+        </w:rPr>
+        <w:t xml:space="preserve">(3), 92–102.</w:t>
       </w:r>
     </w:p>
     <w:p>
@@ -8558,7 +8558,7 @@
           <w:sz w:val="21"/>
           <w:szCs w:val="21"/>
         </w:rPr>
-        <w:t xml:space="preserve">lululemon athletica. (n.d.). </w:t>
+        <w:t xml:space="preserve">Lou, C., &amp; Yuan, S. (2019). Influencer marketing: How message value and credibility affect consumer trust of branded content on social media. </w:t>
       </w:r>
       <w:r>
         <w:rPr>
@@ -8567,14 +8567,14 @@
           <w:sz w:val="21"/>
           <w:szCs w:val="21"/>
         </w:rPr>
-        <w:t xml:space="preserve">Community engagement</w:t>
-      </w:r>
-      <w:r>
-        <w:rPr>
-          <w:sz w:val="21"/>
-          <w:szCs w:val="21"/>
-        </w:rPr>
-        <w:t xml:space="preserve">. Retrieved October 28, 2026, from https://corporate.lululemon.com/our-business/innovation/community-engagement</w:t>
+        <w:t xml:space="preserve">Journal of Interactive Advertising, 19</w:t>
+      </w:r>
+      <w:r>
+        <w:rPr>
+          <w:sz w:val="21"/>
+          <w:szCs w:val="21"/>
+        </w:rPr>
+        <w:t xml:space="preserve">(1), 58–73. https://doi.org/10.1080/15252019.2018.1533501</w:t>
       </w:r>
     </w:p>
     <w:p>
@@ -8587,7 +8587,7 @@
           <w:sz w:val="21"/>
           <w:szCs w:val="21"/>
         </w:rPr>
-        <w:t xml:space="preserve">Mela, C. F., Gupta, S., &amp; Lehmann, D. R. (1997). The long-term impact of promotion and advertising on consumer brand choice. </w:t>
+        <w:t xml:space="preserve">lululemon athletica. (n.d.). </w:t>
       </w:r>
       <w:r>
         <w:rPr>
@@ -8596,14 +8596,14 @@
           <w:sz w:val="21"/>
           <w:szCs w:val="21"/>
         </w:rPr>
-        <w:t xml:space="preserve">Journal of Marketing Research, 34</w:t>
-      </w:r>
-      <w:r>
-        <w:rPr>
-          <w:sz w:val="21"/>
-          <w:szCs w:val="21"/>
-        </w:rPr>
-        <w:t xml:space="preserve">(2), 248–261. https://doi.org/10.1177/002224379703400205</w:t>
+        <w:t xml:space="preserve">Community engagement</w:t>
+      </w:r>
+      <w:r>
+        <w:rPr>
+          <w:sz w:val="21"/>
+          <w:szCs w:val="21"/>
+        </w:rPr>
+        <w:t xml:space="preserve">. Retrieved October 28, 2026, from https://corporate.lululemon.com/our-business/innovation/community-engagement</w:t>
       </w:r>
     </w:p>
     <w:p>
@@ -8616,7 +8616,7 @@
           <w:sz w:val="21"/>
           <w:szCs w:val="21"/>
         </w:rPr>
-        <w:t xml:space="preserve">Modaes. (2026). </w:t>
+        <w:t xml:space="preserve">lululemon athletica. (2018). </w:t>
       </w:r>
       <w:r>
         <w:rPr>
@@ -8625,14 +8625,14 @@
           <w:sz w:val="21"/>
           <w:szCs w:val="21"/>
         </w:rPr>
-        <w:t xml:space="preserve">The owner of Alo Yoga is considering an IPO after selling Bellacanvas</w:t>
-      </w:r>
-      <w:r>
-        <w:rPr>
-          <w:sz w:val="21"/>
-          <w:szCs w:val="21"/>
-        </w:rPr>
-        <w:t xml:space="preserve">. https://www.modaes.com/global/companies/the-owner-of-alo-yoga-is-considering-an-ipo-after-selling-bellacanvas</w:t>
+        <w:t xml:space="preserve">lululemon Sweatlife festival returns to London June 23–24, 2018</w:t>
+      </w:r>
+      <w:r>
+        <w:rPr>
+          <w:sz w:val="21"/>
+          <w:szCs w:val="21"/>
+        </w:rPr>
+        <w:t xml:space="preserve">. https://corporate.lululemon.com/media/our-stories/2018/lululemon-sweatlife-festival-returns-to-london-june-23-24-2018</w:t>
       </w:r>
     </w:p>
     <w:p>
@@ -8645,7 +8645,7 @@
           <w:sz w:val="21"/>
           <w:szCs w:val="21"/>
         </w:rPr>
-        <w:t xml:space="preserve">Ohanian, R. (1990). Construction and validation of a scale to measure celebrity endorsers' perceived expertise, trustworthiness, and attractiveness. </w:t>
+        <w:t xml:space="preserve">Mela, C. F., Gupta, S., &amp; Lehmann, D. R. (1997). The long-term impact of promotion and advertising on consumer brand choice. </w:t>
       </w:r>
       <w:r>
         <w:rPr>
@@ -8654,14 +8654,14 @@
           <w:sz w:val="21"/>
           <w:szCs w:val="21"/>
         </w:rPr>
-        <w:t xml:space="preserve">Journal of Advertising, 19</w:t>
-      </w:r>
-      <w:r>
-        <w:rPr>
-          <w:sz w:val="21"/>
-          <w:szCs w:val="21"/>
-        </w:rPr>
-        <w:t xml:space="preserve">(3), 39–52. https://doi.org/10.1080/00913367.1990.10673191</w:t>
+        <w:t xml:space="preserve">Journal of Marketing Research, 34</w:t>
+      </w:r>
+      <w:r>
+        <w:rPr>
+          <w:sz w:val="21"/>
+          <w:szCs w:val="21"/>
+        </w:rPr>
+        <w:t xml:space="preserve">(2), 248–261. https://doi.org/10.1177/002224379703400205</w:t>
       </w:r>
     </w:p>
     <w:p>
@@ -8674,7 +8674,7 @@
           <w:sz w:val="21"/>
           <w:szCs w:val="21"/>
         </w:rPr>
-        <w:t xml:space="preserve">Petty, R. E., &amp; Cacioppo, J. T. (1986). The elaboration likelihood model of persuasion. </w:t>
+        <w:t xml:space="preserve">Meta. (2020, May). </w:t>
       </w:r>
       <w:r>
         <w:rPr>
@@ -8683,14 +8683,14 @@
           <w:sz w:val="21"/>
           <w:szCs w:val="21"/>
         </w:rPr>
-        <w:t xml:space="preserve">Advances in Experimental Social Psychology, 19</w:t>
-      </w:r>
-      <w:r>
-        <w:rPr>
-          <w:sz w:val="21"/>
-          <w:szCs w:val="21"/>
-        </w:rPr>
-        <w:t xml:space="preserve">, 123–205. https://doi.org/10.1016/S0065-2601(08)60214-2</w:t>
+        <w:t xml:space="preserve">Wirkungsstudie: Effizienz von Anzeigen im Stories-Format</w:t>
+      </w:r>
+      <w:r>
+        <w:rPr>
+          <w:sz w:val="21"/>
+          <w:szCs w:val="21"/>
+        </w:rPr>
+        <w:t xml:space="preserve"> [Effectiveness study: The efficiency of ads in the Stories format]. https://about.fb.com/de/news/2020/05/wirkungsstudie-effizienz-von-anzeigen-im-stories-format/</w:t>
       </w:r>
     </w:p>
     <w:p>
@@ -8703,7 +8703,7 @@
           <w:sz w:val="21"/>
           <w:szCs w:val="21"/>
         </w:rPr>
-        <w:t xml:space="preserve">Petty, R. E., Cacioppo, J. T., &amp; Schumann, D. (1983). Central and peripheral routes to advertising effectiveness: The moderating role of involvement. </w:t>
+        <w:t xml:space="preserve">Modaes. (2026). </w:t>
       </w:r>
       <w:r>
         <w:rPr>
@@ -8712,14 +8712,14 @@
           <w:sz w:val="21"/>
           <w:szCs w:val="21"/>
         </w:rPr>
-        <w:t xml:space="preserve">Journal of Consumer Research, 10</w:t>
-      </w:r>
-      <w:r>
-        <w:rPr>
-          <w:sz w:val="21"/>
-          <w:szCs w:val="21"/>
-        </w:rPr>
-        <w:t xml:space="preserve">(2), 135–146. https://doi.org/10.1086/208954</w:t>
+        <w:t xml:space="preserve">The owner of Alo Yoga is considering an IPO after selling Bellacanvas</w:t>
+      </w:r>
+      <w:r>
+        <w:rPr>
+          <w:sz w:val="21"/>
+          <w:szCs w:val="21"/>
+        </w:rPr>
+        <w:t xml:space="preserve">. https://www.modaes.com/global/companies/the-owner-of-alo-yoga-is-considering-an-ipo-after-selling-bellacanvas</w:t>
       </w:r>
     </w:p>
     <w:p>
@@ -8732,7 +8732,7 @@
           <w:sz w:val="21"/>
           <w:szCs w:val="21"/>
         </w:rPr>
-        <w:t xml:space="preserve">Pine, B. J., II, &amp; Gilmore, J. H. (1998). Welcome to the experience economy. </w:t>
+        <w:t xml:space="preserve">Ohanian, R. (1990). Construction and validation of a scale to measure celebrity endorsers' perceived expertise, trustworthiness, and attractiveness. </w:t>
       </w:r>
       <w:r>
         <w:rPr>
@@ -8741,14 +8741,14 @@
           <w:sz w:val="21"/>
           <w:szCs w:val="21"/>
         </w:rPr>
-        <w:t xml:space="preserve">Harvard Business Review, 76</w:t>
-      </w:r>
-      <w:r>
-        <w:rPr>
-          <w:sz w:val="21"/>
-          <w:szCs w:val="21"/>
-        </w:rPr>
-        <w:t xml:space="preserve">(4), 97–105.</w:t>
+        <w:t xml:space="preserve">Journal of Advertising, 19</w:t>
+      </w:r>
+      <w:r>
+        <w:rPr>
+          <w:sz w:val="21"/>
+          <w:szCs w:val="21"/>
+        </w:rPr>
+        <w:t xml:space="preserve">(3), 39–52. https://doi.org/10.1080/00913367.1990.10673191</w:t>
       </w:r>
     </w:p>
     <w:p>
@@ -8761,7 +8761,7 @@
           <w:sz w:val="21"/>
           <w:szCs w:val="21"/>
         </w:rPr>
-        <w:t xml:space="preserve">RepTrak. (2026, April). </w:t>
+        <w:t xml:space="preserve">Payscale. (2026). </w:t>
       </w:r>
       <w:r>
         <w:rPr>
@@ -8770,14 +8770,14 @@
           <w:sz w:val="21"/>
           <w:szCs w:val="21"/>
         </w:rPr>
-        <w:t xml:space="preserve">Inside the GRT100: A case study on adidas and Nike</w:t>
-      </w:r>
-      <w:r>
-        <w:rPr>
-          <w:sz w:val="21"/>
-          <w:szCs w:val="21"/>
-        </w:rPr>
-        <w:t xml:space="preserve">. https://www.reptrak.com/blog/inside-the-grt100-a-case-study-on-adidas-and-nike/</w:t>
+        <w:t xml:space="preserve">Average Pilates instructor hourly pay in Sydney, New South Wales</w:t>
+      </w:r>
+      <w:r>
+        <w:rPr>
+          <w:sz w:val="21"/>
+          <w:szCs w:val="21"/>
+        </w:rPr>
+        <w:t xml:space="preserve">. https://www.payscale.com/research/AU/Job=Pilates_Instructor/Hourly_Rate/29aefa9d/Sydney</w:t>
       </w:r>
     </w:p>
     <w:p>
@@ -8790,7 +8790,7 @@
           <w:sz w:val="21"/>
           <w:szCs w:val="21"/>
         </w:rPr>
-        <w:t xml:space="preserve">RIISE. (2026). </w:t>
+        <w:t xml:space="preserve">Petty, R. E., &amp; Cacioppo, J. T. (1986). The elaboration likelihood model of persuasion. </w:t>
       </w:r>
       <w:r>
         <w:rPr>
@@ -8799,14 +8799,14 @@
           <w:sz w:val="21"/>
           <w:szCs w:val="21"/>
         </w:rPr>
-        <w:t xml:space="preserve">In motion with Bernadette Sukkar</w:t>
-      </w:r>
-      <w:r>
-        <w:rPr>
-          <w:sz w:val="21"/>
-          <w:szCs w:val="21"/>
-        </w:rPr>
-        <w:t xml:space="preserve">. https://riise.world/blogs/wellness/in-motion-with-bernadette-sukkar</w:t>
+        <w:t xml:space="preserve">Advances in Experimental Social Psychology, 19</w:t>
+      </w:r>
+      <w:r>
+        <w:rPr>
+          <w:sz w:val="21"/>
+          <w:szCs w:val="21"/>
+        </w:rPr>
+        <w:t xml:space="preserve">, 123–205. https://doi.org/10.1016/S0065-2601(08)60214-2</w:t>
       </w:r>
     </w:p>
     <w:p>
@@ -8819,7 +8819,7 @@
           <w:sz w:val="21"/>
           <w:szCs w:val="21"/>
         </w:rPr>
-        <w:t xml:space="preserve">Rydzek, C. (2026, June 24). Alo Yoga owners eye IPO or sale after offloading wholesale T-shirt business. </w:t>
+        <w:t xml:space="preserve">Petty, R. E., Cacioppo, J. T., &amp; Schumann, D. (1983). Central and peripheral routes to advertising effectiveness: The moderating role of involvement. </w:t>
       </w:r>
       <w:r>
         <w:rPr>
@@ -8828,14 +8828,14 @@
           <w:sz w:val="21"/>
           <w:szCs w:val="21"/>
         </w:rPr>
-        <w:t xml:space="preserve">TheIndustry.fashion</w:t>
-      </w:r>
-      <w:r>
-        <w:rPr>
-          <w:sz w:val="21"/>
-          <w:szCs w:val="21"/>
-        </w:rPr>
-        <w:t xml:space="preserve">. https://www.theindustry.fashion/alo-yoga-owners-eye-ipo-or-sale-after-offloading-wholesale-t-shirt-business/</w:t>
+        <w:t xml:space="preserve">Journal of Consumer Research, 10</w:t>
+      </w:r>
+      <w:r>
+        <w:rPr>
+          <w:sz w:val="21"/>
+          <w:szCs w:val="21"/>
+        </w:rPr>
+        <w:t xml:space="preserve">(2), 135–146. https://doi.org/10.1086/208954</w:t>
       </w:r>
     </w:p>
     <w:p>
@@ -8848,7 +8848,7 @@
           <w:sz w:val="21"/>
           <w:szCs w:val="21"/>
         </w:rPr>
-        <w:t xml:space="preserve">Salpini, C. (2025, September 22). Lululemon's 'downward spiral' — and how the brand plans to break out of it. </w:t>
+        <w:t xml:space="preserve">Pine, B. J., II, &amp; Gilmore, J. H. (1998). Welcome to the experience economy. </w:t>
       </w:r>
       <w:r>
         <w:rPr>
@@ -8857,14 +8857,14 @@
           <w:sz w:val="21"/>
           <w:szCs w:val="21"/>
         </w:rPr>
-        <w:t xml:space="preserve">Retail Dive</w:t>
-      </w:r>
-      <w:r>
-        <w:rPr>
-          <w:sz w:val="21"/>
-          <w:szCs w:val="21"/>
-        </w:rPr>
-        <w:t xml:space="preserve">. https://www.retaildive.com/news/lululemon-athleisure-downward-spiral-innovation-turnaround/760318/</w:t>
+        <w:t xml:space="preserve">Harvard Business Review, 76</w:t>
+      </w:r>
+      <w:r>
+        <w:rPr>
+          <w:sz w:val="21"/>
+          <w:szCs w:val="21"/>
+        </w:rPr>
+        <w:t xml:space="preserve">(4), 97–105.</w:t>
       </w:r>
     </w:p>
     <w:p>
@@ -8877,7 +8877,7 @@
           <w:sz w:val="21"/>
           <w:szCs w:val="21"/>
         </w:rPr>
-        <w:t xml:space="preserve">SGB Media. (2026). </w:t>
+        <w:t xml:space="preserve">RepTrak. (2026, April). </w:t>
       </w:r>
       <w:r>
         <w:rPr>
@@ -8886,14 +8886,14 @@
           <w:sz w:val="21"/>
           <w:szCs w:val="21"/>
         </w:rPr>
-        <w:t xml:space="preserve">Alo Yoga opens first store in Greater China</w:t>
-      </w:r>
-      <w:r>
-        <w:rPr>
-          <w:sz w:val="21"/>
-          <w:szCs w:val="21"/>
-        </w:rPr>
-        <w:t xml:space="preserve">. https://sgbonline.com/alo-yoga-opens-first-store-in-greater-china/</w:t>
+        <w:t xml:space="preserve">Inside the GRT100: A case study on adidas and Nike</w:t>
+      </w:r>
+      <w:r>
+        <w:rPr>
+          <w:sz w:val="21"/>
+          <w:szCs w:val="21"/>
+        </w:rPr>
+        <w:t xml:space="preserve">. https://www.reptrak.com/blog/inside-the-grt100-a-case-study-on-adidas-and-nike/</w:t>
       </w:r>
     </w:p>
     <w:p>
@@ -8906,7 +8906,7 @@
           <w:sz w:val="21"/>
           <w:szCs w:val="21"/>
         </w:rPr>
-        <w:t xml:space="preserve">Sharp, B. (2010). </w:t>
+        <w:t xml:space="preserve">RetailBoss. (2026, May). </w:t>
       </w:r>
       <w:r>
         <w:rPr>
@@ -8915,14 +8915,14 @@
           <w:sz w:val="21"/>
           <w:szCs w:val="21"/>
         </w:rPr>
-        <w:t xml:space="preserve">How brands grow: What marketers don't know</w:t>
-      </w:r>
-      <w:r>
-        <w:rPr>
-          <w:sz w:val="21"/>
-          <w:szCs w:val="21"/>
-        </w:rPr>
-        <w:t xml:space="preserve">. Oxford University Press.</w:t>
+        <w:t xml:space="preserve">ALO finally lands in Australia as Chatswood Chase welcomes the country's first elevated wellness sanctuary</w:t>
+      </w:r>
+      <w:r>
+        <w:rPr>
+          <w:sz w:val="21"/>
+          <w:szCs w:val="21"/>
+        </w:rPr>
+        <w:t xml:space="preserve">. https://retailboss.co/alo-finally-lands-in-australia-as-chatswood-chase-welcomes-the-countrys-first-elevated-wellness-sanctuary/</w:t>
       </w:r>
     </w:p>
     <w:p>
@@ -8935,7 +8935,7 @@
           <w:sz w:val="21"/>
           <w:szCs w:val="21"/>
         </w:rPr>
-        <w:t xml:space="preserve">Sichtmann, C., Davvetas, V., &amp; Diamantopoulos, A. (2019). The relational value of perceived brand globalness and localness. </w:t>
+        <w:t xml:space="preserve">RIISE. (2026). </w:t>
       </w:r>
       <w:r>
         <w:rPr>
@@ -8944,14 +8944,14 @@
           <w:sz w:val="21"/>
           <w:szCs w:val="21"/>
         </w:rPr>
-        <w:t xml:space="preserve">Journal of Business Research, 104</w:t>
-      </w:r>
-      <w:r>
-        <w:rPr>
-          <w:sz w:val="21"/>
-          <w:szCs w:val="21"/>
-        </w:rPr>
-        <w:t xml:space="preserve">, 597–613. https://doi.org/10.1016/j.jbusres.2018.10.025</w:t>
+        <w:t xml:space="preserve">In motion with Bernadette Sukkar</w:t>
+      </w:r>
+      <w:r>
+        <w:rPr>
+          <w:sz w:val="21"/>
+          <w:szCs w:val="21"/>
+        </w:rPr>
+        <w:t xml:space="preserve">. https://riise.world/blogs/wellness/in-motion-with-bernadette-sukkar</w:t>
       </w:r>
     </w:p>
     <w:p>
@@ -8964,7 +8964,7 @@
           <w:sz w:val="21"/>
           <w:szCs w:val="21"/>
         </w:rPr>
-        <w:t xml:space="preserve">Smith, R. E., MacKenzie, S. B., Yang, X., Buchholz, L. M., &amp; Darley, W. K. (2007). Modeling the determinants and effects of creativity in advertising. </w:t>
+        <w:t xml:space="preserve">Salpini, C. (2025, September 22). Lululemon's 'downward spiral' — and how the brand plans to break out of it. </w:t>
       </w:r>
       <w:r>
         <w:rPr>
@@ -8973,14 +8973,14 @@
           <w:sz w:val="21"/>
           <w:szCs w:val="21"/>
         </w:rPr>
-        <w:t xml:space="preserve">Marketing Science, 26</w:t>
-      </w:r>
-      <w:r>
-        <w:rPr>
-          <w:sz w:val="21"/>
-          <w:szCs w:val="21"/>
-        </w:rPr>
-        <w:t xml:space="preserve">(6), 819–833. https://doi.org/10.1287/mksc.1070.0272</w:t>
+        <w:t xml:space="preserve">Retail Dive</w:t>
+      </w:r>
+      <w:r>
+        <w:rPr>
+          <w:sz w:val="21"/>
+          <w:szCs w:val="21"/>
+        </w:rPr>
+        <w:t xml:space="preserve">. https://www.retaildive.com/news/lululemon-athleisure-downward-spiral-innovation-turnaround/760318/</w:t>
       </w:r>
     </w:p>
     <w:p>
@@ -8993,7 +8993,7 @@
           <w:sz w:val="21"/>
           <w:szCs w:val="21"/>
         </w:rPr>
-        <w:t xml:space="preserve">Smith, R. E., &amp; Yang, X. (2004). Toward a general theory of creativity in advertising: Examining the role of divergence. </w:t>
+        <w:t xml:space="preserve">SGB Media. (2026). </w:t>
       </w:r>
       <w:r>
         <w:rPr>
@@ -9002,14 +9002,14 @@
           <w:sz w:val="21"/>
           <w:szCs w:val="21"/>
         </w:rPr>
-        <w:t xml:space="preserve">Marketing Theory, 4</w:t>
-      </w:r>
-      <w:r>
-        <w:rPr>
-          <w:sz w:val="21"/>
-          <w:szCs w:val="21"/>
-        </w:rPr>
-        <w:t xml:space="preserve">(1–2), 31–58. https://doi.org/10.1177/1470593104044086</w:t>
+        <w:t xml:space="preserve">Alo Yoga opens first store in Greater China</w:t>
+      </w:r>
+      <w:r>
+        <w:rPr>
+          <w:sz w:val="21"/>
+          <w:szCs w:val="21"/>
+        </w:rPr>
+        <w:t xml:space="preserve">. https://sgbonline.com/alo-yoga-opens-first-store-in-greater-china/</w:t>
       </w:r>
     </w:p>
     <w:p>
@@ -9022,7 +9022,7 @@
           <w:sz w:val="21"/>
           <w:szCs w:val="21"/>
         </w:rPr>
-        <w:t xml:space="preserve">Smith, W. R. (1956). Product differentiation and market segmentation as alternative marketing strategies. </w:t>
+        <w:t xml:space="preserve">Sharp, B. (2010). </w:t>
       </w:r>
       <w:r>
         <w:rPr>
@@ -9031,14 +9031,14 @@
           <w:sz w:val="21"/>
           <w:szCs w:val="21"/>
         </w:rPr>
-        <w:t xml:space="preserve">Journal of Marketing, 21</w:t>
-      </w:r>
-      <w:r>
-        <w:rPr>
-          <w:sz w:val="21"/>
-          <w:szCs w:val="21"/>
-        </w:rPr>
-        <w:t xml:space="preserve">(1), 3–8. https://doi.org/10.1177/002224295602100102</w:t>
+        <w:t xml:space="preserve">How brands grow: What marketers don't know</w:t>
+      </w:r>
+      <w:r>
+        <w:rPr>
+          <w:sz w:val="21"/>
+          <w:szCs w:val="21"/>
+        </w:rPr>
+        <w:t xml:space="preserve">. Oxford University Press.</w:t>
       </w:r>
     </w:p>
     <w:p>
@@ -9051,7 +9051,7 @@
           <w:sz w:val="21"/>
           <w:szCs w:val="21"/>
         </w:rPr>
-        <w:t xml:space="preserve">Sport Australia. (2019, April 30). </w:t>
+        <w:t xml:space="preserve">Sichtmann, C., Davvetas, V., &amp; Diamantopoulos, A. (2019). The relational value of perceived brand globalness and localness. </w:t>
       </w:r>
       <w:r>
         <w:rPr>
@@ -9060,14 +9060,14 @@
           <w:sz w:val="21"/>
           <w:szCs w:val="21"/>
         </w:rPr>
-        <w:t xml:space="preserve">Australia's top 20 sports and physical activities revealed</w:t>
-      </w:r>
-      <w:r>
-        <w:rPr>
-          <w:sz w:val="21"/>
-          <w:szCs w:val="21"/>
-        </w:rPr>
-        <w:t xml:space="preserve"> [Media release]. https://sportaus.gov.au/media_centre/news/previous-news-items/australias_top_20_sports_and_physical_activities_revealed</w:t>
+        <w:t xml:space="preserve">Journal of Business Research, 104</w:t>
+      </w:r>
+      <w:r>
+        <w:rPr>
+          <w:sz w:val="21"/>
+          <w:szCs w:val="21"/>
+        </w:rPr>
+        <w:t xml:space="preserve">, 597–613. https://doi.org/10.1016/j.jbusres.2018.10.025</w:t>
       </w:r>
     </w:p>
     <w:p>
@@ -9080,7 +9080,7 @@
           <w:sz w:val="21"/>
           <w:szCs w:val="21"/>
         </w:rPr>
-        <w:t xml:space="preserve">Stephen, A. T. (2016). The role of digital and social media marketing in consumer behavior. </w:t>
+        <w:t xml:space="preserve">Smith, R. E., MacKenzie, S. B., Yang, X., Buchholz, L. M., &amp; Darley, W. K. (2007). Modeling the determinants and effects of creativity in advertising. </w:t>
       </w:r>
       <w:r>
         <w:rPr>
@@ -9089,14 +9089,14 @@
           <w:sz w:val="21"/>
           <w:szCs w:val="21"/>
         </w:rPr>
-        <w:t xml:space="preserve">Current Opinion in Psychology, 10</w:t>
-      </w:r>
-      <w:r>
-        <w:rPr>
-          <w:sz w:val="21"/>
-          <w:szCs w:val="21"/>
-        </w:rPr>
-        <w:t xml:space="preserve">, 17–21. https://doi.org/10.1016/j.copsyc.2015.10.016</w:t>
+        <w:t xml:space="preserve">Marketing Science, 26</w:t>
+      </w:r>
+      <w:r>
+        <w:rPr>
+          <w:sz w:val="21"/>
+          <w:szCs w:val="21"/>
+        </w:rPr>
+        <w:t xml:space="preserve">(6), 819–833. https://doi.org/10.1287/mksc.1070.0272</w:t>
       </w:r>
     </w:p>
     <w:p>
@@ -9109,7 +9109,7 @@
           <w:sz w:val="21"/>
           <w:szCs w:val="21"/>
         </w:rPr>
-        <w:t xml:space="preserve">Stephen, A. T., &amp; Galak, J. (2012). The effects of traditional and social earned media on sales: A study of a microlending marketplace. </w:t>
+        <w:t xml:space="preserve">Smith, R. E., &amp; Yang, X. (2004). Toward a general theory of creativity in advertising: Examining the role of divergence. </w:t>
       </w:r>
       <w:r>
         <w:rPr>
@@ -9118,14 +9118,14 @@
           <w:sz w:val="21"/>
           <w:szCs w:val="21"/>
         </w:rPr>
-        <w:t xml:space="preserve">Journal of Marketing Research, 49</w:t>
-      </w:r>
-      <w:r>
-        <w:rPr>
-          <w:sz w:val="21"/>
-          <w:szCs w:val="21"/>
-        </w:rPr>
-        <w:t xml:space="preserve">(5), 624–639. https://doi.org/10.1509/jmr.09.0401</w:t>
+        <w:t xml:space="preserve">Marketing Theory, 4</w:t>
+      </w:r>
+      <w:r>
+        <w:rPr>
+          <w:sz w:val="21"/>
+          <w:szCs w:val="21"/>
+        </w:rPr>
+        <w:t xml:space="preserve">(1–2), 31–58. https://doi.org/10.1177/1470593104044086</w:t>
       </w:r>
     </w:p>
     <w:p>
@@ -9138,7 +9138,7 @@
           <w:sz w:val="21"/>
           <w:szCs w:val="21"/>
         </w:rPr>
-        <w:t xml:space="preserve">Strong, E. K., Jr. (1925). </w:t>
+        <w:t xml:space="preserve">Smith, W. R. (1956). Product differentiation and market segmentation as alternative marketing strategies. </w:t>
       </w:r>
       <w:r>
         <w:rPr>
@@ -9147,6 +9147,122 @@
           <w:sz w:val="21"/>
           <w:szCs w:val="21"/>
         </w:rPr>
+        <w:t xml:space="preserve">Journal of Marketing, 21</w:t>
+      </w:r>
+      <w:r>
+        <w:rPr>
+          <w:sz w:val="21"/>
+          <w:szCs w:val="21"/>
+        </w:rPr>
+        <w:t xml:space="preserve">(1), 3–8. https://doi.org/10.1177/002224295602100102</w:t>
+      </w:r>
+    </w:p>
+    <w:p>
+      <w:pPr>
+        <w:spacing w:after="120" w:line="276"/>
+        <w:ind w:left="720" w:hanging="720"/>
+      </w:pPr>
+      <w:r>
+        <w:rPr>
+          <w:sz w:val="21"/>
+          <w:szCs w:val="21"/>
+        </w:rPr>
+        <w:t xml:space="preserve">Sport Australia. (2019, April 30). </w:t>
+      </w:r>
+      <w:r>
+        <w:rPr>
+          <w:i/>
+          <w:iCs/>
+          <w:sz w:val="21"/>
+          <w:szCs w:val="21"/>
+        </w:rPr>
+        <w:t xml:space="preserve">Australia's top 20 sports and physical activities revealed</w:t>
+      </w:r>
+      <w:r>
+        <w:rPr>
+          <w:sz w:val="21"/>
+          <w:szCs w:val="21"/>
+        </w:rPr>
+        <w:t xml:space="preserve"> [Media release]. https://sportaus.gov.au/media_centre/news/previous-news-items/australias_top_20_sports_and_physical_activities_revealed</w:t>
+      </w:r>
+    </w:p>
+    <w:p>
+      <w:pPr>
+        <w:spacing w:after="120" w:line="276"/>
+        <w:ind w:left="720" w:hanging="720"/>
+      </w:pPr>
+      <w:r>
+        <w:rPr>
+          <w:sz w:val="21"/>
+          <w:szCs w:val="21"/>
+        </w:rPr>
+        <w:t xml:space="preserve">Stephen, A. T. (2016). The role of digital and social media marketing in consumer behavior. </w:t>
+      </w:r>
+      <w:r>
+        <w:rPr>
+          <w:i/>
+          <w:iCs/>
+          <w:sz w:val="21"/>
+          <w:szCs w:val="21"/>
+        </w:rPr>
+        <w:t xml:space="preserve">Current Opinion in Psychology, 10</w:t>
+      </w:r>
+      <w:r>
+        <w:rPr>
+          <w:sz w:val="21"/>
+          <w:szCs w:val="21"/>
+        </w:rPr>
+        <w:t xml:space="preserve">, 17–21. https://doi.org/10.1016/j.copsyc.2015.10.016</w:t>
+      </w:r>
+    </w:p>
+    <w:p>
+      <w:pPr>
+        <w:spacing w:after="120" w:line="276"/>
+        <w:ind w:left="720" w:hanging="720"/>
+      </w:pPr>
+      <w:r>
+        <w:rPr>
+          <w:sz w:val="21"/>
+          <w:szCs w:val="21"/>
+        </w:rPr>
+        <w:t xml:space="preserve">Stephen, A. T., &amp; Galak, J. (2012). The effects of traditional and social earned media on sales: A study of a microlending marketplace. </w:t>
+      </w:r>
+      <w:r>
+        <w:rPr>
+          <w:i/>
+          <w:iCs/>
+          <w:sz w:val="21"/>
+          <w:szCs w:val="21"/>
+        </w:rPr>
+        <w:t xml:space="preserve">Journal of Marketing Research, 49</w:t>
+      </w:r>
+      <w:r>
+        <w:rPr>
+          <w:sz w:val="21"/>
+          <w:szCs w:val="21"/>
+        </w:rPr>
+        <w:t xml:space="preserve">(5), 624–639. https://doi.org/10.1509/jmr.09.0401</w:t>
+      </w:r>
+    </w:p>
+    <w:p>
+      <w:pPr>
+        <w:spacing w:after="120" w:line="276"/>
+        <w:ind w:left="720" w:hanging="720"/>
+      </w:pPr>
+      <w:r>
+        <w:rPr>
+          <w:sz w:val="21"/>
+          <w:szCs w:val="21"/>
+        </w:rPr>
+        <w:t xml:space="preserve">Strong, E. K., Jr. (1925). </w:t>
+      </w:r>
+      <w:r>
+        <w:rPr>
+          <w:i/>
+          <w:iCs/>
+          <w:sz w:val="21"/>
+          <w:szCs w:val="21"/>
+        </w:rPr>
         <w:t xml:space="preserve">The psychology of selling and advertising</w:t>
       </w:r>
       <w:r>
@@ -9155,6 +9271,35 @@
           <w:szCs w:val="21"/>
         </w:rPr>
         <w:t xml:space="preserve">. McGraw-Hill.</w:t>
+      </w:r>
+    </w:p>
+    <w:p>
+      <w:pPr>
+        <w:spacing w:after="120" w:line="276"/>
+        <w:ind w:left="720" w:hanging="720"/>
+      </w:pPr>
+      <w:r>
+        <w:rPr>
+          <w:sz w:val="21"/>
+          <w:szCs w:val="21"/>
+        </w:rPr>
+        <w:t xml:space="preserve">Tagvenue. (2025). </w:t>
+      </w:r>
+      <w:r>
+        <w:rPr>
+          <w:i/>
+          <w:iCs/>
+          <w:sz w:val="21"/>
+          <w:szCs w:val="21"/>
+        </w:rPr>
+        <w:t xml:space="preserve">Pilates studios for hire in Sydney</w:t>
+      </w:r>
+      <w:r>
+        <w:rPr>
+          <w:sz w:val="21"/>
+          <w:szCs w:val="21"/>
+        </w:rPr>
+        <w:t xml:space="preserve">. https://www.tagvenue.com/au/hire/pilates-studios/sydney</w:t>
       </w:r>
     </w:p>
     <w:p>
@@ -13169,6 +13314,32 @@
       </w:pPr>
       <w:r>
         <w:t xml:space="preserve">"Make it the exact same but you do the mock ups now"</w:t>
+      </w:r>
+    </w:p>
+    <w:p>
+      <w:pPr>
+        <w:pStyle w:val="ListParagraph"/>
+        <w:numPr>
+          <w:ilvl w:val="0"/>
+          <w:numId w:val="3"/>
+        </w:numPr>
+        <w:spacing w:after="100" w:line="288"/>
+      </w:pPr>
+      <w:r>
+        <w:t xml:space="preserve">"If that is our report adn that is the feedback we got from our presentation. Is it all encorporated?" [Attached: our edited copy of this report and our tutor's presentation feedback.]</w:t>
+      </w:r>
+    </w:p>
+    <w:p>
+      <w:pPr>
+        <w:pStyle w:val="ListParagraph"/>
+        <w:numPr>
+          <w:ilvl w:val="0"/>
+          <w:numId w:val="3"/>
+        </w:numPr>
+        <w:spacing w:after="100" w:line="288"/>
+      </w:pPr>
+      <w:r>
+        <w:t xml:space="preserve">"Yes"</w:t>
       </w:r>
     </w:p>
     <w:p>

</xml_diff>

<commit_message>
Show message integration at every touchpoint
Adds a message-by-touchpoint matrix (Table 3) in place of the media mix
table, an in-store touchpoint mock-up, moves the creative brief to an
appendix, and re-letters appendices in order of first mention.

Co-Authored-By: Claude Opus 5.5 <noreply@anthropic.com>
Claude-Session: https://claude.ai/code/session_01XwhnEvcgigojVrsaWSJPuE
</commit_message>
<xml_diff>
--- a/Alo_Mat_to_Moment_IMC_Brief.docx
+++ b/Alo_Mat_to_Moment_IMC_Brief.docx
@@ -2259,7 +2259,7 @@
         <w:spacing w:after="160" w:line="288"/>
       </w:pPr>
       <w:r>
-        <w:t xml:space="preserve">The objectives follow DAGMAR (Colley, 1961). AIDA and the hierarchy of effects assume that consumers think, then feel, then do (Lavidge &amp; Steiner, 1961; Strong, 1925). Figure 1 shows why this campaign reverses the first two steps. Premium activewear is a high-involvement purchase worn in public, so attitude precedes information (Vaughn, 1980). The hierarchy is a heuristic, not a law, so all four objectives are tracked simultaneously. Targets are set against benchmarks, not ambition. Across 23 Meta brand-lift tests, campaigns raised awareness by an average of 3.7 points and ad recall by 7.6 points (Meta, 2020). Store awareness (O3) is one simple fact repeated on every channel near the stores, so a 10-point lift, two to three times that single-platform norm, is stretching but attainable. Attitudes move less than awareness, so O1 and O2 target 6 points; behaviour moves least, so O4 targets 3. Baselines are estimates to be confirmed by the pre-campaign survey: O3 starts at 25% because Alo's search interest matches Lorna Jane's, but store awareness trails name awareness for a new entrant. Visits rather than sales are targeted because price and stock sit outside communication's control (Belch &amp; Belch, 2021).</w:t>
+        <w:t xml:space="preserve">The objectives follow DAGMAR (Colley, 1961). AIDA and the hierarchy of effects assume that consumers think, then feel, then do (Lavidge &amp; Steiner, 1961; Strong, 1925). Figure 1 shows why this campaign reverses the first two steps. Premium activewear is a high-involvement purchase worn in public, so attitude precedes information (Vaughn, 1980). The hierarchy is a heuristic, not a law, so all four objectives are tracked simultaneously. Across 23 Meta brand-lift tests, campaigns raised awareness by an average of 3.7 points and ad recall by 7.6 points (Meta, 2020). Store awareness (O3) is one simple fact repeated on every channel near the stores, so a 10-point lift, two to three times that single-platform norm, is stretching but attainable. Attitudes move less than awareness, so O1 and O2 target 6 points; behaviour moves least, so O4 targets 3. Baselines are estimates to be confirmed by the pre-campaign survey: O3 starts at 25% because Alo's search interest matches Lorna Jane's, but store awareness trails name awareness for a new entrant. Visits rather than sales are targeted because price and stock sit outside communication's control (Belch &amp; Belch, 2021).</w:t>
       </w:r>
     </w:p>
     <w:p>
@@ -2386,7 +2386,7 @@
         <w:t xml:space="preserve">Insight:</w:t>
       </w:r>
       <w:r>
-        <w:t xml:space="preserve"> for Segment A, studio fitness is a social performance. Young women experience exercise as visible "aesthetic labour" on Instagram (Camacho-Miñano et al., 2019), so activewear is judged at the café as much as in class. The communication process model (Schramm, as cited in Belch &amp; Belch, 2021) explains why Alo has not yet capitalised on this (Figure 2). Meaning is shared only where fields of experience overlap. Alo's launch was encoded in Los Angeles and decoded in Sydney as "beautiful, but not for me". The fix is not more volume but re-encoding the message through Sydney instructors and creators, whose fields of experience overlap almost completely with the audience's. Noise from rivals and influencer clutter favours repeating one idea. The model's feedback loop is built in: comments, bookings and search interest are reviewed between bursts (Section 6).</w:t>
+        <w:t xml:space="preserve"> for Segment A, studio fitness is a social performance. Young women experience exercise as visible "aesthetic labour" on Instagram (Camacho-Miñano et al., 2019), so activewear is judged at the café as much as in class. The communication process model (Schramm, as cited in Belch &amp; Belch, 2021) explains why Alo has not yet capitalised on this (Figure 2). Meaning is shared only where fields of experience overlap. Alo's launch was encoded in Los Angeles and decoded in Sydney as "beautiful, but not for me". The fix is not more volume but re-encoding the message through Sydney instructors and creators, whose fields of experience overlap almost completely with the audience's. Noise from rivals and influencer clutter favours repeating one idea. Its feedback loop is the between-burst review in Section 6.</w:t>
       </w:r>
     </w:p>
     <w:p>
@@ -2793,7 +2793,7 @@
         <w:spacing w:after="160" w:line="288"/>
       </w:pPr>
       <w:r>
-        <w:t xml:space="preserve">IMC exists because fragmented messages weaken brand equity and trust (Belch &amp; Belch, 2021; Keller, 2001). Figure 5 maps the campaign onto the consumer decision journey, extended for social influence (Court et al., 2009; Stephen, 2016): each stage has a different job, but all six tell the same story, and advocates' #MatToMoment posts become discovery content for the next customer at no media cost. Figure 6 shows the cost of this approach. About 45% of the budget goes to creators, sessions and PR, which carry higher impact but lower control (Duncan, as cited in Belch &amp; Belch, 2021). Customer posts, reviews and creator controversies cannot be scripted. Shared brand codes, tight creator briefs and weekly social listening protect consistency. This is the campaign's central bet: advertising alone would be more controllable but less believable.</w:t>
+        <w:t xml:space="preserve">IMC exists because fragmented messages weaken brand equity and trust (Belch &amp; Belch, 2021; Keller, 2001). Figure 5 maps the campaign onto the consumer decision journey, extended for social influence (Court et al., 2009; Stephen, 2016): each stage has a different job, but all six tell the same story, and advocates' #MatToMoment posts become discovery content for the next customer at no media cost. Table 3 shows the message at every touchpoint: the line, set and sign-off stay fixed while the call to action changes by stage. Intrinsic touchpoints (store, staff, swing tags, styling) are where the promise is proven or broken. Figure 6 shows the cost of this approach. About 45% of the budget goes to creators, sessions and PR, which carry higher impact but lower control (Duncan, as cited in Belch &amp; Belch, 2021). Customer posts, reviews and creator controversies cannot be scripted. Shared brand codes, tight creator briefs and weekly social listening protect consistency. This is the campaign's central bet: advertising alone would be more controllable but less believable.</w:t>
       </w:r>
     </w:p>
     <w:p>
@@ -2990,22 +2990,6 @@
     </w:p>
     <w:p>
       <w:pPr>
-        <w:pStyle w:val="Heading1"/>
-      </w:pPr>
-      <w:r>
-        <w:t xml:space="preserve">4. Creative Strategy</w:t>
-      </w:r>
-    </w:p>
-    <w:p>
-      <w:pPr>
-        <w:pStyle w:val="Heading2"/>
-      </w:pPr>
-      <w:r>
-        <w:t xml:space="preserve">4.1 Creative Brief and Concept</w:t>
-      </w:r>
-    </w:p>
-    <w:p>
-      <w:pPr>
         <w:keepNext/>
         <w:spacing w:after="40" w:before="200"/>
       </w:pPr>
@@ -3027,7 +3011,7 @@
           <w:i/>
           <w:iCs/>
         </w:rPr>
-        <w:t xml:space="preserve">Creative Brief Summary</w:t>
+        <w:t xml:space="preserve">Message Consistency Across Every Touchpoint</w:t>
       </w:r>
     </w:p>
     <w:tbl>
@@ -3043,8 +3027,11 @@
         </w:tblBorders>
       </w:tblPr>
       <w:tblGrid>
-        <w:gridCol w:w="2506"/>
-        <w:gridCol w:w="7132"/>
+        <w:gridCol w:w="2120"/>
+        <w:gridCol w:w="1157"/>
+        <w:gridCol w:w="1446"/>
+        <w:gridCol w:w="2891"/>
+        <w:gridCol w:w="2024"/>
       </w:tblGrid>
       <w:tr>
         <w:trPr>
@@ -3052,7 +3039,7 @@
         </w:trPr>
         <w:tc>
           <w:tcPr>
-            <w:tcW w:type="dxa" w:w="2506"/>
+            <w:tcW w:type="dxa" w:w="2120"/>
             <w:tcBorders>
               <w:top w:val="single" w:color="C9CED2" w:sz="4"/>
               <w:left w:val="single" w:color="C9CED2" w:sz="4"/>
@@ -3079,13 +3066,13 @@
                 <w:sz w:val="17"/>
                 <w:szCs w:val="17"/>
               </w:rPr>
-              <w:t xml:space="preserve">Element</w:t>
-            </w:r>
-          </w:p>
-        </w:tc>
-        <w:tc>
-          <w:tcPr>
-            <w:tcW w:type="dxa" w:w="7132"/>
+              <w:t xml:space="preserve">Touchpoint</w:t>
+            </w:r>
+          </w:p>
+        </w:tc>
+        <w:tc>
+          <w:tcPr>
+            <w:tcW w:type="dxa" w:w="1157"/>
             <w:tcBorders>
               <w:top w:val="single" w:color="C9CED2" w:sz="4"/>
               <w:left w:val="single" w:color="C9CED2" w:sz="4"/>
@@ -3112,7 +3099,106 @@
                 <w:sz w:val="17"/>
                 <w:szCs w:val="17"/>
               </w:rPr>
-              <w:t xml:space="preserve">Mat to Moment</w:t>
+              <w:t xml:space="preserve">Type</w:t>
+            </w:r>
+          </w:p>
+        </w:tc>
+        <w:tc>
+          <w:tcPr>
+            <w:tcW w:type="dxa" w:w="1446"/>
+            <w:tcBorders>
+              <w:top w:val="single" w:color="C9CED2" w:sz="4"/>
+              <w:left w:val="single" w:color="C9CED2" w:sz="4"/>
+              <w:bottom w:val="single" w:color="C9CED2" w:sz="4"/>
+              <w:right w:val="single" w:color="C9CED2" w:sz="4"/>
+            </w:tcBorders>
+            <w:shd w:fill="1E2A32" w:color="auto" w:val="clear"/>
+            <w:tcMar>
+              <w:top w:type="dxa" w:w="60"/>
+              <w:left w:type="dxa" w:w="90"/>
+              <w:bottom w:type="dxa" w:w="60"/>
+              <w:right w:type="dxa" w:w="90"/>
+            </w:tcMar>
+          </w:tcPr>
+          <w:p>
+            <w:pPr>
+              <w:spacing w:after="0" w:line="252"/>
+            </w:pPr>
+            <w:r>
+              <w:rPr>
+                <w:b/>
+                <w:bCs/>
+                <w:color w:val="FFFFFF"/>
+                <w:sz w:val="17"/>
+                <w:szCs w:val="17"/>
+              </w:rPr>
+              <w:t xml:space="preserve">Stage</w:t>
+            </w:r>
+          </w:p>
+        </w:tc>
+        <w:tc>
+          <w:tcPr>
+            <w:tcW w:type="dxa" w:w="2891"/>
+            <w:tcBorders>
+              <w:top w:val="single" w:color="C9CED2" w:sz="4"/>
+              <w:left w:val="single" w:color="C9CED2" w:sz="4"/>
+              <w:bottom w:val="single" w:color="C9CED2" w:sz="4"/>
+              <w:right w:val="single" w:color="C9CED2" w:sz="4"/>
+            </w:tcBorders>
+            <w:shd w:fill="1E2A32" w:color="auto" w:val="clear"/>
+            <w:tcMar>
+              <w:top w:type="dxa" w:w="60"/>
+              <w:left w:type="dxa" w:w="90"/>
+              <w:bottom w:type="dxa" w:w="60"/>
+              <w:right w:type="dxa" w:w="90"/>
+            </w:tcMar>
+          </w:tcPr>
+          <w:p>
+            <w:pPr>
+              <w:spacing w:after="0" w:line="252"/>
+            </w:pPr>
+            <w:r>
+              <w:rPr>
+                <w:b/>
+                <w:bCs/>
+                <w:color w:val="FFFFFF"/>
+                <w:sz w:val="17"/>
+                <w:szCs w:val="17"/>
+              </w:rPr>
+              <w:t xml:space="preserve">How "Mat to Moment" appears</w:t>
+            </w:r>
+          </w:p>
+        </w:tc>
+        <w:tc>
+          <w:tcPr>
+            <w:tcW w:type="dxa" w:w="2024"/>
+            <w:tcBorders>
+              <w:top w:val="single" w:color="C9CED2" w:sz="4"/>
+              <w:left w:val="single" w:color="C9CED2" w:sz="4"/>
+              <w:bottom w:val="single" w:color="C9CED2" w:sz="4"/>
+              <w:right w:val="single" w:color="C9CED2" w:sz="4"/>
+            </w:tcBorders>
+            <w:shd w:fill="1E2A32" w:color="auto" w:val="clear"/>
+            <w:tcMar>
+              <w:top w:type="dxa" w:w="60"/>
+              <w:left w:type="dxa" w:w="90"/>
+              <w:bottom w:type="dxa" w:w="60"/>
+              <w:right w:type="dxa" w:w="90"/>
+            </w:tcMar>
+          </w:tcPr>
+          <w:p>
+            <w:pPr>
+              <w:spacing w:after="0" w:line="252"/>
+            </w:pPr>
+            <w:r>
+              <w:rPr>
+                <w:b/>
+                <w:bCs/>
+                <w:color w:val="FFFFFF"/>
+                <w:sz w:val="17"/>
+                <w:szCs w:val="17"/>
+              </w:rPr>
+              <w:t xml:space="preserve">Call to action</w:t>
             </w:r>
           </w:p>
         </w:tc>
@@ -3123,7 +3209,7 @@
         </w:trPr>
         <w:tc>
           <w:tcPr>
-            <w:tcW w:type="dxa" w:w="2506"/>
+            <w:tcW w:type="dxa" w:w="2120"/>
             <w:tcBorders>
               <w:top w:val="single" w:color="C9CED2" w:sz="4"/>
               <w:left w:val="single" w:color="C9CED2" w:sz="4"/>
@@ -3149,39 +3235,135 @@
                 <w:sz w:val="17"/>
                 <w:szCs w:val="17"/>
               </w:rPr>
-              <w:t xml:space="preserve">Target audience</w:t>
-            </w:r>
-          </w:p>
-        </w:tc>
-        <w:tc>
-          <w:tcPr>
-            <w:tcW w:type="dxa" w:w="7132"/>
-            <w:tcBorders>
-              <w:top w:val="single" w:color="C9CED2" w:sz="4"/>
-              <w:left w:val="single" w:color="C9CED2" w:sz="4"/>
-              <w:bottom w:val="single" w:color="C9CED2" w:sz="4"/>
-              <w:right w:val="single" w:color="C9CED2" w:sz="4"/>
-            </w:tcBorders>
-            <w:tcMar>
-              <w:top w:type="dxa" w:w="60"/>
-              <w:left w:type="dxa" w:w="90"/>
-              <w:bottom w:type="dxa" w:w="60"/>
-              <w:right w:type="dxa" w:w="90"/>
-            </w:tcMar>
-          </w:tcPr>
-          <w:p>
-            <w:pPr>
-              <w:spacing w:after="0" w:line="252"/>
-            </w:pPr>
-            <w:r>
-              <w:rPr>
-                <w:b w:val="false"/>
-                <w:bCs w:val="false"/>
-                <w:color w:val="1E2A32"/>
-                <w:sz w:val="17"/>
-                <w:szCs w:val="17"/>
-              </w:rPr>
-              <w:t xml:space="preserve">Style-conscious women, 22–34, Greater Sydney</w:t>
+              <w:t xml:space="preserve">Bus panels, beach posters</w:t>
+            </w:r>
+          </w:p>
+        </w:tc>
+        <w:tc>
+          <w:tcPr>
+            <w:tcW w:type="dxa" w:w="1157"/>
+            <w:tcBorders>
+              <w:top w:val="single" w:color="C9CED2" w:sz="4"/>
+              <w:left w:val="single" w:color="C9CED2" w:sz="4"/>
+              <w:bottom w:val="single" w:color="C9CED2" w:sz="4"/>
+              <w:right w:val="single" w:color="C9CED2" w:sz="4"/>
+            </w:tcBorders>
+            <w:tcMar>
+              <w:top w:type="dxa" w:w="60"/>
+              <w:left w:type="dxa" w:w="90"/>
+              <w:bottom w:type="dxa" w:w="60"/>
+              <w:right w:type="dxa" w:w="90"/>
+            </w:tcMar>
+          </w:tcPr>
+          <w:p>
+            <w:pPr>
+              <w:spacing w:after="0" w:line="252"/>
+            </w:pPr>
+            <w:r>
+              <w:rPr>
+                <w:b w:val="false"/>
+                <w:bCs w:val="false"/>
+                <w:color w:val="1E2A32"/>
+                <w:sz w:val="17"/>
+                <w:szCs w:val="17"/>
+              </w:rPr>
+              <w:t xml:space="preserve">Paid</w:t>
+            </w:r>
+          </w:p>
+        </w:tc>
+        <w:tc>
+          <w:tcPr>
+            <w:tcW w:type="dxa" w:w="1446"/>
+            <w:tcBorders>
+              <w:top w:val="single" w:color="C9CED2" w:sz="4"/>
+              <w:left w:val="single" w:color="C9CED2" w:sz="4"/>
+              <w:bottom w:val="single" w:color="C9CED2" w:sz="4"/>
+              <w:right w:val="single" w:color="C9CED2" w:sz="4"/>
+            </w:tcBorders>
+            <w:tcMar>
+              <w:top w:type="dxa" w:w="60"/>
+              <w:left w:type="dxa" w:w="90"/>
+              <w:bottom w:type="dxa" w:w="60"/>
+              <w:right w:type="dxa" w:w="90"/>
+            </w:tcMar>
+          </w:tcPr>
+          <w:p>
+            <w:pPr>
+              <w:spacing w:after="0" w:line="252"/>
+            </w:pPr>
+            <w:r>
+              <w:rPr>
+                <w:b w:val="false"/>
+                <w:bCs w:val="false"/>
+                <w:color w:val="1E2A32"/>
+                <w:sz w:val="17"/>
+                <w:szCs w:val="17"/>
+              </w:rPr>
+              <w:t xml:space="preserve">Recognition</w:t>
+            </w:r>
+          </w:p>
+        </w:tc>
+        <w:tc>
+          <w:tcPr>
+            <w:tcW w:type="dxa" w:w="2891"/>
+            <w:tcBorders>
+              <w:top w:val="single" w:color="C9CED2" w:sz="4"/>
+              <w:left w:val="single" w:color="C9CED2" w:sz="4"/>
+              <w:bottom w:val="single" w:color="C9CED2" w:sz="4"/>
+              <w:right w:val="single" w:color="C9CED2" w:sz="4"/>
+            </w:tcBorders>
+            <w:tcMar>
+              <w:top w:type="dxa" w:w="60"/>
+              <w:left w:type="dxa" w:w="90"/>
+              <w:bottom w:type="dxa" w:w="60"/>
+              <w:right w:type="dxa" w:w="90"/>
+            </w:tcMar>
+          </w:tcPr>
+          <w:p>
+            <w:pPr>
+              <w:spacing w:after="0" w:line="252"/>
+            </w:pPr>
+            <w:r>
+              <w:rPr>
+                <w:b w:val="false"/>
+                <w:bCs w:val="false"/>
+                <w:color w:val="1E2A32"/>
+                <w:sz w:val="17"/>
+                <w:szCs w:val="17"/>
+              </w:rPr>
+              <w:t xml:space="preserve">Three moments, one set</w:t>
+            </w:r>
+          </w:p>
+        </w:tc>
+        <w:tc>
+          <w:tcPr>
+            <w:tcW w:type="dxa" w:w="2024"/>
+            <w:tcBorders>
+              <w:top w:val="single" w:color="C9CED2" w:sz="4"/>
+              <w:left w:val="single" w:color="C9CED2" w:sz="4"/>
+              <w:bottom w:val="single" w:color="C9CED2" w:sz="4"/>
+              <w:right w:val="single" w:color="C9CED2" w:sz="4"/>
+            </w:tcBorders>
+            <w:tcMar>
+              <w:top w:type="dxa" w:w="60"/>
+              <w:left w:type="dxa" w:w="90"/>
+              <w:bottom w:type="dxa" w:w="60"/>
+              <w:right w:type="dxa" w:w="90"/>
+            </w:tcMar>
+          </w:tcPr>
+          <w:p>
+            <w:pPr>
+              <w:spacing w:after="0" w:line="252"/>
+            </w:pPr>
+            <w:r>
+              <w:rPr>
+                <w:b w:val="false"/>
+                <w:bCs w:val="false"/>
+                <w:color w:val="1E2A32"/>
+                <w:sz w:val="17"/>
+                <w:szCs w:val="17"/>
+              </w:rPr>
+              <w:t xml:space="preserve">Store names</w:t>
             </w:r>
           </w:p>
         </w:tc>
@@ -3192,7 +3374,7 @@
         </w:trPr>
         <w:tc>
           <w:tcPr>
-            <w:tcW w:type="dxa" w:w="2506"/>
+            <w:tcW w:type="dxa" w:w="2120"/>
             <w:tcBorders>
               <w:top w:val="single" w:color="C9CED2" w:sz="4"/>
               <w:left w:val="single" w:color="C9CED2" w:sz="4"/>
@@ -3219,13 +3401,13 @@
                 <w:sz w:val="17"/>
                 <w:szCs w:val="17"/>
               </w:rPr>
-              <w:t xml:space="preserve">Key insight</w:t>
-            </w:r>
-          </w:p>
-        </w:tc>
-        <w:tc>
-          <w:tcPr>
-            <w:tcW w:type="dxa" w:w="7132"/>
+              <w:t xml:space="preserve">Spotify audio</w:t>
+            </w:r>
+          </w:p>
+        </w:tc>
+        <w:tc>
+          <w:tcPr>
+            <w:tcW w:type="dxa" w:w="1157"/>
             <w:tcBorders>
               <w:top w:val="single" w:color="C9CED2" w:sz="4"/>
               <w:left w:val="single" w:color="C9CED2" w:sz="4"/>
@@ -3252,7 +3434,106 @@
                 <w:sz w:val="17"/>
                 <w:szCs w:val="17"/>
               </w:rPr>
-              <w:t xml:space="preserve">Activewear is judged after class as much as in it</w:t>
+              <w:t xml:space="preserve">Paid</w:t>
+            </w:r>
+          </w:p>
+        </w:tc>
+        <w:tc>
+          <w:tcPr>
+            <w:tcW w:type="dxa" w:w="1446"/>
+            <w:tcBorders>
+              <w:top w:val="single" w:color="C9CED2" w:sz="4"/>
+              <w:left w:val="single" w:color="C9CED2" w:sz="4"/>
+              <w:bottom w:val="single" w:color="C9CED2" w:sz="4"/>
+              <w:right w:val="single" w:color="C9CED2" w:sz="4"/>
+            </w:tcBorders>
+            <w:shd w:fill="F7F5F1" w:color="auto" w:val="clear"/>
+            <w:tcMar>
+              <w:top w:type="dxa" w:w="60"/>
+              <w:left w:type="dxa" w:w="90"/>
+              <w:bottom w:type="dxa" w:w="60"/>
+              <w:right w:type="dxa" w:w="90"/>
+            </w:tcMar>
+          </w:tcPr>
+          <w:p>
+            <w:pPr>
+              <w:spacing w:after="0" w:line="252"/>
+            </w:pPr>
+            <w:r>
+              <w:rPr>
+                <w:b w:val="false"/>
+                <w:bCs w:val="false"/>
+                <w:color w:val="1E2A32"/>
+                <w:sz w:val="17"/>
+                <w:szCs w:val="17"/>
+              </w:rPr>
+              <w:t xml:space="preserve">Recognition</w:t>
+            </w:r>
+          </w:p>
+        </w:tc>
+        <w:tc>
+          <w:tcPr>
+            <w:tcW w:type="dxa" w:w="2891"/>
+            <w:tcBorders>
+              <w:top w:val="single" w:color="C9CED2" w:sz="4"/>
+              <w:left w:val="single" w:color="C9CED2" w:sz="4"/>
+              <w:bottom w:val="single" w:color="C9CED2" w:sz="4"/>
+              <w:right w:val="single" w:color="C9CED2" w:sz="4"/>
+            </w:tcBorders>
+            <w:shd w:fill="F7F5F1" w:color="auto" w:val="clear"/>
+            <w:tcMar>
+              <w:top w:type="dxa" w:w="60"/>
+              <w:left w:type="dxa" w:w="90"/>
+              <w:bottom w:type="dxa" w:w="60"/>
+              <w:right w:type="dxa" w:w="90"/>
+            </w:tcMar>
+          </w:tcPr>
+          <w:p>
+            <w:pPr>
+              <w:spacing w:after="0" w:line="252"/>
+            </w:pPr>
+            <w:r>
+              <w:rPr>
+                <w:b w:val="false"/>
+                <w:bCs w:val="false"/>
+                <w:color w:val="1E2A32"/>
+                <w:sz w:val="17"/>
+                <w:szCs w:val="17"/>
+              </w:rPr>
+              <w:t xml:space="preserve">Spoken timestamps, sonic sign-off</w:t>
+            </w:r>
+          </w:p>
+        </w:tc>
+        <w:tc>
+          <w:tcPr>
+            <w:tcW w:type="dxa" w:w="2024"/>
+            <w:tcBorders>
+              <w:top w:val="single" w:color="C9CED2" w:sz="4"/>
+              <w:left w:val="single" w:color="C9CED2" w:sz="4"/>
+              <w:bottom w:val="single" w:color="C9CED2" w:sz="4"/>
+              <w:right w:val="single" w:color="C9CED2" w:sz="4"/>
+            </w:tcBorders>
+            <w:shd w:fill="F7F5F1" w:color="auto" w:val="clear"/>
+            <w:tcMar>
+              <w:top w:type="dxa" w:w="60"/>
+              <w:left w:type="dxa" w:w="90"/>
+              <w:bottom w:type="dxa" w:w="60"/>
+              <w:right w:type="dxa" w:w="90"/>
+            </w:tcMar>
+          </w:tcPr>
+          <w:p>
+            <w:pPr>
+              <w:spacing w:after="0" w:line="252"/>
+            </w:pPr>
+            <w:r>
+              <w:rPr>
+                <w:b w:val="false"/>
+                <w:bCs w:val="false"/>
+                <w:color w:val="1E2A32"/>
+                <w:sz w:val="17"/>
+                <w:szCs w:val="17"/>
+              </w:rPr>
+              <w:t xml:space="preserve">Find us</w:t>
             </w:r>
           </w:p>
         </w:tc>
@@ -3263,7 +3544,7 @@
         </w:trPr>
         <w:tc>
           <w:tcPr>
-            <w:tcW w:type="dxa" w:w="2506"/>
+            <w:tcW w:type="dxa" w:w="2120"/>
             <w:tcBorders>
               <w:top w:val="single" w:color="C9CED2" w:sz="4"/>
               <w:left w:val="single" w:color="C9CED2" w:sz="4"/>
@@ -3289,39 +3570,135 @@
                 <w:sz w:val="17"/>
                 <w:szCs w:val="17"/>
               </w:rPr>
-              <w:t xml:space="preserve">Key message</w:t>
-            </w:r>
-          </w:p>
-        </w:tc>
-        <w:tc>
-          <w:tcPr>
-            <w:tcW w:type="dxa" w:w="7132"/>
-            <w:tcBorders>
-              <w:top w:val="single" w:color="C9CED2" w:sz="4"/>
-              <w:left w:val="single" w:color="C9CED2" w:sz="4"/>
-              <w:bottom w:val="single" w:color="C9CED2" w:sz="4"/>
-              <w:right w:val="single" w:color="C9CED2" w:sz="4"/>
-            </w:tcBorders>
-            <w:tcMar>
-              <w:top w:type="dxa" w:w="60"/>
-              <w:left w:type="dxa" w:w="90"/>
-              <w:bottom w:type="dxa" w:w="60"/>
-              <w:right w:type="dxa" w:w="90"/>
-            </w:tcMar>
-          </w:tcPr>
-          <w:p>
-            <w:pPr>
-              <w:spacing w:after="0" w:line="252"/>
-            </w:pPr>
-            <w:r>
-              <w:rPr>
-                <w:b w:val="false"/>
-                <w:bCs w:val="false"/>
-                <w:color w:val="1E2A32"/>
-                <w:sz w:val="17"/>
-                <w:szCs w:val="17"/>
-              </w:rPr>
-              <w:t xml:space="preserve">One set, made for the whole day</w:t>
+              <w:t xml:space="preserve">Reels, TikTok ads, retargeting</w:t>
+            </w:r>
+          </w:p>
+        </w:tc>
+        <w:tc>
+          <w:tcPr>
+            <w:tcW w:type="dxa" w:w="1157"/>
+            <w:tcBorders>
+              <w:top w:val="single" w:color="C9CED2" w:sz="4"/>
+              <w:left w:val="single" w:color="C9CED2" w:sz="4"/>
+              <w:bottom w:val="single" w:color="C9CED2" w:sz="4"/>
+              <w:right w:val="single" w:color="C9CED2" w:sz="4"/>
+            </w:tcBorders>
+            <w:tcMar>
+              <w:top w:type="dxa" w:w="60"/>
+              <w:left w:type="dxa" w:w="90"/>
+              <w:bottom w:type="dxa" w:w="60"/>
+              <w:right w:type="dxa" w:w="90"/>
+            </w:tcMar>
+          </w:tcPr>
+          <w:p>
+            <w:pPr>
+              <w:spacing w:after="0" w:line="252"/>
+            </w:pPr>
+            <w:r>
+              <w:rPr>
+                <w:b w:val="false"/>
+                <w:bCs w:val="false"/>
+                <w:color w:val="1E2A32"/>
+                <w:sz w:val="17"/>
+                <w:szCs w:val="17"/>
+              </w:rPr>
+              <w:t xml:space="preserve">Paid</w:t>
+            </w:r>
+          </w:p>
+        </w:tc>
+        <w:tc>
+          <w:tcPr>
+            <w:tcW w:type="dxa" w:w="1446"/>
+            <w:tcBorders>
+              <w:top w:val="single" w:color="C9CED2" w:sz="4"/>
+              <w:left w:val="single" w:color="C9CED2" w:sz="4"/>
+              <w:bottom w:val="single" w:color="C9CED2" w:sz="4"/>
+              <w:right w:val="single" w:color="C9CED2" w:sz="4"/>
+            </w:tcBorders>
+            <w:tcMar>
+              <w:top w:type="dxa" w:w="60"/>
+              <w:left w:type="dxa" w:w="90"/>
+              <w:bottom w:type="dxa" w:w="60"/>
+              <w:right w:type="dxa" w:w="90"/>
+            </w:tcMar>
+          </w:tcPr>
+          <w:p>
+            <w:pPr>
+              <w:spacing w:after="0" w:line="252"/>
+            </w:pPr>
+            <w:r>
+              <w:rPr>
+                <w:b w:val="false"/>
+                <w:bCs w:val="false"/>
+                <w:color w:val="1E2A32"/>
+                <w:sz w:val="17"/>
+                <w:szCs w:val="17"/>
+              </w:rPr>
+              <w:t xml:space="preserve">Discovery, purchase</w:t>
+            </w:r>
+          </w:p>
+        </w:tc>
+        <w:tc>
+          <w:tcPr>
+            <w:tcW w:type="dxa" w:w="2891"/>
+            <w:tcBorders>
+              <w:top w:val="single" w:color="C9CED2" w:sz="4"/>
+              <w:left w:val="single" w:color="C9CED2" w:sz="4"/>
+              <w:bottom w:val="single" w:color="C9CED2" w:sz="4"/>
+              <w:right w:val="single" w:color="C9CED2" w:sz="4"/>
+            </w:tcBorders>
+            <w:tcMar>
+              <w:top w:type="dxa" w:w="60"/>
+              <w:left w:type="dxa" w:w="90"/>
+              <w:bottom w:type="dxa" w:w="60"/>
+              <w:right w:type="dxa" w:w="90"/>
+            </w:tcMar>
+          </w:tcPr>
+          <w:p>
+            <w:pPr>
+              <w:spacing w:after="0" w:line="252"/>
+            </w:pPr>
+            <w:r>
+              <w:rPr>
+                <w:b w:val="false"/>
+                <w:bCs w:val="false"/>
+                <w:color w:val="1E2A32"/>
+                <w:sz w:val="17"/>
+                <w:szCs w:val="17"/>
+              </w:rPr>
+              <w:t xml:space="preserve">One set, one day in 15 seconds</w:t>
+            </w:r>
+          </w:p>
+        </w:tc>
+        <w:tc>
+          <w:tcPr>
+            <w:tcW w:type="dxa" w:w="2024"/>
+            <w:tcBorders>
+              <w:top w:val="single" w:color="C9CED2" w:sz="4"/>
+              <w:left w:val="single" w:color="C9CED2" w:sz="4"/>
+              <w:bottom w:val="single" w:color="C9CED2" w:sz="4"/>
+              <w:right w:val="single" w:color="C9CED2" w:sz="4"/>
+            </w:tcBorders>
+            <w:tcMar>
+              <w:top w:type="dxa" w:w="60"/>
+              <w:left w:type="dxa" w:w="90"/>
+              <w:bottom w:type="dxa" w:w="60"/>
+              <w:right w:type="dxa" w:w="90"/>
+            </w:tcMar>
+          </w:tcPr>
+          <w:p>
+            <w:pPr>
+              <w:spacing w:after="0" w:line="252"/>
+            </w:pPr>
+            <w:r>
+              <w:rPr>
+                <w:b w:val="false"/>
+                <w:bCs w:val="false"/>
+                <w:color w:val="1E2A32"/>
+                <w:sz w:val="17"/>
+                <w:szCs w:val="17"/>
+              </w:rPr>
+              <w:t xml:space="preserve">Find your store</w:t>
             </w:r>
           </w:p>
         </w:tc>
@@ -3332,7 +3709,7 @@
         </w:trPr>
         <w:tc>
           <w:tcPr>
-            <w:tcW w:type="dxa" w:w="2506"/>
+            <w:tcW w:type="dxa" w:w="2120"/>
             <w:tcBorders>
               <w:top w:val="single" w:color="C9CED2" w:sz="4"/>
               <w:left w:val="single" w:color="C9CED2" w:sz="4"/>
@@ -3359,13 +3736,13 @@
                 <w:sz w:val="17"/>
                 <w:szCs w:val="17"/>
               </w:rPr>
-              <w:t xml:space="preserve">Reasons to believe</w:t>
-            </w:r>
-          </w:p>
-        </w:tc>
-        <w:tc>
-          <w:tcPr>
-            <w:tcW w:type="dxa" w:w="7132"/>
+              <w:t xml:space="preserve">Lead and micro-creators</w:t>
+            </w:r>
+          </w:p>
+        </w:tc>
+        <w:tc>
+          <w:tcPr>
+            <w:tcW w:type="dxa" w:w="1157"/>
             <w:tcBorders>
               <w:top w:val="single" w:color="C9CED2" w:sz="4"/>
               <w:left w:val="single" w:color="C9CED2" w:sz="4"/>
@@ -3392,7 +3769,106 @@
                 <w:sz w:val="17"/>
                 <w:szCs w:val="17"/>
               </w:rPr>
-              <w:t xml:space="preserve">Instructor-tested fit, cost per wear, editorial reviews</w:t>
+              <w:t xml:space="preserve">Paid → earned</w:t>
+            </w:r>
+          </w:p>
+        </w:tc>
+        <w:tc>
+          <w:tcPr>
+            <w:tcW w:type="dxa" w:w="1446"/>
+            <w:tcBorders>
+              <w:top w:val="single" w:color="C9CED2" w:sz="4"/>
+              <w:left w:val="single" w:color="C9CED2" w:sz="4"/>
+              <w:bottom w:val="single" w:color="C9CED2" w:sz="4"/>
+              <w:right w:val="single" w:color="C9CED2" w:sz="4"/>
+            </w:tcBorders>
+            <w:shd w:fill="F7F5F1" w:color="auto" w:val="clear"/>
+            <w:tcMar>
+              <w:top w:type="dxa" w:w="60"/>
+              <w:left w:type="dxa" w:w="90"/>
+              <w:bottom w:type="dxa" w:w="60"/>
+              <w:right w:type="dxa" w:w="90"/>
+            </w:tcMar>
+          </w:tcPr>
+          <w:p>
+            <w:pPr>
+              <w:spacing w:after="0" w:line="252"/>
+            </w:pPr>
+            <w:r>
+              <w:rPr>
+                <w:b w:val="false"/>
+                <w:bCs w:val="false"/>
+                <w:color w:val="1E2A32"/>
+                <w:sz w:val="17"/>
+                <w:szCs w:val="17"/>
+              </w:rPr>
+              <w:t xml:space="preserve">Discovery</w:t>
+            </w:r>
+          </w:p>
+        </w:tc>
+        <w:tc>
+          <w:tcPr>
+            <w:tcW w:type="dxa" w:w="2891"/>
+            <w:tcBorders>
+              <w:top w:val="single" w:color="C9CED2" w:sz="4"/>
+              <w:left w:val="single" w:color="C9CED2" w:sz="4"/>
+              <w:bottom w:val="single" w:color="C9CED2" w:sz="4"/>
+              <w:right w:val="single" w:color="C9CED2" w:sz="4"/>
+            </w:tcBorders>
+            <w:shd w:fill="F7F5F1" w:color="auto" w:val="clear"/>
+            <w:tcMar>
+              <w:top w:type="dxa" w:w="60"/>
+              <w:left w:type="dxa" w:w="90"/>
+              <w:bottom w:type="dxa" w:w="60"/>
+              <w:right w:type="dxa" w:w="90"/>
+            </w:tcMar>
+          </w:tcPr>
+          <w:p>
+            <w:pPr>
+              <w:spacing w:after="0" w:line="252"/>
+            </w:pPr>
+            <w:r>
+              <w:rPr>
+                <w:b w:val="false"/>
+                <w:bCs w:val="false"/>
+                <w:color w:val="1E2A32"/>
+                <w:sz w:val="17"/>
+                <w:szCs w:val="17"/>
+              </w:rPr>
+              <w:t xml:space="preserve">Their own day in one set (#ad)</w:t>
+            </w:r>
+          </w:p>
+        </w:tc>
+        <w:tc>
+          <w:tcPr>
+            <w:tcW w:type="dxa" w:w="2024"/>
+            <w:tcBorders>
+              <w:top w:val="single" w:color="C9CED2" w:sz="4"/>
+              <w:left w:val="single" w:color="C9CED2" w:sz="4"/>
+              <w:bottom w:val="single" w:color="C9CED2" w:sz="4"/>
+              <w:right w:val="single" w:color="C9CED2" w:sz="4"/>
+            </w:tcBorders>
+            <w:shd w:fill="F7F5F1" w:color="auto" w:val="clear"/>
+            <w:tcMar>
+              <w:top w:type="dxa" w:w="60"/>
+              <w:left w:type="dxa" w:w="90"/>
+              <w:bottom w:type="dxa" w:w="60"/>
+              <w:right w:type="dxa" w:w="90"/>
+            </w:tcMar>
+          </w:tcPr>
+          <w:p>
+            <w:pPr>
+              <w:spacing w:after="0" w:line="252"/>
+            </w:pPr>
+            <w:r>
+              <w:rPr>
+                <w:b w:val="false"/>
+                <w:bCs w:val="false"/>
+                <w:color w:val="1E2A32"/>
+                <w:sz w:val="17"/>
+                <w:szCs w:val="17"/>
+              </w:rPr>
+              <w:t xml:space="preserve">Book a session</w:t>
             </w:r>
           </w:p>
         </w:tc>
@@ -3403,7 +3879,7 @@
         </w:trPr>
         <w:tc>
           <w:tcPr>
-            <w:tcW w:type="dxa" w:w="2506"/>
+            <w:tcW w:type="dxa" w:w="2120"/>
             <w:tcBorders>
               <w:top w:val="single" w:color="C9CED2" w:sz="4"/>
               <w:left w:val="single" w:color="C9CED2" w:sz="4"/>
@@ -3429,39 +3905,975 @@
                 <w:sz w:val="17"/>
                 <w:szCs w:val="17"/>
               </w:rPr>
-              <w:t xml:space="preserve">Tone</w:t>
-            </w:r>
-          </w:p>
-        </w:tc>
-        <w:tc>
-          <w:tcPr>
-            <w:tcW w:type="dxa" w:w="7132"/>
-            <w:tcBorders>
-              <w:top w:val="single" w:color="C9CED2" w:sz="4"/>
-              <w:left w:val="single" w:color="C9CED2" w:sz="4"/>
-              <w:bottom w:val="single" w:color="C9CED2" w:sz="4"/>
-              <w:right w:val="single" w:color="C9CED2" w:sz="4"/>
-            </w:tcBorders>
-            <w:tcMar>
-              <w:top w:type="dxa" w:w="60"/>
-              <w:left w:type="dxa" w:w="90"/>
-              <w:bottom w:type="dxa" w:w="60"/>
-              <w:right w:type="dxa" w:w="90"/>
-            </w:tcMar>
-          </w:tcPr>
-          <w:p>
-            <w:pPr>
-              <w:spacing w:after="0" w:line="252"/>
-            </w:pPr>
-            <w:r>
-              <w:rPr>
-                <w:b w:val="false"/>
-                <w:bCs w:val="false"/>
-                <w:color w:val="1E2A32"/>
-                <w:sz w:val="17"/>
-                <w:szCs w:val="17"/>
-              </w:rPr>
-              <w:t xml:space="preserve">Calm, confident, natural light, diverse bodies</w:t>
+              <w:t xml:space="preserve">Sanctuary Sessions, walks</w:t>
+            </w:r>
+          </w:p>
+        </w:tc>
+        <w:tc>
+          <w:tcPr>
+            <w:tcW w:type="dxa" w:w="1157"/>
+            <w:tcBorders>
+              <w:top w:val="single" w:color="C9CED2" w:sz="4"/>
+              <w:left w:val="single" w:color="C9CED2" w:sz="4"/>
+              <w:bottom w:val="single" w:color="C9CED2" w:sz="4"/>
+              <w:right w:val="single" w:color="C9CED2" w:sz="4"/>
+            </w:tcBorders>
+            <w:tcMar>
+              <w:top w:type="dxa" w:w="60"/>
+              <w:left w:type="dxa" w:w="90"/>
+              <w:bottom w:type="dxa" w:w="60"/>
+              <w:right w:type="dxa" w:w="90"/>
+            </w:tcMar>
+          </w:tcPr>
+          <w:p>
+            <w:pPr>
+              <w:spacing w:after="0" w:line="252"/>
+            </w:pPr>
+            <w:r>
+              <w:rPr>
+                <w:b w:val="false"/>
+                <w:bCs w:val="false"/>
+                <w:color w:val="1E2A32"/>
+                <w:sz w:val="17"/>
+                <w:szCs w:val="17"/>
+              </w:rPr>
+              <w:t xml:space="preserve">Experiential</w:t>
+            </w:r>
+          </w:p>
+        </w:tc>
+        <w:tc>
+          <w:tcPr>
+            <w:tcW w:type="dxa" w:w="1446"/>
+            <w:tcBorders>
+              <w:top w:val="single" w:color="C9CED2" w:sz="4"/>
+              <w:left w:val="single" w:color="C9CED2" w:sz="4"/>
+              <w:bottom w:val="single" w:color="C9CED2" w:sz="4"/>
+              <w:right w:val="single" w:color="C9CED2" w:sz="4"/>
+            </w:tcBorders>
+            <w:tcMar>
+              <w:top w:type="dxa" w:w="60"/>
+              <w:left w:type="dxa" w:w="90"/>
+              <w:bottom w:type="dxa" w:w="60"/>
+              <w:right w:type="dxa" w:w="90"/>
+            </w:tcMar>
+          </w:tcPr>
+          <w:p>
+            <w:pPr>
+              <w:spacing w:after="0" w:line="252"/>
+            </w:pPr>
+            <w:r>
+              <w:rPr>
+                <w:b w:val="false"/>
+                <w:bCs w:val="false"/>
+                <w:color w:val="1E2A32"/>
+                <w:sz w:val="17"/>
+                <w:szCs w:val="17"/>
+              </w:rPr>
+              <w:t xml:space="preserve">Evaluation</w:t>
+            </w:r>
+          </w:p>
+        </w:tc>
+        <w:tc>
+          <w:tcPr>
+            <w:tcW w:type="dxa" w:w="2891"/>
+            <w:tcBorders>
+              <w:top w:val="single" w:color="C9CED2" w:sz="4"/>
+              <w:left w:val="single" w:color="C9CED2" w:sz="4"/>
+              <w:bottom w:val="single" w:color="C9CED2" w:sz="4"/>
+              <w:right w:val="single" w:color="C9CED2" w:sz="4"/>
+            </w:tcBorders>
+            <w:tcMar>
+              <w:top w:type="dxa" w:w="60"/>
+              <w:left w:type="dxa" w:w="90"/>
+              <w:bottom w:type="dxa" w:w="60"/>
+              <w:right w:type="dxa" w:w="90"/>
+            </w:tcMar>
+          </w:tcPr>
+          <w:p>
+            <w:pPr>
+              <w:spacing w:after="0" w:line="252"/>
+            </w:pPr>
+            <w:r>
+              <w:rPr>
+                <w:b w:val="false"/>
+                <w:bCs w:val="false"/>
+                <w:color w:val="1E2A32"/>
+                <w:sz w:val="17"/>
+                <w:szCs w:val="17"/>
+              </w:rPr>
+              <w:t xml:space="preserve">Class, then styled for the day</w:t>
+            </w:r>
+          </w:p>
+        </w:tc>
+        <w:tc>
+          <w:tcPr>
+            <w:tcW w:type="dxa" w:w="2024"/>
+            <w:tcBorders>
+              <w:top w:val="single" w:color="C9CED2" w:sz="4"/>
+              <w:left w:val="single" w:color="C9CED2" w:sz="4"/>
+              <w:bottom w:val="single" w:color="C9CED2" w:sz="4"/>
+              <w:right w:val="single" w:color="C9CED2" w:sz="4"/>
+            </w:tcBorders>
+            <w:tcMar>
+              <w:top w:type="dxa" w:w="60"/>
+              <w:left w:type="dxa" w:w="90"/>
+              <w:bottom w:type="dxa" w:w="60"/>
+              <w:right w:type="dxa" w:w="90"/>
+            </w:tcMar>
+          </w:tcPr>
+          <w:p>
+            <w:pPr>
+              <w:spacing w:after="0" w:line="252"/>
+            </w:pPr>
+            <w:r>
+              <w:rPr>
+                <w:b w:val="false"/>
+                <w:bCs w:val="false"/>
+                <w:color w:val="1E2A32"/>
+                <w:sz w:val="17"/>
+                <w:szCs w:val="17"/>
+              </w:rPr>
+              <w:t xml:space="preserve">Styling appointment</w:t>
+            </w:r>
+          </w:p>
+        </w:tc>
+      </w:tr>
+      <w:tr>
+        <w:trPr>
+          <w:cantSplit/>
+        </w:trPr>
+        <w:tc>
+          <w:tcPr>
+            <w:tcW w:type="dxa" w:w="2120"/>
+            <w:tcBorders>
+              <w:top w:val="single" w:color="C9CED2" w:sz="4"/>
+              <w:left w:val="single" w:color="C9CED2" w:sz="4"/>
+              <w:bottom w:val="single" w:color="C9CED2" w:sz="4"/>
+              <w:right w:val="single" w:color="C9CED2" w:sz="4"/>
+            </w:tcBorders>
+            <w:shd w:fill="F7F5F1" w:color="auto" w:val="clear"/>
+            <w:tcMar>
+              <w:top w:type="dxa" w:w="60"/>
+              <w:left w:type="dxa" w:w="90"/>
+              <w:bottom w:type="dxa" w:w="60"/>
+              <w:right w:type="dxa" w:w="90"/>
+            </w:tcMar>
+          </w:tcPr>
+          <w:p>
+            <w:pPr>
+              <w:spacing w:after="0" w:line="252"/>
+            </w:pPr>
+            <w:r>
+              <w:rPr>
+                <w:b/>
+                <w:bCs/>
+                <w:color w:val="1E2A32"/>
+                <w:sz w:val="17"/>
+                <w:szCs w:val="17"/>
+              </w:rPr>
+              <w:t xml:space="preserve">Media alert, editorial</w:t>
+            </w:r>
+          </w:p>
+        </w:tc>
+        <w:tc>
+          <w:tcPr>
+            <w:tcW w:type="dxa" w:w="1157"/>
+            <w:tcBorders>
+              <w:top w:val="single" w:color="C9CED2" w:sz="4"/>
+              <w:left w:val="single" w:color="C9CED2" w:sz="4"/>
+              <w:bottom w:val="single" w:color="C9CED2" w:sz="4"/>
+              <w:right w:val="single" w:color="C9CED2" w:sz="4"/>
+            </w:tcBorders>
+            <w:shd w:fill="F7F5F1" w:color="auto" w:val="clear"/>
+            <w:tcMar>
+              <w:top w:type="dxa" w:w="60"/>
+              <w:left w:type="dxa" w:w="90"/>
+              <w:bottom w:type="dxa" w:w="60"/>
+              <w:right w:type="dxa" w:w="90"/>
+            </w:tcMar>
+          </w:tcPr>
+          <w:p>
+            <w:pPr>
+              <w:spacing w:after="0" w:line="252"/>
+            </w:pPr>
+            <w:r>
+              <w:rPr>
+                <w:b w:val="false"/>
+                <w:bCs w:val="false"/>
+                <w:color w:val="1E2A32"/>
+                <w:sz w:val="17"/>
+                <w:szCs w:val="17"/>
+              </w:rPr>
+              <w:t xml:space="preserve">Earned</w:t>
+            </w:r>
+          </w:p>
+        </w:tc>
+        <w:tc>
+          <w:tcPr>
+            <w:tcW w:type="dxa" w:w="1446"/>
+            <w:tcBorders>
+              <w:top w:val="single" w:color="C9CED2" w:sz="4"/>
+              <w:left w:val="single" w:color="C9CED2" w:sz="4"/>
+              <w:bottom w:val="single" w:color="C9CED2" w:sz="4"/>
+              <w:right w:val="single" w:color="C9CED2" w:sz="4"/>
+            </w:tcBorders>
+            <w:shd w:fill="F7F5F1" w:color="auto" w:val="clear"/>
+            <w:tcMar>
+              <w:top w:type="dxa" w:w="60"/>
+              <w:left w:type="dxa" w:w="90"/>
+              <w:bottom w:type="dxa" w:w="60"/>
+              <w:right w:type="dxa" w:w="90"/>
+            </w:tcMar>
+          </w:tcPr>
+          <w:p>
+            <w:pPr>
+              <w:spacing w:after="0" w:line="252"/>
+            </w:pPr>
+            <w:r>
+              <w:rPr>
+                <w:b w:val="false"/>
+                <w:bCs w:val="false"/>
+                <w:color w:val="1E2A32"/>
+                <w:sz w:val="17"/>
+                <w:szCs w:val="17"/>
+              </w:rPr>
+              <w:t xml:space="preserve">Evaluation</w:t>
+            </w:r>
+          </w:p>
+        </w:tc>
+        <w:tc>
+          <w:tcPr>
+            <w:tcW w:type="dxa" w:w="2891"/>
+            <w:tcBorders>
+              <w:top w:val="single" w:color="C9CED2" w:sz="4"/>
+              <w:left w:val="single" w:color="C9CED2" w:sz="4"/>
+              <w:bottom w:val="single" w:color="C9CED2" w:sz="4"/>
+              <w:right w:val="single" w:color="C9CED2" w:sz="4"/>
+            </w:tcBorders>
+            <w:shd w:fill="F7F5F1" w:color="auto" w:val="clear"/>
+            <w:tcMar>
+              <w:top w:type="dxa" w:w="60"/>
+              <w:left w:type="dxa" w:w="90"/>
+              <w:bottom w:type="dxa" w:w="60"/>
+              <w:right w:type="dxa" w:w="90"/>
+            </w:tcMar>
+          </w:tcPr>
+          <w:p>
+            <w:pPr>
+              <w:spacing w:after="0" w:line="252"/>
+            </w:pPr>
+            <w:r>
+              <w:rPr>
+                <w:b w:val="false"/>
+                <w:bCs w:val="false"/>
+                <w:color w:val="1E2A32"/>
+                <w:sz w:val="17"/>
+                <w:szCs w:val="17"/>
+              </w:rPr>
+              <w:t xml:space="preserve">"Walk Bondi to Bronte in one set"</w:t>
+            </w:r>
+          </w:p>
+        </w:tc>
+        <w:tc>
+          <w:tcPr>
+            <w:tcW w:type="dxa" w:w="2024"/>
+            <w:tcBorders>
+              <w:top w:val="single" w:color="C9CED2" w:sz="4"/>
+              <w:left w:val="single" w:color="C9CED2" w:sz="4"/>
+              <w:bottom w:val="single" w:color="C9CED2" w:sz="4"/>
+              <w:right w:val="single" w:color="C9CED2" w:sz="4"/>
+            </w:tcBorders>
+            <w:shd w:fill="F7F5F1" w:color="auto" w:val="clear"/>
+            <w:tcMar>
+              <w:top w:type="dxa" w:w="60"/>
+              <w:left w:type="dxa" w:w="90"/>
+              <w:bottom w:type="dxa" w:w="60"/>
+              <w:right w:type="dxa" w:w="90"/>
+            </w:tcMar>
+          </w:tcPr>
+          <w:p>
+            <w:pPr>
+              <w:spacing w:after="0" w:line="252"/>
+            </w:pPr>
+            <w:r>
+              <w:rPr>
+                <w:b w:val="false"/>
+                <w:bCs w:val="false"/>
+                <w:color w:val="1E2A32"/>
+                <w:sz w:val="17"/>
+                <w:szCs w:val="17"/>
+              </w:rPr>
+              <w:t xml:space="preserve">Join a walk</w:t>
+            </w:r>
+          </w:p>
+        </w:tc>
+      </w:tr>
+      <w:tr>
+        <w:trPr>
+          <w:cantSplit/>
+        </w:trPr>
+        <w:tc>
+          <w:tcPr>
+            <w:tcW w:type="dxa" w:w="2120"/>
+            <w:tcBorders>
+              <w:top w:val="single" w:color="C9CED2" w:sz="4"/>
+              <w:left w:val="single" w:color="C9CED2" w:sz="4"/>
+              <w:bottom w:val="single" w:color="C9CED2" w:sz="4"/>
+              <w:right w:val="single" w:color="C9CED2" w:sz="4"/>
+            </w:tcBorders>
+            <w:tcMar>
+              <w:top w:type="dxa" w:w="60"/>
+              <w:left w:type="dxa" w:w="90"/>
+              <w:bottom w:type="dxa" w:w="60"/>
+              <w:right w:type="dxa" w:w="90"/>
+            </w:tcMar>
+          </w:tcPr>
+          <w:p>
+            <w:pPr>
+              <w:spacing w:after="0" w:line="252"/>
+            </w:pPr>
+            <w:r>
+              <w:rPr>
+                <w:b/>
+                <w:bCs/>
+                <w:color w:val="1E2A32"/>
+                <w:sz w:val="17"/>
+                <w:szCs w:val="17"/>
+              </w:rPr>
+              <w:t xml:space="preserve">Carousel, website, emails</w:t>
+            </w:r>
+          </w:p>
+        </w:tc>
+        <w:tc>
+          <w:tcPr>
+            <w:tcW w:type="dxa" w:w="1157"/>
+            <w:tcBorders>
+              <w:top w:val="single" w:color="C9CED2" w:sz="4"/>
+              <w:left w:val="single" w:color="C9CED2" w:sz="4"/>
+              <w:bottom w:val="single" w:color="C9CED2" w:sz="4"/>
+              <w:right w:val="single" w:color="C9CED2" w:sz="4"/>
+            </w:tcBorders>
+            <w:tcMar>
+              <w:top w:type="dxa" w:w="60"/>
+              <w:left w:type="dxa" w:w="90"/>
+              <w:bottom w:type="dxa" w:w="60"/>
+              <w:right w:type="dxa" w:w="90"/>
+            </w:tcMar>
+          </w:tcPr>
+          <w:p>
+            <w:pPr>
+              <w:spacing w:after="0" w:line="252"/>
+            </w:pPr>
+            <w:r>
+              <w:rPr>
+                <w:b w:val="false"/>
+                <w:bCs w:val="false"/>
+                <w:color w:val="1E2A32"/>
+                <w:sz w:val="17"/>
+                <w:szCs w:val="17"/>
+              </w:rPr>
+              <w:t xml:space="preserve">Owned</w:t>
+            </w:r>
+          </w:p>
+        </w:tc>
+        <w:tc>
+          <w:tcPr>
+            <w:tcW w:type="dxa" w:w="1446"/>
+            <w:tcBorders>
+              <w:top w:val="single" w:color="C9CED2" w:sz="4"/>
+              <w:left w:val="single" w:color="C9CED2" w:sz="4"/>
+              <w:bottom w:val="single" w:color="C9CED2" w:sz="4"/>
+              <w:right w:val="single" w:color="C9CED2" w:sz="4"/>
+            </w:tcBorders>
+            <w:tcMar>
+              <w:top w:type="dxa" w:w="60"/>
+              <w:left w:type="dxa" w:w="90"/>
+              <w:bottom w:type="dxa" w:w="60"/>
+              <w:right w:type="dxa" w:w="90"/>
+            </w:tcMar>
+          </w:tcPr>
+          <w:p>
+            <w:pPr>
+              <w:spacing w:after="0" w:line="252"/>
+            </w:pPr>
+            <w:r>
+              <w:rPr>
+                <w:b w:val="false"/>
+                <w:bCs w:val="false"/>
+                <w:color w:val="1E2A32"/>
+                <w:sz w:val="17"/>
+                <w:szCs w:val="17"/>
+              </w:rPr>
+              <w:t xml:space="preserve">Evaluation, purchase</w:t>
+            </w:r>
+          </w:p>
+        </w:tc>
+        <w:tc>
+          <w:tcPr>
+            <w:tcW w:type="dxa" w:w="2891"/>
+            <w:tcBorders>
+              <w:top w:val="single" w:color="C9CED2" w:sz="4"/>
+              <w:left w:val="single" w:color="C9CED2" w:sz="4"/>
+              <w:bottom w:val="single" w:color="C9CED2" w:sz="4"/>
+              <w:right w:val="single" w:color="C9CED2" w:sz="4"/>
+            </w:tcBorders>
+            <w:tcMar>
+              <w:top w:type="dxa" w:w="60"/>
+              <w:left w:type="dxa" w:w="90"/>
+              <w:bottom w:type="dxa" w:w="60"/>
+              <w:right w:type="dxa" w:w="90"/>
+            </w:tcMar>
+          </w:tcPr>
+          <w:p>
+            <w:pPr>
+              <w:spacing w:after="0" w:line="252"/>
+            </w:pPr>
+            <w:r>
+              <w:rPr>
+                <w:b w:val="false"/>
+                <w:bCs w:val="false"/>
+                <w:color w:val="1E2A32"/>
+                <w:sz w:val="17"/>
+                <w:szCs w:val="17"/>
+              </w:rPr>
+              <w:t xml:space="preserve">Cost per wear; "Wear it to class. Keep it on."</w:t>
+            </w:r>
+          </w:p>
+        </w:tc>
+        <w:tc>
+          <w:tcPr>
+            <w:tcW w:type="dxa" w:w="2024"/>
+            <w:tcBorders>
+              <w:top w:val="single" w:color="C9CED2" w:sz="4"/>
+              <w:left w:val="single" w:color="C9CED2" w:sz="4"/>
+              <w:bottom w:val="single" w:color="C9CED2" w:sz="4"/>
+              <w:right w:val="single" w:color="C9CED2" w:sz="4"/>
+            </w:tcBorders>
+            <w:tcMar>
+              <w:top w:type="dxa" w:w="60"/>
+              <w:left w:type="dxa" w:w="90"/>
+              <w:bottom w:type="dxa" w:w="60"/>
+              <w:right w:type="dxa" w:w="90"/>
+            </w:tcMar>
+          </w:tcPr>
+          <w:p>
+            <w:pPr>
+              <w:spacing w:after="0" w:line="252"/>
+            </w:pPr>
+            <w:r>
+              <w:rPr>
+                <w:b w:val="false"/>
+                <w:bCs w:val="false"/>
+                <w:color w:val="1E2A32"/>
+                <w:sz w:val="17"/>
+                <w:szCs w:val="17"/>
+              </w:rPr>
+              <w:t xml:space="preserve">Book; find store</w:t>
+            </w:r>
+          </w:p>
+        </w:tc>
+      </w:tr>
+      <w:tr>
+        <w:trPr>
+          <w:cantSplit/>
+        </w:trPr>
+        <w:tc>
+          <w:tcPr>
+            <w:tcW w:type="dxa" w:w="2120"/>
+            <w:tcBorders>
+              <w:top w:val="single" w:color="C9CED2" w:sz="4"/>
+              <w:left w:val="single" w:color="C9CED2" w:sz="4"/>
+              <w:bottom w:val="single" w:color="C9CED2" w:sz="4"/>
+              <w:right w:val="single" w:color="C9CED2" w:sz="4"/>
+            </w:tcBorders>
+            <w:shd w:fill="F7F5F1" w:color="auto" w:val="clear"/>
+            <w:tcMar>
+              <w:top w:type="dxa" w:w="60"/>
+              <w:left w:type="dxa" w:w="90"/>
+              <w:bottom w:type="dxa" w:w="60"/>
+              <w:right w:type="dxa" w:w="90"/>
+            </w:tcMar>
+          </w:tcPr>
+          <w:p>
+            <w:pPr>
+              <w:spacing w:after="0" w:line="252"/>
+            </w:pPr>
+            <w:r>
+              <w:rPr>
+                <w:b/>
+                <w:bCs/>
+                <w:color w:val="1E2A32"/>
+                <w:sz w:val="17"/>
+                <w:szCs w:val="17"/>
+              </w:rPr>
+              <w:t xml:space="preserve">Window, staff, styling</w:t>
+            </w:r>
+          </w:p>
+        </w:tc>
+        <w:tc>
+          <w:tcPr>
+            <w:tcW w:type="dxa" w:w="1157"/>
+            <w:tcBorders>
+              <w:top w:val="single" w:color="C9CED2" w:sz="4"/>
+              <w:left w:val="single" w:color="C9CED2" w:sz="4"/>
+              <w:bottom w:val="single" w:color="C9CED2" w:sz="4"/>
+              <w:right w:val="single" w:color="C9CED2" w:sz="4"/>
+            </w:tcBorders>
+            <w:shd w:fill="F7F5F1" w:color="auto" w:val="clear"/>
+            <w:tcMar>
+              <w:top w:type="dxa" w:w="60"/>
+              <w:left w:type="dxa" w:w="90"/>
+              <w:bottom w:type="dxa" w:w="60"/>
+              <w:right w:type="dxa" w:w="90"/>
+            </w:tcMar>
+          </w:tcPr>
+          <w:p>
+            <w:pPr>
+              <w:spacing w:after="0" w:line="252"/>
+            </w:pPr>
+            <w:r>
+              <w:rPr>
+                <w:b w:val="false"/>
+                <w:bCs w:val="false"/>
+                <w:color w:val="1E2A32"/>
+                <w:sz w:val="17"/>
+                <w:szCs w:val="17"/>
+              </w:rPr>
+              <w:t xml:space="preserve">Intrinsic</w:t>
+            </w:r>
+          </w:p>
+        </w:tc>
+        <w:tc>
+          <w:tcPr>
+            <w:tcW w:type="dxa" w:w="1446"/>
+            <w:tcBorders>
+              <w:top w:val="single" w:color="C9CED2" w:sz="4"/>
+              <w:left w:val="single" w:color="C9CED2" w:sz="4"/>
+              <w:bottom w:val="single" w:color="C9CED2" w:sz="4"/>
+              <w:right w:val="single" w:color="C9CED2" w:sz="4"/>
+            </w:tcBorders>
+            <w:shd w:fill="F7F5F1" w:color="auto" w:val="clear"/>
+            <w:tcMar>
+              <w:top w:type="dxa" w:w="60"/>
+              <w:left w:type="dxa" w:w="90"/>
+              <w:bottom w:type="dxa" w:w="60"/>
+              <w:right w:type="dxa" w:w="90"/>
+            </w:tcMar>
+          </w:tcPr>
+          <w:p>
+            <w:pPr>
+              <w:spacing w:after="0" w:line="252"/>
+            </w:pPr>
+            <w:r>
+              <w:rPr>
+                <w:b w:val="false"/>
+                <w:bCs w:val="false"/>
+                <w:color w:val="1E2A32"/>
+                <w:sz w:val="17"/>
+                <w:szCs w:val="17"/>
+              </w:rPr>
+              <w:t xml:space="preserve">Purchase</w:t>
+            </w:r>
+          </w:p>
+        </w:tc>
+        <w:tc>
+          <w:tcPr>
+            <w:tcW w:type="dxa" w:w="2891"/>
+            <w:tcBorders>
+              <w:top w:val="single" w:color="C9CED2" w:sz="4"/>
+              <w:left w:val="single" w:color="C9CED2" w:sz="4"/>
+              <w:bottom w:val="single" w:color="C9CED2" w:sz="4"/>
+              <w:right w:val="single" w:color="C9CED2" w:sz="4"/>
+            </w:tcBorders>
+            <w:shd w:fill="F7F5F1" w:color="auto" w:val="clear"/>
+            <w:tcMar>
+              <w:top w:type="dxa" w:w="60"/>
+              <w:left w:type="dxa" w:w="90"/>
+              <w:bottom w:type="dxa" w:w="60"/>
+              <w:right w:type="dxa" w:w="90"/>
+            </w:tcMar>
+          </w:tcPr>
+          <w:p>
+            <w:pPr>
+              <w:spacing w:after="0" w:line="252"/>
+            </w:pPr>
+            <w:r>
+              <w:rPr>
+                <w:b w:val="false"/>
+                <w:bCs w:val="false"/>
+                <w:color w:val="1E2A32"/>
+                <w:sz w:val="17"/>
+                <w:szCs w:val="17"/>
+              </w:rPr>
+              <w:t xml:space="preserve">One set styled three ways</w:t>
+            </w:r>
+          </w:p>
+        </w:tc>
+        <w:tc>
+          <w:tcPr>
+            <w:tcW w:type="dxa" w:w="2024"/>
+            <w:tcBorders>
+              <w:top w:val="single" w:color="C9CED2" w:sz="4"/>
+              <w:left w:val="single" w:color="C9CED2" w:sz="4"/>
+              <w:bottom w:val="single" w:color="C9CED2" w:sz="4"/>
+              <w:right w:val="single" w:color="C9CED2" w:sz="4"/>
+            </w:tcBorders>
+            <w:shd w:fill="F7F5F1" w:color="auto" w:val="clear"/>
+            <w:tcMar>
+              <w:top w:type="dxa" w:w="60"/>
+              <w:left w:type="dxa" w:w="90"/>
+              <w:bottom w:type="dxa" w:w="60"/>
+              <w:right w:type="dxa" w:w="90"/>
+            </w:tcMar>
+          </w:tcPr>
+          <w:p>
+            <w:pPr>
+              <w:spacing w:after="0" w:line="252"/>
+            </w:pPr>
+            <w:r>
+              <w:rPr>
+                <w:b w:val="false"/>
+                <w:bCs w:val="false"/>
+                <w:color w:val="1E2A32"/>
+                <w:sz w:val="17"/>
+                <w:szCs w:val="17"/>
+              </w:rPr>
+              <w:t xml:space="preserve">Try the set</w:t>
+            </w:r>
+          </w:p>
+        </w:tc>
+      </w:tr>
+      <w:tr>
+        <w:trPr>
+          <w:cantSplit/>
+        </w:trPr>
+        <w:tc>
+          <w:tcPr>
+            <w:tcW w:type="dxa" w:w="2120"/>
+            <w:tcBorders>
+              <w:top w:val="single" w:color="C9CED2" w:sz="4"/>
+              <w:left w:val="single" w:color="C9CED2" w:sz="4"/>
+              <w:bottom w:val="single" w:color="C9CED2" w:sz="4"/>
+              <w:right w:val="single" w:color="C9CED2" w:sz="4"/>
+            </w:tcBorders>
+            <w:tcMar>
+              <w:top w:type="dxa" w:w="60"/>
+              <w:left w:type="dxa" w:w="90"/>
+              <w:bottom w:type="dxa" w:w="60"/>
+              <w:right w:type="dxa" w:w="90"/>
+            </w:tcMar>
+          </w:tcPr>
+          <w:p>
+            <w:pPr>
+              <w:spacing w:after="0" w:line="252"/>
+            </w:pPr>
+            <w:r>
+              <w:rPr>
+                <w:b/>
+                <w:bCs/>
+                <w:color w:val="1E2A32"/>
+                <w:sz w:val="17"/>
+                <w:szCs w:val="17"/>
+              </w:rPr>
+              <w:t xml:space="preserve">Swing tag, bag</w:t>
+            </w:r>
+          </w:p>
+        </w:tc>
+        <w:tc>
+          <w:tcPr>
+            <w:tcW w:type="dxa" w:w="1157"/>
+            <w:tcBorders>
+              <w:top w:val="single" w:color="C9CED2" w:sz="4"/>
+              <w:left w:val="single" w:color="C9CED2" w:sz="4"/>
+              <w:bottom w:val="single" w:color="C9CED2" w:sz="4"/>
+              <w:right w:val="single" w:color="C9CED2" w:sz="4"/>
+            </w:tcBorders>
+            <w:tcMar>
+              <w:top w:type="dxa" w:w="60"/>
+              <w:left w:type="dxa" w:w="90"/>
+              <w:bottom w:type="dxa" w:w="60"/>
+              <w:right w:type="dxa" w:w="90"/>
+            </w:tcMar>
+          </w:tcPr>
+          <w:p>
+            <w:pPr>
+              <w:spacing w:after="0" w:line="252"/>
+            </w:pPr>
+            <w:r>
+              <w:rPr>
+                <w:b w:val="false"/>
+                <w:bCs w:val="false"/>
+                <w:color w:val="1E2A32"/>
+                <w:sz w:val="17"/>
+                <w:szCs w:val="17"/>
+              </w:rPr>
+              <w:t xml:space="preserve">Intrinsic</w:t>
+            </w:r>
+          </w:p>
+        </w:tc>
+        <w:tc>
+          <w:tcPr>
+            <w:tcW w:type="dxa" w:w="1446"/>
+            <w:tcBorders>
+              <w:top w:val="single" w:color="C9CED2" w:sz="4"/>
+              <w:left w:val="single" w:color="C9CED2" w:sz="4"/>
+              <w:bottom w:val="single" w:color="C9CED2" w:sz="4"/>
+              <w:right w:val="single" w:color="C9CED2" w:sz="4"/>
+            </w:tcBorders>
+            <w:tcMar>
+              <w:top w:type="dxa" w:w="60"/>
+              <w:left w:type="dxa" w:w="90"/>
+              <w:bottom w:type="dxa" w:w="60"/>
+              <w:right w:type="dxa" w:w="90"/>
+            </w:tcMar>
+          </w:tcPr>
+          <w:p>
+            <w:pPr>
+              <w:spacing w:after="0" w:line="252"/>
+            </w:pPr>
+            <w:r>
+              <w:rPr>
+                <w:b w:val="false"/>
+                <w:bCs w:val="false"/>
+                <w:color w:val="1E2A32"/>
+                <w:sz w:val="17"/>
+                <w:szCs w:val="17"/>
+              </w:rPr>
+              <w:t xml:space="preserve">Post-purchase</w:t>
+            </w:r>
+          </w:p>
+        </w:tc>
+        <w:tc>
+          <w:tcPr>
+            <w:tcW w:type="dxa" w:w="2891"/>
+            <w:tcBorders>
+              <w:top w:val="single" w:color="C9CED2" w:sz="4"/>
+              <w:left w:val="single" w:color="C9CED2" w:sz="4"/>
+              <w:bottom w:val="single" w:color="C9CED2" w:sz="4"/>
+              <w:right w:val="single" w:color="C9CED2" w:sz="4"/>
+            </w:tcBorders>
+            <w:tcMar>
+              <w:top w:type="dxa" w:w="60"/>
+              <w:left w:type="dxa" w:w="90"/>
+              <w:bottom w:type="dxa" w:w="60"/>
+              <w:right w:type="dxa" w:w="90"/>
+            </w:tcMar>
+          </w:tcPr>
+          <w:p>
+            <w:pPr>
+              <w:spacing w:after="0" w:line="252"/>
+            </w:pPr>
+            <w:r>
+              <w:rPr>
+                <w:b w:val="false"/>
+                <w:bCs w:val="false"/>
+                <w:color w:val="1E2A32"/>
+                <w:sz w:val="17"/>
+                <w:szCs w:val="17"/>
+              </w:rPr>
+              <w:t xml:space="preserve">"1. Mat. 2. Moment."</w:t>
+            </w:r>
+          </w:p>
+        </w:tc>
+        <w:tc>
+          <w:tcPr>
+            <w:tcW w:type="dxa" w:w="2024"/>
+            <w:tcBorders>
+              <w:top w:val="single" w:color="C9CED2" w:sz="4"/>
+              <w:left w:val="single" w:color="C9CED2" w:sz="4"/>
+              <w:bottom w:val="single" w:color="C9CED2" w:sz="4"/>
+              <w:right w:val="single" w:color="C9CED2" w:sz="4"/>
+            </w:tcBorders>
+            <w:tcMar>
+              <w:top w:type="dxa" w:w="60"/>
+              <w:left w:type="dxa" w:w="90"/>
+              <w:bottom w:type="dxa" w:w="60"/>
+              <w:right w:type="dxa" w:w="90"/>
+            </w:tcMar>
+          </w:tcPr>
+          <w:p>
+            <w:pPr>
+              <w:spacing w:after="0" w:line="252"/>
+            </w:pPr>
+            <w:r>
+              <w:rPr>
+                <w:b w:val="false"/>
+                <w:bCs w:val="false"/>
+                <w:color w:val="1E2A32"/>
+                <w:sz w:val="17"/>
+                <w:szCs w:val="17"/>
+              </w:rPr>
+              <w:t xml:space="preserve">Share your day</w:t>
+            </w:r>
+          </w:p>
+        </w:tc>
+      </w:tr>
+      <w:tr>
+        <w:trPr>
+          <w:cantSplit/>
+        </w:trPr>
+        <w:tc>
+          <w:tcPr>
+            <w:tcW w:type="dxa" w:w="2120"/>
+            <w:tcBorders>
+              <w:top w:val="single" w:color="C9CED2" w:sz="4"/>
+              <w:left w:val="single" w:color="C9CED2" w:sz="4"/>
+              <w:bottom w:val="single" w:color="C9CED2" w:sz="4"/>
+              <w:right w:val="single" w:color="C9CED2" w:sz="4"/>
+            </w:tcBorders>
+            <w:shd w:fill="F7F5F1" w:color="auto" w:val="clear"/>
+            <w:tcMar>
+              <w:top w:type="dxa" w:w="60"/>
+              <w:left w:type="dxa" w:w="90"/>
+              <w:bottom w:type="dxa" w:w="60"/>
+              <w:right w:type="dxa" w:w="90"/>
+            </w:tcMar>
+          </w:tcPr>
+          <w:p>
+            <w:pPr>
+              <w:spacing w:after="0" w:line="252"/>
+            </w:pPr>
+            <w:r>
+              <w:rPr>
+                <w:b/>
+                <w:bCs/>
+                <w:color w:val="1E2A32"/>
+                <w:sz w:val="17"/>
+                <w:szCs w:val="17"/>
+              </w:rPr>
+              <w:t xml:space="preserve">#MatToMoment posts</w:t>
+            </w:r>
+          </w:p>
+        </w:tc>
+        <w:tc>
+          <w:tcPr>
+            <w:tcW w:type="dxa" w:w="1157"/>
+            <w:tcBorders>
+              <w:top w:val="single" w:color="C9CED2" w:sz="4"/>
+              <w:left w:val="single" w:color="C9CED2" w:sz="4"/>
+              <w:bottom w:val="single" w:color="C9CED2" w:sz="4"/>
+              <w:right w:val="single" w:color="C9CED2" w:sz="4"/>
+            </w:tcBorders>
+            <w:shd w:fill="F7F5F1" w:color="auto" w:val="clear"/>
+            <w:tcMar>
+              <w:top w:type="dxa" w:w="60"/>
+              <w:left w:type="dxa" w:w="90"/>
+              <w:bottom w:type="dxa" w:w="60"/>
+              <w:right w:type="dxa" w:w="90"/>
+            </w:tcMar>
+          </w:tcPr>
+          <w:p>
+            <w:pPr>
+              <w:spacing w:after="0" w:line="252"/>
+            </w:pPr>
+            <w:r>
+              <w:rPr>
+                <w:b w:val="false"/>
+                <w:bCs w:val="false"/>
+                <w:color w:val="1E2A32"/>
+                <w:sz w:val="17"/>
+                <w:szCs w:val="17"/>
+              </w:rPr>
+              <w:t xml:space="preserve">Earned</w:t>
+            </w:r>
+          </w:p>
+        </w:tc>
+        <w:tc>
+          <w:tcPr>
+            <w:tcW w:type="dxa" w:w="1446"/>
+            <w:tcBorders>
+              <w:top w:val="single" w:color="C9CED2" w:sz="4"/>
+              <w:left w:val="single" w:color="C9CED2" w:sz="4"/>
+              <w:bottom w:val="single" w:color="C9CED2" w:sz="4"/>
+              <w:right w:val="single" w:color="C9CED2" w:sz="4"/>
+            </w:tcBorders>
+            <w:shd w:fill="F7F5F1" w:color="auto" w:val="clear"/>
+            <w:tcMar>
+              <w:top w:type="dxa" w:w="60"/>
+              <w:left w:type="dxa" w:w="90"/>
+              <w:bottom w:type="dxa" w:w="60"/>
+              <w:right w:type="dxa" w:w="90"/>
+            </w:tcMar>
+          </w:tcPr>
+          <w:p>
+            <w:pPr>
+              <w:spacing w:after="0" w:line="252"/>
+            </w:pPr>
+            <w:r>
+              <w:rPr>
+                <w:b w:val="false"/>
+                <w:bCs w:val="false"/>
+                <w:color w:val="1E2A32"/>
+                <w:sz w:val="17"/>
+                <w:szCs w:val="17"/>
+              </w:rPr>
+              <w:t xml:space="preserve">Advocacy</w:t>
+            </w:r>
+          </w:p>
+        </w:tc>
+        <w:tc>
+          <w:tcPr>
+            <w:tcW w:type="dxa" w:w="2891"/>
+            <w:tcBorders>
+              <w:top w:val="single" w:color="C9CED2" w:sz="4"/>
+              <w:left w:val="single" w:color="C9CED2" w:sz="4"/>
+              <w:bottom w:val="single" w:color="C9CED2" w:sz="4"/>
+              <w:right w:val="single" w:color="C9CED2" w:sz="4"/>
+            </w:tcBorders>
+            <w:shd w:fill="F7F5F1" w:color="auto" w:val="clear"/>
+            <w:tcMar>
+              <w:top w:type="dxa" w:w="60"/>
+              <w:left w:type="dxa" w:w="90"/>
+              <w:bottom w:type="dxa" w:w="60"/>
+              <w:right w:type="dxa" w:w="90"/>
+            </w:tcMar>
+          </w:tcPr>
+          <w:p>
+            <w:pPr>
+              <w:spacing w:after="0" w:line="252"/>
+            </w:pPr>
+            <w:r>
+              <w:rPr>
+                <w:b w:val="false"/>
+                <w:bCs w:val="false"/>
+                <w:color w:val="1E2A32"/>
+                <w:sz w:val="17"/>
+                <w:szCs w:val="17"/>
+              </w:rPr>
+              <w:t xml:space="preserve">Customers' own days</w:t>
+            </w:r>
+          </w:p>
+        </w:tc>
+        <w:tc>
+          <w:tcPr>
+            <w:tcW w:type="dxa" w:w="2024"/>
+            <w:tcBorders>
+              <w:top w:val="single" w:color="C9CED2" w:sz="4"/>
+              <w:left w:val="single" w:color="C9CED2" w:sz="4"/>
+              <w:bottom w:val="single" w:color="C9CED2" w:sz="4"/>
+              <w:right w:val="single" w:color="C9CED2" w:sz="4"/>
+            </w:tcBorders>
+            <w:shd w:fill="F7F5F1" w:color="auto" w:val="clear"/>
+            <w:tcMar>
+              <w:top w:type="dxa" w:w="60"/>
+              <w:left w:type="dxa" w:w="90"/>
+              <w:bottom w:type="dxa" w:w="60"/>
+              <w:right w:type="dxa" w:w="90"/>
+            </w:tcMar>
+          </w:tcPr>
+          <w:p>
+            <w:pPr>
+              <w:spacing w:after="0" w:line="252"/>
+            </w:pPr>
+            <w:r>
+              <w:rPr>
+                <w:b w:val="false"/>
+                <w:bCs w:val="false"/>
+                <w:color w:val="1E2A32"/>
+                <w:sz w:val="17"/>
+                <w:szCs w:val="17"/>
+              </w:rPr>
+              <w:t xml:space="preserve">Next customer's discovery</w:t>
             </w:r>
           </w:p>
         </w:tc>
@@ -3487,7 +4899,23 @@
           <w:sz w:val="19"/>
           <w:szCs w:val="19"/>
         </w:rPr>
-        <w:t xml:space="preserve">Elements from Belch and Belch (2021).</w:t>
+        <w:t xml:space="preserve">Every touchpoint carries the logo, palette and sign-off. Mock-ups: Figure 7 and Appendix I.</w:t>
+      </w:r>
+    </w:p>
+    <w:p>
+      <w:pPr>
+        <w:pStyle w:val="Heading1"/>
+      </w:pPr>
+      <w:r>
+        <w:t xml:space="preserve">4. Creative Strategy</w:t>
+      </w:r>
+    </w:p>
+    <w:p>
+      <w:pPr>
+        <w:pStyle w:val="Heading2"/>
+      </w:pPr>
+      <w:r>
+        <w:t xml:space="preserve">4.1 Creative Brief and Concept</w:t>
       </w:r>
     </w:p>
     <w:p>
@@ -3502,7 +4930,7 @@
         <w:t xml:space="preserve">One Set, One Day</w:t>
       </w:r>
       <w:r>
-        <w:t xml:space="preserve"> follows a single Alo set through a real Sydney day. The lead creator, Bernadette Sukkar of Body by Berner in Bondi, combines Pilates expertise with a fashion-PR background, matching both halves of the message (RIISE, 2026). Her studio hosts the first </w:t>
+        <w:t xml:space="preserve"> follows a single Alo set through a real Sydney day (creative brief in Appendix F). The lead creator, Bernadette Sukkar of Body by Berner in Bondi, combines Pilates expertise with a fashion-PR background, matching both halves of the message (RIISE, 2026). Her studio hosts the first </w:t>
       </w:r>
       <w:r>
         <w:rPr>
@@ -3512,7 +4940,7 @@
         <w:t xml:space="preserve">Sanctuary Sessions</w:t>
       </w:r>
       <w:r>
-        <w:t xml:space="preserve">: a class, a fabric trial and styling advice, followed by a complimentary styling appointment rather than a discount. Memorable experiences create value that advertising alone cannot (Pine &amp; Gilmore, 1998), and there is precedent: Alo already presents its Chatswood store as a wellness sanctuary (RetailBoss, 2026), Lululemon built community through events such as its Sweatlife festival (lululemon athletica, 2018), and Gymshark's community pop-ups drew crowds before it had local stores (blogTO, 2018). The sessions add something Lululemon's run clubs do not: the community continues into the "moment" after class, which is the half of the proposition Lululemon does not own.</w:t>
+        <w:t xml:space="preserve">: a class, a fabric trial and styling advice, followed by a complimentary styling appointment rather than a discount. Memorable experiences create value that advertising alone cannot (Pine &amp; Gilmore, 1998), and there is precedent: Alo already presents its Chatswood store as a wellness sanctuary (RetailBoss, 2026), Lululemon built community through events such as its Sweatlife festival (lululemon athletica, 2018), and Gymshark's community pop-ups drew crowds before it had local stores (blogTO, 2018). Unlike Lululemon's run clubs, the community continues into the "moment" after class.</w:t>
       </w:r>
     </w:p>
     <w:p>
@@ -3538,7 +4966,7 @@
         <w:t xml:space="preserve">is</w:t>
       </w:r>
       <w:r>
-        <w:t xml:space="preserve"> the positioning (Smith &amp; Yang, 2004). On Smith et al.'s (2007) divergence dimensions, it scores on originality, synthesis and flexibility (Appendix F). The risk is that divergent work is remembered without the brand, so the logo, palette and "Mat to Moment" sign-off appear in every execution. The lead appeals are aspirational and social approval (Belch &amp; Belch, 2021). Social approval is the riskiest choice here, because visibility drives appearance pressure (Camacho-Miñano et al., 2019), and exploiting that insecurity would cross from persuasion into manipulation. Executions therefore show diverse bodies and use no retouching. A rational appeal reframes price as cost per wear, presenting value as longevity rather than low price. Slice-of-life storytelling carries the emotion, and demonstration carries the proof.</w:t>
+        <w:t xml:space="preserve"> the positioning (Smith &amp; Yang, 2004). On Smith et al.'s (2007) divergence dimensions, it scores on originality, synthesis and flexibility (Appendix G). The risk is that divergent work is remembered without the brand, so the logo, palette and "Mat to Moment" sign-off appear in every execution. The lead appeals are aspirational and social approval (Belch &amp; Belch, 2021). Social approval is the riskiest choice here, because visibility drives appearance pressure (Camacho-Miñano et al., 2019), and exploiting that insecurity would cross from persuasion into manipulation. Executions therefore show diverse bodies and use no retouching. A rational appeal reframes price as cost per wear, presenting value as longevity rather than low price. Slice-of-life storytelling carries the emotion, and demonstration carries the proof.</w:t>
       </w:r>
     </w:p>
     <w:p>
@@ -3554,7 +4982,7 @@
         <w:spacing w:after="160" w:line="288"/>
       </w:pPr>
       <w:r>
-        <w:t xml:space="preserve">In Appendix G, each channel adapts the hook and call to action to suit its medium, but all share one story and one sign-off, which gives consistent meaning without identical executions (Batra &amp; Keller, 2016). Because IMC builds recall through repetition and consistency (Keller, 2001), a viewer who hears the audio, passes a bus shelter and then sees a creator's post meets one idea three times, not three different ideas once. Claims must be substantiated under the Australian Consumer Law, as Lorna Jane's A$5 million penalty shows (ACCC, 2021), and creator posts must be clearly identifiable as advertising (Australian Association of National Advertisers [AANA], 2021). The music also needs sync licences.</w:t>
+        <w:t xml:space="preserve">Each channel adapts the hook and call to action to its medium (Appendix H) but shares one story and sign-off: consistent meaning without identical executions (Batra &amp; Keller, 2016). Because IMC builds recall through repetition and consistency (Keller, 2001), a viewer who hears the audio, passes a bus shelter and then sees a creator's post meets one idea three times, not three different ideas once. Claims must be substantiated, as Lorna Jane's A$5 million penalty shows (ACCC, 2021), creator posts must be labelled as advertising (Australian Association of National Advertisers [AANA], 2021), and music needs sync licences.</w:t>
       </w:r>
     </w:p>
     <w:p>
@@ -3570,7 +4998,7 @@
         <w:spacing w:after="160" w:line="288"/>
       </w:pPr>
       <w:r>
-        <w:t xml:space="preserve">Appendix H holds draft materials for every other element of the mix; Figure 7 shows the outdoor panel. All share one set, one day and one sign-off; only the call to action shifts by journey stage.</w:t>
+        <w:t xml:space="preserve">Appendix I holds draft materials for the other touchpoints in Table 3, including in-store; Figure 7 shows the outdoor panel.</w:t>
       </w:r>
     </w:p>
     <w:p>
@@ -3666,7 +5094,7 @@
           <w:sz w:val="19"/>
           <w:szCs w:val="19"/>
         </w:rPr>
-        <w:t xml:space="preserve">Draft mock-up; colour blocks stand in for campaign photography.</w:t>
+        <w:t xml:space="preserve">Draft mock-up; photography placeholders.</w:t>
       </w:r>
     </w:p>
     <w:p>
@@ -3712,1005 +5140,8 @@
         <w:t xml:space="preserve">Made for Sydney's day</w:t>
       </w:r>
       <w:r>
-        <w:t xml:space="preserve">. The media objective is to reach 70% of Segment A at least once in Burst 1, at an average frequency of four, and to retarget 20% of those exposed in Burst 3. Geographic coverage is Greater Sydney, weighted to the catchments around Chatswood Chase, The Galeries and Bondi Junction. Vehicles are Instagram Reels and Stories, TikTok in-feed ads with boosted creator posts, Spotify audio ads, and bus-side panels on routes serving the three stores. Television and print were excluded as unaffordable at useful frequency and less efficient for this audience. Filmed sessions and styling guides form the content-marketing layer on owned channels. Outdoor has low audience selectivity (Belch &amp; Belch, 2021), so it carries only the store line, near the stores. Spotify reaches commuting and workout moments but cannot show the set, so it uses sound cues. Retargeting then follows anyone exposed, and it works best once consumers have formed preferences (Lambrecht &amp; Tucker, 2013). Publicity depends on newsworthiness (Belch &amp; Belch, 2021), and a branded class is not news, so the hook is a free Bondi-to-Bronte walk series. Sessions also act as a free trial, which reduces purchase risk without a price cut (Belch &amp; Belch, 2021).</w:t>
-      </w:r>
-    </w:p>
-    <w:p>
-      <w:pPr>
-        <w:keepNext/>
-        <w:spacing w:after="40" w:before="200"/>
-      </w:pPr>
-      <w:r>
-        <w:rPr>
-          <w:b/>
-          <w:bCs/>
-        </w:rPr>
-        <w:t xml:space="preserve">Table 4</w:t>
-      </w:r>
-    </w:p>
-    <w:p>
-      <w:pPr>
-        <w:keepNext/>
-        <w:spacing w:after="100"/>
-      </w:pPr>
-      <w:r>
-        <w:rPr>
-          <w:i/>
-          <w:iCs/>
-        </w:rPr>
-        <w:t xml:space="preserve">Media Mix</w:t>
-      </w:r>
-    </w:p>
-    <w:tbl>
-      <w:tblPr>
-        <w:tblW w:type="dxa" w:w="9638"/>
-        <w:tblBorders>
-          <w:top w:val="single" w:color="auto" w:sz="4"/>
-          <w:left w:val="single" w:color="auto" w:sz="4"/>
-          <w:bottom w:val="single" w:color="auto" w:sz="4"/>
-          <w:right w:val="single" w:color="auto" w:sz="4"/>
-          <w:insideH w:val="single" w:color="auto" w:sz="4"/>
-          <w:insideV w:val="single" w:color="auto" w:sz="4"/>
-        </w:tblBorders>
-      </w:tblPr>
-      <w:tblGrid>
-        <w:gridCol w:w="2891"/>
-        <w:gridCol w:w="2313"/>
-        <w:gridCol w:w="1542"/>
-        <w:gridCol w:w="2892"/>
-      </w:tblGrid>
-      <w:tr>
-        <w:trPr>
-          <w:tblHeader/>
-        </w:trPr>
-        <w:tc>
-          <w:tcPr>
-            <w:tcW w:type="dxa" w:w="2891"/>
-            <w:tcBorders>
-              <w:top w:val="single" w:color="C9CED2" w:sz="4"/>
-              <w:left w:val="single" w:color="C9CED2" w:sz="4"/>
-              <w:bottom w:val="single" w:color="C9CED2" w:sz="4"/>
-              <w:right w:val="single" w:color="C9CED2" w:sz="4"/>
-            </w:tcBorders>
-            <w:shd w:fill="1E2A32" w:color="auto" w:val="clear"/>
-            <w:tcMar>
-              <w:top w:type="dxa" w:w="60"/>
-              <w:left w:type="dxa" w:w="90"/>
-              <w:bottom w:type="dxa" w:w="60"/>
-              <w:right w:type="dxa" w:w="90"/>
-            </w:tcMar>
-          </w:tcPr>
-          <w:p>
-            <w:pPr>
-              <w:spacing w:after="0" w:line="252"/>
-            </w:pPr>
-            <w:r>
-              <w:rPr>
-                <w:b/>
-                <w:bCs/>
-                <w:color w:val="FFFFFF"/>
-                <w:sz w:val="17"/>
-                <w:szCs w:val="17"/>
-              </w:rPr>
-              <w:t xml:space="preserve">Vehicle</w:t>
-            </w:r>
-          </w:p>
-        </w:tc>
-        <w:tc>
-          <w:tcPr>
-            <w:tcW w:type="dxa" w:w="2313"/>
-            <w:tcBorders>
-              <w:top w:val="single" w:color="C9CED2" w:sz="4"/>
-              <w:left w:val="single" w:color="C9CED2" w:sz="4"/>
-              <w:bottom w:val="single" w:color="C9CED2" w:sz="4"/>
-              <w:right w:val="single" w:color="C9CED2" w:sz="4"/>
-            </w:tcBorders>
-            <w:shd w:fill="1E2A32" w:color="auto" w:val="clear"/>
-            <w:tcMar>
-              <w:top w:type="dxa" w:w="60"/>
-              <w:left w:type="dxa" w:w="90"/>
-              <w:bottom w:type="dxa" w:w="60"/>
-              <w:right w:type="dxa" w:w="90"/>
-            </w:tcMar>
-          </w:tcPr>
-          <w:p>
-            <w:pPr>
-              <w:spacing w:after="0" w:line="252"/>
-            </w:pPr>
-            <w:r>
-              <w:rPr>
-                <w:b/>
-                <w:bCs/>
-                <w:color w:val="FFFFFF"/>
-                <w:sz w:val="17"/>
-                <w:szCs w:val="17"/>
-              </w:rPr>
-              <w:t xml:space="preserve">Pillar</w:t>
-            </w:r>
-          </w:p>
-        </w:tc>
-        <w:tc>
-          <w:tcPr>
-            <w:tcW w:type="dxa" w:w="1542"/>
-            <w:tcBorders>
-              <w:top w:val="single" w:color="C9CED2" w:sz="4"/>
-              <w:left w:val="single" w:color="C9CED2" w:sz="4"/>
-              <w:bottom w:val="single" w:color="C9CED2" w:sz="4"/>
-              <w:right w:val="single" w:color="C9CED2" w:sz="4"/>
-            </w:tcBorders>
-            <w:shd w:fill="1E2A32" w:color="auto" w:val="clear"/>
-            <w:tcMar>
-              <w:top w:type="dxa" w:w="60"/>
-              <w:left w:type="dxa" w:w="90"/>
-              <w:bottom w:type="dxa" w:w="60"/>
-              <w:right w:type="dxa" w:w="90"/>
-            </w:tcMar>
-          </w:tcPr>
-          <w:p>
-            <w:pPr>
-              <w:spacing w:after="0" w:line="252"/>
-            </w:pPr>
-            <w:r>
-              <w:rPr>
-                <w:b/>
-                <w:bCs/>
-                <w:color w:val="FFFFFF"/>
-                <w:sz w:val="17"/>
-                <w:szCs w:val="17"/>
-              </w:rPr>
-              <w:t xml:space="preserve">Type</w:t>
-            </w:r>
-          </w:p>
-        </w:tc>
-        <w:tc>
-          <w:tcPr>
-            <w:tcW w:type="dxa" w:w="2892"/>
-            <w:tcBorders>
-              <w:top w:val="single" w:color="C9CED2" w:sz="4"/>
-              <w:left w:val="single" w:color="C9CED2" w:sz="4"/>
-              <w:bottom w:val="single" w:color="C9CED2" w:sz="4"/>
-              <w:right w:val="single" w:color="C9CED2" w:sz="4"/>
-            </w:tcBorders>
-            <w:shd w:fill="1E2A32" w:color="auto" w:val="clear"/>
-            <w:tcMar>
-              <w:top w:type="dxa" w:w="60"/>
-              <w:left w:type="dxa" w:w="90"/>
-              <w:bottom w:type="dxa" w:w="60"/>
-              <w:right w:type="dxa" w:w="90"/>
-            </w:tcMar>
-          </w:tcPr>
-          <w:p>
-            <w:pPr>
-              <w:spacing w:after="0" w:line="252"/>
-            </w:pPr>
-            <w:r>
-              <w:rPr>
-                <w:b/>
-                <w:bCs/>
-                <w:color w:val="FFFFFF"/>
-                <w:sz w:val="17"/>
-                <w:szCs w:val="17"/>
-              </w:rPr>
-              <w:t xml:space="preserve">Role</w:t>
-            </w:r>
-          </w:p>
-        </w:tc>
-      </w:tr>
-      <w:tr>
-        <w:trPr>
-          <w:cantSplit/>
-        </w:trPr>
-        <w:tc>
-          <w:tcPr>
-            <w:tcW w:type="dxa" w:w="2891"/>
-            <w:tcBorders>
-              <w:top w:val="single" w:color="C9CED2" w:sz="4"/>
-              <w:left w:val="single" w:color="C9CED2" w:sz="4"/>
-              <w:bottom w:val="single" w:color="C9CED2" w:sz="4"/>
-              <w:right w:val="single" w:color="C9CED2" w:sz="4"/>
-            </w:tcBorders>
-            <w:tcMar>
-              <w:top w:type="dxa" w:w="60"/>
-              <w:left w:type="dxa" w:w="90"/>
-              <w:bottom w:type="dxa" w:w="60"/>
-              <w:right w:type="dxa" w:w="90"/>
-            </w:tcMar>
-          </w:tcPr>
-          <w:p>
-            <w:pPr>
-              <w:spacing w:after="0" w:line="252"/>
-            </w:pPr>
-            <w:r>
-              <w:rPr>
-                <w:b/>
-                <w:bCs/>
-                <w:color w:val="1E2A32"/>
-                <w:sz w:val="17"/>
-                <w:szCs w:val="17"/>
-              </w:rPr>
-              <w:t xml:space="preserve">Outdoor near stores</w:t>
-            </w:r>
-          </w:p>
-        </w:tc>
-        <w:tc>
-          <w:tcPr>
-            <w:tcW w:type="dxa" w:w="2313"/>
-            <w:tcBorders>
-              <w:top w:val="single" w:color="C9CED2" w:sz="4"/>
-              <w:left w:val="single" w:color="C9CED2" w:sz="4"/>
-              <w:bottom w:val="single" w:color="C9CED2" w:sz="4"/>
-              <w:right w:val="single" w:color="C9CED2" w:sz="4"/>
-            </w:tcBorders>
-            <w:tcMar>
-              <w:top w:type="dxa" w:w="60"/>
-              <w:left w:type="dxa" w:w="90"/>
-              <w:bottom w:type="dxa" w:w="60"/>
-              <w:right w:type="dxa" w:w="90"/>
-            </w:tcMar>
-          </w:tcPr>
-          <w:p>
-            <w:pPr>
-              <w:spacing w:after="0" w:line="252"/>
-            </w:pPr>
-            <w:r>
-              <w:rPr>
-                <w:b w:val="false"/>
-                <w:bCs w:val="false"/>
-                <w:color w:val="1E2A32"/>
-                <w:sz w:val="17"/>
-                <w:szCs w:val="17"/>
-              </w:rPr>
-              <w:t xml:space="preserve">Find us</w:t>
-            </w:r>
-          </w:p>
-        </w:tc>
-        <w:tc>
-          <w:tcPr>
-            <w:tcW w:type="dxa" w:w="1542"/>
-            <w:tcBorders>
-              <w:top w:val="single" w:color="C9CED2" w:sz="4"/>
-              <w:left w:val="single" w:color="C9CED2" w:sz="4"/>
-              <w:bottom w:val="single" w:color="C9CED2" w:sz="4"/>
-              <w:right w:val="single" w:color="C9CED2" w:sz="4"/>
-            </w:tcBorders>
-            <w:tcMar>
-              <w:top w:type="dxa" w:w="60"/>
-              <w:left w:type="dxa" w:w="90"/>
-              <w:bottom w:type="dxa" w:w="60"/>
-              <w:right w:type="dxa" w:w="90"/>
-            </w:tcMar>
-          </w:tcPr>
-          <w:p>
-            <w:pPr>
-              <w:spacing w:after="0" w:line="252"/>
-            </w:pPr>
-            <w:r>
-              <w:rPr>
-                <w:b w:val="false"/>
-                <w:bCs w:val="false"/>
-                <w:color w:val="1E2A32"/>
-                <w:sz w:val="17"/>
-                <w:szCs w:val="17"/>
-              </w:rPr>
-              <w:t xml:space="preserve">Paid</w:t>
-            </w:r>
-          </w:p>
-        </w:tc>
-        <w:tc>
-          <w:tcPr>
-            <w:tcW w:type="dxa" w:w="2892"/>
-            <w:tcBorders>
-              <w:top w:val="single" w:color="C9CED2" w:sz="4"/>
-              <w:left w:val="single" w:color="C9CED2" w:sz="4"/>
-              <w:bottom w:val="single" w:color="C9CED2" w:sz="4"/>
-              <w:right w:val="single" w:color="C9CED2" w:sz="4"/>
-            </w:tcBorders>
-            <w:tcMar>
-              <w:top w:type="dxa" w:w="60"/>
-              <w:left w:type="dxa" w:w="90"/>
-              <w:bottom w:type="dxa" w:w="60"/>
-              <w:right w:type="dxa" w:w="90"/>
-            </w:tcMar>
-          </w:tcPr>
-          <w:p>
-            <w:pPr>
-              <w:spacing w:after="0" w:line="252"/>
-            </w:pPr>
-            <w:r>
-              <w:rPr>
-                <w:b w:val="false"/>
-                <w:bCs w:val="false"/>
-                <w:color w:val="1E2A32"/>
-                <w:sz w:val="17"/>
-                <w:szCs w:val="17"/>
-              </w:rPr>
-              <w:t xml:space="preserve">Reach, store cue</w:t>
-            </w:r>
-          </w:p>
-        </w:tc>
-      </w:tr>
-      <w:tr>
-        <w:trPr>
-          <w:cantSplit/>
-        </w:trPr>
-        <w:tc>
-          <w:tcPr>
-            <w:tcW w:type="dxa" w:w="2891"/>
-            <w:tcBorders>
-              <w:top w:val="single" w:color="C9CED2" w:sz="4"/>
-              <w:left w:val="single" w:color="C9CED2" w:sz="4"/>
-              <w:bottom w:val="single" w:color="C9CED2" w:sz="4"/>
-              <w:right w:val="single" w:color="C9CED2" w:sz="4"/>
-            </w:tcBorders>
-            <w:shd w:fill="F7F5F1" w:color="auto" w:val="clear"/>
-            <w:tcMar>
-              <w:top w:type="dxa" w:w="60"/>
-              <w:left w:type="dxa" w:w="90"/>
-              <w:bottom w:type="dxa" w:w="60"/>
-              <w:right w:type="dxa" w:w="90"/>
-            </w:tcMar>
-          </w:tcPr>
-          <w:p>
-            <w:pPr>
-              <w:spacing w:after="0" w:line="252"/>
-            </w:pPr>
-            <w:r>
-              <w:rPr>
-                <w:b/>
-                <w:bCs/>
-                <w:color w:val="1E2A32"/>
-                <w:sz w:val="17"/>
-                <w:szCs w:val="17"/>
-              </w:rPr>
-              <w:t xml:space="preserve">Spotify audio</w:t>
-            </w:r>
-          </w:p>
-        </w:tc>
-        <w:tc>
-          <w:tcPr>
-            <w:tcW w:type="dxa" w:w="2313"/>
-            <w:tcBorders>
-              <w:top w:val="single" w:color="C9CED2" w:sz="4"/>
-              <w:left w:val="single" w:color="C9CED2" w:sz="4"/>
-              <w:bottom w:val="single" w:color="C9CED2" w:sz="4"/>
-              <w:right w:val="single" w:color="C9CED2" w:sz="4"/>
-            </w:tcBorders>
-            <w:shd w:fill="F7F5F1" w:color="auto" w:val="clear"/>
-            <w:tcMar>
-              <w:top w:type="dxa" w:w="60"/>
-              <w:left w:type="dxa" w:w="90"/>
-              <w:bottom w:type="dxa" w:w="60"/>
-              <w:right w:type="dxa" w:w="90"/>
-            </w:tcMar>
-          </w:tcPr>
-          <w:p>
-            <w:pPr>
-              <w:spacing w:after="0" w:line="252"/>
-            </w:pPr>
-            <w:r>
-              <w:rPr>
-                <w:b w:val="false"/>
-                <w:bCs w:val="false"/>
-                <w:color w:val="1E2A32"/>
-                <w:sz w:val="17"/>
-                <w:szCs w:val="17"/>
-              </w:rPr>
-              <w:t xml:space="preserve">Sydney's day</w:t>
-            </w:r>
-          </w:p>
-        </w:tc>
-        <w:tc>
-          <w:tcPr>
-            <w:tcW w:type="dxa" w:w="1542"/>
-            <w:tcBorders>
-              <w:top w:val="single" w:color="C9CED2" w:sz="4"/>
-              <w:left w:val="single" w:color="C9CED2" w:sz="4"/>
-              <w:bottom w:val="single" w:color="C9CED2" w:sz="4"/>
-              <w:right w:val="single" w:color="C9CED2" w:sz="4"/>
-            </w:tcBorders>
-            <w:shd w:fill="F7F5F1" w:color="auto" w:val="clear"/>
-            <w:tcMar>
-              <w:top w:type="dxa" w:w="60"/>
-              <w:left w:type="dxa" w:w="90"/>
-              <w:bottom w:type="dxa" w:w="60"/>
-              <w:right w:type="dxa" w:w="90"/>
-            </w:tcMar>
-          </w:tcPr>
-          <w:p>
-            <w:pPr>
-              <w:spacing w:after="0" w:line="252"/>
-            </w:pPr>
-            <w:r>
-              <w:rPr>
-                <w:b w:val="false"/>
-                <w:bCs w:val="false"/>
-                <w:color w:val="1E2A32"/>
-                <w:sz w:val="17"/>
-                <w:szCs w:val="17"/>
-              </w:rPr>
-              <w:t xml:space="preserve">Paid</w:t>
-            </w:r>
-          </w:p>
-        </w:tc>
-        <w:tc>
-          <w:tcPr>
-            <w:tcW w:type="dxa" w:w="2892"/>
-            <w:tcBorders>
-              <w:top w:val="single" w:color="C9CED2" w:sz="4"/>
-              <w:left w:val="single" w:color="C9CED2" w:sz="4"/>
-              <w:bottom w:val="single" w:color="C9CED2" w:sz="4"/>
-              <w:right w:val="single" w:color="C9CED2" w:sz="4"/>
-            </w:tcBorders>
-            <w:shd w:fill="F7F5F1" w:color="auto" w:val="clear"/>
-            <w:tcMar>
-              <w:top w:type="dxa" w:w="60"/>
-              <w:left w:type="dxa" w:w="90"/>
-              <w:bottom w:type="dxa" w:w="60"/>
-              <w:right w:type="dxa" w:w="90"/>
-            </w:tcMar>
-          </w:tcPr>
-          <w:p>
-            <w:pPr>
-              <w:spacing w:after="0" w:line="252"/>
-            </w:pPr>
-            <w:r>
-              <w:rPr>
-                <w:b w:val="false"/>
-                <w:bCs w:val="false"/>
-                <w:color w:val="1E2A32"/>
-                <w:sz w:val="17"/>
-                <w:szCs w:val="17"/>
-              </w:rPr>
-              <w:t xml:space="preserve">Reach</w:t>
-            </w:r>
-          </w:p>
-        </w:tc>
-      </w:tr>
-      <w:tr>
-        <w:trPr>
-          <w:cantSplit/>
-        </w:trPr>
-        <w:tc>
-          <w:tcPr>
-            <w:tcW w:type="dxa" w:w="2891"/>
-            <w:tcBorders>
-              <w:top w:val="single" w:color="C9CED2" w:sz="4"/>
-              <w:left w:val="single" w:color="C9CED2" w:sz="4"/>
-              <w:bottom w:val="single" w:color="C9CED2" w:sz="4"/>
-              <w:right w:val="single" w:color="C9CED2" w:sz="4"/>
-            </w:tcBorders>
-            <w:tcMar>
-              <w:top w:type="dxa" w:w="60"/>
-              <w:left w:type="dxa" w:w="90"/>
-              <w:bottom w:type="dxa" w:w="60"/>
-              <w:right w:type="dxa" w:w="90"/>
-            </w:tcMar>
-          </w:tcPr>
-          <w:p>
-            <w:pPr>
-              <w:spacing w:after="0" w:line="252"/>
-            </w:pPr>
-            <w:r>
-              <w:rPr>
-                <w:b/>
-                <w:bCs/>
-                <w:color w:val="1E2A32"/>
-                <w:sz w:val="17"/>
-                <w:szCs w:val="17"/>
-              </w:rPr>
-              <w:t xml:space="preserve">Paid social, retargeting</w:t>
-            </w:r>
-          </w:p>
-        </w:tc>
-        <w:tc>
-          <w:tcPr>
-            <w:tcW w:type="dxa" w:w="2313"/>
-            <w:tcBorders>
-              <w:top w:val="single" w:color="C9CED2" w:sz="4"/>
-              <w:left w:val="single" w:color="C9CED2" w:sz="4"/>
-              <w:bottom w:val="single" w:color="C9CED2" w:sz="4"/>
-              <w:right w:val="single" w:color="C9CED2" w:sz="4"/>
-            </w:tcBorders>
-            <w:tcMar>
-              <w:top w:type="dxa" w:w="60"/>
-              <w:left w:type="dxa" w:w="90"/>
-              <w:bottom w:type="dxa" w:w="60"/>
-              <w:right w:type="dxa" w:w="90"/>
-            </w:tcMar>
-          </w:tcPr>
-          <w:p>
-            <w:pPr>
-              <w:spacing w:after="0" w:line="252"/>
-            </w:pPr>
-            <w:r>
-              <w:rPr>
-                <w:b w:val="false"/>
-                <w:bCs w:val="false"/>
-                <w:color w:val="1E2A32"/>
-                <w:sz w:val="17"/>
-                <w:szCs w:val="17"/>
-              </w:rPr>
-              <w:t xml:space="preserve">All</w:t>
-            </w:r>
-          </w:p>
-        </w:tc>
-        <w:tc>
-          <w:tcPr>
-            <w:tcW w:type="dxa" w:w="1542"/>
-            <w:tcBorders>
-              <w:top w:val="single" w:color="C9CED2" w:sz="4"/>
-              <w:left w:val="single" w:color="C9CED2" w:sz="4"/>
-              <w:bottom w:val="single" w:color="C9CED2" w:sz="4"/>
-              <w:right w:val="single" w:color="C9CED2" w:sz="4"/>
-            </w:tcBorders>
-            <w:tcMar>
-              <w:top w:type="dxa" w:w="60"/>
-              <w:left w:type="dxa" w:w="90"/>
-              <w:bottom w:type="dxa" w:w="60"/>
-              <w:right w:type="dxa" w:w="90"/>
-            </w:tcMar>
-          </w:tcPr>
-          <w:p>
-            <w:pPr>
-              <w:spacing w:after="0" w:line="252"/>
-            </w:pPr>
-            <w:r>
-              <w:rPr>
-                <w:b w:val="false"/>
-                <w:bCs w:val="false"/>
-                <w:color w:val="1E2A32"/>
-                <w:sz w:val="17"/>
-                <w:szCs w:val="17"/>
-              </w:rPr>
-              <w:t xml:space="preserve">Paid</w:t>
-            </w:r>
-          </w:p>
-        </w:tc>
-        <w:tc>
-          <w:tcPr>
-            <w:tcW w:type="dxa" w:w="2892"/>
-            <w:tcBorders>
-              <w:top w:val="single" w:color="C9CED2" w:sz="4"/>
-              <w:left w:val="single" w:color="C9CED2" w:sz="4"/>
-              <w:bottom w:val="single" w:color="C9CED2" w:sz="4"/>
-              <w:right w:val="single" w:color="C9CED2" w:sz="4"/>
-            </w:tcBorders>
-            <w:tcMar>
-              <w:top w:type="dxa" w:w="60"/>
-              <w:left w:type="dxa" w:w="90"/>
-              <w:bottom w:type="dxa" w:w="60"/>
-              <w:right w:type="dxa" w:w="90"/>
-            </w:tcMar>
-          </w:tcPr>
-          <w:p>
-            <w:pPr>
-              <w:spacing w:after="0" w:line="252"/>
-            </w:pPr>
-            <w:r>
-              <w:rPr>
-                <w:b w:val="false"/>
-                <w:bCs w:val="false"/>
-                <w:color w:val="1E2A32"/>
-                <w:sz w:val="17"/>
-                <w:szCs w:val="17"/>
-              </w:rPr>
-              <w:t xml:space="preserve">Reach, then frequency</w:t>
-            </w:r>
-          </w:p>
-        </w:tc>
-      </w:tr>
-      <w:tr>
-        <w:trPr>
-          <w:cantSplit/>
-        </w:trPr>
-        <w:tc>
-          <w:tcPr>
-            <w:tcW w:type="dxa" w:w="2891"/>
-            <w:tcBorders>
-              <w:top w:val="single" w:color="C9CED2" w:sz="4"/>
-              <w:left w:val="single" w:color="C9CED2" w:sz="4"/>
-              <w:bottom w:val="single" w:color="C9CED2" w:sz="4"/>
-              <w:right w:val="single" w:color="C9CED2" w:sz="4"/>
-            </w:tcBorders>
-            <w:shd w:fill="F7F5F1" w:color="auto" w:val="clear"/>
-            <w:tcMar>
-              <w:top w:type="dxa" w:w="60"/>
-              <w:left w:type="dxa" w:w="90"/>
-              <w:bottom w:type="dxa" w:w="60"/>
-              <w:right w:type="dxa" w:w="90"/>
-            </w:tcMar>
-          </w:tcPr>
-          <w:p>
-            <w:pPr>
-              <w:spacing w:after="0" w:line="252"/>
-            </w:pPr>
-            <w:r>
-              <w:rPr>
-                <w:b/>
-                <w:bCs/>
-                <w:color w:val="1E2A32"/>
-                <w:sz w:val="17"/>
-                <w:szCs w:val="17"/>
-              </w:rPr>
-              <w:t xml:space="preserve">Creators</w:t>
-            </w:r>
-          </w:p>
-        </w:tc>
-        <w:tc>
-          <w:tcPr>
-            <w:tcW w:type="dxa" w:w="2313"/>
-            <w:tcBorders>
-              <w:top w:val="single" w:color="C9CED2" w:sz="4"/>
-              <w:left w:val="single" w:color="C9CED2" w:sz="4"/>
-              <w:bottom w:val="single" w:color="C9CED2" w:sz="4"/>
-              <w:right w:val="single" w:color="C9CED2" w:sz="4"/>
-            </w:tcBorders>
-            <w:shd w:fill="F7F5F1" w:color="auto" w:val="clear"/>
-            <w:tcMar>
-              <w:top w:type="dxa" w:w="60"/>
-              <w:left w:type="dxa" w:w="90"/>
-              <w:bottom w:type="dxa" w:w="60"/>
-              <w:right w:type="dxa" w:w="90"/>
-            </w:tcMar>
-          </w:tcPr>
-          <w:p>
-            <w:pPr>
-              <w:spacing w:after="0" w:line="252"/>
-            </w:pPr>
-            <w:r>
-              <w:rPr>
-                <w:b w:val="false"/>
-                <w:bCs w:val="false"/>
-                <w:color w:val="1E2A32"/>
-                <w:sz w:val="17"/>
-                <w:szCs w:val="17"/>
-              </w:rPr>
-              <w:t xml:space="preserve">Sydney's day</w:t>
-            </w:r>
-          </w:p>
-        </w:tc>
-        <w:tc>
-          <w:tcPr>
-            <w:tcW w:type="dxa" w:w="1542"/>
-            <w:tcBorders>
-              <w:top w:val="single" w:color="C9CED2" w:sz="4"/>
-              <w:left w:val="single" w:color="C9CED2" w:sz="4"/>
-              <w:bottom w:val="single" w:color="C9CED2" w:sz="4"/>
-              <w:right w:val="single" w:color="C9CED2" w:sz="4"/>
-            </w:tcBorders>
-            <w:shd w:fill="F7F5F1" w:color="auto" w:val="clear"/>
-            <w:tcMar>
-              <w:top w:type="dxa" w:w="60"/>
-              <w:left w:type="dxa" w:w="90"/>
-              <w:bottom w:type="dxa" w:w="60"/>
-              <w:right w:type="dxa" w:w="90"/>
-            </w:tcMar>
-          </w:tcPr>
-          <w:p>
-            <w:pPr>
-              <w:spacing w:after="0" w:line="252"/>
-            </w:pPr>
-            <w:r>
-              <w:rPr>
-                <w:b w:val="false"/>
-                <w:bCs w:val="false"/>
-                <w:color w:val="1E2A32"/>
-                <w:sz w:val="17"/>
-                <w:szCs w:val="17"/>
-              </w:rPr>
-              <w:t xml:space="preserve">Paid → earned</w:t>
-            </w:r>
-          </w:p>
-        </w:tc>
-        <w:tc>
-          <w:tcPr>
-            <w:tcW w:type="dxa" w:w="2892"/>
-            <w:tcBorders>
-              <w:top w:val="single" w:color="C9CED2" w:sz="4"/>
-              <w:left w:val="single" w:color="C9CED2" w:sz="4"/>
-              <w:bottom w:val="single" w:color="C9CED2" w:sz="4"/>
-              <w:right w:val="single" w:color="C9CED2" w:sz="4"/>
-            </w:tcBorders>
-            <w:shd w:fill="F7F5F1" w:color="auto" w:val="clear"/>
-            <w:tcMar>
-              <w:top w:type="dxa" w:w="60"/>
-              <w:left w:type="dxa" w:w="90"/>
-              <w:bottom w:type="dxa" w:w="60"/>
-              <w:right w:type="dxa" w:w="90"/>
-            </w:tcMar>
-          </w:tcPr>
-          <w:p>
-            <w:pPr>
-              <w:spacing w:after="0" w:line="252"/>
-            </w:pPr>
-            <w:r>
-              <w:rPr>
-                <w:b w:val="false"/>
-                <w:bCs w:val="false"/>
-                <w:color w:val="1E2A32"/>
-                <w:sz w:val="17"/>
-                <w:szCs w:val="17"/>
-              </w:rPr>
-              <w:t xml:space="preserve">Credibility</w:t>
-            </w:r>
-          </w:p>
-        </w:tc>
-      </w:tr>
-      <w:tr>
-        <w:trPr>
-          <w:cantSplit/>
-        </w:trPr>
-        <w:tc>
-          <w:tcPr>
-            <w:tcW w:type="dxa" w:w="2891"/>
-            <w:tcBorders>
-              <w:top w:val="single" w:color="C9CED2" w:sz="4"/>
-              <w:left w:val="single" w:color="C9CED2" w:sz="4"/>
-              <w:bottom w:val="single" w:color="C9CED2" w:sz="4"/>
-              <w:right w:val="single" w:color="C9CED2" w:sz="4"/>
-            </w:tcBorders>
-            <w:tcMar>
-              <w:top w:type="dxa" w:w="60"/>
-              <w:left w:type="dxa" w:w="90"/>
-              <w:bottom w:type="dxa" w:w="60"/>
-              <w:right w:type="dxa" w:w="90"/>
-            </w:tcMar>
-          </w:tcPr>
-          <w:p>
-            <w:pPr>
-              <w:spacing w:after="0" w:line="252"/>
-            </w:pPr>
-            <w:r>
-              <w:rPr>
-                <w:b/>
-                <w:bCs/>
-                <w:color w:val="1E2A32"/>
-                <w:sz w:val="17"/>
-                <w:szCs w:val="17"/>
-              </w:rPr>
-              <w:t xml:space="preserve">Sanctuary Sessions, PR</w:t>
-            </w:r>
-          </w:p>
-        </w:tc>
-        <w:tc>
-          <w:tcPr>
-            <w:tcW w:type="dxa" w:w="2313"/>
-            <w:tcBorders>
-              <w:top w:val="single" w:color="C9CED2" w:sz="4"/>
-              <w:left w:val="single" w:color="C9CED2" w:sz="4"/>
-              <w:bottom w:val="single" w:color="C9CED2" w:sz="4"/>
-              <w:right w:val="single" w:color="C9CED2" w:sz="4"/>
-            </w:tcBorders>
-            <w:tcMar>
-              <w:top w:type="dxa" w:w="60"/>
-              <w:left w:type="dxa" w:w="90"/>
-              <w:bottom w:type="dxa" w:w="60"/>
-              <w:right w:type="dxa" w:w="90"/>
-            </w:tcMar>
-          </w:tcPr>
-          <w:p>
-            <w:pPr>
-              <w:spacing w:after="0" w:line="252"/>
-            </w:pPr>
-            <w:r>
-              <w:rPr>
-                <w:b w:val="false"/>
-                <w:bCs w:val="false"/>
-                <w:color w:val="1E2A32"/>
-                <w:sz w:val="17"/>
-                <w:szCs w:val="17"/>
-              </w:rPr>
-              <w:t xml:space="preserve">Worth it</w:t>
-            </w:r>
-          </w:p>
-        </w:tc>
-        <w:tc>
-          <w:tcPr>
-            <w:tcW w:type="dxa" w:w="1542"/>
-            <w:tcBorders>
-              <w:top w:val="single" w:color="C9CED2" w:sz="4"/>
-              <w:left w:val="single" w:color="C9CED2" w:sz="4"/>
-              <w:bottom w:val="single" w:color="C9CED2" w:sz="4"/>
-              <w:right w:val="single" w:color="C9CED2" w:sz="4"/>
-            </w:tcBorders>
-            <w:tcMar>
-              <w:top w:type="dxa" w:w="60"/>
-              <w:left w:type="dxa" w:w="90"/>
-              <w:bottom w:type="dxa" w:w="60"/>
-              <w:right w:type="dxa" w:w="90"/>
-            </w:tcMar>
-          </w:tcPr>
-          <w:p>
-            <w:pPr>
-              <w:spacing w:after="0" w:line="252"/>
-            </w:pPr>
-            <w:r>
-              <w:rPr>
-                <w:b w:val="false"/>
-                <w:bCs w:val="false"/>
-                <w:color w:val="1E2A32"/>
-                <w:sz w:val="17"/>
-                <w:szCs w:val="17"/>
-              </w:rPr>
-              <w:t xml:space="preserve">Earned</w:t>
-            </w:r>
-          </w:p>
-        </w:tc>
-        <w:tc>
-          <w:tcPr>
-            <w:tcW w:type="dxa" w:w="2892"/>
-            <w:tcBorders>
-              <w:top w:val="single" w:color="C9CED2" w:sz="4"/>
-              <w:left w:val="single" w:color="C9CED2" w:sz="4"/>
-              <w:bottom w:val="single" w:color="C9CED2" w:sz="4"/>
-              <w:right w:val="single" w:color="C9CED2" w:sz="4"/>
-            </w:tcBorders>
-            <w:tcMar>
-              <w:top w:type="dxa" w:w="60"/>
-              <w:left w:type="dxa" w:w="90"/>
-              <w:bottom w:type="dxa" w:w="60"/>
-              <w:right w:type="dxa" w:w="90"/>
-            </w:tcMar>
-          </w:tcPr>
-          <w:p>
-            <w:pPr>
-              <w:spacing w:after="0" w:line="252"/>
-            </w:pPr>
-            <w:r>
-              <w:rPr>
-                <w:b w:val="false"/>
-                <w:bCs w:val="false"/>
-                <w:color w:val="1E2A32"/>
-                <w:sz w:val="17"/>
-                <w:szCs w:val="17"/>
-              </w:rPr>
-              <w:t xml:space="preserve">Trial, credibility</w:t>
-            </w:r>
-          </w:p>
-        </w:tc>
-      </w:tr>
-      <w:tr>
-        <w:trPr>
-          <w:cantSplit/>
-        </w:trPr>
-        <w:tc>
-          <w:tcPr>
-            <w:tcW w:type="dxa" w:w="2891"/>
-            <w:tcBorders>
-              <w:top w:val="single" w:color="C9CED2" w:sz="4"/>
-              <w:left w:val="single" w:color="C9CED2" w:sz="4"/>
-              <w:bottom w:val="single" w:color="C9CED2" w:sz="4"/>
-              <w:right w:val="single" w:color="C9CED2" w:sz="4"/>
-            </w:tcBorders>
-            <w:shd w:fill="F7F5F1" w:color="auto" w:val="clear"/>
-            <w:tcMar>
-              <w:top w:type="dxa" w:w="60"/>
-              <w:left w:type="dxa" w:w="90"/>
-              <w:bottom w:type="dxa" w:w="60"/>
-              <w:right w:type="dxa" w:w="90"/>
-            </w:tcMar>
-          </w:tcPr>
-          <w:p>
-            <w:pPr>
-              <w:spacing w:after="0" w:line="252"/>
-            </w:pPr>
-            <w:r>
-              <w:rPr>
-                <w:b/>
-                <w:bCs/>
-                <w:color w:val="1E2A32"/>
-                <w:sz w:val="17"/>
-                <w:szCs w:val="17"/>
-              </w:rPr>
-              <w:t xml:space="preserve">Owned social, emails</w:t>
-            </w:r>
-          </w:p>
-        </w:tc>
-        <w:tc>
-          <w:tcPr>
-            <w:tcW w:type="dxa" w:w="2313"/>
-            <w:tcBorders>
-              <w:top w:val="single" w:color="C9CED2" w:sz="4"/>
-              <w:left w:val="single" w:color="C9CED2" w:sz="4"/>
-              <w:bottom w:val="single" w:color="C9CED2" w:sz="4"/>
-              <w:right w:val="single" w:color="C9CED2" w:sz="4"/>
-            </w:tcBorders>
-            <w:shd w:fill="F7F5F1" w:color="auto" w:val="clear"/>
-            <w:tcMar>
-              <w:top w:type="dxa" w:w="60"/>
-              <w:left w:type="dxa" w:w="90"/>
-              <w:bottom w:type="dxa" w:w="60"/>
-              <w:right w:type="dxa" w:w="90"/>
-            </w:tcMar>
-          </w:tcPr>
-          <w:p>
-            <w:pPr>
-              <w:spacing w:after="0" w:line="252"/>
-            </w:pPr>
-            <w:r>
-              <w:rPr>
-                <w:b w:val="false"/>
-                <w:bCs w:val="false"/>
-                <w:color w:val="1E2A32"/>
-                <w:sz w:val="17"/>
-                <w:szCs w:val="17"/>
-              </w:rPr>
-              <w:t xml:space="preserve">Find us</w:t>
-            </w:r>
-          </w:p>
-        </w:tc>
-        <w:tc>
-          <w:tcPr>
-            <w:tcW w:type="dxa" w:w="1542"/>
-            <w:tcBorders>
-              <w:top w:val="single" w:color="C9CED2" w:sz="4"/>
-              <w:left w:val="single" w:color="C9CED2" w:sz="4"/>
-              <w:bottom w:val="single" w:color="C9CED2" w:sz="4"/>
-              <w:right w:val="single" w:color="C9CED2" w:sz="4"/>
-            </w:tcBorders>
-            <w:shd w:fill="F7F5F1" w:color="auto" w:val="clear"/>
-            <w:tcMar>
-              <w:top w:type="dxa" w:w="60"/>
-              <w:left w:type="dxa" w:w="90"/>
-              <w:bottom w:type="dxa" w:w="60"/>
-              <w:right w:type="dxa" w:w="90"/>
-            </w:tcMar>
-          </w:tcPr>
-          <w:p>
-            <w:pPr>
-              <w:spacing w:after="0" w:line="252"/>
-            </w:pPr>
-            <w:r>
-              <w:rPr>
-                <w:b w:val="false"/>
-                <w:bCs w:val="false"/>
-                <w:color w:val="1E2A32"/>
-                <w:sz w:val="17"/>
-                <w:szCs w:val="17"/>
-              </w:rPr>
-              <w:t xml:space="preserve">Owned</w:t>
-            </w:r>
-          </w:p>
-        </w:tc>
-        <w:tc>
-          <w:tcPr>
-            <w:tcW w:type="dxa" w:w="2892"/>
-            <w:tcBorders>
-              <w:top w:val="single" w:color="C9CED2" w:sz="4"/>
-              <w:left w:val="single" w:color="C9CED2" w:sz="4"/>
-              <w:bottom w:val="single" w:color="C9CED2" w:sz="4"/>
-              <w:right w:val="single" w:color="C9CED2" w:sz="4"/>
-            </w:tcBorders>
-            <w:shd w:fill="F7F5F1" w:color="auto" w:val="clear"/>
-            <w:tcMar>
-              <w:top w:type="dxa" w:w="60"/>
-              <w:left w:type="dxa" w:w="90"/>
-              <w:bottom w:type="dxa" w:w="60"/>
-              <w:right w:type="dxa" w:w="90"/>
-            </w:tcMar>
-          </w:tcPr>
-          <w:p>
-            <w:pPr>
-              <w:spacing w:after="0" w:line="252"/>
-            </w:pPr>
-            <w:r>
-              <w:rPr>
-                <w:b w:val="false"/>
-                <w:bCs w:val="false"/>
-                <w:color w:val="1E2A32"/>
-                <w:sz w:val="17"/>
-                <w:szCs w:val="17"/>
-              </w:rPr>
-              <w:t xml:space="preserve">Conversion</w:t>
-            </w:r>
-          </w:p>
-        </w:tc>
-      </w:tr>
-    </w:tbl>
-    <w:p>
-      <w:pPr>
-        <w:spacing w:after="160"/>
-      </w:pPr>
+        <w:t xml:space="preserve">. The media objective is to reach 70% of Segment A at least once in Burst 1, at an average frequency of four, and to retarget 20% of those exposed in Burst 3. Geographic coverage is Greater Sydney, weighted to the catchments around Chatswood Chase, The Galeries and Bondi Junction. Table 3 lists every vehicle and its paid, owned or earned role. Television and print were excluded as unaffordable at useful frequency and less efficient for this audience. Filmed sessions and styling guides form the content-marketing layer on owned channels. Outdoor has low audience selectivity (Belch &amp; Belch, 2021), so it carries only the store line, near the stores. Retargeting then follows anyone exposed, and it works best once consumers have formed preferences (Lambrecht &amp; Tucker, 2013). Publicity depends on newsworthiness (Belch &amp; Belch, 2021), and a branded class is not news, so the hook is a free Bondi-to-Bronte walk series. Sessions also act as a free trial, which reduces purchase risk without a price cut (Belch &amp; Belch, 2021).</w:t>
+      </w:r>
     </w:p>
     <w:p>
       <w:pPr>
@@ -4823,7 +5254,7 @@
           <w:sz w:val="19"/>
           <w:szCs w:val="19"/>
         </w:rPr>
-        <w:t xml:space="preserve">Agency media plan. Pre- and post-campaign surveys run in December 2026 and April 2027.</w:t>
+        <w:t xml:space="preserve">Agency media plan.</w:t>
       </w:r>
     </w:p>
     <w:p>
@@ -4831,7 +5262,7 @@
         <w:spacing w:after="160" w:line="288"/>
       </w:pPr>
       <w:r>
-        <w:t xml:space="preserve">The budget uses the objective-and-task method (Belch &amp; Belch, 2021). Partnerships receive 42% because they span paid, owned and earned media (Stephen &amp; Galak, 2012): a creator partnership is paid, its content is reused on Alo's owned channels, and audiences share it as earned media. Costs follow published benchmarks. Australian micro-creators charge roughly A$150–750 per post (Wise, 2025), so A$50,000 funds about 40 micro posts plus the lead and macro creators. Sydney bus-side panels start at about A$150 per week plus A$375 production (GoTransit, n.d.), so outdoor buys about 40 panels for three weeks with beach-side posters. At Instagram CPMs of about US$8 (Admetrics, 2025), paid social delivers several million impressions, enough for the Burst 1 reach target. Sanctuary Sessions, the largest line, are costed bottom-up: Sydney Pilates studios hire for about A$50–120 an hour (Tagvenue, 2025) and instructors earn about A$36 an hour (Payscale, 2026), so 36 sessions cost roughly A$15,000; trial product (A$15,000), filming (A$15,000) and the walk series (A$10,000) make up the rest. The split also reflects Binet and Field's (2013) finding that effective campaigns weight brand building over activation by about 60:40; here outdoor, audio, creators, production and PR take 57% of working budget. The weakness is that only 40% buys traditional reach, so if Burst 1 misses its reach target, the contingency moves into paid social.</w:t>
+        <w:t xml:space="preserve">The budget uses the objective-and-task method (Belch &amp; Belch, 2021). Partnerships receive 42% because they span paid, owned and earned media (Stephen &amp; Galak, 2012): a creator partnership is paid, its content is reused on Alo's owned channels, and audiences share it as earned media. Australian micro-creators charge roughly A$150–750 per post (Wise, 2025), so A$50,000 funds about 40 micro posts plus the lead and macro creators. Sydney bus-side panels start at about A$150 per week plus A$375 production (GoTransit, n.d.), so outdoor buys about 40 panels for three weeks with beach-side posters. At Instagram CPMs of about US$8 (Admetrics, 2025), paid social delivers several million impressions, enough for the Burst 1 reach target. Sanctuary Sessions, the largest line, are costed bottom-up: Sydney Pilates studios hire for about A$50–120 an hour (Tagvenue, 2025) and instructors earn about A$36 an hour (Payscale, 2026), so 36 sessions cost roughly A$15,000; trial product (A$15,000), filming (A$15,000) and the walk series (A$10,000) make up the rest. The split also reflects Binet and Field's (2013) finding that effective campaigns weight brand building over activation by about 60:40; here outdoor, audio, creators, production and PR take 57% of working budget. The weakness is that only 40% buys traditional reach, so if Burst 1 misses its reach target, the contingency moves into paid social.</w:t>
       </w:r>
     </w:p>
     <w:p>
@@ -4844,7 +5275,7 @@
           <w:b/>
           <w:bCs/>
         </w:rPr>
-        <w:t xml:space="preserve">Table 5</w:t>
+        <w:t xml:space="preserve">Table 4</w:t>
       </w:r>
     </w:p>
     <w:p>
@@ -6757,7 +7188,7 @@
         <w:spacing w:after="160" w:line="288"/>
       </w:pPr>
       <w:r>
-        <w:t xml:space="preserve">Effectiveness means achieving the intended outcomes, not likes (Belch &amp; Belch, 2021). Pre-testing in December 2026 uses concept tests, A/B comparisons of edits and the baseline survey to check comprehension, brand attribution, relevance and the call to action. Because test viewers are made to watch, results are used to choose between executions rather than forecast outcomes. In-flight digital metrics guide reallocation between bursts. Creators are judged on audience fit, credibility, brand lift and tracked action, not followers (Campbell &amp; Farrell, 2020). Each measure maps to one objective (Table 6). Each survey wave samples about 400 Segment A respondents and 150 Melbourne controls; at that size only changes of roughly five points are reliable, so O4 is judged with store traffic and web data, not the survey alone. Post-testing in April 2027 repeats the survey, uses social listening, checks self-reported visits against store traffic and web analytics, and compares results with a Melbourne control sample. Observational attribution can overstate advertising effects compared with experiments (Gordon et al., 2019), so results will be reported as indicative rather than proven.</w:t>
+        <w:t xml:space="preserve">Effectiveness means achieving the intended outcomes, not likes (Belch &amp; Belch, 2021). Pre-testing in December 2026 uses concept tests, A/B comparisons of edits and the baseline survey to check comprehension, brand attribution, relevance and the call to action. Because test viewers are made to watch, results are used to choose between executions rather than forecast outcomes. In-flight digital metrics guide reallocation between bursts. Creators are judged on audience fit, credibility, brand lift and tracked action, not followers (Campbell &amp; Farrell, 2020). Each measure maps to one objective (Table 5). Each survey wave samples about 400 Segment A respondents and 150 Melbourne controls; at that size only changes of roughly five points are reliable, so O4 is judged with store traffic and web data, not the survey alone. Post-testing in April 2027 repeats the survey and social listening against the Melbourne control. Observational attribution can overstate advertising effects compared with experiments (Gordon et al., 2019), so results will be reported as indicative rather than proven.</w:t>
       </w:r>
     </w:p>
     <w:p>
@@ -6770,7 +7201,7 @@
           <w:b/>
           <w:bCs/>
         </w:rPr>
-        <w:t xml:space="preserve">Table 6</w:t>
+        <w:t xml:space="preserve">Table 5</w:t>
       </w:r>
     </w:p>
     <w:p>
@@ -7633,7 +8064,7 @@
         <w:spacing w:after="160" w:line="288"/>
       </w:pPr>
       <w:r>
-        <w:t xml:space="preserve">Every pillar, source, channel and burst answers a diagnosed challenge, with one message adapted to every channel but never changed: one set, made for the whole Sydney day. AI use is disclosed in Appendix I.</w:t>
+        <w:t xml:space="preserve">Every pillar, source, channel and burst answers a diagnosed challenge, with one message adapted to every channel but never changed: one set, made for the whole Sydney day. AI use is disclosed in Appendix J.</w:t>
       </w:r>
     </w:p>
     <w:p>
@@ -11636,7 +12067,7 @@
         <w:pStyle w:val="Heading1"/>
       </w:pPr>
       <w:r>
-        <w:t xml:space="preserve">Appendix F: Divergence and Relevance Assessment</w:t>
+        <w:t xml:space="preserve">Appendix F: Creative Brief</w:t>
       </w:r>
     </w:p>
     <w:p>
@@ -11650,6 +12081,505 @@
           <w:bCs/>
         </w:rPr>
         <w:t xml:space="preserve">Table F1</w:t>
+      </w:r>
+    </w:p>
+    <w:p>
+      <w:pPr>
+        <w:keepNext/>
+        <w:spacing w:after="100"/>
+      </w:pPr>
+      <w:r>
+        <w:rPr>
+          <w:i/>
+          <w:iCs/>
+        </w:rPr>
+        <w:t xml:space="preserve">Creative Brief Summary</w:t>
+      </w:r>
+    </w:p>
+    <w:tbl>
+      <w:tblPr>
+        <w:tblW w:type="dxa" w:w="9638"/>
+        <w:tblBorders>
+          <w:top w:val="single" w:color="auto" w:sz="4"/>
+          <w:left w:val="single" w:color="auto" w:sz="4"/>
+          <w:bottom w:val="single" w:color="auto" w:sz="4"/>
+          <w:right w:val="single" w:color="auto" w:sz="4"/>
+          <w:insideH w:val="single" w:color="auto" w:sz="4"/>
+          <w:insideV w:val="single" w:color="auto" w:sz="4"/>
+        </w:tblBorders>
+      </w:tblPr>
+      <w:tblGrid>
+        <w:gridCol w:w="2506"/>
+        <w:gridCol w:w="7132"/>
+      </w:tblGrid>
+      <w:tr>
+        <w:trPr>
+          <w:tblHeader/>
+        </w:trPr>
+        <w:tc>
+          <w:tcPr>
+            <w:tcW w:type="dxa" w:w="2506"/>
+            <w:tcBorders>
+              <w:top w:val="single" w:color="C9CED2" w:sz="4"/>
+              <w:left w:val="single" w:color="C9CED2" w:sz="4"/>
+              <w:bottom w:val="single" w:color="C9CED2" w:sz="4"/>
+              <w:right w:val="single" w:color="C9CED2" w:sz="4"/>
+            </w:tcBorders>
+            <w:shd w:fill="1E2A32" w:color="auto" w:val="clear"/>
+            <w:tcMar>
+              <w:top w:type="dxa" w:w="60"/>
+              <w:left w:type="dxa" w:w="90"/>
+              <w:bottom w:type="dxa" w:w="60"/>
+              <w:right w:type="dxa" w:w="90"/>
+            </w:tcMar>
+          </w:tcPr>
+          <w:p>
+            <w:pPr>
+              <w:spacing w:after="0" w:line="252"/>
+            </w:pPr>
+            <w:r>
+              <w:rPr>
+                <w:b/>
+                <w:bCs/>
+                <w:color w:val="FFFFFF"/>
+                <w:sz w:val="17"/>
+                <w:szCs w:val="17"/>
+              </w:rPr>
+              <w:t xml:space="preserve">Element</w:t>
+            </w:r>
+          </w:p>
+        </w:tc>
+        <w:tc>
+          <w:tcPr>
+            <w:tcW w:type="dxa" w:w="7132"/>
+            <w:tcBorders>
+              <w:top w:val="single" w:color="C9CED2" w:sz="4"/>
+              <w:left w:val="single" w:color="C9CED2" w:sz="4"/>
+              <w:bottom w:val="single" w:color="C9CED2" w:sz="4"/>
+              <w:right w:val="single" w:color="C9CED2" w:sz="4"/>
+            </w:tcBorders>
+            <w:shd w:fill="1E2A32" w:color="auto" w:val="clear"/>
+            <w:tcMar>
+              <w:top w:type="dxa" w:w="60"/>
+              <w:left w:type="dxa" w:w="90"/>
+              <w:bottom w:type="dxa" w:w="60"/>
+              <w:right w:type="dxa" w:w="90"/>
+            </w:tcMar>
+          </w:tcPr>
+          <w:p>
+            <w:pPr>
+              <w:spacing w:after="0" w:line="252"/>
+            </w:pPr>
+            <w:r>
+              <w:rPr>
+                <w:b/>
+                <w:bCs/>
+                <w:color w:val="FFFFFF"/>
+                <w:sz w:val="17"/>
+                <w:szCs w:val="17"/>
+              </w:rPr>
+              <w:t xml:space="preserve">Mat to Moment</w:t>
+            </w:r>
+          </w:p>
+        </w:tc>
+      </w:tr>
+      <w:tr>
+        <w:trPr>
+          <w:cantSplit/>
+        </w:trPr>
+        <w:tc>
+          <w:tcPr>
+            <w:tcW w:type="dxa" w:w="2506"/>
+            <w:tcBorders>
+              <w:top w:val="single" w:color="C9CED2" w:sz="4"/>
+              <w:left w:val="single" w:color="C9CED2" w:sz="4"/>
+              <w:bottom w:val="single" w:color="C9CED2" w:sz="4"/>
+              <w:right w:val="single" w:color="C9CED2" w:sz="4"/>
+            </w:tcBorders>
+            <w:tcMar>
+              <w:top w:type="dxa" w:w="60"/>
+              <w:left w:type="dxa" w:w="90"/>
+              <w:bottom w:type="dxa" w:w="60"/>
+              <w:right w:type="dxa" w:w="90"/>
+            </w:tcMar>
+          </w:tcPr>
+          <w:p>
+            <w:pPr>
+              <w:spacing w:after="0" w:line="252"/>
+            </w:pPr>
+            <w:r>
+              <w:rPr>
+                <w:b/>
+                <w:bCs/>
+                <w:color w:val="1E2A32"/>
+                <w:sz w:val="17"/>
+                <w:szCs w:val="17"/>
+              </w:rPr>
+              <w:t xml:space="preserve">Target audience</w:t>
+            </w:r>
+          </w:p>
+        </w:tc>
+        <w:tc>
+          <w:tcPr>
+            <w:tcW w:type="dxa" w:w="7132"/>
+            <w:tcBorders>
+              <w:top w:val="single" w:color="C9CED2" w:sz="4"/>
+              <w:left w:val="single" w:color="C9CED2" w:sz="4"/>
+              <w:bottom w:val="single" w:color="C9CED2" w:sz="4"/>
+              <w:right w:val="single" w:color="C9CED2" w:sz="4"/>
+            </w:tcBorders>
+            <w:tcMar>
+              <w:top w:type="dxa" w:w="60"/>
+              <w:left w:type="dxa" w:w="90"/>
+              <w:bottom w:type="dxa" w:w="60"/>
+              <w:right w:type="dxa" w:w="90"/>
+            </w:tcMar>
+          </w:tcPr>
+          <w:p>
+            <w:pPr>
+              <w:spacing w:after="0" w:line="252"/>
+            </w:pPr>
+            <w:r>
+              <w:rPr>
+                <w:b w:val="false"/>
+                <w:bCs w:val="false"/>
+                <w:color w:val="1E2A32"/>
+                <w:sz w:val="17"/>
+                <w:szCs w:val="17"/>
+              </w:rPr>
+              <w:t xml:space="preserve">Style-conscious women, 22–34, Greater Sydney</w:t>
+            </w:r>
+          </w:p>
+        </w:tc>
+      </w:tr>
+      <w:tr>
+        <w:trPr>
+          <w:cantSplit/>
+        </w:trPr>
+        <w:tc>
+          <w:tcPr>
+            <w:tcW w:type="dxa" w:w="2506"/>
+            <w:tcBorders>
+              <w:top w:val="single" w:color="C9CED2" w:sz="4"/>
+              <w:left w:val="single" w:color="C9CED2" w:sz="4"/>
+              <w:bottom w:val="single" w:color="C9CED2" w:sz="4"/>
+              <w:right w:val="single" w:color="C9CED2" w:sz="4"/>
+            </w:tcBorders>
+            <w:shd w:fill="F7F5F1" w:color="auto" w:val="clear"/>
+            <w:tcMar>
+              <w:top w:type="dxa" w:w="60"/>
+              <w:left w:type="dxa" w:w="90"/>
+              <w:bottom w:type="dxa" w:w="60"/>
+              <w:right w:type="dxa" w:w="90"/>
+            </w:tcMar>
+          </w:tcPr>
+          <w:p>
+            <w:pPr>
+              <w:spacing w:after="0" w:line="252"/>
+            </w:pPr>
+            <w:r>
+              <w:rPr>
+                <w:b/>
+                <w:bCs/>
+                <w:color w:val="1E2A32"/>
+                <w:sz w:val="17"/>
+                <w:szCs w:val="17"/>
+              </w:rPr>
+              <w:t xml:space="preserve">Key insight</w:t>
+            </w:r>
+          </w:p>
+        </w:tc>
+        <w:tc>
+          <w:tcPr>
+            <w:tcW w:type="dxa" w:w="7132"/>
+            <w:tcBorders>
+              <w:top w:val="single" w:color="C9CED2" w:sz="4"/>
+              <w:left w:val="single" w:color="C9CED2" w:sz="4"/>
+              <w:bottom w:val="single" w:color="C9CED2" w:sz="4"/>
+              <w:right w:val="single" w:color="C9CED2" w:sz="4"/>
+            </w:tcBorders>
+            <w:shd w:fill="F7F5F1" w:color="auto" w:val="clear"/>
+            <w:tcMar>
+              <w:top w:type="dxa" w:w="60"/>
+              <w:left w:type="dxa" w:w="90"/>
+              <w:bottom w:type="dxa" w:w="60"/>
+              <w:right w:type="dxa" w:w="90"/>
+            </w:tcMar>
+          </w:tcPr>
+          <w:p>
+            <w:pPr>
+              <w:spacing w:after="0" w:line="252"/>
+            </w:pPr>
+            <w:r>
+              <w:rPr>
+                <w:b w:val="false"/>
+                <w:bCs w:val="false"/>
+                <w:color w:val="1E2A32"/>
+                <w:sz w:val="17"/>
+                <w:szCs w:val="17"/>
+              </w:rPr>
+              <w:t xml:space="preserve">Activewear is judged after class as much as in it</w:t>
+            </w:r>
+          </w:p>
+        </w:tc>
+      </w:tr>
+      <w:tr>
+        <w:trPr>
+          <w:cantSplit/>
+        </w:trPr>
+        <w:tc>
+          <w:tcPr>
+            <w:tcW w:type="dxa" w:w="2506"/>
+            <w:tcBorders>
+              <w:top w:val="single" w:color="C9CED2" w:sz="4"/>
+              <w:left w:val="single" w:color="C9CED2" w:sz="4"/>
+              <w:bottom w:val="single" w:color="C9CED2" w:sz="4"/>
+              <w:right w:val="single" w:color="C9CED2" w:sz="4"/>
+            </w:tcBorders>
+            <w:tcMar>
+              <w:top w:type="dxa" w:w="60"/>
+              <w:left w:type="dxa" w:w="90"/>
+              <w:bottom w:type="dxa" w:w="60"/>
+              <w:right w:type="dxa" w:w="90"/>
+            </w:tcMar>
+          </w:tcPr>
+          <w:p>
+            <w:pPr>
+              <w:spacing w:after="0" w:line="252"/>
+            </w:pPr>
+            <w:r>
+              <w:rPr>
+                <w:b/>
+                <w:bCs/>
+                <w:color w:val="1E2A32"/>
+                <w:sz w:val="17"/>
+                <w:szCs w:val="17"/>
+              </w:rPr>
+              <w:t xml:space="preserve">Key message</w:t>
+            </w:r>
+          </w:p>
+        </w:tc>
+        <w:tc>
+          <w:tcPr>
+            <w:tcW w:type="dxa" w:w="7132"/>
+            <w:tcBorders>
+              <w:top w:val="single" w:color="C9CED2" w:sz="4"/>
+              <w:left w:val="single" w:color="C9CED2" w:sz="4"/>
+              <w:bottom w:val="single" w:color="C9CED2" w:sz="4"/>
+              <w:right w:val="single" w:color="C9CED2" w:sz="4"/>
+            </w:tcBorders>
+            <w:tcMar>
+              <w:top w:type="dxa" w:w="60"/>
+              <w:left w:type="dxa" w:w="90"/>
+              <w:bottom w:type="dxa" w:w="60"/>
+              <w:right w:type="dxa" w:w="90"/>
+            </w:tcMar>
+          </w:tcPr>
+          <w:p>
+            <w:pPr>
+              <w:spacing w:after="0" w:line="252"/>
+            </w:pPr>
+            <w:r>
+              <w:rPr>
+                <w:b w:val="false"/>
+                <w:bCs w:val="false"/>
+                <w:color w:val="1E2A32"/>
+                <w:sz w:val="17"/>
+                <w:szCs w:val="17"/>
+              </w:rPr>
+              <w:t xml:space="preserve">One set, made for the whole day</w:t>
+            </w:r>
+          </w:p>
+        </w:tc>
+      </w:tr>
+      <w:tr>
+        <w:trPr>
+          <w:cantSplit/>
+        </w:trPr>
+        <w:tc>
+          <w:tcPr>
+            <w:tcW w:type="dxa" w:w="2506"/>
+            <w:tcBorders>
+              <w:top w:val="single" w:color="C9CED2" w:sz="4"/>
+              <w:left w:val="single" w:color="C9CED2" w:sz="4"/>
+              <w:bottom w:val="single" w:color="C9CED2" w:sz="4"/>
+              <w:right w:val="single" w:color="C9CED2" w:sz="4"/>
+            </w:tcBorders>
+            <w:shd w:fill="F7F5F1" w:color="auto" w:val="clear"/>
+            <w:tcMar>
+              <w:top w:type="dxa" w:w="60"/>
+              <w:left w:type="dxa" w:w="90"/>
+              <w:bottom w:type="dxa" w:w="60"/>
+              <w:right w:type="dxa" w:w="90"/>
+            </w:tcMar>
+          </w:tcPr>
+          <w:p>
+            <w:pPr>
+              <w:spacing w:after="0" w:line="252"/>
+            </w:pPr>
+            <w:r>
+              <w:rPr>
+                <w:b/>
+                <w:bCs/>
+                <w:color w:val="1E2A32"/>
+                <w:sz w:val="17"/>
+                <w:szCs w:val="17"/>
+              </w:rPr>
+              <w:t xml:space="preserve">Reasons to believe</w:t>
+            </w:r>
+          </w:p>
+        </w:tc>
+        <w:tc>
+          <w:tcPr>
+            <w:tcW w:type="dxa" w:w="7132"/>
+            <w:tcBorders>
+              <w:top w:val="single" w:color="C9CED2" w:sz="4"/>
+              <w:left w:val="single" w:color="C9CED2" w:sz="4"/>
+              <w:bottom w:val="single" w:color="C9CED2" w:sz="4"/>
+              <w:right w:val="single" w:color="C9CED2" w:sz="4"/>
+            </w:tcBorders>
+            <w:shd w:fill="F7F5F1" w:color="auto" w:val="clear"/>
+            <w:tcMar>
+              <w:top w:type="dxa" w:w="60"/>
+              <w:left w:type="dxa" w:w="90"/>
+              <w:bottom w:type="dxa" w:w="60"/>
+              <w:right w:type="dxa" w:w="90"/>
+            </w:tcMar>
+          </w:tcPr>
+          <w:p>
+            <w:pPr>
+              <w:spacing w:after="0" w:line="252"/>
+            </w:pPr>
+            <w:r>
+              <w:rPr>
+                <w:b w:val="false"/>
+                <w:bCs w:val="false"/>
+                <w:color w:val="1E2A32"/>
+                <w:sz w:val="17"/>
+                <w:szCs w:val="17"/>
+              </w:rPr>
+              <w:t xml:space="preserve">Instructor-tested fit, cost per wear, editorial reviews</w:t>
+            </w:r>
+          </w:p>
+        </w:tc>
+      </w:tr>
+      <w:tr>
+        <w:trPr>
+          <w:cantSplit/>
+        </w:trPr>
+        <w:tc>
+          <w:tcPr>
+            <w:tcW w:type="dxa" w:w="2506"/>
+            <w:tcBorders>
+              <w:top w:val="single" w:color="C9CED2" w:sz="4"/>
+              <w:left w:val="single" w:color="C9CED2" w:sz="4"/>
+              <w:bottom w:val="single" w:color="C9CED2" w:sz="4"/>
+              <w:right w:val="single" w:color="C9CED2" w:sz="4"/>
+            </w:tcBorders>
+            <w:tcMar>
+              <w:top w:type="dxa" w:w="60"/>
+              <w:left w:type="dxa" w:w="90"/>
+              <w:bottom w:type="dxa" w:w="60"/>
+              <w:right w:type="dxa" w:w="90"/>
+            </w:tcMar>
+          </w:tcPr>
+          <w:p>
+            <w:pPr>
+              <w:spacing w:after="0" w:line="252"/>
+            </w:pPr>
+            <w:r>
+              <w:rPr>
+                <w:b/>
+                <w:bCs/>
+                <w:color w:val="1E2A32"/>
+                <w:sz w:val="17"/>
+                <w:szCs w:val="17"/>
+              </w:rPr>
+              <w:t xml:space="preserve">Tone</w:t>
+            </w:r>
+          </w:p>
+        </w:tc>
+        <w:tc>
+          <w:tcPr>
+            <w:tcW w:type="dxa" w:w="7132"/>
+            <w:tcBorders>
+              <w:top w:val="single" w:color="C9CED2" w:sz="4"/>
+              <w:left w:val="single" w:color="C9CED2" w:sz="4"/>
+              <w:bottom w:val="single" w:color="C9CED2" w:sz="4"/>
+              <w:right w:val="single" w:color="C9CED2" w:sz="4"/>
+            </w:tcBorders>
+            <w:tcMar>
+              <w:top w:type="dxa" w:w="60"/>
+              <w:left w:type="dxa" w:w="90"/>
+              <w:bottom w:type="dxa" w:w="60"/>
+              <w:right w:type="dxa" w:w="90"/>
+            </w:tcMar>
+          </w:tcPr>
+          <w:p>
+            <w:pPr>
+              <w:spacing w:after="0" w:line="252"/>
+            </w:pPr>
+            <w:r>
+              <w:rPr>
+                <w:b w:val="false"/>
+                <w:bCs w:val="false"/>
+                <w:color w:val="1E2A32"/>
+                <w:sz w:val="17"/>
+                <w:szCs w:val="17"/>
+              </w:rPr>
+              <w:t xml:space="preserve">Calm, confident, natural light, diverse bodies</w:t>
+            </w:r>
+          </w:p>
+        </w:tc>
+      </w:tr>
+    </w:tbl>
+    <w:p>
+      <w:pPr>
+        <w:spacing w:after="240" w:before="60"/>
+      </w:pPr>
+      <w:r>
+        <w:rPr>
+          <w:i/>
+          <w:iCs/>
+          <w:color w:val="5B6770"/>
+          <w:sz w:val="19"/>
+          <w:szCs w:val="19"/>
+        </w:rPr>
+        <w:t xml:space="preserve">Note. </w:t>
+      </w:r>
+      <w:r>
+        <w:rPr>
+          <w:color w:val="5B6770"/>
+          <w:sz w:val="19"/>
+          <w:szCs w:val="19"/>
+        </w:rPr>
+        <w:t xml:space="preserve">Elements from Belch and Belch (2021).</w:t>
+      </w:r>
+    </w:p>
+    <w:p>
+      <w:r>
+        <w:br w:type="page"/>
+      </w:r>
+    </w:p>
+    <w:p>
+      <w:pPr>
+        <w:pStyle w:val="Heading1"/>
+      </w:pPr>
+      <w:r>
+        <w:t xml:space="preserve">Appendix G: Divergence and Relevance Assessment</w:t>
+      </w:r>
+    </w:p>
+    <w:p>
+      <w:pPr>
+        <w:keepNext/>
+        <w:spacing w:after="40" w:before="200"/>
+      </w:pPr>
+      <w:r>
+        <w:rPr>
+          <w:b/>
+          <w:bCs/>
+        </w:rPr>
+        <w:t xml:space="preserve">Table G1</w:t>
       </w:r>
     </w:p>
     <w:p>
@@ -12418,7 +13348,7 @@
         <w:pStyle w:val="Heading1"/>
       </w:pPr>
       <w:r>
-        <w:t xml:space="preserve">Appendix G: Creative Tactics by Channel</w:t>
+        <w:t xml:space="preserve">Appendix H: Creative Tactics by Channel</w:t>
       </w:r>
     </w:p>
     <w:p>
@@ -12431,7 +13361,7 @@
           <w:b/>
           <w:bCs/>
         </w:rPr>
-        <w:t xml:space="preserve">Figure G1</w:t>
+        <w:t xml:space="preserve">Figure H1</w:t>
       </w:r>
     </w:p>
     <w:p>
@@ -12527,7 +13457,7 @@
         <w:pStyle w:val="Heading1"/>
       </w:pPr>
       <w:r>
-        <w:t xml:space="preserve">Appendix H: Draft Communication Materials</w:t>
+        <w:t xml:space="preserve">Appendix I: Draft Communication Materials</w:t>
       </w:r>
     </w:p>
     <w:p>
@@ -12535,7 +13465,7 @@
         <w:spacing w:after="160" w:line="288"/>
       </w:pPr>
       <w:r>
-        <w:t xml:space="preserve">Draft mock-ups for each media mix element. Colour blocks stand in for campaign photography, creator handles are placeholders, and all copy follows the mandatory requirements in Section 4.3. The outdoor panel appears as Figure 7.</w:t>
+        <w:t xml:space="preserve">Draft mock-ups for each touchpoint in Table 3. Colour blocks stand in for campaign photography, creator handles are placeholders, and all copy follows the mandatory requirements in Section 4.3. The outdoor panel appears as Figure 7.</w:t>
       </w:r>
     </w:p>
     <w:p>
@@ -12548,7 +13478,7 @@
           <w:b/>
           <w:bCs/>
         </w:rPr>
-        <w:t xml:space="preserve">Figure H1</w:t>
+        <w:t xml:space="preserve">Figure I1</w:t>
       </w:r>
     </w:p>
     <w:p>
@@ -12644,7 +13574,7 @@
           <w:b/>
           <w:bCs/>
         </w:rPr>
-        <w:t xml:space="preserve">Figure H2</w:t>
+        <w:t xml:space="preserve">Figure I2</w:t>
       </w:r>
     </w:p>
     <w:p>
@@ -12740,7 +13670,7 @@
           <w:b/>
           <w:bCs/>
         </w:rPr>
-        <w:t xml:space="preserve">Figure H3</w:t>
+        <w:t xml:space="preserve">Figure I3</w:t>
       </w:r>
     </w:p>
     <w:p>
@@ -12836,7 +13766,7 @@
           <w:b/>
           <w:bCs/>
         </w:rPr>
-        <w:t xml:space="preserve">Figure H4</w:t>
+        <w:t xml:space="preserve">Figure I4</w:t>
       </w:r>
     </w:p>
     <w:p>
@@ -12932,7 +13862,7 @@
           <w:b/>
           <w:bCs/>
         </w:rPr>
-        <w:t xml:space="preserve">Figure H5</w:t>
+        <w:t xml:space="preserve">Figure I5</w:t>
       </w:r>
     </w:p>
     <w:p>
@@ -13028,7 +13958,7 @@
           <w:b/>
           <w:bCs/>
         </w:rPr>
-        <w:t xml:space="preserve">Figure H6</w:t>
+        <w:t xml:space="preserve">Figure I6</w:t>
       </w:r>
     </w:p>
     <w:p>
@@ -13115,41 +14045,137 @@
       </w:r>
     </w:p>
     <w:p>
-      <w:r>
-        <w:br w:type="page"/>
-      </w:r>
-    </w:p>
-    <w:p>
-      <w:pPr>
-        <w:pStyle w:val="Heading1"/>
-      </w:pPr>
-      <w:r>
-        <w:t xml:space="preserve">Appendix I: Disclosure of AI Use</w:t>
-      </w:r>
-    </w:p>
-    <w:p>
-      <w:pPr>
-        <w:spacing w:after="160" w:line="288"/>
+      <w:pPr>
+        <w:keepNext/>
+        <w:spacing w:after="40" w:before="200"/>
       </w:pPr>
       <w:r>
         <w:rPr>
           <w:b/>
           <w:bCs/>
         </w:rPr>
-        <w:t xml:space="preserve">Tool:</w:t>
-      </w:r>
-      <w:r>
-        <w:t xml:space="preserve"> Claude (Anthropic), used through Claude Code in October 2026. </w:t>
-      </w:r>
+        <w:t xml:space="preserve">Figure I7</w:t>
+      </w:r>
+    </w:p>
+    <w:p>
+      <w:pPr>
+        <w:keepNext/>
+        <w:spacing w:after="100"/>
+      </w:pPr>
+      <w:r>
+        <w:rPr>
+          <w:i/>
+          <w:iCs/>
+        </w:rPr>
+        <w:t xml:space="preserve">In-Store Touchpoints: Window, Swing Tag, Bag and Styling Card (Intrinsic)</w:t>
+      </w:r>
+    </w:p>
+    <w:p>
+      <w:pPr>
+        <w:keepNext/>
+        <w:spacing w:after="80"/>
+        <w:jc w:val="center"/>
+      </w:pPr>
+      <w:r>
+        <w:drawing>
+          <wp:inline distT="0" distB="0" distL="0" distR="0">
+            <wp:extent cx="6035040" cy="1847850"/>
+            <wp:effectExtent t="0" r="0" b="0" l="0"/>
+            <wp:docPr id="1" name="" descr="" title=""/>
+            <wp:cNvGraphicFramePr>
+              <a:graphicFrameLocks xmlns:a="http://schemas.openxmlformats.org/drawingml/2006/main" noChangeAspect="1"/>
+            </wp:cNvGraphicFramePr>
+            <a:graphic xmlns:a="http://schemas.openxmlformats.org/drawingml/2006/main">
+              <a:graphicData uri="http://schemas.openxmlformats.org/drawingml/2006/picture">
+                <pic:pic xmlns:pic="http://schemas.openxmlformats.org/drawingml/2006/picture">
+                  <pic:nvPicPr>
+                    <pic:cNvPr id="0" name="" descr=""/>
+                    <pic:cNvPicPr>
+                      <a:picLocks noChangeAspect="1" noChangeArrowheads="1"/>
+                    </pic:cNvPicPr>
+                  </pic:nvPicPr>
+                  <pic:blipFill>
+                    <a:blip r:embed="rId26" cstate="none"/>
+                    <a:srcRect/>
+                    <a:stretch>
+                      <a:fillRect/>
+                    </a:stretch>
+                  </pic:blipFill>
+                  <pic:spPr bwMode="auto">
+                    <a:xfrm>
+                      <a:off x="0" y="0"/>
+                      <a:ext cx="6035040" cy="1847850"/>
+                    </a:xfrm>
+                    <a:prstGeom prst="rect">
+                      <a:avLst/>
+                    </a:prstGeom>
+                  </pic:spPr>
+                </pic:pic>
+              </a:graphicData>
+            </a:graphic>
+          </wp:inline>
+        </w:drawing>
+      </w:r>
+    </w:p>
+    <w:p>
+      <w:pPr>
+        <w:spacing w:after="240"/>
+      </w:pPr>
+      <w:r>
+        <w:rPr>
+          <w:i/>
+          <w:iCs/>
+          <w:color w:val="5B6770"/>
+          <w:sz w:val="19"/>
+          <w:szCs w:val="19"/>
+        </w:rPr>
+        <w:t xml:space="preserve">Note. </w:t>
+      </w:r>
+      <w:r>
+        <w:rPr>
+          <w:color w:val="5B6770"/>
+          <w:sz w:val="19"/>
+          <w:szCs w:val="19"/>
+        </w:rPr>
+        <w:t xml:space="preserve">The swing tag prompts #MatToMoment posts, closing the advocacy loop.</w:t>
+      </w:r>
+    </w:p>
+    <w:p>
+      <w:r>
+        <w:br w:type="page"/>
+      </w:r>
+    </w:p>
+    <w:p>
+      <w:pPr>
+        <w:pStyle w:val="Heading1"/>
+      </w:pPr>
+      <w:r>
+        <w:t xml:space="preserve">Appendix J: Disclosure of AI Use</w:t>
+      </w:r>
+    </w:p>
+    <w:p>
+      <w:pPr>
+        <w:spacing w:after="160" w:line="288"/>
+      </w:pPr>
       <w:r>
         <w:rPr>
           <w:b/>
           <w:bCs/>
         </w:rPr>
+        <w:t xml:space="preserve">Tool:</w:t>
+      </w:r>
+      <w:r>
+        <w:t xml:space="preserve"> Claude (Anthropic), used through Claude Code in October 2026. </w:t>
+      </w:r>
+      <w:r>
+        <w:rPr>
+          <w:b/>
+          <w:bCs/>
+        </w:rPr>
         <w:t xml:space="preserve">Used for:</w:t>
       </w:r>
       <w:r>
-        <w:t xml:space="preserve"> restructuring and editing our draft against the rubric, suggesting and applying theory, checking facts and sources, formatting APA references, and creating the diagrams in Figures 1–6, 8, B1, E1 and G1 from our specifications, and producing the draft mock-ups in Figure 7 and Appendix H as designed layouts (no image-generation model was used). All AI output was reviewed, edited and verified by the group, which remains responsible for the content.</w:t>
+        <w:t xml:space="preserve"> restructuring and editing our draft against the rubric, suggesting and applying theory, checking facts and sources, formatting APA references, and creating the diagrams in Figures 1–6, 8, B1, E1 and H1 from our specifications, and producing the draft mock-ups in Figure 7 and Appendix I as designed layouts (no image-generation model was used). All AI output was reviewed, edited and verified by the group, which remains responsible for the content.</w:t>
       </w:r>
     </w:p>
     <w:p>
@@ -13157,7 +14183,7 @@
         <w:pStyle w:val="Heading2"/>
       </w:pPr>
       <w:r>
-        <w:t xml:space="preserve">I1. Prompts Used (Verbatim)</w:t>
+        <w:t xml:space="preserve">J1. Prompts Used (Verbatim)</w:t>
       </w:r>
     </w:p>
     <w:p>
@@ -13344,6 +14370,32 @@
     </w:p>
     <w:p>
       <w:pPr>
+        <w:pStyle w:val="ListParagraph"/>
+        <w:numPr>
+          <w:ilvl w:val="0"/>
+          <w:numId w:val="3"/>
+        </w:numPr>
+        <w:spacing w:after="100" w:line="288"/>
+      </w:pPr>
+      <w:r>
+        <w:t xml:space="preserve">"- we need to show how the message is in every touchpoint. Going to get graded on how your campaign is integrated across every touchpoint do we do this"</w:t>
+      </w:r>
+    </w:p>
+    <w:p>
+      <w:pPr>
+        <w:pStyle w:val="ListParagraph"/>
+        <w:numPr>
+          <w:ilvl w:val="0"/>
+          <w:numId w:val="3"/>
+        </w:numPr>
+        <w:spacing w:after="100" w:line="288"/>
+      </w:pPr>
+      <w:r>
+        <w:t xml:space="preserve">"Yes but remember to keep it in line with the rubric"</w:t>
+      </w:r>
+    </w:p>
+    <w:p>
+      <w:pPr>
         <w:spacing w:after="60"/>
       </w:pPr>
     </w:p>
@@ -13352,7 +14404,7 @@
         <w:pStyle w:val="Heading2"/>
       </w:pPr>
       <w:r>
-        <w:t xml:space="preserve">I2. Critical Reflection</w:t>
+        <w:t xml:space="preserve">J2. Critical Reflection</w:t>
       </w:r>
     </w:p>
     <w:p>

</xml_diff>